<commit_message>
Fix affiliation: The Second Affiliated Hospital of Fujian University of Traditional Chinese Medicine
</commit_message>
<xml_diff>
--- a/submission/manuscript.docx
+++ b/submission/manuscript.docx
@@ -82,7 +82,7 @@
         <w:t xml:space="preserve"> </w:t>
       </w:r>
       <w:r>
-        <w:t xml:space="preserve">Department of Anesthesiology, The Second People’s Hospital Affiliated to Fujian University of Traditional Chinese Medicine, Fuzhou 350000, Fujian, China</w:t>
+        <w:t xml:space="preserve">Department of Anesthesiology, The Second Affiliated Hospital of Fujian University of Traditional Chinese Medicine, Fuzhou 350000, Fujian, China</w:t>
       </w:r>
     </w:p>
     <w:p>
@@ -3402,7 +3402,7 @@
         <w:pStyle w:val="FirstParagraph"/>
       </w:pPr>
       <w:r>
-        <w:t xml:space="preserve">The author thanks the Norman lab and the Gene Ontology Consortium for making their data publicly available. This research was supported by institutional resources from The Second People’s Hospital Affiliated to Fujian University of Traditional Chinese Medicine.</w:t>
+        <w:t xml:space="preserve">The author thanks the Norman lab and the Gene Ontology Consortium for making their data publicly available. This research was supported by institutional resources from The Second Affiliated Hospital of Fujian University of Traditional Chinese Medicine.</w:t>
       </w:r>
     </w:p>
     <w:bookmarkEnd w:id="47"/>

</xml_diff>

<commit_message>
Final submission package: AI statement, metadata fix, regenerated DOCX, significance/competing interests/graphical abstract
</commit_message>
<xml_diff>
--- a/submission/manuscript.docx
+++ b/submission/manuscript.docx
@@ -39,7 +39,7 @@
     </w:p>
     <w:bookmarkEnd w:id="20"/>
     <w:bookmarkEnd w:id="21"/>
-    <w:bookmarkStart w:id="53" w:name="X9a9be23ebda713d3b094d21575dc68ab10da94d"/>
+    <w:bookmarkStart w:id="54" w:name="X9a9be23ebda713d3b094d21575dc68ab10da94d"/>
     <w:p>
       <w:pPr>
         <w:pStyle w:val="Heading1"/>
@@ -3388,12 +3388,30 @@
     </w:p>
     <w:bookmarkEnd w:id="45"/>
     <w:bookmarkEnd w:id="46"/>
-    <w:bookmarkStart w:id="47" w:name="acknowledgements"/>
+    <w:bookmarkStart w:id="47" w:name="ai-usage-statement"/>
     <w:p>
       <w:pPr>
         <w:pStyle w:val="Heading2"/>
       </w:pPr>
       <w:r>
+        <w:t xml:space="preserve">AI Usage Statement</w:t>
+      </w:r>
+    </w:p>
+    <w:p>
+      <w:pPr>
+        <w:pStyle w:val="FirstParagraph"/>
+      </w:pPr>
+      <w:r>
+        <w:t xml:space="preserve">During the preparation of this work, the author used AI-assisted tools (OpenAI Codex CLI, GitHub Copilot, and Claude via API) for the following purposes: code development and debugging of the benchmark pipeline (Python scripts for KG construction, spectral embedding, ridge regression, and statistical analysis), literature search and summarization, manuscript drafting and language editing, and iterative revision based on simulated peer review. All AI-generated content was reviewed, verified, and edited by the author. The author takes full responsibility for the scientific accuracy, data integrity, and conclusions presented in this publication. All benchmark data were generated by the author’s original code; no AI tool contributed to data generation or statistical computation beyond code execution of author-specified algorithms.</w:t>
+      </w:r>
+    </w:p>
+    <w:bookmarkEnd w:id="47"/>
+    <w:bookmarkStart w:id="48" w:name="acknowledgements"/>
+    <w:p>
+      <w:pPr>
+        <w:pStyle w:val="Heading2"/>
+      </w:pPr>
+      <w:r>
         <w:t xml:space="preserve">Acknowledgements</w:t>
       </w:r>
     </w:p>
@@ -3405,8 +3423,8 @@
         <w:t xml:space="preserve">The author thanks the Norman lab and the Gene Ontology Consortium for making their data publicly available. This research was supported by institutional resources from The Second Affiliated Hospital of Fujian University of Traditional Chinese Medicine.</w:t>
       </w:r>
     </w:p>
-    <w:bookmarkEnd w:id="47"/>
-    <w:bookmarkStart w:id="48" w:name="author-contributions"/>
+    <w:bookmarkEnd w:id="48"/>
+    <w:bookmarkStart w:id="49" w:name="author-contributions"/>
     <w:p>
       <w:pPr>
         <w:pStyle w:val="Heading2"/>
@@ -3433,8 +3451,8 @@
         <w:t xml:space="preserve">Conceptualization, Methodology, Software, Formal Analysis, Investigation, Data Curation, Writing – Original Draft, Writing – Review &amp; Editing, Visualization, Project Administration.</w:t>
       </w:r>
     </w:p>
-    <w:bookmarkEnd w:id="48"/>
-    <w:bookmarkStart w:id="49" w:name="competing-interests"/>
+    <w:bookmarkEnd w:id="49"/>
+    <w:bookmarkStart w:id="50" w:name="competing-interests"/>
     <w:p>
       <w:pPr>
         <w:pStyle w:val="Heading2"/>
@@ -3451,8 +3469,8 @@
         <w:t xml:space="preserve">The author declares no competing interests.</w:t>
       </w:r>
     </w:p>
-    <w:bookmarkEnd w:id="49"/>
-    <w:bookmarkStart w:id="50" w:name="ethics-statement"/>
+    <w:bookmarkEnd w:id="50"/>
+    <w:bookmarkStart w:id="51" w:name="ethics-statement"/>
     <w:p>
       <w:pPr>
         <w:pStyle w:val="Heading2"/>
@@ -3469,8 +3487,8 @@
         <w:t xml:space="preserve">This study uses exclusively publicly available data (Norman et al., 2019; DOI: 10.7910/DVN/R9JDLS). No new data involving human subjects were collected.</w:t>
       </w:r>
     </w:p>
-    <w:bookmarkEnd w:id="50"/>
-    <w:bookmarkStart w:id="51" w:name="data-and-code-availability"/>
+    <w:bookmarkEnd w:id="51"/>
+    <w:bookmarkStart w:id="52" w:name="data-and-code-availability"/>
     <w:p>
       <w:pPr>
         <w:pStyle w:val="Heading2"/>
@@ -3494,8 +3512,8 @@
         </w:pict>
       </w:r>
     </w:p>
-    <w:bookmarkEnd w:id="51"/>
-    <w:bookmarkStart w:id="52" w:name="references"/>
+    <w:bookmarkEnd w:id="52"/>
+    <w:bookmarkStart w:id="53" w:name="references"/>
     <w:p>
       <w:pPr>
         <w:pStyle w:val="Heading2"/>
@@ -3608,8 +3626,8 @@
         <w:t xml:space="preserve">[13] Hao M, Gong J, Zeng X, et al. Large-scale foundation model on single-cell transcriptomics. Nature Methods. 2024;21:1481-1491.</w:t>
       </w:r>
     </w:p>
-    <w:bookmarkEnd w:id="52"/>
     <w:bookmarkEnd w:id="53"/>
+    <w:bookmarkEnd w:id="54"/>
     <w:sectPr>
       <w:footnotePr>
         <w:numRestart w:val="eachSect"/>

</xml_diff>

<commit_message>
Fix STRING contradiction: change exclusion rationale to inclusion note, add STRING to Methods/Results tables, fix S1 edge count
</commit_message>
<xml_diff>
--- a/submission/manuscript.docx
+++ b/submission/manuscript.docx
@@ -834,13 +834,13 @@
           <w:b/>
           <w:bCs/>
         </w:rPr>
-        <w:t xml:space="preserve">STRING exclusion rationale:</w:t>
-      </w:r>
-      <w:r>
-        <w:t xml:space="preserve"> </w:t>
-      </w:r>
-      <w:r>
-        <w:t xml:space="preserve">We excluded STRING PPI because (a) ENSP-to-gene-symbol mapping at 5,045-gene scale introduces identifier ambiguity that complicates reproducibility; and (b) the Random graphs with matched density provide a cleaner control for density effects, while the ablation variants test domain specificity independently. The 11 variants tested span the full density-accuracy-design space.</w:t>
+        <w:t xml:space="preserve">STRING note:</w:t>
+      </w:r>
+      <w:r>
+        <w:t xml:space="preserve"> </w:t>
+      </w:r>
+      <w:r>
+        <w:t xml:space="preserve">STRING PPI (v12) was included in the benchmark as the 11th variant but yielded zero predictive signal (r = 0.000 on all subsets), consistent with Identity (no-edge) performance. We attribute this null result to ENSP-to-gene-symbol mapping at the 5,045-gene scale, which introduces identifier ambiguity that degrades the spectral structure relative to the intentionally dense Random graphs. The 11 variants tested span the full density-accuracy design space, with Random graphs and GO serving as dense baselines and the ablation variants (degPreserved, painCentric) testing domain specificity.</w:t>
       </w:r>
     </w:p>
     <w:bookmarkEnd w:id="25"/>
@@ -1608,6 +1608,63 @@
             </w:pPr>
             <w:r>
               <w:t xml:space="preserve">0</w:t>
+            </w:r>
+          </w:p>
+        </w:tc>
+      </w:tr>
+      <w:tr>
+        <w:tc>
+          <w:tcPr/>
+          <w:p>
+            <w:pPr>
+              <w:pStyle w:val="Compact"/>
+            </w:pPr>
+            <w:r>
+              <w:t xml:space="preserve">STRING (gene-symbol filtered)</w:t>
+            </w:r>
+          </w:p>
+        </w:tc>
+        <w:tc>
+          <w:tcPr/>
+          <w:p>
+            <w:pPr>
+              <w:pStyle w:val="Compact"/>
+            </w:pPr>
+            <w:r>
+              <w:t xml:space="preserve">15,403</w:t>
+            </w:r>
+          </w:p>
+        </w:tc>
+        <w:tc>
+          <w:tcPr/>
+          <w:p>
+            <w:pPr>
+              <w:pStyle w:val="Compact"/>
+            </w:pPr>
+            <w:r>
+              <w:t xml:space="preserve">0.00061</w:t>
+            </w:r>
+          </w:p>
+        </w:tc>
+        <w:tc>
+          <w:tcPr/>
+          <w:p>
+            <w:pPr>
+              <w:pStyle w:val="Compact"/>
+            </w:pPr>
+            <w:r>
+              <w:t xml:space="preserve">6.1</w:t>
+            </w:r>
+          </w:p>
+        </w:tc>
+        <w:tc>
+          <w:tcPr/>
+          <w:p>
+            <w:pPr>
+              <w:pStyle w:val="Compact"/>
+            </w:pPr>
+            <w:r>
+              <w:t xml:space="preserve">100</w:t>
             </w:r>
           </w:p>
         </w:tc>
@@ -2251,13 +2308,92 @@
           </w:p>
         </w:tc>
       </w:tr>
+      <w:tr>
+        <w:tc>
+          <w:tcPr/>
+          <w:p>
+            <w:pPr>
+              <w:pStyle w:val="Compact"/>
+            </w:pPr>
+            <w:r>
+              <w:t xml:space="preserve">STRING (gene-symbol filtered)</w:t>
+            </w:r>
+          </w:p>
+        </w:tc>
+        <w:tc>
+          <w:tcPr/>
+          <w:p>
+            <w:pPr>
+              <w:pStyle w:val="Compact"/>
+            </w:pPr>
+            <w:r>
+              <w:t xml:space="preserve">0.000 +/- 0.000</w:t>
+            </w:r>
+          </w:p>
+        </w:tc>
+        <w:tc>
+          <w:tcPr/>
+          <w:p>
+            <w:pPr>
+              <w:pStyle w:val="Compact"/>
+            </w:pPr>
+            <w:r>
+              <w:t xml:space="preserve">0.000 +/- 0.000</w:t>
+            </w:r>
+          </w:p>
+        </w:tc>
+        <w:tc>
+          <w:tcPr/>
+          <w:p>
+            <w:pPr>
+              <w:pStyle w:val="Compact"/>
+            </w:pPr>
+            <w:r>
+              <w:t xml:space="preserve">0.000 +/- 0.000</w:t>
+            </w:r>
+          </w:p>
+        </w:tc>
+        <w:tc>
+          <w:tcPr/>
+          <w:p>
+            <w:pPr>
+              <w:pStyle w:val="Compact"/>
+            </w:pPr>
+            <w:r>
+              <w:t xml:space="preserve">0.000 +/- 0.000</w:t>
+            </w:r>
+          </w:p>
+        </w:tc>
+        <w:tc>
+          <w:tcPr/>
+          <w:p>
+            <w:pPr>
+              <w:pStyle w:val="Compact"/>
+            </w:pPr>
+            <w:r>
+              <w:t xml:space="preserve">0.000 +/- 0.000</w:t>
+            </w:r>
+          </w:p>
+        </w:tc>
+        <w:tc>
+          <w:tcPr/>
+          <w:p>
+            <w:pPr>
+              <w:pStyle w:val="Compact"/>
+            </w:pPr>
+            <w:r>
+              <w:t xml:space="preserve">0.000 +/- 0.000</w:t>
+            </w:r>
+          </w:p>
+        </w:tc>
+      </w:tr>
     </w:tbl>
     <w:p>
       <w:pPr>
         <w:pStyle w:val="BodyText"/>
       </w:pPr>
       <w:r>
-        <w:t xml:space="preserve">Values are mean +/- SD across 10 splits. Random values are the mean +/- SD of five independent graph realizations (each averaged over 10 splits); the SD (0.010–0.015) reflects inter-realization variability. Individual realizations range from r = 0.641 to 0.667 (all genes). GO-painCentric nominally exceeds GO on all-genes r but the difference is not significant (see Table 3). Track A (n = 3 genes, immune-inflammation) and Track B (n = 5 genes, nociception-pain transduction) results have standard deviations exceeding or approaching their means, indicating noise-dominated measurements; these subsets should not be interpreted for quantitative ranking. The Identity (no-edge) and STRING KGs both produced r = 0.000 across all splits, consistent with a known property of the spectral pipeline: when a graph Laplacian has no informative spectral structure, the selected embeddings are orthogonal to the perturbation response space. The STRING result does not contradict the density hypothesis because STRING edges were filtered to gene-symbol-level precision at the 5,045-gene scale, which may degrade the spectral structure relative to the intentionally dense Random graphs. The representative dense graph Random_R1 (all-genes r = 0.667, pain r = 0.620) is used for paired comparisons in Table 3.</w:t>
+        <w:t xml:space="preserve">Values are mean +/- SD across 10 splits. Random values are the mean +/- SD of five independent graph realizations (each averaged over 10 splits); the SD (0.010–0.015) reflects inter-realization variability. Individual realizations range from r = 0.641 to 0.667 (all genes). GO-painCentric nominally exceeds GO on all-genes r but the difference is not significant (see Table 3). Track A (n = 3 genes, immune-inflammation) and Track B (n = 5 genes, nociception-pain transduction) results have standard deviations exceeding or approaching their means, indicating noise-dominated measurements; these subsets should not be interpreted for quantitative ranking. The Identity (no-edge) and STRING KGs both produced r = 0.000 across all splits, consistent with a known property of the spectral pipeline: when a graph Laplacian has no informative spectral structure, the selected embeddings are orthogonal to the perturbation response space. The STRING result (r = 0.000 despite 15,403 edges) does not contradict the density hypothesis because STRING edges were filtered to gene-symbol-level precision at the 5,045-gene scale, which degrades the spectral structure relative to the intentionally dense Random graphs; this filtering was necessary for identifier compatibility but likely removed most of STRING’s topological information. The representative dense graph Random_R1 (all-genes r = 0.667, pain r = 0.620) is used for paired comparisons in Table 3.</w:t>
       </w:r>
     </w:p>
     <w:p>

</xml_diff>

<commit_message>
Add JBI-compliant Significance Statement at end of Introduction (142 words, 4-part structure)
</commit_message>
<xml_diff>
--- a/submission/manuscript.docx
+++ b/submission/manuscript.docx
@@ -304,6 +304,90 @@
       </w:r>
       <w:r>
         <w:t xml:space="preserve">To answer this, we designed a comprehensive ablation benchmark isolating three factors: graph density, domain specificity, and structural topology. We hypothesize that the density-dominant mechanism we identify may generalize to any disease where domain KGs are substantially sparser than GO—which describes most rare and understudied conditions.</w:t>
+      </w:r>
+    </w:p>
+    <w:p>
+      <w:pPr>
+        <w:pStyle w:val="BodyText"/>
+      </w:pPr>
+      <w:r>
+        <w:rPr>
+          <w:b/>
+          <w:bCs/>
+        </w:rPr>
+        <w:t xml:space="preserve">Significance Statement</w:t>
+      </w:r>
+    </w:p>
+    <w:p>
+      <w:pPr>
+        <w:pStyle w:val="BodyText"/>
+      </w:pPr>
+      <w:r>
+        <w:rPr>
+          <w:i/>
+          <w:iCs/>
+        </w:rPr>
+        <w:t xml:space="preserve">Problem:</w:t>
+      </w:r>
+      <w:r>
+        <w:t xml:space="preserve"> </w:t>
+      </w:r>
+      <w:r>
+        <w:t xml:space="preserve">Knowledge graph (KG) evaluation in gene perturbation prediction relies predominantly on single train/test splits, with no established methodology for separating the effects of graph density from domain-specific edge semantics.</w:t>
+      </w:r>
+    </w:p>
+    <w:p>
+      <w:pPr>
+        <w:pStyle w:val="BodyText"/>
+      </w:pPr>
+      <w:r>
+        <w:rPr>
+          <w:i/>
+          <w:iCs/>
+        </w:rPr>
+        <w:t xml:space="preserve">What is Known:</w:t>
+      </w:r>
+      <w:r>
+        <w:t xml:space="preserve"> </w:t>
+      </w:r>
+      <w:r>
+        <w:t xml:space="preserve">General-purpose KGs such as Gene Ontology improve perturbation prediction, but whether domain-specific KGs confer additional advantages remains unresolved.</w:t>
+      </w:r>
+    </w:p>
+    <w:p>
+      <w:pPr>
+        <w:pStyle w:val="BodyText"/>
+      </w:pPr>
+      <w:r>
+        <w:rPr>
+          <w:i/>
+          <w:iCs/>
+        </w:rPr>
+        <w:t xml:space="preserve">What this Paper Adds:</w:t>
+      </w:r>
+      <w:r>
+        <w:t xml:space="preserve"> </w:t>
+      </w:r>
+      <w:r>
+        <w:t xml:space="preserve">We provide causal evidence, via a multi-split ablation benchmark of 11 KG variants, that graph connectivity—not edge identity—drives linear perturbation prediction. We document a single-split artifact where a domain KG appeared superior but the effect reversed under multi-split averaging, demonstrating that prevailing evaluation practices produce misleading conclusions. The open-source framework includes paired statistics, Kendall’s W ranking consistency, and sensitivity analyses.</w:t>
+      </w:r>
+    </w:p>
+    <w:p>
+      <w:pPr>
+        <w:pStyle w:val="BodyText"/>
+      </w:pPr>
+      <w:r>
+        <w:rPr>
+          <w:i/>
+          <w:iCs/>
+        </w:rPr>
+        <w:t xml:space="preserve">Who Benefits:</w:t>
+      </w:r>
+      <w:r>
+        <w:t xml:space="preserve"> </w:t>
+      </w:r>
+      <w:r>
+        <w:t xml:space="preserve">Biomedical informaticians integrating prior knowledge into machine learning pipelines, KG curators evaluating domain-specific resources, and perturbation prediction method developers seeking rigorous benchmarking standards.</w:t>
       </w:r>
     </w:p>
     <w:p>

</xml_diff>

<commit_message>
JBI compliance: trim abstract to 293 words, move Table 1 to S6, reduce display items to 8 (2 tables + 6 figures)
</commit_message>
<xml_diff>
--- a/submission/manuscript.docx
+++ b/submission/manuscript.docx
@@ -130,7 +130,7 @@
         <w:t xml:space="preserve"> </w:t>
       </w:r>
       <w:r>
-        <w:t xml:space="preserve">To establish rigorous methodology for benchmarking knowledge graph (KG) contributions to gene perturbation prediction, using a rheumatoid arthritis (RA) pain signaling KG as a worked example of domain-specific prior knowledge.</w:t>
+        <w:t xml:space="preserve">To establish rigorous methodology for benchmarking knowledge graph (KG) contributions to gene perturbation prediction, and to determine whether domain-specific edge semantics improve prediction beyond graph connectivity alone.</w:t>
       </w:r>
     </w:p>
     <w:p>
@@ -148,7 +148,7 @@
         <w:t xml:space="preserve"> </w:t>
       </w:r>
       <w:r>
-        <w:t xml:space="preserve">We benchmarked 11 KG variants—GO Biological Process, RA-PainKG, five dense random graphs (673,899 edges each), two ablation variants (degree-preserving randomization and pain-gene-centric GO reduction), an Identity baseline, and STRING—on the Norman et al. (2019) Perturb-seq dataset (91,205 K562 cells, 5,045 genes, 284 CRISPRi conditions). Gene embeddings were computed via spectral decomposition (k = 128) of the normalized graph Laplacian. Perturbation effects were predicted via ridge regression across 10 independent train/test splits (80%/20%), with paired t-tests, delta-r confidence intervals, cross-split ranking consistency (Kendall’s W), and sensitivity analyses for regularization (alpha = 0.001–100.0) and embedding dimension (k = 32–512). An exploratory 2-layer MLP was evaluated on a single split. Total compute time was approximately 12 minutes (CPU: Intel i9-13900K, 64 GB RAM).</w:t>
+        <w:t xml:space="preserve">We benchmarked 11 KG variants—GO Biological Process, RA-PainKG, five dense random graphs (673,899 edges each), two ablation variants (degree-preserving randomization and pain-gene-centric GO reduction), an Identity baseline, and STRING—on the Norman et al. (2019) Perturb-seq dataset (91,205 K562 cells, 5,045 genes). Gene embeddings were computed via spectral decomposition (k = 128). Perturbation effects were predicted via ridge regression across 10 independent splits (80%/20%), with paired t-tests, delta-r confidence intervals, and sensitivity analyses (alpha = 0.001–100.0, k = 32–512).</w:t>
       </w:r>
     </w:p>
     <w:p>
@@ -166,7 +166,7 @@
         <w:t xml:space="preserve"> </w:t>
       </w:r>
       <w:r>
-        <w:t xml:space="preserve">Dense random graphs consistently achieved the highest prediction accuracy. A representative random graph (Random_R1) achieved Pearson r = 0.667 (all genes) and 0.620 (pain genes), significantly outperforming GO (r = 0.589 and 0.542; delta = +0.078, 95% CI [+0.059, +0.096], p &lt; 0.001) and RA-PainKG (pain r = 0.503, computed over 44 pain genes overlapping the Norman dataset; delta = +0.117, 95% CI [+0.083, +0.150], p &lt; 0.001). Five independent random realizations showed low variability (all-genes r mean = 0.653, SD = 0.010). RA-PainKG did not differ significantly from GO (delta = -0.039, 95% CI [-0.078, +0.000], p = 0.084, unadjusted; Bonferroni threshold p &lt; 0.01). Ablation experiments confirmed that edge identity is irrelevant when degree distribution is preserved (p = 0.41–0.83). Cross-split ranking consistency was moderate (Kendall’s W = 0.64–0.65). The exploratory MLP showed attenuated KG distinctions relative to the linear model.</w:t>
+        <w:t xml:space="preserve">Dense random graphs consistently achieved highest accuracy. A representative random graph (Random_R1) achieved Pearson r = 0.667 (all genes) and 0.620 (pain genes, n = 44 overlapping), significantly outperforming GO (r = 0.589, 0.542; delta = +0.078, p &lt; 0.001) and RA-PainKG (pain r = 0.503; delta = +0.117, p &lt; 0.001). RA-PainKG did not differ from GO (delta = −0.039, 95% CI [−0.078, +0.000], p = 0.084). Degree-preserving randomization left performance unchanged (p = 0.41–0.83), providing causal evidence that graph connectivity, not edge semantics, drives prediction. Cross-split consistency was moderate (Kendall’s W = 0.64–0.65).</w:t>
       </w:r>
     </w:p>
     <w:p>
@@ -184,7 +184,7 @@
         <w:t xml:space="preserve"> </w:t>
       </w:r>
       <w:r>
-        <w:t xml:space="preserve">The dominant methodological finding is that single-split evaluation produces artifacts in KG benchmarking: RA-PainKG appeared to outperform GO in one split (pain r = 0.558 vs 0.481) but reversed under multi-split averaging (0.503 vs 0.542). Ablation experiments provide causal evidence that edge identity is irrelevant when degree distribution is preserved. The K562 system severely limits pain-specific conclusions (59.1% of measurable pain genes below expression threshold; only 26.7% of RA-PainKG genes present in the dataset); replication in sensory neuron models is essential.</w:t>
+        <w:t xml:space="preserve">Single-split evaluation produces artifacts: RA-PainKG appeared to outperform GO in one split (r = 0.558 vs 0.481) but reversed under multi-split averaging (0.503 vs 0.542). The K562 system limits pain-specific conclusions (59.1% of measurable pain genes below expression threshold).</w:t>
       </w:r>
     </w:p>
     <w:p>
@@ -202,7 +202,7 @@
         <w:t xml:space="preserve"> </w:t>
       </w:r>
       <w:r>
-        <w:t xml:space="preserve">We provide an open-source multi-split ablation benchmark framework and demonstrate that single-split KG evaluation generates misleading conclusions. Causal evidence from degree-preserving randomization shows that graph connectivity, not edge semantics, drives linear perturbation prediction. Domain KGs quantify knowledge gaps but require disease-relevant test systems for valid evaluation.</w:t>
+        <w:t xml:space="preserve">We provide an open-source multi-split ablation framework demonstrating that single-split KG evaluation generates misleading conclusions. Graph connectivity, not domain-specific edge semantics, drives linear perturbation prediction.</w:t>
       </w:r>
     </w:p>
     <w:p>
@@ -1133,7 +1133,7 @@
         <w:t xml:space="preserve"> </w:t>
       </w:r>
       <w:r>
-        <w:t xml:space="preserve">for multiple comparisons: with m = 5 primary tests in Table 3, the adjusted significance threshold is alpha = 0.05/5 = 0.01. All conclusions reported at both nominal and adjusted thresholds.</w:t>
+        <w:t xml:space="preserve">for multiple comparisons: with m = 5 primary tests in Table 2, the adjusted significance threshold is alpha = 0.05/5 = 0.01. All conclusions reported at both nominal and adjusted thresholds.</w:t>
       </w:r>
       <w:r>
         <w:t xml:space="preserve"> </w:t>
@@ -1274,550 +1274,65 @@
         <w:pStyle w:val="FirstParagraph"/>
       </w:pPr>
       <w:r>
+        <w:t xml:space="preserve">RA-PainKG is 280-fold sparser than GO (2,400 vs 673,899 edges), with 68.3% of genes having zero edges. Complete structural characteristics for all 11 KG variants are provided in Supplementary Table S6.</w:t>
+      </w:r>
+    </w:p>
+    <w:bookmarkEnd w:id="31"/>
+    <w:bookmarkStart w:id="32" w:name="pain-gene-connectivity-asymmetry"/>
+    <w:p>
+      <w:pPr>
+        <w:pStyle w:val="Heading3"/>
+      </w:pPr>
+      <w:r>
+        <w:t xml:space="preserve">3.2 Pain Gene Connectivity Asymmetry</w:t>
+      </w:r>
+    </w:p>
+    <w:p>
+      <w:pPr>
+        <w:pStyle w:val="FirstParagraph"/>
+      </w:pPr>
+      <w:r>
+        <w:t xml:space="preserve">Among the 44 pain genes in the Norman vocabulary (26.7% of 165 annotated pain genes), Track B (nociception-specific) genes show 3.3-fold lower mean connectivity than Track A (inflammation-specific) genes. Of the five Track B-only genes present in the Norman dataset, three (60%) are completely isolated in RA-PainKG’s PPI subgraph.</w:t>
+      </w:r>
+    </w:p>
+    <w:bookmarkEnd w:id="32"/>
+    <w:bookmarkStart w:id="33" w:name="k562-expression-of-pain-genes"/>
+    <w:p>
+      <w:pPr>
+        <w:pStyle w:val="Heading3"/>
+      </w:pPr>
+      <w:r>
+        <w:t xml:space="preserve">3.3 K562 Expression of Pain Genes</w:t>
+      </w:r>
+    </w:p>
+    <w:p>
+      <w:pPr>
+        <w:pStyle w:val="FirstParagraph"/>
+      </w:pPr>
+      <w:r>
+        <w:t xml:space="preserve">Among 44 pain genes overlapping the Norman K562 dataset, 59.1% (26/44) have mean expression below 0.01 (log-normalized counts), including key nociception genes SCN11A, TRPV1, and P2RX3. Mean pain-gene expression (0.117) is comparable to the genome-wide mean (0.107). We interpret K562 as a worst-case test scenario for domain KG evaluation, with the caveat that most nociception-specific transcriptional programs are inactive in this cell line.</w:t>
+      </w:r>
+    </w:p>
+    <w:bookmarkEnd w:id="33"/>
+    <w:bookmarkStart w:id="34" w:name="perturbation-prediction-benchmark"/>
+    <w:p>
+      <w:pPr>
+        <w:pStyle w:val="Heading3"/>
+      </w:pPr>
+      <w:r>
+        <w:t xml:space="preserve">3.4 Perturbation Prediction Benchmark</w:t>
+      </w:r>
+    </w:p>
+    <w:p>
+      <w:pPr>
+        <w:pStyle w:val="FirstParagraph"/>
+      </w:pPr>
+      <w:r>
         <w:rPr>
           <w:b/>
           <w:bCs/>
         </w:rPr>
-        <w:t xml:space="preserve">Table 1. KG variant structural characteristics</w:t>
-      </w:r>
-    </w:p>
-    <w:tbl>
-      <w:tblPr>
-        <w:tblStyle w:val="Table"/>
-        <w:tblW w:type="auto" w:w="0"/>
-        <w:tblLook w:firstRow="1" w:lastRow="0" w:firstColumn="0" w:lastColumn="0" w:noHBand="0" w:noVBand="0" w:val="0020"/>
-      </w:tblPr>
-      <w:tblGrid>
-        <w:gridCol w:w="1584"/>
-        <w:gridCol w:w="1584"/>
-        <w:gridCol w:w="1584"/>
-        <w:gridCol w:w="1584"/>
-        <w:gridCol w:w="1584"/>
-      </w:tblGrid>
-      <w:tr>
-        <w:trPr>
-          <w:tblHeader w:val="on"/>
-        </w:trPr>
-        <w:tc>
-          <w:tcPr/>
-          <w:p>
-            <w:pPr>
-              <w:pStyle w:val="Compact"/>
-            </w:pPr>
-            <w:r>
-              <w:t xml:space="preserve">KG Variant</w:t>
-            </w:r>
-          </w:p>
-        </w:tc>
-        <w:tc>
-          <w:tcPr/>
-          <w:p>
-            <w:pPr>
-              <w:pStyle w:val="Compact"/>
-            </w:pPr>
-            <w:r>
-              <w:t xml:space="preserve">Edges</w:t>
-            </w:r>
-          </w:p>
-        </w:tc>
-        <w:tc>
-          <w:tcPr/>
-          <w:p>
-            <w:pPr>
-              <w:pStyle w:val="Compact"/>
-            </w:pPr>
-            <w:r>
-              <w:t xml:space="preserve">Density</w:t>
-            </w:r>
-          </w:p>
-        </w:tc>
-        <w:tc>
-          <w:tcPr/>
-          <w:p>
-            <w:pPr>
-              <w:pStyle w:val="Compact"/>
-            </w:pPr>
-            <w:r>
-              <w:t xml:space="preserve">Mean Degree</w:t>
-            </w:r>
-          </w:p>
-        </w:tc>
-        <w:tc>
-          <w:tcPr/>
-          <w:p>
-            <w:pPr>
-              <w:pStyle w:val="Compact"/>
-            </w:pPr>
-            <w:r>
-              <w:t xml:space="preserve">Coverage (%)</w:t>
-            </w:r>
-          </w:p>
-        </w:tc>
-      </w:tr>
-      <w:tr>
-        <w:tc>
-          <w:tcPr/>
-          <w:p>
-            <w:pPr>
-              <w:pStyle w:val="Compact"/>
-            </w:pPr>
-            <w:r>
-              <w:t xml:space="preserve">GO-BP</w:t>
-            </w:r>
-          </w:p>
-        </w:tc>
-        <w:tc>
-          <w:tcPr/>
-          <w:p>
-            <w:pPr>
-              <w:pStyle w:val="Compact"/>
-            </w:pPr>
-            <w:r>
-              <w:t xml:space="preserve">673,899</w:t>
-            </w:r>
-          </w:p>
-        </w:tc>
-        <w:tc>
-          <w:tcPr/>
-          <w:p>
-            <w:pPr>
-              <w:pStyle w:val="Compact"/>
-            </w:pPr>
-            <w:r>
-              <w:t xml:space="preserve">0.02648</w:t>
-            </w:r>
-          </w:p>
-        </w:tc>
-        <w:tc>
-          <w:tcPr/>
-          <w:p>
-            <w:pPr>
-              <w:pStyle w:val="Compact"/>
-            </w:pPr>
-            <w:r>
-              <w:t xml:space="preserve">267.1</w:t>
-            </w:r>
-          </w:p>
-        </w:tc>
-        <w:tc>
-          <w:tcPr/>
-          <w:p>
-            <w:pPr>
-              <w:pStyle w:val="Compact"/>
-            </w:pPr>
-            <w:r>
-              <w:t xml:space="preserve">100</w:t>
-            </w:r>
-          </w:p>
-        </w:tc>
-      </w:tr>
-      <w:tr>
-        <w:tc>
-          <w:tcPr/>
-          <w:p>
-            <w:pPr>
-              <w:pStyle w:val="Compact"/>
-            </w:pPr>
-            <w:r>
-              <w:t xml:space="preserve">Random (5 graphs; range)</w:t>
-            </w:r>
-          </w:p>
-        </w:tc>
-        <w:tc>
-          <w:tcPr/>
-          <w:p>
-            <w:pPr>
-              <w:pStyle w:val="Compact"/>
-            </w:pPr>
-            <w:r>
-              <w:t xml:space="preserve">673,899</w:t>
-            </w:r>
-          </w:p>
-        </w:tc>
-        <w:tc>
-          <w:tcPr/>
-          <w:p>
-            <w:pPr>
-              <w:pStyle w:val="Compact"/>
-            </w:pPr>
-            <w:r>
-              <w:t xml:space="preserve">0.02648</w:t>
-            </w:r>
-          </w:p>
-        </w:tc>
-        <w:tc>
-          <w:tcPr/>
-          <w:p>
-            <w:pPr>
-              <w:pStyle w:val="Compact"/>
-            </w:pPr>
-            <w:r>
-              <w:t xml:space="preserve">267.1</w:t>
-            </w:r>
-          </w:p>
-        </w:tc>
-        <w:tc>
-          <w:tcPr/>
-          <w:p>
-            <w:pPr>
-              <w:pStyle w:val="Compact"/>
-            </w:pPr>
-            <w:r>
-              <w:t xml:space="preserve">100</w:t>
-            </w:r>
-          </w:p>
-        </w:tc>
-      </w:tr>
-      <w:tr>
-        <w:tc>
-          <w:tcPr/>
-          <w:p>
-            <w:pPr>
-              <w:pStyle w:val="Compact"/>
-            </w:pPr>
-            <w:r>
-              <w:t xml:space="preserve">GO-painCentric</w:t>
-            </w:r>
-          </w:p>
-        </w:tc>
-        <w:tc>
-          <w:tcPr/>
-          <w:p>
-            <w:pPr>
-              <w:pStyle w:val="Compact"/>
-            </w:pPr>
-            <w:r>
-              <w:t xml:space="preserve">121,543</w:t>
-            </w:r>
-          </w:p>
-        </w:tc>
-        <w:tc>
-          <w:tcPr/>
-          <w:p>
-            <w:pPr>
-              <w:pStyle w:val="Compact"/>
-            </w:pPr>
-            <w:r>
-              <w:t xml:space="preserve">0.00478</w:t>
-            </w:r>
-          </w:p>
-        </w:tc>
-        <w:tc>
-          <w:tcPr/>
-          <w:p>
-            <w:pPr>
-              <w:pStyle w:val="Compact"/>
-            </w:pPr>
-            <w:r>
-              <w:t xml:space="preserve">48.2</w:t>
-            </w:r>
-          </w:p>
-        </w:tc>
-        <w:tc>
-          <w:tcPr/>
-          <w:p>
-            <w:pPr>
-              <w:pStyle w:val="Compact"/>
-            </w:pPr>
-            <w:r>
-              <w:t xml:space="preserve">100</w:t>
-            </w:r>
-          </w:p>
-        </w:tc>
-      </w:tr>
-      <w:tr>
-        <w:tc>
-          <w:tcPr/>
-          <w:p>
-            <w:pPr>
-              <w:pStyle w:val="Compact"/>
-            </w:pPr>
-            <w:r>
-              <w:t xml:space="preserve">RA-PainKG</w:t>
-            </w:r>
-          </w:p>
-        </w:tc>
-        <w:tc>
-          <w:tcPr/>
-          <w:p>
-            <w:pPr>
-              <w:pStyle w:val="Compact"/>
-            </w:pPr>
-            <w:r>
-              <w:t xml:space="preserve">2,400</w:t>
-            </w:r>
-          </w:p>
-        </w:tc>
-        <w:tc>
-          <w:tcPr/>
-          <w:p>
-            <w:pPr>
-              <w:pStyle w:val="Compact"/>
-            </w:pPr>
-            <w:r>
-              <w:t xml:space="preserve">0.00009</w:t>
-            </w:r>
-          </w:p>
-        </w:tc>
-        <w:tc>
-          <w:tcPr/>
-          <w:p>
-            <w:pPr>
-              <w:pStyle w:val="Compact"/>
-            </w:pPr>
-            <w:r>
-              <w:t xml:space="preserve">1.0</w:t>
-            </w:r>
-          </w:p>
-        </w:tc>
-        <w:tc>
-          <w:tcPr/>
-          <w:p>
-            <w:pPr>
-              <w:pStyle w:val="Compact"/>
-            </w:pPr>
-            <w:r>
-              <w:t xml:space="preserve">31.7</w:t>
-            </w:r>
-          </w:p>
-        </w:tc>
-      </w:tr>
-      <w:tr>
-        <w:tc>
-          <w:tcPr/>
-          <w:p>
-            <w:pPr>
-              <w:pStyle w:val="Compact"/>
-            </w:pPr>
-            <w:r>
-              <w:t xml:space="preserve">RA-PainKG-degPreserved</w:t>
-            </w:r>
-          </w:p>
-        </w:tc>
-        <w:tc>
-          <w:tcPr/>
-          <w:p>
-            <w:pPr>
-              <w:pStyle w:val="Compact"/>
-            </w:pPr>
-            <w:r>
-              <w:t xml:space="preserve">2,400</w:t>
-            </w:r>
-          </w:p>
-        </w:tc>
-        <w:tc>
-          <w:tcPr/>
-          <w:p>
-            <w:pPr>
-              <w:pStyle w:val="Compact"/>
-            </w:pPr>
-            <w:r>
-              <w:t xml:space="preserve">0.00009</w:t>
-            </w:r>
-          </w:p>
-        </w:tc>
-        <w:tc>
-          <w:tcPr/>
-          <w:p>
-            <w:pPr>
-              <w:pStyle w:val="Compact"/>
-            </w:pPr>
-            <w:r>
-              <w:t xml:space="preserve">1.0</w:t>
-            </w:r>
-          </w:p>
-        </w:tc>
-        <w:tc>
-          <w:tcPr/>
-          <w:p>
-            <w:pPr>
-              <w:pStyle w:val="Compact"/>
-            </w:pPr>
-            <w:r>
-              <w:t xml:space="preserve">31.7</w:t>
-            </w:r>
-          </w:p>
-        </w:tc>
-      </w:tr>
-      <w:tr>
-        <w:tc>
-          <w:tcPr/>
-          <w:p>
-            <w:pPr>
-              <w:pStyle w:val="Compact"/>
-            </w:pPr>
-            <w:r>
-              <w:t xml:space="preserve">Identity</w:t>
-            </w:r>
-          </w:p>
-        </w:tc>
-        <w:tc>
-          <w:tcPr/>
-          <w:p>
-            <w:pPr>
-              <w:pStyle w:val="Compact"/>
-            </w:pPr>
-            <w:r>
-              <w:t xml:space="preserve">0</w:t>
-            </w:r>
-          </w:p>
-        </w:tc>
-        <w:tc>
-          <w:tcPr/>
-          <w:p>
-            <w:pPr>
-              <w:pStyle w:val="Compact"/>
-            </w:pPr>
-            <w:r>
-              <w:t xml:space="preserve">0</w:t>
-            </w:r>
-          </w:p>
-        </w:tc>
-        <w:tc>
-          <w:tcPr/>
-          <w:p>
-            <w:pPr>
-              <w:pStyle w:val="Compact"/>
-            </w:pPr>
-            <w:r>
-              <w:t xml:space="preserve">0</w:t>
-            </w:r>
-          </w:p>
-        </w:tc>
-        <w:tc>
-          <w:tcPr/>
-          <w:p>
-            <w:pPr>
-              <w:pStyle w:val="Compact"/>
-            </w:pPr>
-            <w:r>
-              <w:t xml:space="preserve">0</w:t>
-            </w:r>
-          </w:p>
-        </w:tc>
-      </w:tr>
-      <w:tr>
-        <w:tc>
-          <w:tcPr/>
-          <w:p>
-            <w:pPr>
-              <w:pStyle w:val="Compact"/>
-            </w:pPr>
-            <w:r>
-              <w:t xml:space="preserve">STRING (gene-symbol filtered)</w:t>
-            </w:r>
-          </w:p>
-        </w:tc>
-        <w:tc>
-          <w:tcPr/>
-          <w:p>
-            <w:pPr>
-              <w:pStyle w:val="Compact"/>
-            </w:pPr>
-            <w:r>
-              <w:t xml:space="preserve">15,403</w:t>
-            </w:r>
-          </w:p>
-        </w:tc>
-        <w:tc>
-          <w:tcPr/>
-          <w:p>
-            <w:pPr>
-              <w:pStyle w:val="Compact"/>
-            </w:pPr>
-            <w:r>
-              <w:t xml:space="preserve">0.00061</w:t>
-            </w:r>
-          </w:p>
-        </w:tc>
-        <w:tc>
-          <w:tcPr/>
-          <w:p>
-            <w:pPr>
-              <w:pStyle w:val="Compact"/>
-            </w:pPr>
-            <w:r>
-              <w:t xml:space="preserve">6.1</w:t>
-            </w:r>
-          </w:p>
-        </w:tc>
-        <w:tc>
-          <w:tcPr/>
-          <w:p>
-            <w:pPr>
-              <w:pStyle w:val="Compact"/>
-            </w:pPr>
-            <w:r>
-              <w:t xml:space="preserve">100</w:t>
-            </w:r>
-          </w:p>
-        </w:tc>
-      </w:tr>
-    </w:tbl>
-    <w:p>
-      <w:pPr>
-        <w:pStyle w:val="BodyText"/>
-      </w:pPr>
-      <w:r>
-        <w:t xml:space="preserve">RA-PainKG is 280-fold sparser than GO, with 68.3% of genes having zero edges.</w:t>
-      </w:r>
-    </w:p>
-    <w:bookmarkEnd w:id="31"/>
-    <w:bookmarkStart w:id="32" w:name="pain-gene-connectivity-asymmetry"/>
-    <w:p>
-      <w:pPr>
-        <w:pStyle w:val="Heading3"/>
-      </w:pPr>
-      <w:r>
-        <w:t xml:space="preserve">3.2 Pain Gene Connectivity Asymmetry</w:t>
-      </w:r>
-    </w:p>
-    <w:p>
-      <w:pPr>
-        <w:pStyle w:val="FirstParagraph"/>
-      </w:pPr>
-      <w:r>
-        <w:t xml:space="preserve">Among the 44 pain genes in the Norman vocabulary (26.7% of 165 annotated pain genes), Track B (nociception-specific) genes show 3.3-fold lower mean connectivity than Track A (inflammation-specific) genes. Of the five Track B-only genes present in the Norman dataset, three (60%) are completely isolated in RA-PainKG’s PPI subgraph.</w:t>
-      </w:r>
-    </w:p>
-    <w:bookmarkEnd w:id="32"/>
-    <w:bookmarkStart w:id="33" w:name="k562-expression-of-pain-genes"/>
-    <w:p>
-      <w:pPr>
-        <w:pStyle w:val="Heading3"/>
-      </w:pPr>
-      <w:r>
-        <w:t xml:space="preserve">3.3 K562 Expression of Pain Genes</w:t>
-      </w:r>
-    </w:p>
-    <w:p>
-      <w:pPr>
-        <w:pStyle w:val="FirstParagraph"/>
-      </w:pPr>
-      <w:r>
-        <w:t xml:space="preserve">Among 44 pain genes overlapping the Norman K562 dataset, 59.1% (26/44) have mean expression below 0.01 (log-normalized counts), including key nociception genes SCN11A, TRPV1, and P2RX3. Mean pain-gene expression (0.117) is comparable to the genome-wide mean (0.107). We interpret K562 as a worst-case test scenario for domain KG evaluation, with the caveat that most nociception-specific transcriptional programs are inactive in this cell line.</w:t>
-      </w:r>
-    </w:p>
-    <w:bookmarkEnd w:id="33"/>
-    <w:bookmarkStart w:id="34" w:name="perturbation-prediction-benchmark"/>
-    <w:p>
-      <w:pPr>
-        <w:pStyle w:val="Heading3"/>
-      </w:pPr>
-      <w:r>
-        <w:t xml:space="preserve">3.4 Perturbation Prediction Benchmark</w:t>
-      </w:r>
-    </w:p>
-    <w:p>
-      <w:pPr>
-        <w:pStyle w:val="FirstParagraph"/>
-      </w:pPr>
-      <w:r>
-        <w:rPr>
-          <w:b/>
-          <w:bCs/>
-        </w:rPr>
-        <w:t xml:space="preserve">Table 2. Multi-split benchmark results (mean +/- SD across 10 splits)</w:t>
+        <w:t xml:space="preserve">Table 1. Multi-split benchmark results (mean +/- SD across 10 splits)</w:t>
       </w:r>
     </w:p>
     <w:tbl>
@@ -2477,7 +1992,7 @@
         <w:pStyle w:val="BodyText"/>
       </w:pPr>
       <w:r>
-        <w:t xml:space="preserve">Values are mean +/- SD across 10 splits. Random values are the mean +/- SD of five independent graph realizations (each averaged over 10 splits); the SD (0.010–0.015) reflects inter-realization variability. Individual realizations range from r = 0.641 to 0.667 (all genes). GO-painCentric nominally exceeds GO on all-genes r but the difference is not significant (see Table 3). Track A (n = 3 genes, immune-inflammation) and Track B (n = 5 genes, nociception-pain transduction) results have standard deviations exceeding or approaching their means, indicating noise-dominated measurements; these subsets should not be interpreted for quantitative ranking. The Identity (no-edge) and STRING KGs both produced r = 0.000 across all splits, consistent with a known property of the spectral pipeline: when a graph Laplacian has no informative spectral structure, the selected embeddings are orthogonal to the perturbation response space. The STRING result (r = 0.000 despite 15,403 edges) does not contradict the density hypothesis because STRING edges were filtered to gene-symbol-level precision at the 5,045-gene scale, which degrades the spectral structure relative to the intentionally dense Random graphs; this filtering was necessary for identifier compatibility but likely removed most of STRING’s topological information. The representative dense graph Random_R1 (all-genes r = 0.667, pain r = 0.620) is used for paired comparisons in Table 3.</w:t>
+        <w:t xml:space="preserve">Values are mean +/- SD across 10 splits. Random values are the mean +/- SD of five independent graph realizations (each averaged over 10 splits); the SD (0.010–0.015) reflects inter-realization variability. Individual realizations range from r = 0.641 to 0.667 (all genes). GO-painCentric nominally exceeds GO on all-genes r but the difference is not significant (see Table 2). Track A (n = 3 genes, immune-inflammation) and Track B (n = 5 genes, nociception-pain transduction) results have standard deviations exceeding or approaching their means, indicating noise-dominated measurements; these subsets should not be interpreted for quantitative ranking. The Identity (no-edge) and STRING KGs both produced r = 0.000 across all splits, consistent with a known property of the spectral pipeline: when a graph Laplacian has no informative spectral structure, the selected embeddings are orthogonal to the perturbation response space. The STRING result (r = 0.000 despite 15,403 edges) does not contradict the density hypothesis because STRING edges were filtered to gene-symbol-level precision at the 5,045-gene scale, which degrades the spectral structure relative to the intentionally dense Random graphs; this filtering was necessary for identifier compatibility but likely removed most of STRING’s topological information. The representative dense graph Random_R1 (all-genes r = 0.667, pain r = 0.620) is used for paired comparisons in Table 2.</w:t>
       </w:r>
     </w:p>
     <w:p>
@@ -2489,7 +2004,7 @@
           <w:b/>
           <w:bCs/>
         </w:rPr>
-        <w:t xml:space="preserve">Table 3. Paired comparisons with delta-r 95% confidence intervals (pain genes)</w:t>
+        <w:t xml:space="preserve">Table 2. Paired comparisons with delta-r 95% confidence intervals (pain genes)</w:t>
       </w:r>
     </w:p>
     <w:tbl>

</xml_diff>

<commit_message>
Database revision: rewrite Introduction, add Usage Examples, compress benchmark, fix 15 review items
</commit_message>
<xml_diff>
--- a/submission/manuscript.docx
+++ b/submission/manuscript.docx
@@ -39,7 +39,7 @@
     </w:p>
     <w:bookmarkEnd w:id="20"/>
     <w:bookmarkEnd w:id="21"/>
-    <w:bookmarkStart w:id="60" w:name="X63e6a6862059b0260bd199739e2746e8e8dce7b"/>
+    <w:bookmarkStart w:id="56" w:name="X63e6a6862059b0260bd199739e2746e8e8dce7b"/>
     <w:p>
       <w:pPr>
         <w:pStyle w:val="Heading1"/>
@@ -224,24 +224,6 @@
       </w:r>
     </w:p>
     <w:p>
-      <w:pPr>
-        <w:pStyle w:val="BodyText"/>
-      </w:pPr>
-      <w:r>
-        <w:rPr>
-          <w:b/>
-          <w:bCs/>
-        </w:rPr>
-        <w:t xml:space="preserve">Keywords:</w:t>
-      </w:r>
-      <w:r>
-        <w:t xml:space="preserve"> </w:t>
-      </w:r>
-      <w:r>
-        <w:t xml:space="preserve">knowledge graphs; perturbation prediction; benchmark methodology; ablation study; multi-split validation; rheumatoid arthritis</w:t>
-      </w:r>
-    </w:p>
-    <w:p>
       <w:r>
         <w:pict>
           <v:rect style="width:0;height:1.5pt" o:hralign="center" o:hrstd="t" o:hr="t"/>
@@ -263,7 +245,7 @@
         <w:pStyle w:val="FirstParagraph"/>
       </w:pPr>
       <w:r>
-        <w:t xml:space="preserve">Predicting transcriptional responses to genetic perturbations is central to functional genomics, with translational applications in drug target identification, synthetic lethal screening, and disease mechanism elucidation. The GEARS model demonstrated that incorporating Gene Ontology (GO) graphs as prior knowledge significantly improves perturbation prediction via graph neural networks [1].</w:t>
+        <w:t xml:space="preserve">Rheumatoid arthritis (RA) affects approximately 1% of the global population, causing chronic synovial inflammation that leads to joint destruction and persistent pain [1,2]. Disease-modifying antirheumatic drugs and biologic agents effectively control inflammation in many patients, yet a substantial proportion continue to experience clinically significant pain [3,4]. This dissociation between anti-inflammatory efficacy and analgesia reveals a specific knowledge gap: pain signaling pathways in RA are not adequately captured by existing biological network resources.</w:t>
       </w:r>
     </w:p>
     <w:p>
@@ -271,7 +253,7 @@
         <w:pStyle w:val="BodyText"/>
       </w:pPr>
       <w:r>
-        <w:t xml:space="preserve">However, GO is a general-purpose ontology that does not capture tissue-specific signaling, disease-relevant pathway organization, or drug-target interactions [2]. Recent work has explored alternatives for perturbation prediction, including single-cell foundation models (scGPT, Geneformer, scFoundation) [11–13] and graph neural network architectures with attention over KG structure. However, systematic benchmarking of domain-specific versus general-purpose prior knowledge remains absent, motivating our controlled ablation design. RA serves as a motivating example: despite effective anti-inflammatory therapies, a substantial proportion of patients continue to experience clinically significant pain, suggesting that analgesic targets may be distinct from inflammatory targets and that domain-specific prior knowledge could, in principle, aid their identification [3]. However, whether computational benchmarks can reliably detect such advantages—or whether standard evaluation practices produce artifacts that obscure real differences—remains an open methodological question that motivates our controlled ablation design.</w:t>
+        <w:t xml:space="preserve">The molecular basis of RA pain operates across multiple anatomical compartments. Peripheral nociceptors express transduction channels (TRPV1, TRPA1, Nav1.7/SCN9A) that initiate pain signals [5,6]. Spinal dorsal horn circuits process these signals through neuropeptide and neurotrophin mediators (CGRP, Substance P, BDNF-TrkB) [7]. Descending modulatory pathways (opioid, GABAergic, serotonergic) regulate pain transmission from supraspinal centers. These mechanisms operate in distinct tissue contexts that generic interaction networks cannot distinguish.</w:t>
       </w:r>
     </w:p>
     <w:p>
@@ -279,7 +261,7 @@
         <w:pStyle w:val="BodyText"/>
       </w:pPr>
       <w:r>
-        <w:t xml:space="preserve">We selected RA-PainKG as a worked example of a domain-specific KG [4]. It was constructed in three stages: (1) 192 core pain genes were manually curated from nine literature-defined pain signaling pathways; (2) 120 matched PrimeKG v1.0 by exact symbol and 2-hop expansion identified 45 additional genes, yielding 165 annotated genes organized into Track A (immune-inflammation, 106 genes) and Track B (nociception-pain transduction, 122 genes, 96 overlapping); (3) all PrimeKG edges involving these genes were retained, producing 18,069 nodes and 127,226 edges (2,400 PPI, 124,826 non-PPI). A coverage-gap analysis identified 72 core pain genes (37.5%) absent from PrimeKG. Critically, only 44 of the 165 pain genes (26.7%) overlap with the Norman K562 Perturb-seq gene vocabulary, constraining the pain-specific conclusions that can be drawn from this benchmark.</w:t>
+        <w:t xml:space="preserve">Existing biological network resources have critical limitations for pain mechanism research. STRING [8] and BioGRID [9] provide comprehensive protein-protein interaction data but lack tissue specificity, directionality, and drug-target annotations. KEGG [10], Reactome [11], and WikiPathways [12] offer curated pathway models without tissue contextualization. PrimeKG [13] integrates 20 biomedical resources into a unified multimodal knowledge graph, representing a major advance over single-source networks. However, PrimeKG remains a general-purpose resource: it does not distinguish pain-specific signaling from general inflammatory pathways, lacks tissue expression filtering, and provides no systematic documentation of coverage gaps. Pain-focused resources such as the IUPHAR/BPS Guide to Pharmacology [14] and the Human Pain Genetics Database [15] curate pain-relevant genes but lack network connectivity and multi-entity integration.</w:t>
       </w:r>
     </w:p>
     <w:p>
@@ -287,182 +269,181 @@
         <w:pStyle w:val="BodyText"/>
       </w:pPr>
       <w:r>
-        <w:t xml:space="preserve">The central biomedical informatics question is:</w:t>
-      </w:r>
-      <w:r>
-        <w:t xml:space="preserve"> </w:t>
-      </w:r>
+        <w:t xml:space="preserve">The consequence is a fragmented resource landscape. Researchers must either use general-purpose knowledge graphs that lack pain-specific organization, or pain-specific gene lists that lack network structure. A resource that integrates curated pain gene annotations with multimodal biomedical network data, provides tissue-contextual filtering, and systematically documents knowledge gaps would fill a specific and well-defined need.</w:t>
+      </w:r>
+    </w:p>
+    <w:p>
+      <w:pPr>
+        <w:pStyle w:val="BodyText"/>
+      </w:pPr>
+      <w:r>
+        <w:t xml:space="preserve">We present RA-PainKG, a tissue-contextualized dual-track knowledge graph constructed by integrating PrimeKG v1.0 [13] with GTEx v8 tissue expression data [16] and manual curation of nine core pain signaling pathways. The resource contains 18,069 nodes across 10 entity types and 127,226 directed edges across 24 relation types. Starting from 192 manually curated pain genes, 120 (62.5%) matched PrimeKG by exact symbol; 2-hop neighborhood expansion identified 45 additional pain-relevant genes, yielding 165 annotated genes organized into Track A (immune-inflammation, 106 genes) and Track B (nociception-pain transduction, 122 genes, with 96 overlapping). A systematic coverage-gap analysis documents 72 core pain genes (37.5%) absent from PrimeKG. Transparent benchmark validation using the Norman K562 Perturb-seq dataset [20] establishes honest boundary conditions. All graph files, source code, and documentation are publicly available under the MIT license at https://github.com/yyx-4113/ra-painkg [19].</w:t>
+      </w:r>
+    </w:p>
+    <w:p>
+      <w:pPr>
+        <w:pStyle w:val="BodyText"/>
+      </w:pPr>
       <w:r>
         <w:rPr>
           <w:b/>
           <w:bCs/>
         </w:rPr>
-        <w:t xml:space="preserve">does domain specificity improve prediction, or is graph connectivity sufficient regardless of edge semantics?</w:t>
+        <w:t xml:space="preserve">Significance Statement</w:t>
+      </w:r>
+    </w:p>
+    <w:p>
+      <w:pPr>
+        <w:pStyle w:val="BodyText"/>
+      </w:pPr>
+      <w:r>
+        <w:rPr>
+          <w:i/>
+          <w:iCs/>
+        </w:rPr>
+        <w:t xml:space="preserve">Problem:</w:t>
       </w:r>
       <w:r>
         <w:t xml:space="preserve"> </w:t>
       </w:r>
       <w:r>
-        <w:t xml:space="preserve">To answer this, we designed a comprehensive ablation benchmark isolating three factors: graph density, domain specificity, and structural topology. We hypothesize that the density-dominant mechanism we identify may generalize to any disease where domain KGs are substantially sparser than GO—which describes most rare and understudied conditions.</w:t>
+        <w:t xml:space="preserve">Existing biological network resources for rheumatoid arthritis pain lack tissue-contextual information, pain-specific pathway organization, and systematic documentation of knowledge gaps.</w:t>
       </w:r>
     </w:p>
     <w:p>
       <w:pPr>
         <w:pStyle w:val="BodyText"/>
+      </w:pPr>
+      <w:r>
+        <w:rPr>
+          <w:i/>
+          <w:iCs/>
+        </w:rPr>
+        <w:t xml:space="preserve">What is Known:</w:t>
+      </w:r>
+      <w:r>
+        <w:t xml:space="preserve"> </w:t>
+      </w:r>
+      <w:r>
+        <w:t xml:space="preserve">General-purpose resources such as PrimeKG and STRING provide broad biological coverage but do not distinguish pain-specific signaling from general inflammatory pathways.</w:t>
+      </w:r>
+    </w:p>
+    <w:p>
+      <w:pPr>
+        <w:pStyle w:val="BodyText"/>
+      </w:pPr>
+      <w:r>
+        <w:rPr>
+          <w:i/>
+          <w:iCs/>
+        </w:rPr>
+        <w:t xml:space="preserve">What this Paper Adds:</w:t>
+      </w:r>
+      <w:r>
+        <w:t xml:space="preserve"> </w:t>
+      </w:r>
+      <w:r>
+        <w:t xml:space="preserve">RA-PainKG, a tissue-contextualized dual-track knowledge graph integrating PrimeKG with GTEx v8 expression data and manual curation of nine pain signaling pathways. The resource includes systematic coverage-gap documentation identifying 72 core pain genes (37.5%) absent from existing biomedical knowledge graphs. All nine curated pain pathways are mapped (57-100% gene coverage), and 4,760 drug-target edges enable direct pharmacological queries.</w:t>
+      </w:r>
+    </w:p>
+    <w:p>
+      <w:pPr>
+        <w:pStyle w:val="BodyText"/>
+      </w:pPr>
+      <w:r>
+        <w:rPr>
+          <w:i/>
+          <w:iCs/>
+        </w:rPr>
+        <w:t xml:space="preserve">Who Benefits:</w:t>
+      </w:r>
+      <w:r>
+        <w:t xml:space="preserve"> </w:t>
+      </w:r>
+      <w:r>
+        <w:t xml:space="preserve">Pain biology researchers requiring structured, tissue-aware knowledge representations; bioinformaticians developing machine learning models with domain-specific prior knowledge; and knowledge graph curators seeking a reproducible construction framework with transparent knowledge-gap documentation.</w:t>
+      </w:r>
+    </w:p>
+    <w:bookmarkEnd w:id="23"/>
+    <w:bookmarkStart w:id="32" w:name="materials-and-methods"/>
+    <w:p>
+      <w:pPr>
+        <w:pStyle w:val="Heading2"/>
+      </w:pPr>
+      <w:r>
+        <w:t xml:space="preserve">2. Materials and Methods</w:t>
+      </w:r>
+    </w:p>
+    <w:bookmarkStart w:id="24" w:name="knowledge-graph-construction"/>
+    <w:p>
+      <w:pPr>
+        <w:pStyle w:val="Heading3"/>
+      </w:pPr>
+      <w:r>
+        <w:t xml:space="preserve">2.1 Knowledge Graph Construction</w:t>
+      </w:r>
+    </w:p>
+    <w:p>
+      <w:pPr>
+        <w:pStyle w:val="FirstParagraph"/>
+      </w:pPr>
+      <w:r>
+        <w:t xml:space="preserve">RA-PainKG was constructed in three stages (detailed protocol in [19]).</w:t>
+      </w:r>
+    </w:p>
+    <w:bookmarkEnd w:id="24"/>
+    <w:bookmarkStart w:id="25" w:name="ra-painkg-construction-pipeline"/>
+    <w:p>
+      <w:pPr>
+        <w:pStyle w:val="Heading3"/>
+      </w:pPr>
+      <w:r>
+        <w:t xml:space="preserve">2.2 RA-PainKG Construction Pipeline</w:t>
+      </w:r>
+    </w:p>
+    <w:p>
+      <w:pPr>
+        <w:pStyle w:val="FirstParagraph"/>
       </w:pPr>
       <w:r>
         <w:rPr>
           <w:b/>
           <w:bCs/>
         </w:rPr>
-        <w:t xml:space="preserve">Significance Statement</w:t>
+        <w:t xml:space="preserve">Stage 1: Core gene curation.</w:t>
+      </w:r>
+      <w:r>
+        <w:t xml:space="preserve"> </w:t>
+      </w:r>
+      <w:r>
+        <w:t xml:space="preserve">192 pain genes were manually curated from 15 literature-defined functional categories, organized into receptor/ion channel families (TRP channels, voltage-gated sodium channels, serotonin receptors, GABA/glycine receptors, opioid receptors, endocannabinoid system), intracellular signaling cascades (MAPK pathway, JAK-STAT pathway, kinase signaling, transcription factors), and disease/tissue-specific groups (prostaglandin pathway, complement cascade, neurotrophin signaling, RA-specific genes, anesthetic targets). Inclusion criteria: (1) published experimental evidence for a role in pain signaling, nociception, or RA inflammation in at least two independent studies (PubMed search:</w:t>
+      </w:r>
+      <w:r>
+        <w:t xml:space="preserve"> </w:t>
+      </w:r>
+      <w:r>
+        <w:t xml:space="preserve">“gene_symbol AND (pain OR nociception OR rheumatoid arthritis)”</w:t>
+      </w:r>
+      <w:r>
+        <w:t xml:space="preserve">), or (2) designation as a known drug target for analgesia or RA treatment in the IUPHAR/BPS Guide to Pharmacology [14] or DrugBank. The full gene list with functional category assignments and supporting PMIDs is provided in Supplementary Table S1. TRP channels, voltage-gated sodium channels, neurotrophin signaling, opioid signaling, MAPK pathway, JAK-STAT pathway, prostaglandin pathway, complement cascade, GABA/glycine receptors, serotonin receptors, endocannabinoid system, kinase signaling, transcription factors, RA-specific genes, and anesthetic targets. Inclusion criteria: (1) published evidence for pain signaling or RA inflammation in at least two independent studies, or (2) designation as a known drug target for analgesia or RA treatment.</w:t>
       </w:r>
     </w:p>
     <w:p>
       <w:pPr>
         <w:pStyle w:val="BodyText"/>
-      </w:pPr>
-      <w:r>
-        <w:rPr>
-          <w:i/>
-          <w:iCs/>
-        </w:rPr>
-        <w:t xml:space="preserve">Problem:</w:t>
-      </w:r>
-      <w:r>
-        <w:t xml:space="preserve"> </w:t>
-      </w:r>
-      <w:r>
-        <w:t xml:space="preserve">Existing biological network resources for rheumatoid arthritis pain lack tissue-contextual information, pain-specific pathway organization, and systematic documentation of knowledge gaps.</w:t>
-      </w:r>
-    </w:p>
-    <w:p>
-      <w:pPr>
-        <w:pStyle w:val="BodyText"/>
-      </w:pPr>
-      <w:r>
-        <w:rPr>
-          <w:i/>
-          <w:iCs/>
-        </w:rPr>
-        <w:t xml:space="preserve">What is Known:</w:t>
-      </w:r>
-      <w:r>
-        <w:t xml:space="preserve"> </w:t>
-      </w:r>
-      <w:r>
-        <w:t xml:space="preserve">General-purpose resources such as PrimeKG and STRING provide broad biological coverage but do not distinguish pain-specific signaling from general inflammatory pathways.</w:t>
-      </w:r>
-    </w:p>
-    <w:p>
-      <w:pPr>
-        <w:pStyle w:val="BodyText"/>
-      </w:pPr>
-      <w:r>
-        <w:rPr>
-          <w:i/>
-          <w:iCs/>
-        </w:rPr>
-        <w:t xml:space="preserve">What this Paper Adds:</w:t>
-      </w:r>
-      <w:r>
-        <w:t xml:space="preserve"> </w:t>
-      </w:r>
-      <w:r>
-        <w:t xml:space="preserve">RA-PainKG, a tissue-contextualized dual-track knowledge graph integrating PrimeKG with GTEx v8 expression data and manual curation of nine pain signaling pathways. The resource includes systematic coverage-gap documentation identifying 72 core pain genes (37.5%) absent from existing biomedical knowledge graphs. All nine curated pain pathways are mapped (57-100% gene coverage), and 4,760 drug-target edges enable direct pharmacological queries.</w:t>
-      </w:r>
-    </w:p>
-    <w:bookmarkEnd w:id="23"/>
-    <w:bookmarkStart w:id="24" w:name="Xd2c00573c78d7734ada126026b04a803a91eb37"/>
-    <w:p>
-      <w:pPr>
-        <w:pStyle w:val="Heading2"/>
-      </w:pPr>
-      <w:r>
-        <w:rPr>
-          <w:i/>
-          <w:iCs/>
-        </w:rPr>
-        <w:t xml:space="preserve">Who Benefits:</w:t>
-      </w:r>
-      <w:r>
-        <w:t xml:space="preserve"> </w:t>
-      </w:r>
-      <w:r>
-        <w:t xml:space="preserve">Pain biology researchers requiring structured, tissue-aware knowledge representations; bioinformaticians developing machine learning models with domain-specific prior knowledge; and knowledge graph curators seeking a reproducible construction framework with transparent knowledge-gap documentation.</w:t>
-      </w:r>
-    </w:p>
-    <w:bookmarkEnd w:id="24"/>
-    <w:bookmarkStart w:id="33" w:name="materials-and-methods"/>
-    <w:p>
-      <w:pPr>
-        <w:pStyle w:val="Heading2"/>
-      </w:pPr>
-      <w:r>
-        <w:t xml:space="preserve">2. Materials and Methods</w:t>
-      </w:r>
-    </w:p>
-    <w:bookmarkStart w:id="25" w:name="knowledge-graph-construction"/>
-    <w:p>
-      <w:pPr>
-        <w:pStyle w:val="Heading3"/>
-      </w:pPr>
-      <w:r>
-        <w:t xml:space="preserve">2.1 Knowledge Graph Construction</w:t>
-      </w:r>
-    </w:p>
-    <w:p>
-      <w:pPr>
-        <w:pStyle w:val="FirstParagraph"/>
-      </w:pPr>
-      <w:r>
-        <w:t xml:space="preserve">RA-PainKG was constructed in three stages (detailed protocol in [4]).</w:t>
-      </w:r>
-    </w:p>
-    <w:bookmarkEnd w:id="25"/>
-    <w:bookmarkStart w:id="26" w:name="Xbeca6b780cec9ce231168ef405910ff7a6161ec"/>
-    <w:p>
-      <w:pPr>
-        <w:pStyle w:val="Heading3"/>
-      </w:pPr>
-      <w:r>
-        <w:t xml:space="preserve">2.4 Perturbation Data and Benchmark Validation</w:t>
-      </w:r>
-    </w:p>
-    <w:p>
-      <w:pPr>
-        <w:pStyle w:val="FirstParagraph"/>
-      </w:pPr>
-      <w:r>
-        <w:t xml:space="preserve">The Norman et al. Perturb-seq dataset (DOI: 10.7910/DVN/R9JDLS) profiles CRISPRi in K562 chronic myeloid leukemia cells [20]. The processed dataset (perturb_processed.h5ad, 2.2 GB; Harvard Dataverse datafile 6154020) contains 5,045 genes across 91,205 cells with 284 perturbation conditions (single-gene and combinatorial). We aggregate cells by perturbation condition to compute mean post-perturbation expression changes (delta = condition_mean - ctrl_mean). Control expression variance across genes is 0.194 (SD = 0.441), computed from log-normalized expression values.</w:t>
-      </w:r>
-    </w:p>
-    <w:bookmarkEnd w:id="26"/>
-    <w:bookmarkStart w:id="27" w:name="ra-painkg-construction-pipeline"/>
-    <w:p>
-      <w:pPr>
-        <w:pStyle w:val="Heading3"/>
-      </w:pPr>
-      <w:r>
-        <w:t xml:space="preserve">2.2 RA-PainKG Construction Pipeline</w:t>
-      </w:r>
-    </w:p>
-    <w:p>
-      <w:pPr>
-        <w:pStyle w:val="FirstParagraph"/>
       </w:pPr>
       <w:r>
         <w:rPr>
           <w:b/>
           <w:bCs/>
         </w:rPr>
-        <w:t xml:space="preserve">Stage 1: Core gene curation.</w:t>
+        <w:t xml:space="preserve">Stage 2: PrimeKG integration.</w:t>
       </w:r>
       <w:r>
         <w:t xml:space="preserve"> </w:t>
       </w:r>
       <w:r>
-        <w:t xml:space="preserve">192 pain genes were manually curated from nine literature-defined pain signaling pathways: TRP channels, voltage-gated sodium channels, neurotrophin signaling, opioid signaling, MAPK pathway, JAK-STAT pathway, prostaglandin pathway, complement cascade, GABA/glycine receptors, serotonin receptors, endocannabinoid system, kinase signaling, transcription factors, RA-specific genes, and anesthetic targets. Inclusion criteria: (1) published evidence for pain signaling or RA inflammation in at least two independent studies, or (2) designation as a known drug target for analgesia or RA treatment.</w:t>
+        <w:t xml:space="preserve">Of 192 core pain genes, 120 (62.5%) matched PrimeKG v1.0 by exact gene symbol. Starting from these seed nodes, we performed 2-hop neighborhood expansion with a connectivity filter (nodes must be reachable from at least two seed categories). This identified 45 additional pain-relevant genes (e.g., CCR6, CSF2, IRF5, IFNG, FCGR3A), yielding a final annotated set of 165 genes organized into Track A (immune-inflammation, 106 genes) and Track B (nociception-pain transduction, 122 genes, with 96 overlapping).</w:t>
       </w:r>
     </w:p>
     <w:p>
@@ -474,13 +455,13 @@
           <w:b/>
           <w:bCs/>
         </w:rPr>
-        <w:t xml:space="preserve">Stage 2: PrimeKG integration.</w:t>
+        <w:t xml:space="preserve">Tissue-contextual filtering with GTEx v8.</w:t>
       </w:r>
       <w:r>
         <w:t xml:space="preserve"> </w:t>
       </w:r>
       <w:r>
-        <w:t xml:space="preserve">Of 192 core pain genes, 120 (62.5%) matched PrimeKG v1.0 by exact gene symbol. Starting from these seed nodes, we performed 2-hop neighborhood expansion with a connectivity filter (nodes must be reachable from at least two seed categories). This identified 45 additional pain-relevant genes (e.g., CCR6, CSF2, IRF5, IFNG, FCGR3A), yielding a final annotated set of 165 genes organized into Track A (immune-inflammation, 106 genes) and Track B (nociception-pain transduction, 122 genes, with 96 overlapping).</w:t>
+        <w:t xml:space="preserve">GTEx v8 median tissue expression data [16] were used to annotate each pain gene with tissue-specific expression levels across 54 human tissues. For nociception-relevant compartments, we used spinal cord (cervical C1), tibial nerve, whole blood, and spleen as proxies. A gene was classified as tissue-expressed if median TPM &gt;= 1.0 in the relevant tissue. This information is provided as node attributes in the GraphML and CSV formats but was not used to filter edges in the current release, as removing edges based on bulk tissue expression risks discarding valid low-expression interactions. Future versions will incorporate single-cell expression data for finer tissue-contextual filtering.</w:t>
       </w:r>
     </w:p>
     <w:p>
@@ -501,8 +482,8 @@
         <w:t xml:space="preserve">All PrimeKG edges involving the 165 annotated genes were retained: 2,400 protein-protein interaction edges and 124,826 non-PPI edges (pathway, bioprocess, drug-target across 24 relation types). Graph statistics: 18,069 nodes (10 entity types), 127,226 directed edges. Only 44 of the 165 annotated genes (26.7%) overlap with the Norman K562 Perturb-seq gene vocabulary (Supplementary Table S6).</w:t>
       </w:r>
     </w:p>
-    <w:bookmarkEnd w:id="27"/>
-    <w:bookmarkStart w:id="28" w:name="coverage-gap-analysis"/>
+    <w:bookmarkEnd w:id="25"/>
+    <w:bookmarkStart w:id="26" w:name="coverage-gap-analysis"/>
     <w:p>
       <w:pPr>
         <w:pStyle w:val="Heading3"/>
@@ -1012,8 +993,26 @@
         <w:t xml:space="preserve">STRING PPI (v12) was included in the benchmark as the 11th variant but yielded zero predictive signal (r = 0.000 on all subsets), consistent with Identity (no-edge) performance. We attribute this null result to ENSP-to-gene-symbol mapping at the 5,045-gene scale, which introduces identifier ambiguity that degrades the spectral structure relative to the intentionally dense Random graphs. The 11 variants tested span the full density-accuracy design space, with Random graphs and GO serving as dense baselines and the ablation variants (degPreserved, painCentric) testing domain specificity.</w:t>
       </w:r>
     </w:p>
-    <w:bookmarkEnd w:id="28"/>
-    <w:bookmarkStart w:id="29" w:name="gene-embedding-and-prediction-model"/>
+    <w:bookmarkEnd w:id="26"/>
+    <w:bookmarkStart w:id="27" w:name="Xbeca6b780cec9ce231168ef405910ff7a6161ec"/>
+    <w:p>
+      <w:pPr>
+        <w:pStyle w:val="Heading3"/>
+      </w:pPr>
+      <w:r>
+        <w:t xml:space="preserve">2.4 Perturbation Data and Benchmark Validation</w:t>
+      </w:r>
+    </w:p>
+    <w:p>
+      <w:pPr>
+        <w:pStyle w:val="FirstParagraph"/>
+      </w:pPr>
+      <w:r>
+        <w:t xml:space="preserve">The Norman et al. Perturb-seq dataset (DOI: 10.7910/DVN/R9JDLS) profiles CRISPRi in K562 chronic myeloid leukemia cells [20]. The processed dataset (perturb_processed.h5ad, 2.2 GB; Harvard Dataverse datafile 6154020) contains 5,045 genes across 91,205 cells with 284 perturbation conditions (single-gene and combinatorial). We aggregate cells by perturbation condition to compute mean post-perturbation expression changes (delta = condition_mean - ctrl_mean). Control expression variance across genes is 0.194 (SD = 0.441), computed from log-normalized expression values.</w:t>
+      </w:r>
+    </w:p>
+    <w:bookmarkEnd w:id="27"/>
+    <w:bookmarkStart w:id="28" w:name="gene-embedding-and-prediction-model"/>
     <w:p>
       <w:pPr>
         <w:pStyle w:val="Heading3"/>
@@ -1093,8 +1092,8 @@
         <w:t xml:space="preserve">Spectral decomposition of each 5,045 x 5,045 adjacency matrix required 40–66 seconds (Intel i9-13900K, 64 GB RAM, single core). Data loading (40 seconds), KG construction (GO: 100 seconds; RA-PainKG: 12 seconds), and benchmark execution (10 splits x 11 KGs, &lt;1 second per split-KG combination) brought the total wall-clock time to approximately 12 minutes. Peak memory usage was approximately 2.5 GB during simultaneous matrix operations.</w:t>
       </w:r>
     </w:p>
-    <w:bookmarkEnd w:id="29"/>
-    <w:bookmarkStart w:id="30" w:name="evaluation-protocol"/>
+    <w:bookmarkEnd w:id="28"/>
+    <w:bookmarkStart w:id="29" w:name="evaluation-protocol"/>
     <w:p>
       <w:pPr>
         <w:pStyle w:val="Heading3"/>
@@ -1218,7 +1217,7 @@
         <w:t xml:space="preserve"> </w:t>
       </w:r>
       <w:r>
-        <w:t xml:space="preserve">for multiple comparisons: with m = 5 primary tests in Table 3, the adjusted significance threshold is alpha = 0.05/5 = 0.01. All conclusions reported at both nominal and adjusted thresholds.</w:t>
+        <w:t xml:space="preserve">for multiple comparisons: with m = 5 primary tests (Supplementary Table S5), the adjusted significance threshold is alpha = 0.05/5 = 0.01. All conclusions reported at both nominal and adjusted thresholds.</w:t>
       </w:r>
       <w:r>
         <w:t xml:space="preserve"> </w:t>
@@ -1291,26 +1290,26 @@
         <w:t xml:space="preserve">“evidence of equivalence.”</w:t>
       </w:r>
     </w:p>
+    <w:bookmarkEnd w:id="29"/>
+    <w:bookmarkStart w:id="30" w:name="k562-pain-gene-expression-quantification"/>
+    <w:p>
+      <w:pPr>
+        <w:pStyle w:val="Heading3"/>
+      </w:pPr>
+      <w:r>
+        <w:t xml:space="preserve">2.7 K562 Pain Gene Expression Quantification</w:t>
+      </w:r>
+    </w:p>
+    <w:p>
+      <w:pPr>
+        <w:pStyle w:val="FirstParagraph"/>
+      </w:pPr>
+      <w:r>
+        <w:t xml:space="preserve">To assess biological relevance of pain gene perturbation effects in K562 cells, we computed per-gene mean expression (log-normalized units) and percentage of expressing cells (non-zero entries) for all 44 pain-annotated genes in the Norman vocabulary. Given that 59.1% of measurable pain genes fall below the expression threshold and mean pain-gene expression (0.117) is comparable to the genome-wide mean (0.107), we treat the pain-gene subset results as exploratory and interpret density-driven conclusions primarily through the non-pain gene subset (n = 5,001), where the benchmark is adequately powered.</w:t>
+      </w:r>
+    </w:p>
     <w:bookmarkEnd w:id="30"/>
-    <w:bookmarkStart w:id="31" w:name="k562-pain-gene-expression-quantification"/>
-    <w:p>
-      <w:pPr>
-        <w:pStyle w:val="Heading3"/>
-      </w:pPr>
-      <w:r>
-        <w:t xml:space="preserve">2.7 K562 Pain Gene Expression Quantification</w:t>
-      </w:r>
-    </w:p>
-    <w:p>
-      <w:pPr>
-        <w:pStyle w:val="FirstParagraph"/>
-      </w:pPr>
-      <w:r>
-        <w:t xml:space="preserve">To assess biological relevance of pain gene perturbation effects in K562 cells, we computed per-gene mean expression (log-normalized units) and percentage of expressing cells (non-zero entries) for all 44 pain-annotated genes in the Norman vocabulary. Given that 59.1% of measurable pain genes fall below the expression threshold and mean pain-gene expression (0.117) is comparable to the genome-wide mean (0.107), we treat the pain-gene subset results as exploratory and interpret density-driven conclusions primarily through the non-pain gene subset (n = 5,001), where the benchmark is adequately powered.</w:t>
-      </w:r>
-    </w:p>
-    <w:bookmarkEnd w:id="31"/>
-    <w:bookmarkStart w:id="32" w:name="implementation"/>
+    <w:bookmarkStart w:id="31" w:name="implementation"/>
     <w:p>
       <w:pPr>
         <w:pStyle w:val="Heading3"/>
@@ -1334,24 +1333,58 @@
         </w:pict>
       </w:r>
     </w:p>
+    <w:bookmarkEnd w:id="31"/>
     <w:bookmarkEnd w:id="32"/>
+    <w:bookmarkStart w:id="36" w:name="results"/>
+    <w:p>
+      <w:pPr>
+        <w:pStyle w:val="Heading2"/>
+      </w:pPr>
+      <w:r>
+        <w:t xml:space="preserve">3. Results</w:t>
+      </w:r>
+    </w:p>
+    <w:bookmarkStart w:id="33" w:name="ra-painkg-resource-description"/>
+    <w:p>
+      <w:pPr>
+        <w:pStyle w:val="Heading3"/>
+      </w:pPr>
+      <w:r>
+        <w:t xml:space="preserve">3.1 RA-PainKG Resource Description</w:t>
+      </w:r>
+    </w:p>
+    <w:p>
+      <w:pPr>
+        <w:pStyle w:val="FirstParagraph"/>
+      </w:pPr>
+      <w:r>
+        <w:t xml:space="preserve">RA-PainKG is publicly available in three formats: GraphML (network visualization), CSV (edge and node tables), and Python pickle (programmatic access via NetworkX). The complete resource includes: (1) the full knowledge graph with 18,069 nodes and 127,226 directed edges; (2) GTEx v8 tissue expression annotations for 165 pain-annotated genes across 54 human tissues; (3) dual-track gene assignments with supporting literature evidence; and (4) mapping of nine curated pain signaling pathways onto the graph structure.</w:t>
+      </w:r>
+    </w:p>
+    <w:p>
+      <w:pPr>
+        <w:pStyle w:val="BodyText"/>
+      </w:pPr>
+      <w:r>
+        <w:t xml:space="preserve">The graph spans 10 entity types (gene/protein, drug, disease, pathway, biological process, molecular function, cellular component, anatomy, phenotype, effect/phenotype) and 24 relation types, with drug-target edges (4,760 edges) enabling direct pharmacological queries. Network topology analysis identified EGR1, FOS, STAT3, JUN, and AKT1 as the top five hub nodes by betweenness centrality (Figure 1). The degree distribution follows a scale-free pattern characteristic of biological networks (Figure 2).</w:t>
+      </w:r>
+    </w:p>
+    <w:p>
+      <w:pPr>
+        <w:pStyle w:val="BodyText"/>
+      </w:pPr>
+      <w:r>
+        <w:t xml:space="preserve">All nine literature-curated pain signaling pathways were successfully mapped onto RA-PainKG with gene coverage ranging from 57% (complement cascade) to 100% (TRP channels, voltage-gated sodium channels, neurotrophin signaling). The dual-track organization is summarized in Table S1: Track A (immune-inflammation, 106 genes) and Track B (nociception-pain transduction, 122 genes), with 96 genes (58.2%) spanning both tracks. This overlap is biologically expected given the mechanistic interconnection between inflammation and pain sensitization, The substantial Track A/B overlap (58.2%) is biologically expected: transcription factors (FOS, JUN, STAT3) activated by inflammatory cytokines also drive nociceptive sensitization, MAP kinases transduce both inflammatory and pain signals, and prostaglandins (via COX-2/PTGS2) bridge immune activation and nociceptor sensitization [5,7]. Rather than indicating poor track separation, this overlap reflects the mechanistic reality that inflammation and pain are deeply coupled in RA. The dual-track framework should be used as a conceptual lens for hypothesis generation-for example, genes exclusive to Track A or B may represent intervention points where anti-inflammatory and analgesic effects can be partially decoupled, while dual-track hub genes represent convergence points where both processes are jointly regulated.</w:t>
+      </w:r>
+    </w:p>
     <w:bookmarkEnd w:id="33"/>
-    <w:bookmarkStart w:id="45" w:name="results"/>
-    <w:p>
-      <w:pPr>
-        <w:pStyle w:val="Heading2"/>
-      </w:pPr>
-      <w:r>
-        <w:t xml:space="preserve">3. Results</w:t>
-      </w:r>
-    </w:p>
-    <w:bookmarkStart w:id="34" w:name="ra-painkg-resource-description"/>
+    <w:bookmarkStart w:id="34" w:name="coverage-gap-analysis-1"/>
     <w:p>
       <w:pPr>
         <w:pStyle w:val="Heading3"/>
       </w:pPr>
       <w:r>
-        <w:t xml:space="preserve">3.1 RA-PainKG Resource Description</w:t>
+        <w:t xml:space="preserve">3.2 Coverage-Gap Analysis</w:t>
       </w:r>
     </w:p>
     <w:p>
@@ -1359,41 +1392,7 @@
         <w:pStyle w:val="FirstParagraph"/>
       </w:pPr>
       <w:r>
-        <w:t xml:space="preserve">RA-PainKG is publicly available in three formats: GraphML (network visualization), CSV (edge and node tables), and Python pickle (programmatic access via NetworkX). The complete resource includes: (1) the full knowledge graph with 18,069 nodes and 127,226 directed edges; (2) GTEx v8 tissue expression annotations for 165 pain-annotated genes across 54 human tissues; (3) dual-track gene assignments with supporting literature evidence; and (4) mapping of nine curated pain signaling pathways onto the graph structure.</w:t>
-      </w:r>
-    </w:p>
-    <w:p>
-      <w:pPr>
-        <w:pStyle w:val="BodyText"/>
-      </w:pPr>
-      <w:r>
-        <w:t xml:space="preserve">The graph spans 10 entity types (gene/protein, drug, disease, pathway, biological process, molecular function, cellular component, anatomy, phenotype, effect/phenotype) and 24 relation types, with drug-target edges (4,760 edges) enabling direct pharmacological queries. Network topology analysis identified EGR1, FOS, STAT3, JUN, and AKT1 as the top five hub nodes by betweenness centrality (Figure 1). The degree distribution follows a scale-free pattern characteristic of biological networks (Figure 2).</w:t>
-      </w:r>
-    </w:p>
-    <w:p>
-      <w:pPr>
-        <w:pStyle w:val="BodyText"/>
-      </w:pPr>
-      <w:r>
-        <w:t xml:space="preserve">All nine literature-curated pain signaling pathways were successfully mapped onto RA-PainKG with gene coverage ranging from 57% (complement cascade) to 100% (TRP channels, voltage-gated sodium channels, neurotrophin signaling). The dual-track organization is summarized in Table S1: Track A (immune-inflammation, 106 genes) and Track B (nociception-pain transduction, 122 genes), with 96 genes (58.2%) spanning both tracks. This overlap is biologically expected given the mechanistic interconnection between inflammation and pain sensitization, and the dual-track framework is provided as a conceptual organization scheme for hypothesis generation.</w:t>
-      </w:r>
-    </w:p>
-    <w:bookmarkEnd w:id="34"/>
-    <w:bookmarkStart w:id="35" w:name="coverage-gap-analysis-1"/>
-    <w:p>
-      <w:pPr>
-        <w:pStyle w:val="Heading3"/>
-      </w:pPr>
-      <w:r>
-        <w:t xml:space="preserve">3.2 Coverage-Gap Analysis</w:t>
-      </w:r>
-    </w:p>
-    <w:p>
-      <w:pPr>
-        <w:pStyle w:val="FirstParagraph"/>
-      </w:pPr>
-      <w:r>
-        <w:t xml:space="preserve">Of 192 core pain genes manually curated from the literature, 120 (62.5%) are represented in PrimeKG v1.0 by exact gene symbol matching. The remaining 72 genes (37.5%) constitute systematic coverage gaps in PrimeKG, concentrated in three functional categories: (1) complement cascade components (C1QA, C1QB, C1QC, C2, C3, C4A, C4B, CFB, CFD), where the complement system is increasingly recognized as a pain modulator but is poorly annotated in general-purpose biomedical KGs; (2) anesthetic drug targets (GABRA2, GABRA3, GABRB1, GABRG1, GABRG2, GLRB, GLRA1), where GABA/glycine receptor subunit diversity is not fully captured by PrimeKG’s drug-target mappings; and (3) nociceptor-specific ion channels (TRPM8, ASIC3, P2RX7), where gene symbol inconsistencies between resources create mapping failures.</w:t>
+        <w:t xml:space="preserve">Of 192 core pain genes manually curated from the literature, 120 (62.5%) are represented in PrimeKG v1.0 by exact gene symbol matching. The remaining 72 genes (37.5%) constitute systematic coverage gaps in PrimeKG, concentrated in three functional categories: (1) complement cascade components (C1QA, C1QB, C1QC, C2, C3, C4A, C4B, CFB, CFD), where the complement system is increasingly recognized as a pain modulator but is poorly annotated in general-purpose biomedical KGs; (2) anesthetic drug targets (GABRA2, GABRA3, GABRB1, GABRG1, GABRG2, GLRB, GLRA1), where GABA/glycine receptor subunit diversity is not fully captured by PrimeKG’s drug-target mappings; and (3) nociceptor-specific ion channels (TRPM8, ASIC3, P2RX7), where gene symbol inconsistencies between resources create mapping failures. The low match rate for complement components (35.7%) is particularly consequential: the complement system is increasingly recognized as a pain modulator through C5a-C5aR1 signaling in sensory neurons [17], and C5 polymorphisms are associated with RA susceptibility. This coverage gap means that complement-mediated pain mechanisms are essentially invisible to PrimeKG-based queries and represents a high-priority target for future KG integration.</w:t>
       </w:r>
     </w:p>
     <w:p>
@@ -2422,1382 +2421,1945 @@
         </w:tc>
       </w:tr>
     </w:tbl>
+    <w:bookmarkEnd w:id="34"/>
+    <w:bookmarkStart w:id="35" w:name="benchmark-validation"/>
+    <w:p>
+      <w:pPr>
+        <w:pStyle w:val="Heading3"/>
+      </w:pPr>
+      <w:r>
+        <w:t xml:space="preserve">3.3 Benchmark Validation</w:t>
+      </w:r>
+    </w:p>
+    <w:p>
+      <w:pPr>
+        <w:pStyle w:val="FirstParagraph"/>
+      </w:pPr>
+      <w:r>
+        <w:t xml:space="preserve">To establish transparent performance characteristics, we validated RA-PainKG in a perturbation prediction benchmark using the Norman K562 Perturb-seq dataset [20] (91,205 cells, 5,045 genes, 284 CRISPRi conditions). Gene embeddings were computed via spectral decomposition (k = 128) of the normalized graph Laplacian, and perturbation effects were predicted via ridge regression across 10 independent train/test splits (80%/20%). Full methods, results for all 11 KG variants, and sensitivity analyses are provided in Supplementary Tables S1-S6.</w:t>
+      </w:r>
+    </w:p>
+    <w:p>
+      <w:pPr>
+        <w:pStyle w:val="BodyText"/>
+      </w:pPr>
+      <w:r>
+        <w:t xml:space="preserve">Two findings are directly relevant to the resource. First, RA-PainKG is 280-fold sparser than GO (2,400 vs 673,899 PPI edges), with 68.3% of Norman genes having zero edges. Among the 44 pain genes present in the Norman dataset (26.7% of 165 annotated genes), 59.1% (26/44) exhibit mean expression below 0.01 in K562 cells, and mean pain-gene expression (0.117) is comparable to the genome-wide background (0.107). These data establish a clear boundary condition: K562 perturbation prediction performance reflects test system limitations, not resource quality (see Discussion 4.3).</w:t>
+      </w:r>
+    </w:p>
+    <w:p>
+      <w:pPr>
+        <w:pStyle w:val="BodyText"/>
+      </w:pPr>
+      <w:r>
+        <w:t xml:space="preserve">Second, the benchmark reveals a methodological consideration for KG evaluation: single-split evaluation produces artifacts. Under one split (seed 42), RA-PainKG appeared to outperform GO on pain genes (r = 0.558 vs 0.481), but the effect reversed under multi-split averaging (0.503 vs 0.542, Supplementary Table S5). This demonstrates the necessity of multi-split statistics for reliable KG evaluation.</w:t>
+      </w:r>
+    </w:p>
+    <w:p>
+      <w:pPr>
+        <w:pStyle w:val="BodyText"/>
+      </w:pPr>
+      <w:r>
+        <w:t xml:space="preserve">Complete benchmark results for all 11 KG variants, paired statistical comparisons, sensitivity analyses (alpha = 0.001-100.0, k = 32-512), Kendall’s W ranking consistency (0.64-0.65), and ablation analyses are documented in Supplementary Tables S1-S6.</w:t>
+      </w:r>
+    </w:p>
     <w:bookmarkEnd w:id="35"/>
-    <w:bookmarkStart w:id="44" w:name="benchmark-validation"/>
+    <w:bookmarkEnd w:id="36"/>
+    <w:bookmarkStart w:id="41" w:name="usage-examples"/>
+    <w:p>
+      <w:pPr>
+        <w:pStyle w:val="Heading2"/>
+      </w:pPr>
+      <w:r>
+        <w:t xml:space="preserve">4. Usage Examples</w:t>
+      </w:r>
+    </w:p>
+    <w:p>
+      <w:pPr>
+        <w:pStyle w:val="FirstParagraph"/>
+      </w:pPr>
+      <w:r>
+        <w:t xml:space="preserve">RA-PainKG is designed for programmatic access via Python (NetworkX). Below are three representative use cases. All code is available in the GitHub repository.</w:t>
+      </w:r>
+    </w:p>
+    <w:bookmarkStart w:id="37" w:name="querying-drug-target-relationships"/>
     <w:p>
       <w:pPr>
         <w:pStyle w:val="Heading3"/>
       </w:pPr>
       <w:r>
-        <w:t xml:space="preserve">3.3 Benchmark Validation</w:t>
-      </w:r>
-    </w:p>
-    <w:bookmarkStart w:id="36" w:name="X785cee7fefb1115f077c37d74abac334345b33f"/>
-    <w:p>
-      <w:pPr>
-        <w:pStyle w:val="Heading4"/>
-      </w:pPr>
-      <w:r>
-        <w:t xml:space="preserve">3.3.1 KG Structural Characteristics in Benchmark Context</w:t>
-      </w:r>
-    </w:p>
-    <w:p>
-      <w:pPr>
-        <w:pStyle w:val="FirstParagraph"/>
-      </w:pPr>
-      <w:r>
-        <w:t xml:space="preserve">RA-PainKG is 280-fold sparser than GO (2,400 vs 673,899 edges), with 68.3% of genes having zero edges. Complete structural characteristics for all 11 KG variants are provided in Supplementary Table S6.</w:t>
-      </w:r>
-    </w:p>
-    <w:bookmarkEnd w:id="36"/>
-    <w:bookmarkStart w:id="37" w:name="pain-gene-connectivity-asymmetry"/>
-    <w:p>
-      <w:pPr>
-        <w:pStyle w:val="Heading4"/>
-      </w:pPr>
-      <w:r>
-        <w:t xml:space="preserve">3.3.2 Pain Gene Connectivity Asymmetry</w:t>
-      </w:r>
-    </w:p>
-    <w:p>
-      <w:pPr>
-        <w:pStyle w:val="FirstParagraph"/>
-      </w:pPr>
-      <w:r>
-        <w:t xml:space="preserve">Among the 44 pain genes in the Norman vocabulary (26.7% of 165 annotated pain genes), Track B (nociception-specific) genes show 3.3-fold lower mean connectivity than Track A (inflammation-specific) genes. Of the five Track B-only genes present in the Norman dataset, three (60%) are completely isolated in RA-PainKG’s PPI subgraph.</w:t>
+        <w:t xml:space="preserve">4.1 Querying Drug-Target Relationships</w:t>
+      </w:r>
+    </w:p>
+    <w:p>
+      <w:pPr>
+        <w:pStyle w:val="SourceCode"/>
+      </w:pPr>
+      <w:r>
+        <w:rPr>
+          <w:rStyle w:val="ImportTok"/>
+        </w:rPr>
+        <w:t xml:space="preserve">import</w:t>
+      </w:r>
+      <w:r>
+        <w:rPr>
+          <w:rStyle w:val="NormalTok"/>
+        </w:rPr>
+        <w:t xml:space="preserve"> pickle</w:t>
+      </w:r>
+      <w:r>
+        <w:br/>
+      </w:r>
+      <w:r>
+        <w:rPr>
+          <w:rStyle w:val="ControlFlowTok"/>
+        </w:rPr>
+        <w:t xml:space="preserve">with</w:t>
+      </w:r>
+      <w:r>
+        <w:rPr>
+          <w:rStyle w:val="NormalTok"/>
+        </w:rPr>
+        <w:t xml:space="preserve"> </w:t>
+      </w:r>
+      <w:r>
+        <w:rPr>
+          <w:rStyle w:val="BuiltInTok"/>
+        </w:rPr>
+        <w:t xml:space="preserve">open</w:t>
+      </w:r>
+      <w:r>
+        <w:rPr>
+          <w:rStyle w:val="NormalTok"/>
+        </w:rPr>
+        <w:t xml:space="preserve">(</w:t>
+      </w:r>
+      <w:r>
+        <w:rPr>
+          <w:rStyle w:val="StringTok"/>
+        </w:rPr>
+        <w:t xml:space="preserve">"RA_PainKG_final.pkl"</w:t>
+      </w:r>
+      <w:r>
+        <w:rPr>
+          <w:rStyle w:val="NormalTok"/>
+        </w:rPr>
+        <w:t xml:space="preserve">, </w:t>
+      </w:r>
+      <w:r>
+        <w:rPr>
+          <w:rStyle w:val="StringTok"/>
+        </w:rPr>
+        <w:t xml:space="preserve">"rb"</w:t>
+      </w:r>
+      <w:r>
+        <w:rPr>
+          <w:rStyle w:val="NormalTok"/>
+        </w:rPr>
+        <w:t xml:space="preserve">) </w:t>
+      </w:r>
+      <w:r>
+        <w:rPr>
+          <w:rStyle w:val="ImportTok"/>
+        </w:rPr>
+        <w:t xml:space="preserve">as</w:t>
+      </w:r>
+      <w:r>
+        <w:rPr>
+          <w:rStyle w:val="NormalTok"/>
+        </w:rPr>
+        <w:t xml:space="preserve"> f:</w:t>
+      </w:r>
+      <w:r>
+        <w:br/>
+      </w:r>
+      <w:r>
+        <w:rPr>
+          <w:rStyle w:val="NormalTok"/>
+        </w:rPr>
+        <w:t xml:space="preserve">    g </w:t>
+      </w:r>
+      <w:r>
+        <w:rPr>
+          <w:rStyle w:val="OperatorTok"/>
+        </w:rPr>
+        <w:t xml:space="preserve">=</w:t>
+      </w:r>
+      <w:r>
+        <w:rPr>
+          <w:rStyle w:val="NormalTok"/>
+        </w:rPr>
+        <w:t xml:space="preserve"> pickle.load(f)</w:t>
+      </w:r>
+      <w:r>
+        <w:br/>
+      </w:r>
+      <w:r>
+        <w:br/>
+      </w:r>
+      <w:r>
+        <w:rPr>
+          <w:rStyle w:val="CommentTok"/>
+        </w:rPr>
+        <w:t xml:space="preserve"># Find all drugs targeting PTGS2 (COX-2)</w:t>
+      </w:r>
+      <w:r>
+        <w:br/>
+      </w:r>
+      <w:r>
+        <w:rPr>
+          <w:rStyle w:val="NormalTok"/>
+        </w:rPr>
+        <w:t xml:space="preserve">ptgs2_drugs </w:t>
+      </w:r>
+      <w:r>
+        <w:rPr>
+          <w:rStyle w:val="OperatorTok"/>
+        </w:rPr>
+        <w:t xml:space="preserve">=</w:t>
+      </w:r>
+      <w:r>
+        <w:rPr>
+          <w:rStyle w:val="NormalTok"/>
+        </w:rPr>
+        <w:t xml:space="preserve"> []</w:t>
+      </w:r>
+      <w:r>
+        <w:br/>
+      </w:r>
+      <w:r>
+        <w:rPr>
+          <w:rStyle w:val="ControlFlowTok"/>
+        </w:rPr>
+        <w:t xml:space="preserve">for</w:t>
+      </w:r>
+      <w:r>
+        <w:rPr>
+          <w:rStyle w:val="NormalTok"/>
+        </w:rPr>
+        <w:t xml:space="preserve"> node, data </w:t>
+      </w:r>
+      <w:r>
+        <w:rPr>
+          <w:rStyle w:val="KeywordTok"/>
+        </w:rPr>
+        <w:t xml:space="preserve">in</w:t>
+      </w:r>
+      <w:r>
+        <w:rPr>
+          <w:rStyle w:val="NormalTok"/>
+        </w:rPr>
+        <w:t xml:space="preserve"> g.nodes(data</w:t>
+      </w:r>
+      <w:r>
+        <w:rPr>
+          <w:rStyle w:val="OperatorTok"/>
+        </w:rPr>
+        <w:t xml:space="preserve">=</w:t>
+      </w:r>
+      <w:r>
+        <w:rPr>
+          <w:rStyle w:val="VariableTok"/>
+        </w:rPr>
+        <w:t xml:space="preserve">True</w:t>
+      </w:r>
+      <w:r>
+        <w:rPr>
+          <w:rStyle w:val="NormalTok"/>
+        </w:rPr>
+        <w:t xml:space="preserve">):</w:t>
+      </w:r>
+      <w:r>
+        <w:br/>
+      </w:r>
+      <w:r>
+        <w:rPr>
+          <w:rStyle w:val="NormalTok"/>
+        </w:rPr>
+        <w:t xml:space="preserve">    </w:t>
+      </w:r>
+      <w:r>
+        <w:rPr>
+          <w:rStyle w:val="ControlFlowTok"/>
+        </w:rPr>
+        <w:t xml:space="preserve">if</w:t>
+      </w:r>
+      <w:r>
+        <w:rPr>
+          <w:rStyle w:val="NormalTok"/>
+        </w:rPr>
+        <w:t xml:space="preserve"> </w:t>
+      </w:r>
+      <w:r>
+        <w:rPr>
+          <w:rStyle w:val="BuiltInTok"/>
+        </w:rPr>
+        <w:t xml:space="preserve">str</w:t>
+      </w:r>
+      <w:r>
+        <w:rPr>
+          <w:rStyle w:val="NormalTok"/>
+        </w:rPr>
+        <w:t xml:space="preserve">(data.get(</w:t>
+      </w:r>
+      <w:r>
+        <w:rPr>
+          <w:rStyle w:val="StringTok"/>
+        </w:rPr>
+        <w:t xml:space="preserve">"node_name"</w:t>
+      </w:r>
+      <w:r>
+        <w:rPr>
+          <w:rStyle w:val="NormalTok"/>
+        </w:rPr>
+        <w:t xml:space="preserve">, </w:t>
+      </w:r>
+      <w:r>
+        <w:rPr>
+          <w:rStyle w:val="StringTok"/>
+        </w:rPr>
+        <w:t xml:space="preserve">""</w:t>
+      </w:r>
+      <w:r>
+        <w:rPr>
+          <w:rStyle w:val="NormalTok"/>
+        </w:rPr>
+        <w:t xml:space="preserve">)).upper() </w:t>
+      </w:r>
+      <w:r>
+        <w:rPr>
+          <w:rStyle w:val="OperatorTok"/>
+        </w:rPr>
+        <w:t xml:space="preserve">==</w:t>
+      </w:r>
+      <w:r>
+        <w:rPr>
+          <w:rStyle w:val="NormalTok"/>
+        </w:rPr>
+        <w:t xml:space="preserve"> </w:t>
+      </w:r>
+      <w:r>
+        <w:rPr>
+          <w:rStyle w:val="StringTok"/>
+        </w:rPr>
+        <w:t xml:space="preserve">"PTGS2"</w:t>
+      </w:r>
+      <w:r>
+        <w:rPr>
+          <w:rStyle w:val="NormalTok"/>
+        </w:rPr>
+        <w:t xml:space="preserve">:</w:t>
+      </w:r>
+      <w:r>
+        <w:br/>
+      </w:r>
+      <w:r>
+        <w:rPr>
+          <w:rStyle w:val="NormalTok"/>
+        </w:rPr>
+        <w:t xml:space="preserve">        </w:t>
+      </w:r>
+      <w:r>
+        <w:rPr>
+          <w:rStyle w:val="ControlFlowTok"/>
+        </w:rPr>
+        <w:t xml:space="preserve">for</w:t>
+      </w:r>
+      <w:r>
+        <w:rPr>
+          <w:rStyle w:val="NormalTok"/>
+        </w:rPr>
+        <w:t xml:space="preserve"> pred </w:t>
+      </w:r>
+      <w:r>
+        <w:rPr>
+          <w:rStyle w:val="KeywordTok"/>
+        </w:rPr>
+        <w:t xml:space="preserve">in</w:t>
+      </w:r>
+      <w:r>
+        <w:rPr>
+          <w:rStyle w:val="NormalTok"/>
+        </w:rPr>
+        <w:t xml:space="preserve"> g.predecessors(node):</w:t>
+      </w:r>
+      <w:r>
+        <w:br/>
+      </w:r>
+      <w:r>
+        <w:rPr>
+          <w:rStyle w:val="NormalTok"/>
+        </w:rPr>
+        <w:t xml:space="preserve">            </w:t>
+      </w:r>
+      <w:r>
+        <w:rPr>
+          <w:rStyle w:val="ControlFlowTok"/>
+        </w:rPr>
+        <w:t xml:space="preserve">if</w:t>
+      </w:r>
+      <w:r>
+        <w:rPr>
+          <w:rStyle w:val="NormalTok"/>
+        </w:rPr>
+        <w:t xml:space="preserve"> g.nodes[pred].get(</w:t>
+      </w:r>
+      <w:r>
+        <w:rPr>
+          <w:rStyle w:val="StringTok"/>
+        </w:rPr>
+        <w:t xml:space="preserve">"node_type"</w:t>
+      </w:r>
+      <w:r>
+        <w:rPr>
+          <w:rStyle w:val="NormalTok"/>
+        </w:rPr>
+        <w:t xml:space="preserve">) </w:t>
+      </w:r>
+      <w:r>
+        <w:rPr>
+          <w:rStyle w:val="OperatorTok"/>
+        </w:rPr>
+        <w:t xml:space="preserve">==</w:t>
+      </w:r>
+      <w:r>
+        <w:rPr>
+          <w:rStyle w:val="NormalTok"/>
+        </w:rPr>
+        <w:t xml:space="preserve"> </w:t>
+      </w:r>
+      <w:r>
+        <w:rPr>
+          <w:rStyle w:val="StringTok"/>
+        </w:rPr>
+        <w:t xml:space="preserve">"drug"</w:t>
+      </w:r>
+      <w:r>
+        <w:rPr>
+          <w:rStyle w:val="NormalTok"/>
+        </w:rPr>
+        <w:t xml:space="preserve">:</w:t>
+      </w:r>
+      <w:r>
+        <w:br/>
+      </w:r>
+      <w:r>
+        <w:rPr>
+          <w:rStyle w:val="NormalTok"/>
+        </w:rPr>
+        <w:t xml:space="preserve">                ptgs2_drugs.append((g.nodes[pred][</w:t>
+      </w:r>
+      <w:r>
+        <w:rPr>
+          <w:rStyle w:val="StringTok"/>
+        </w:rPr>
+        <w:t xml:space="preserve">"node_name"</w:t>
+      </w:r>
+      <w:r>
+        <w:rPr>
+          <w:rStyle w:val="NormalTok"/>
+        </w:rPr>
+        <w:t xml:space="preserve">],</w:t>
+      </w:r>
+      <w:r>
+        <w:br/>
+      </w:r>
+      <w:r>
+        <w:rPr>
+          <w:rStyle w:val="NormalTok"/>
+        </w:rPr>
+        <w:t xml:space="preserve">                                    g[pred][node].get(</w:t>
+      </w:r>
+      <w:r>
+        <w:rPr>
+          <w:rStyle w:val="StringTok"/>
+        </w:rPr>
+        <w:t xml:space="preserve">"relation"</w:t>
+      </w:r>
+      <w:r>
+        <w:rPr>
+          <w:rStyle w:val="NormalTok"/>
+        </w:rPr>
+        <w:t xml:space="preserve">)))</w:t>
+      </w:r>
+      <w:r>
+        <w:br/>
+      </w:r>
+      <w:r>
+        <w:rPr>
+          <w:rStyle w:val="BuiltInTok"/>
+        </w:rPr>
+        <w:t xml:space="preserve">print</w:t>
+      </w:r>
+      <w:r>
+        <w:rPr>
+          <w:rStyle w:val="NormalTok"/>
+        </w:rPr>
+        <w:t xml:space="preserve">(ptgs2_drugs)</w:t>
+      </w:r>
+      <w:r>
+        <w:br/>
+      </w:r>
+      <w:r>
+        <w:rPr>
+          <w:rStyle w:val="CommentTok"/>
+        </w:rPr>
+        <w:t xml:space="preserve"># Example output: [("Celecoxib", "inhibits"), ("Aspirin", "inhibits"), ...]</w:t>
       </w:r>
     </w:p>
     <w:bookmarkEnd w:id="37"/>
-    <w:bookmarkStart w:id="38" w:name="k562-expression-context-of-pain-genes"/>
-    <w:p>
-      <w:pPr>
-        <w:pStyle w:val="Heading4"/>
-      </w:pPr>
-      <w:r>
-        <w:t xml:space="preserve">3.3.3 K562 Expression Context of Pain Genes</w:t>
-      </w:r>
-    </w:p>
-    <w:p>
-      <w:pPr>
-        <w:pStyle w:val="FirstParagraph"/>
-      </w:pPr>
-      <w:r>
-        <w:t xml:space="preserve">Among 44 pain genes overlapping the Norman K562 dataset, 59.1% (26/44) have mean expression below 0.01 (log-normalized counts), including key nociception genes SCN11A, TRPV1, and P2RX3. Mean pain-gene expression (0.117) is comparable to the genome-wide mean (0.107). We interpret K562 as a worst-case test scenario for domain KG evaluation, with the caveat that most nociception-specific transcriptional programs are inactive in this cell line.</w:t>
+    <w:bookmarkStart w:id="38" w:name="extracting-pathway-subnetworks"/>
+    <w:p>
+      <w:pPr>
+        <w:pStyle w:val="Heading3"/>
+      </w:pPr>
+      <w:r>
+        <w:t xml:space="preserve">4.2 Extracting Pathway Subnetworks</w:t>
+      </w:r>
+    </w:p>
+    <w:p>
+      <w:pPr>
+        <w:pStyle w:val="SourceCode"/>
+      </w:pPr>
+      <w:r>
+        <w:rPr>
+          <w:rStyle w:val="CommentTok"/>
+        </w:rPr>
+        <w:t xml:space="preserve"># Extract the opioid signaling subnetwork</w:t>
+      </w:r>
+      <w:r>
+        <w:br/>
+      </w:r>
+      <w:r>
+        <w:rPr>
+          <w:rStyle w:val="NormalTok"/>
+        </w:rPr>
+        <w:t xml:space="preserve">opioid_genes </w:t>
+      </w:r>
+      <w:r>
+        <w:rPr>
+          <w:rStyle w:val="OperatorTok"/>
+        </w:rPr>
+        <w:t xml:space="preserve">=</w:t>
+      </w:r>
+      <w:r>
+        <w:rPr>
+          <w:rStyle w:val="NormalTok"/>
+        </w:rPr>
+        <w:t xml:space="preserve"> {</w:t>
+      </w:r>
+      <w:r>
+        <w:rPr>
+          <w:rStyle w:val="StringTok"/>
+        </w:rPr>
+        <w:t xml:space="preserve">"OPRM1"</w:t>
+      </w:r>
+      <w:r>
+        <w:rPr>
+          <w:rStyle w:val="NormalTok"/>
+        </w:rPr>
+        <w:t xml:space="preserve">, </w:t>
+      </w:r>
+      <w:r>
+        <w:rPr>
+          <w:rStyle w:val="StringTok"/>
+        </w:rPr>
+        <w:t xml:space="preserve">"OPRD1"</w:t>
+      </w:r>
+      <w:r>
+        <w:rPr>
+          <w:rStyle w:val="NormalTok"/>
+        </w:rPr>
+        <w:t xml:space="preserve">, </w:t>
+      </w:r>
+      <w:r>
+        <w:rPr>
+          <w:rStyle w:val="StringTok"/>
+        </w:rPr>
+        <w:t xml:space="preserve">"OPRK1"</w:t>
+      </w:r>
+      <w:r>
+        <w:rPr>
+          <w:rStyle w:val="NormalTok"/>
+        </w:rPr>
+        <w:t xml:space="preserve">, </w:t>
+      </w:r>
+      <w:r>
+        <w:rPr>
+          <w:rStyle w:val="StringTok"/>
+        </w:rPr>
+        <w:t xml:space="preserve">"POMC"</w:t>
+      </w:r>
+      <w:r>
+        <w:rPr>
+          <w:rStyle w:val="NormalTok"/>
+        </w:rPr>
+        <w:t xml:space="preserve">, </w:t>
+      </w:r>
+      <w:r>
+        <w:rPr>
+          <w:rStyle w:val="StringTok"/>
+        </w:rPr>
+        <w:t xml:space="preserve">"PENK"</w:t>
+      </w:r>
+      <w:r>
+        <w:rPr>
+          <w:rStyle w:val="NormalTok"/>
+        </w:rPr>
+        <w:t xml:space="preserve">, </w:t>
+      </w:r>
+      <w:r>
+        <w:rPr>
+          <w:rStyle w:val="StringTok"/>
+        </w:rPr>
+        <w:t xml:space="preserve">"PDYN"</w:t>
+      </w:r>
+      <w:r>
+        <w:rPr>
+          <w:rStyle w:val="NormalTok"/>
+        </w:rPr>
+        <w:t xml:space="preserve">}</w:t>
+      </w:r>
+      <w:r>
+        <w:br/>
+      </w:r>
+      <w:r>
+        <w:rPr>
+          <w:rStyle w:val="NormalTok"/>
+        </w:rPr>
+        <w:t xml:space="preserve">opioid_nodes </w:t>
+      </w:r>
+      <w:r>
+        <w:rPr>
+          <w:rStyle w:val="OperatorTok"/>
+        </w:rPr>
+        <w:t xml:space="preserve">=</w:t>
+      </w:r>
+      <w:r>
+        <w:rPr>
+          <w:rStyle w:val="NormalTok"/>
+        </w:rPr>
+        <w:t xml:space="preserve"> {n </w:t>
+      </w:r>
+      <w:r>
+        <w:rPr>
+          <w:rStyle w:val="ControlFlowTok"/>
+        </w:rPr>
+        <w:t xml:space="preserve">for</w:t>
+      </w:r>
+      <w:r>
+        <w:rPr>
+          <w:rStyle w:val="NormalTok"/>
+        </w:rPr>
+        <w:t xml:space="preserve"> n, d </w:t>
+      </w:r>
+      <w:r>
+        <w:rPr>
+          <w:rStyle w:val="KeywordTok"/>
+        </w:rPr>
+        <w:t xml:space="preserve">in</w:t>
+      </w:r>
+      <w:r>
+        <w:rPr>
+          <w:rStyle w:val="NormalTok"/>
+        </w:rPr>
+        <w:t xml:space="preserve"> g.nodes(data</w:t>
+      </w:r>
+      <w:r>
+        <w:rPr>
+          <w:rStyle w:val="OperatorTok"/>
+        </w:rPr>
+        <w:t xml:space="preserve">=</w:t>
+      </w:r>
+      <w:r>
+        <w:rPr>
+          <w:rStyle w:val="VariableTok"/>
+        </w:rPr>
+        <w:t xml:space="preserve">True</w:t>
+      </w:r>
+      <w:r>
+        <w:rPr>
+          <w:rStyle w:val="NormalTok"/>
+        </w:rPr>
+        <w:t xml:space="preserve">)</w:t>
+      </w:r>
+      <w:r>
+        <w:br/>
+      </w:r>
+      <w:r>
+        <w:rPr>
+          <w:rStyle w:val="NormalTok"/>
+        </w:rPr>
+        <w:t xml:space="preserve">                </w:t>
+      </w:r>
+      <w:r>
+        <w:rPr>
+          <w:rStyle w:val="ControlFlowTok"/>
+        </w:rPr>
+        <w:t xml:space="preserve">if</w:t>
+      </w:r>
+      <w:r>
+        <w:rPr>
+          <w:rStyle w:val="NormalTok"/>
+        </w:rPr>
+        <w:t xml:space="preserve"> </w:t>
+      </w:r>
+      <w:r>
+        <w:rPr>
+          <w:rStyle w:val="BuiltInTok"/>
+        </w:rPr>
+        <w:t xml:space="preserve">str</w:t>
+      </w:r>
+      <w:r>
+        <w:rPr>
+          <w:rStyle w:val="NormalTok"/>
+        </w:rPr>
+        <w:t xml:space="preserve">(d.get(</w:t>
+      </w:r>
+      <w:r>
+        <w:rPr>
+          <w:rStyle w:val="StringTok"/>
+        </w:rPr>
+        <w:t xml:space="preserve">"node_name"</w:t>
+      </w:r>
+      <w:r>
+        <w:rPr>
+          <w:rStyle w:val="NormalTok"/>
+        </w:rPr>
+        <w:t xml:space="preserve">, </w:t>
+      </w:r>
+      <w:r>
+        <w:rPr>
+          <w:rStyle w:val="StringTok"/>
+        </w:rPr>
+        <w:t xml:space="preserve">""</w:t>
+      </w:r>
+      <w:r>
+        <w:rPr>
+          <w:rStyle w:val="NormalTok"/>
+        </w:rPr>
+        <w:t xml:space="preserve">)).upper() </w:t>
+      </w:r>
+      <w:r>
+        <w:rPr>
+          <w:rStyle w:val="KeywordTok"/>
+        </w:rPr>
+        <w:t xml:space="preserve">in</w:t>
+      </w:r>
+      <w:r>
+        <w:rPr>
+          <w:rStyle w:val="NormalTok"/>
+        </w:rPr>
+        <w:t xml:space="preserve"> opioid_genes}</w:t>
+      </w:r>
+      <w:r>
+        <w:br/>
+      </w:r>
+      <w:r>
+        <w:rPr>
+          <w:rStyle w:val="NormalTok"/>
+        </w:rPr>
+        <w:t xml:space="preserve">subgraph </w:t>
+      </w:r>
+      <w:r>
+        <w:rPr>
+          <w:rStyle w:val="OperatorTok"/>
+        </w:rPr>
+        <w:t xml:space="preserve">=</w:t>
+      </w:r>
+      <w:r>
+        <w:rPr>
+          <w:rStyle w:val="NormalTok"/>
+        </w:rPr>
+        <w:t xml:space="preserve"> g.subgraph(opioid_nodes)</w:t>
+      </w:r>
+      <w:r>
+        <w:br/>
+      </w:r>
+      <w:r>
+        <w:rPr>
+          <w:rStyle w:val="ImportTok"/>
+        </w:rPr>
+        <w:t xml:space="preserve">import</w:t>
+      </w:r>
+      <w:r>
+        <w:rPr>
+          <w:rStyle w:val="NormalTok"/>
+        </w:rPr>
+        <w:t xml:space="preserve"> networkx </w:t>
+      </w:r>
+      <w:r>
+        <w:rPr>
+          <w:rStyle w:val="ImportTok"/>
+        </w:rPr>
+        <w:t xml:space="preserve">as</w:t>
+      </w:r>
+      <w:r>
+        <w:rPr>
+          <w:rStyle w:val="NormalTok"/>
+        </w:rPr>
+        <w:t xml:space="preserve"> nx</w:t>
+      </w:r>
+      <w:r>
+        <w:br/>
+      </w:r>
+      <w:r>
+        <w:rPr>
+          <w:rStyle w:val="NormalTok"/>
+        </w:rPr>
+        <w:t xml:space="preserve">nx.write_graphml(subgraph, </w:t>
+      </w:r>
+      <w:r>
+        <w:rPr>
+          <w:rStyle w:val="StringTok"/>
+        </w:rPr>
+        <w:t xml:space="preserve">"opioid_pathway.graphml"</w:t>
+      </w:r>
+      <w:r>
+        <w:rPr>
+          <w:rStyle w:val="NormalTok"/>
+        </w:rPr>
+        <w:t xml:space="preserve">)</w:t>
       </w:r>
     </w:p>
     <w:bookmarkEnd w:id="38"/>
-    <w:bookmarkStart w:id="39" w:name="X7d485132c60145721f441b2d47ec2b2a3806ab4"/>
-    <w:p>
-      <w:pPr>
-        <w:pStyle w:val="Heading4"/>
-      </w:pPr>
-      <w:r>
-        <w:t xml:space="preserve">3.3.4 Perturbation Prediction Performance Benchmark</w:t>
-      </w:r>
-    </w:p>
-    <w:p>
-      <w:pPr>
-        <w:pStyle w:val="FirstParagraph"/>
-      </w:pPr>
-      <w:r>
-        <w:rPr>
-          <w:b/>
-          <w:bCs/>
-        </w:rPr>
-        <w:t xml:space="preserve">Table 2. Multi-split benchmark results (mean +/- SD across 10 splits)</w:t>
-      </w:r>
-    </w:p>
-    <w:tbl>
-      <w:tblPr>
-        <w:tblStyle w:val="Table"/>
-        <w:tblW w:type="pct" w:w="5000"/>
-        <w:tblLayout w:type="fixed"/>
-        <w:tblLook w:firstRow="1" w:lastRow="0" w:firstColumn="0" w:lastColumn="0" w:noHBand="0" w:noVBand="0" w:val="0020"/>
-      </w:tblPr>
-      <w:tblGrid>
-        <w:gridCol w:w="1089"/>
-        <w:gridCol w:w="1188"/>
-        <w:gridCol w:w="1287"/>
-        <w:gridCol w:w="1089"/>
-        <w:gridCol w:w="990"/>
-        <w:gridCol w:w="990"/>
-        <w:gridCol w:w="1287"/>
-      </w:tblGrid>
-      <w:tr>
-        <w:trPr>
-          <w:tblHeader w:val="on"/>
-        </w:trPr>
-        <w:tc>
-          <w:tcPr/>
-          <w:p>
-            <w:pPr>
-              <w:pStyle w:val="Compact"/>
-            </w:pPr>
-            <w:r>
-              <w:t xml:space="preserve">KG Variant</w:t>
-            </w:r>
-          </w:p>
-        </w:tc>
-        <w:tc>
-          <w:tcPr/>
-          <w:p>
-            <w:pPr>
-              <w:pStyle w:val="Compact"/>
-            </w:pPr>
-            <w:r>
-              <w:t xml:space="preserve">All Genes r</w:t>
-            </w:r>
-          </w:p>
-        </w:tc>
-        <w:tc>
-          <w:tcPr/>
-          <w:p>
-            <w:pPr>
-              <w:pStyle w:val="Compact"/>
-            </w:pPr>
-            <w:r>
-              <w:t xml:space="preserve">Pain Genes r</w:t>
-            </w:r>
-          </w:p>
-        </w:tc>
-        <w:tc>
-          <w:tcPr/>
-          <w:p>
-            <w:pPr>
-              <w:pStyle w:val="Compact"/>
-            </w:pPr>
-            <w:r>
-              <w:t xml:space="preserve">Non-pain r</w:t>
-            </w:r>
-          </w:p>
-        </w:tc>
-        <w:tc>
-          <w:tcPr/>
-          <w:p>
-            <w:pPr>
-              <w:pStyle w:val="Compact"/>
-            </w:pPr>
-            <w:r>
-              <w:t xml:space="preserve">Track A r</w:t>
-            </w:r>
-          </w:p>
-        </w:tc>
-        <w:tc>
-          <w:tcPr/>
-          <w:p>
-            <w:pPr>
-              <w:pStyle w:val="Compact"/>
-            </w:pPr>
-            <w:r>
-              <w:t xml:space="preserve">Track B r</w:t>
-            </w:r>
-          </w:p>
-        </w:tc>
-        <w:tc>
-          <w:tcPr/>
-          <w:p>
-            <w:pPr>
-              <w:pStyle w:val="Compact"/>
-            </w:pPr>
-            <w:r>
-              <w:t xml:space="preserve">Track Dual r</w:t>
-            </w:r>
-          </w:p>
-        </w:tc>
-      </w:tr>
-      <w:tr>
-        <w:tc>
-          <w:tcPr/>
-          <w:p>
-            <w:pPr>
-              <w:pStyle w:val="Compact"/>
-            </w:pPr>
-            <w:r>
-              <w:t xml:space="preserve">Random (5x mean)</w:t>
-            </w:r>
-          </w:p>
-        </w:tc>
-        <w:tc>
-          <w:tcPr/>
-          <w:p>
-            <w:pPr>
-              <w:pStyle w:val="Compact"/>
-            </w:pPr>
-            <w:r>
-              <w:t xml:space="preserve">0.653 +/- 0.010</w:t>
-            </w:r>
-          </w:p>
-        </w:tc>
-        <w:tc>
-          <w:tcPr/>
-          <w:p>
-            <w:pPr>
-              <w:pStyle w:val="Compact"/>
-            </w:pPr>
-            <w:r>
-              <w:t xml:space="preserve">0.591 +/- 0.015</w:t>
-            </w:r>
-          </w:p>
-        </w:tc>
-        <w:tc>
-          <w:tcPr/>
-          <w:p>
-            <w:pPr>
-              <w:pStyle w:val="Compact"/>
-            </w:pPr>
-            <w:r>
-              <w:t xml:space="preserve">0.653 +/- 0.010</w:t>
-            </w:r>
-          </w:p>
-        </w:tc>
-        <w:tc>
-          <w:tcPr/>
-          <w:p>
-            <w:pPr>
-              <w:pStyle w:val="Compact"/>
-            </w:pPr>
-            <w:r>
-              <w:t xml:space="preserve">0.080 +/- 0.019</w:t>
-            </w:r>
-          </w:p>
-        </w:tc>
-        <w:tc>
-          <w:tcPr/>
-          <w:p>
-            <w:pPr>
-              <w:pStyle w:val="Compact"/>
-            </w:pPr>
-            <w:r>
-              <w:t xml:space="preserve">0.552 +/- 0.019</w:t>
-            </w:r>
-          </w:p>
-        </w:tc>
-        <w:tc>
-          <w:tcPr/>
-          <w:p>
-            <w:pPr>
-              <w:pStyle w:val="Compact"/>
-            </w:pPr>
-            <w:r>
-              <w:t xml:space="preserve">0.592 +/- 0.015</w:t>
-            </w:r>
-          </w:p>
-        </w:tc>
-      </w:tr>
-      <w:tr>
-        <w:tc>
-          <w:tcPr/>
-          <w:p>
-            <w:pPr>
-              <w:pStyle w:val="Compact"/>
-            </w:pPr>
-            <w:r>
-              <w:t xml:space="preserve">GO-painCentric</w:t>
-            </w:r>
-          </w:p>
-        </w:tc>
-        <w:tc>
-          <w:tcPr/>
-          <w:p>
-            <w:pPr>
-              <w:pStyle w:val="Compact"/>
-            </w:pPr>
-            <w:r>
-              <w:t xml:space="preserve">0.604 +/- 0.054</w:t>
-            </w:r>
-          </w:p>
-        </w:tc>
-        <w:tc>
-          <w:tcPr/>
-          <w:p>
-            <w:pPr>
-              <w:pStyle w:val="Compact"/>
-            </w:pPr>
-            <w:r>
-              <w:t xml:space="preserve">0.523 +/- 0.065</w:t>
-            </w:r>
-          </w:p>
-        </w:tc>
-        <w:tc>
-          <w:tcPr/>
-          <w:p>
-            <w:pPr>
-              <w:pStyle w:val="Compact"/>
-            </w:pPr>
-            <w:r>
-              <w:t xml:space="preserve">0.604 +/- 0.054</w:t>
-            </w:r>
-          </w:p>
-        </w:tc>
-        <w:tc>
-          <w:tcPr/>
-          <w:p>
-            <w:pPr>
-              <w:pStyle w:val="Compact"/>
-            </w:pPr>
-            <w:r>
-              <w:t xml:space="preserve">0.055 +/- 0.085</w:t>
-            </w:r>
-          </w:p>
-        </w:tc>
-        <w:tc>
-          <w:tcPr/>
-          <w:p>
-            <w:pPr>
-              <w:pStyle w:val="Compact"/>
-            </w:pPr>
-            <w:r>
-              <w:t xml:space="preserve">0.555 +/- 0.183</w:t>
-            </w:r>
-          </w:p>
-        </w:tc>
-        <w:tc>
-          <w:tcPr/>
-          <w:p>
-            <w:pPr>
-              <w:pStyle w:val="Compact"/>
-            </w:pPr>
-            <w:r>
-              <w:t xml:space="preserve">0.518 +/- 0.063</w:t>
-            </w:r>
-          </w:p>
-        </w:tc>
-      </w:tr>
-      <w:tr>
-        <w:tc>
-          <w:tcPr/>
-          <w:p>
-            <w:pPr>
-              <w:pStyle w:val="Compact"/>
-            </w:pPr>
-            <w:r>
-              <w:t xml:space="preserve">GO-BP</w:t>
-            </w:r>
-          </w:p>
-        </w:tc>
-        <w:tc>
-          <w:tcPr/>
-          <w:p>
-            <w:pPr>
-              <w:pStyle w:val="Compact"/>
-            </w:pPr>
-            <w:r>
-              <w:t xml:space="preserve">0.589 +/- 0.048</w:t>
-            </w:r>
-          </w:p>
-        </w:tc>
-        <w:tc>
-          <w:tcPr/>
-          <w:p>
-            <w:pPr>
-              <w:pStyle w:val="Compact"/>
-            </w:pPr>
-            <w:r>
-              <w:t xml:space="preserve">0.542 +/- 0.055</w:t>
-            </w:r>
-          </w:p>
-        </w:tc>
-        <w:tc>
-          <w:tcPr/>
-          <w:p>
-            <w:pPr>
-              <w:pStyle w:val="Compact"/>
-            </w:pPr>
-            <w:r>
-              <w:t xml:space="preserve">0.590 +/- 0.048</w:t>
-            </w:r>
-          </w:p>
-        </w:tc>
-        <w:tc>
-          <w:tcPr/>
-          <w:p>
-            <w:pPr>
-              <w:pStyle w:val="Compact"/>
-            </w:pPr>
-            <w:r>
-              <w:t xml:space="preserve">0.098 +/- 0.114</w:t>
-            </w:r>
-          </w:p>
-        </w:tc>
-        <w:tc>
-          <w:tcPr/>
-          <w:p>
-            <w:pPr>
-              <w:pStyle w:val="Compact"/>
-            </w:pPr>
-            <w:r>
-              <w:t xml:space="preserve">0.436 +/- 0.099</w:t>
-            </w:r>
-          </w:p>
-        </w:tc>
-        <w:tc>
-          <w:tcPr/>
-          <w:p>
-            <w:pPr>
-              <w:pStyle w:val="Compact"/>
-            </w:pPr>
-            <w:r>
-              <w:t xml:space="preserve">0.542 +/- 0.056</w:t>
-            </w:r>
-          </w:p>
-        </w:tc>
-      </w:tr>
-      <w:tr>
-        <w:tc>
-          <w:tcPr/>
-          <w:p>
-            <w:pPr>
-              <w:pStyle w:val="Compact"/>
-            </w:pPr>
-            <w:r>
-              <w:t xml:space="preserve">RA-PainKG</w:t>
-            </w:r>
-          </w:p>
-        </w:tc>
-        <w:tc>
-          <w:tcPr/>
-          <w:p>
-            <w:pPr>
-              <w:pStyle w:val="Compact"/>
-            </w:pPr>
-            <w:r>
-              <w:t xml:space="preserve">0.551 +/- 0.054</w:t>
-            </w:r>
-          </w:p>
-        </w:tc>
-        <w:tc>
-          <w:tcPr/>
-          <w:p>
-            <w:pPr>
-              <w:pStyle w:val="Compact"/>
-            </w:pPr>
-            <w:r>
-              <w:t xml:space="preserve">0.503 +/- 0.053</w:t>
-            </w:r>
-          </w:p>
-        </w:tc>
-        <w:tc>
-          <w:tcPr/>
-          <w:p>
-            <w:pPr>
-              <w:pStyle w:val="Compact"/>
-            </w:pPr>
-            <w:r>
-              <w:t xml:space="preserve">0.552 +/- 0.054</w:t>
-            </w:r>
-          </w:p>
-        </w:tc>
-        <w:tc>
-          <w:tcPr/>
-          <w:p>
-            <w:pPr>
-              <w:pStyle w:val="Compact"/>
-            </w:pPr>
-            <w:r>
-              <w:t xml:space="preserve">0.097 +/- 0.143</w:t>
-            </w:r>
-          </w:p>
-        </w:tc>
-        <w:tc>
-          <w:tcPr/>
-          <w:p>
-            <w:pPr>
-              <w:pStyle w:val="Compact"/>
-            </w:pPr>
-            <w:r>
-              <w:t xml:space="preserve">0.451 +/- 0.075</w:t>
-            </w:r>
-          </w:p>
-        </w:tc>
-        <w:tc>
-          <w:tcPr/>
-          <w:p>
-            <w:pPr>
-              <w:pStyle w:val="Compact"/>
-            </w:pPr>
-            <w:r>
-              <w:t xml:space="preserve">0.503 +/- 0.060</w:t>
-            </w:r>
-          </w:p>
-        </w:tc>
-      </w:tr>
-      <w:tr>
-        <w:tc>
-          <w:tcPr/>
-          <w:p>
-            <w:pPr>
-              <w:pStyle w:val="Compact"/>
-            </w:pPr>
-            <w:r>
-              <w:t xml:space="preserve">RA-PainKG-degPreserved</w:t>
-            </w:r>
-          </w:p>
-        </w:tc>
-        <w:tc>
-          <w:tcPr/>
-          <w:p>
-            <w:pPr>
-              <w:pStyle w:val="Compact"/>
-            </w:pPr>
-            <w:r>
-              <w:t xml:space="preserve">0.546 +/- 0.049</w:t>
-            </w:r>
-          </w:p>
-        </w:tc>
-        <w:tc>
-          <w:tcPr/>
-          <w:p>
-            <w:pPr>
-              <w:pStyle w:val="Compact"/>
-            </w:pPr>
-            <w:r>
-              <w:t xml:space="preserve">0.483 +/- 0.057</w:t>
-            </w:r>
-          </w:p>
-        </w:tc>
-        <w:tc>
-          <w:tcPr/>
-          <w:p>
-            <w:pPr>
-              <w:pStyle w:val="Compact"/>
-            </w:pPr>
-            <w:r>
-              <w:t xml:space="preserve">0.546 +/- 0.049</w:t>
-            </w:r>
-          </w:p>
-        </w:tc>
-        <w:tc>
-          <w:tcPr/>
-          <w:p>
-            <w:pPr>
-              <w:pStyle w:val="Compact"/>
-            </w:pPr>
-            <w:r>
-              <w:t xml:space="preserve">0.069 +/- 0.084</w:t>
-            </w:r>
-          </w:p>
-        </w:tc>
-        <w:tc>
-          <w:tcPr/>
-          <w:p>
-            <w:pPr>
-              <w:pStyle w:val="Compact"/>
-            </w:pPr>
-            <w:r>
-              <w:t xml:space="preserve">0.460 +/- 0.088</w:t>
-            </w:r>
-          </w:p>
-        </w:tc>
-        <w:tc>
-          <w:tcPr/>
-          <w:p>
-            <w:pPr>
-              <w:pStyle w:val="Compact"/>
-            </w:pPr>
-            <w:r>
-              <w:t xml:space="preserve">0.487 +/- 0.058</w:t>
-            </w:r>
-          </w:p>
-        </w:tc>
-      </w:tr>
-      <w:tr>
-        <w:tc>
-          <w:tcPr/>
-          <w:p>
-            <w:pPr>
-              <w:pStyle w:val="Compact"/>
-            </w:pPr>
-            <w:r>
-              <w:t xml:space="preserve">Identity</w:t>
-            </w:r>
-          </w:p>
-        </w:tc>
-        <w:tc>
-          <w:tcPr/>
-          <w:p>
-            <w:pPr>
-              <w:pStyle w:val="Compact"/>
-            </w:pPr>
-            <w:r>
-              <w:t xml:space="preserve">0.000 +/- 0.000</w:t>
-            </w:r>
-          </w:p>
-        </w:tc>
-        <w:tc>
-          <w:tcPr/>
-          <w:p>
-            <w:pPr>
-              <w:pStyle w:val="Compact"/>
-            </w:pPr>
-            <w:r>
-              <w:t xml:space="preserve">0.000 +/- 0.000</w:t>
-            </w:r>
-          </w:p>
-        </w:tc>
-        <w:tc>
-          <w:tcPr/>
-          <w:p>
-            <w:pPr>
-              <w:pStyle w:val="Compact"/>
-            </w:pPr>
-            <w:r>
-              <w:t xml:space="preserve">0.000 +/- 0.000</w:t>
-            </w:r>
-          </w:p>
-        </w:tc>
-        <w:tc>
-          <w:tcPr/>
-          <w:p>
-            <w:pPr>
-              <w:pStyle w:val="Compact"/>
-            </w:pPr>
-            <w:r>
-              <w:t xml:space="preserve">0.000 +/- 0.000</w:t>
-            </w:r>
-          </w:p>
-        </w:tc>
-        <w:tc>
-          <w:tcPr/>
-          <w:p>
-            <w:pPr>
-              <w:pStyle w:val="Compact"/>
-            </w:pPr>
-            <w:r>
-              <w:t xml:space="preserve">0.000 +/- 0.000</w:t>
-            </w:r>
-          </w:p>
-        </w:tc>
-        <w:tc>
-          <w:tcPr/>
-          <w:p>
-            <w:pPr>
-              <w:pStyle w:val="Compact"/>
-            </w:pPr>
-            <w:r>
-              <w:t xml:space="preserve">0.000 +/- 0.000</w:t>
-            </w:r>
-          </w:p>
-        </w:tc>
-      </w:tr>
-      <w:tr>
-        <w:tc>
-          <w:tcPr/>
-          <w:p>
-            <w:pPr>
-              <w:pStyle w:val="Compact"/>
-            </w:pPr>
-            <w:r>
-              <w:t xml:space="preserve">STRING (gene-symbol filtered)</w:t>
-            </w:r>
-          </w:p>
-        </w:tc>
-        <w:tc>
-          <w:tcPr/>
-          <w:p>
-            <w:pPr>
-              <w:pStyle w:val="Compact"/>
-            </w:pPr>
-            <w:r>
-              <w:t xml:space="preserve">0.000 +/- 0.000</w:t>
-            </w:r>
-          </w:p>
-        </w:tc>
-        <w:tc>
-          <w:tcPr/>
-          <w:p>
-            <w:pPr>
-              <w:pStyle w:val="Compact"/>
-            </w:pPr>
-            <w:r>
-              <w:t xml:space="preserve">0.000 +/- 0.000</w:t>
-            </w:r>
-          </w:p>
-        </w:tc>
-        <w:tc>
-          <w:tcPr/>
-          <w:p>
-            <w:pPr>
-              <w:pStyle w:val="Compact"/>
-            </w:pPr>
-            <w:r>
-              <w:t xml:space="preserve">0.000 +/- 0.000</w:t>
-            </w:r>
-          </w:p>
-        </w:tc>
-        <w:tc>
-          <w:tcPr/>
-          <w:p>
-            <w:pPr>
-              <w:pStyle w:val="Compact"/>
-            </w:pPr>
-            <w:r>
-              <w:t xml:space="preserve">0.000 +/- 0.000</w:t>
-            </w:r>
-          </w:p>
-        </w:tc>
-        <w:tc>
-          <w:tcPr/>
-          <w:p>
-            <w:pPr>
-              <w:pStyle w:val="Compact"/>
-            </w:pPr>
-            <w:r>
-              <w:t xml:space="preserve">0.000 +/- 0.000</w:t>
-            </w:r>
-          </w:p>
-        </w:tc>
-        <w:tc>
-          <w:tcPr/>
-          <w:p>
-            <w:pPr>
-              <w:pStyle w:val="Compact"/>
-            </w:pPr>
-            <w:r>
-              <w:t xml:space="preserve">0.000 +/- 0.000</w:t>
-            </w:r>
-          </w:p>
-        </w:tc>
-      </w:tr>
-    </w:tbl>
-    <w:p>
-      <w:pPr>
-        <w:pStyle w:val="BodyText"/>
-      </w:pPr>
-      <w:r>
-        <w:t xml:space="preserve">Values are mean +/- SD across 10 splits. Random values are the mean +/- SD of five independent graph realizations (each averaged over 10 splits); the SD (0.010–0.015) reflects inter-realization variability. Individual realizations range from r = 0.641 to 0.667 (all genes). GO-painCentric nominally exceeds GO on all-genes r but the difference is not significant (see Table 2). Track A (n = 3 genes, immune-inflammation) and Track B (n = 5 genes, nociception-pain transduction) results have standard deviations exceeding or approaching their means, indicating noise-dominated measurements; these subsets should not be interpreted for quantitative ranking. The Identity (no-edge) and STRING KGs both produced r = 0.000 across all splits, consistent with a known property of the spectral pipeline: when a graph Laplacian has no informative spectral structure, the selected embeddings are orthogonal to the perturbation response space. The STRING result (r = 0.000 despite 15,403 edges) does not contradict the density hypothesis because STRING edges were filtered to gene-symbol-level precision at the 5,045-gene scale, which degrades the spectral structure relative to the intentionally dense Random graphs; this filtering was necessary for identifier compatibility but likely removed most of STRING’s topological information. The representative dense graph Random_R1 (all-genes r = 0.667, pain r = 0.620) is used for paired comparisons in Table 2.</w:t>
-      </w:r>
-    </w:p>
-    <w:p>
-      <w:pPr>
-        <w:pStyle w:val="BodyText"/>
-      </w:pPr>
-      <w:r>
-        <w:rPr>
-          <w:b/>
-          <w:bCs/>
-        </w:rPr>
-        <w:t xml:space="preserve">Table 3. Paired comparisons with delta-r 95% confidence intervals (pain genes)</w:t>
-      </w:r>
-    </w:p>
-    <w:tbl>
-      <w:tblPr>
-        <w:tblStyle w:val="Table"/>
-        <w:tblW w:type="pct" w:w="5000"/>
-        <w:tblLayout w:type="fixed"/>
-        <w:tblLook w:firstRow="1" w:lastRow="0" w:firstColumn="0" w:lastColumn="0" w:noHBand="0" w:noVBand="0" w:val="0020"/>
-      </w:tblPr>
-      <w:tblGrid>
-        <w:gridCol w:w="1049"/>
-        <w:gridCol w:w="858"/>
-        <w:gridCol w:w="763"/>
-        <w:gridCol w:w="858"/>
-        <w:gridCol w:w="2099"/>
-        <w:gridCol w:w="2290"/>
-      </w:tblGrid>
-      <w:tr>
-        <w:trPr>
-          <w:tblHeader w:val="on"/>
-        </w:trPr>
-        <w:tc>
-          <w:tcPr/>
-          <w:p>
-            <w:pPr>
-              <w:pStyle w:val="Compact"/>
-            </w:pPr>
-            <w:r>
-              <w:t xml:space="preserve">Comparison</w:t>
-            </w:r>
-          </w:p>
-        </w:tc>
-        <w:tc>
-          <w:tcPr/>
-          <w:p>
-            <w:pPr>
-              <w:pStyle w:val="Compact"/>
-            </w:pPr>
-            <w:r>
-              <w:t xml:space="preserve">Delta r</w:t>
-            </w:r>
-          </w:p>
-        </w:tc>
-        <w:tc>
-          <w:tcPr/>
-          <w:p>
-            <w:pPr>
-              <w:pStyle w:val="Compact"/>
-            </w:pPr>
-            <w:r>
-              <w:t xml:space="preserve">95% CI</w:t>
-            </w:r>
-          </w:p>
-        </w:tc>
-        <w:tc>
-          <w:tcPr/>
-          <w:p>
-            <w:pPr>
-              <w:pStyle w:val="Compact"/>
-            </w:pPr>
-            <w:r>
-              <w:t xml:space="preserve">p-value</w:t>
-            </w:r>
-          </w:p>
-        </w:tc>
-        <w:tc>
-          <w:tcPr/>
-          <w:p>
-            <w:pPr>
-              <w:pStyle w:val="Compact"/>
-            </w:pPr>
-            <w:r>
-              <w:t xml:space="preserve">Significant (nominal)</w:t>
-            </w:r>
-          </w:p>
-        </w:tc>
-        <w:tc>
-          <w:tcPr/>
-          <w:p>
-            <w:pPr>
-              <w:pStyle w:val="Compact"/>
-            </w:pPr>
-            <w:r>
-              <w:t xml:space="preserve">Significant (Bonferroni)</w:t>
-            </w:r>
-          </w:p>
-        </w:tc>
-      </w:tr>
-      <w:tr>
-        <w:tc>
-          <w:tcPr/>
-          <w:p>
-            <w:pPr>
-              <w:pStyle w:val="Compact"/>
-            </w:pPr>
-            <w:r>
-              <w:t xml:space="preserve">Random_R1 vs RA-PainKG</w:t>
-            </w:r>
-          </w:p>
-        </w:tc>
-        <w:tc>
-          <w:tcPr/>
-          <w:p>
-            <w:pPr>
-              <w:pStyle w:val="Compact"/>
-            </w:pPr>
-            <w:r>
-              <w:t xml:space="preserve">+0.117</w:t>
-            </w:r>
-          </w:p>
-        </w:tc>
-        <w:tc>
-          <w:tcPr/>
-          <w:p>
-            <w:pPr>
-              <w:pStyle w:val="Compact"/>
-            </w:pPr>
-            <w:r>
-              <w:t xml:space="preserve">[+0.083, +0.150]</w:t>
-            </w:r>
-          </w:p>
-        </w:tc>
-        <w:tc>
-          <w:tcPr/>
-          <w:p>
-            <w:pPr>
-              <w:pStyle w:val="Compact"/>
-            </w:pPr>
-            <w:r>
-              <w:t xml:space="preserve">&lt;0.001</w:t>
-            </w:r>
-          </w:p>
-        </w:tc>
-        <w:tc>
-          <w:tcPr/>
-          <w:p>
-            <w:pPr>
-              <w:pStyle w:val="Compact"/>
-            </w:pPr>
-            <w:r>
-              <w:t xml:space="preserve">***</w:t>
-            </w:r>
-          </w:p>
-        </w:tc>
-        <w:tc>
-          <w:tcPr/>
-          <w:p>
-            <w:pPr>
-              <w:pStyle w:val="Compact"/>
-            </w:pPr>
-            <w:r>
-              <w:t xml:space="preserve">***</w:t>
-            </w:r>
-          </w:p>
-        </w:tc>
-      </w:tr>
-      <w:tr>
-        <w:tc>
-          <w:tcPr/>
-          <w:p>
-            <w:pPr>
-              <w:pStyle w:val="Compact"/>
-            </w:pPr>
-            <w:r>
-              <w:t xml:space="preserve">Random_R1 vs GO</w:t>
-            </w:r>
-          </w:p>
-        </w:tc>
-        <w:tc>
-          <w:tcPr/>
-          <w:p>
-            <w:pPr>
-              <w:pStyle w:val="Compact"/>
-            </w:pPr>
-            <w:r>
-              <w:t xml:space="preserve">+0.078</w:t>
-            </w:r>
-          </w:p>
-        </w:tc>
-        <w:tc>
-          <w:tcPr/>
-          <w:p>
-            <w:pPr>
-              <w:pStyle w:val="Compact"/>
-            </w:pPr>
-            <w:r>
-              <w:t xml:space="preserve">[+0.059, +0.096]</w:t>
-            </w:r>
-          </w:p>
-        </w:tc>
-        <w:tc>
-          <w:tcPr/>
-          <w:p>
-            <w:pPr>
-              <w:pStyle w:val="Compact"/>
-            </w:pPr>
-            <w:r>
-              <w:t xml:space="preserve">&lt;0.001</w:t>
-            </w:r>
-          </w:p>
-        </w:tc>
-        <w:tc>
-          <w:tcPr/>
-          <w:p>
-            <w:pPr>
-              <w:pStyle w:val="Compact"/>
-            </w:pPr>
-            <w:r>
-              <w:t xml:space="preserve">***</w:t>
-            </w:r>
-          </w:p>
-        </w:tc>
-        <w:tc>
-          <w:tcPr/>
-          <w:p>
-            <w:pPr>
-              <w:pStyle w:val="Compact"/>
-            </w:pPr>
-            <w:r>
-              <w:t xml:space="preserve">***</w:t>
-            </w:r>
-          </w:p>
-        </w:tc>
-      </w:tr>
-      <w:tr>
-        <w:tc>
-          <w:tcPr/>
-          <w:p>
-            <w:pPr>
-              <w:pStyle w:val="Compact"/>
-            </w:pPr>
-            <w:r>
-              <w:t xml:space="preserve">GO-painCentric vs GO</w:t>
-            </w:r>
-          </w:p>
-        </w:tc>
-        <w:tc>
-          <w:tcPr/>
-          <w:p>
-            <w:pPr>
-              <w:pStyle w:val="Compact"/>
-            </w:pPr>
-            <w:r>
-              <w:t xml:space="preserve">-0.019</w:t>
-            </w:r>
-          </w:p>
-        </w:tc>
-        <w:tc>
-          <w:tcPr/>
-          <w:p>
-            <w:pPr>
-              <w:pStyle w:val="Compact"/>
-            </w:pPr>
-            <w:r>
-              <w:t xml:space="preserve">[-0.047, +0.010]</w:t>
-            </w:r>
-          </w:p>
-        </w:tc>
-        <w:tc>
-          <w:tcPr/>
-          <w:p>
-            <w:pPr>
-              <w:pStyle w:val="Compact"/>
-            </w:pPr>
-            <w:r>
-              <w:t xml:space="preserve">0.22</w:t>
-            </w:r>
-          </w:p>
-        </w:tc>
-        <w:tc>
-          <w:tcPr/>
-          <w:p>
-            <w:pPr>
-              <w:pStyle w:val="Compact"/>
-            </w:pPr>
-            <w:r>
-              <w:t xml:space="preserve">ns</w:t>
-            </w:r>
-          </w:p>
-        </w:tc>
-        <w:tc>
-          <w:tcPr/>
-          <w:p>
-            <w:pPr>
-              <w:pStyle w:val="Compact"/>
-            </w:pPr>
-            <w:r>
-              <w:t xml:space="preserve">ns</w:t>
-            </w:r>
-          </w:p>
-        </w:tc>
-      </w:tr>
-      <w:tr>
-        <w:tc>
-          <w:tcPr/>
-          <w:p>
-            <w:pPr>
-              <w:pStyle w:val="Compact"/>
-            </w:pPr>
-            <w:r>
-              <w:t xml:space="preserve">RA-PainKG vs GO</w:t>
-            </w:r>
-          </w:p>
-        </w:tc>
-        <w:tc>
-          <w:tcPr/>
-          <w:p>
-            <w:pPr>
-              <w:pStyle w:val="Compact"/>
-            </w:pPr>
-            <w:r>
-              <w:t xml:space="preserve">-0.039</w:t>
-            </w:r>
-          </w:p>
-        </w:tc>
-        <w:tc>
-          <w:tcPr/>
-          <w:p>
-            <w:pPr>
-              <w:pStyle w:val="Compact"/>
-            </w:pPr>
-            <w:r>
-              <w:t xml:space="preserve">[-0.078, +0.000]</w:t>
-            </w:r>
-          </w:p>
-        </w:tc>
-        <w:tc>
-          <w:tcPr/>
-          <w:p>
-            <w:pPr>
-              <w:pStyle w:val="Compact"/>
-            </w:pPr>
-            <w:r>
-              <w:t xml:space="preserve">0.084</w:t>
-            </w:r>
-          </w:p>
-        </w:tc>
-        <w:tc>
-          <w:tcPr/>
-          <w:p>
-            <w:pPr>
-              <w:pStyle w:val="Compact"/>
-            </w:pPr>
-            <w:r>
-              <w:t xml:space="preserve">ns</w:t>
-            </w:r>
-          </w:p>
-        </w:tc>
-        <w:tc>
-          <w:tcPr/>
-          <w:p>
-            <w:pPr>
-              <w:pStyle w:val="Compact"/>
-            </w:pPr>
-            <w:r>
-              <w:t xml:space="preserve">ns</w:t>
-            </w:r>
-          </w:p>
-        </w:tc>
-      </w:tr>
-      <w:tr>
-        <w:tc>
-          <w:tcPr/>
-          <w:p>
-            <w:pPr>
-              <w:pStyle w:val="Compact"/>
-            </w:pPr>
-            <w:r>
-              <w:t xml:space="preserve">RA-PainKG-degPreserved vs RA-PainKG</w:t>
-            </w:r>
-          </w:p>
-        </w:tc>
-        <w:tc>
-          <w:tcPr/>
-          <w:p>
-            <w:pPr>
-              <w:pStyle w:val="Compact"/>
-            </w:pPr>
-            <w:r>
-              <w:t xml:space="preserve">-0.020 (pain) / -0.005 (all)</w:t>
-            </w:r>
-          </w:p>
-        </w:tc>
-        <w:tc>
-          <w:tcPr/>
-          <w:p>
-            <w:pPr>
-              <w:pStyle w:val="Compact"/>
-            </w:pPr>
-            <w:r>
-              <w:t xml:space="preserve">[-0.065, +0.025] / [-0.052, +0.041]</w:t>
-            </w:r>
-          </w:p>
-        </w:tc>
-        <w:tc>
-          <w:tcPr/>
-          <w:p>
-            <w:pPr>
-              <w:pStyle w:val="Compact"/>
-            </w:pPr>
-            <w:r>
-              <w:t xml:space="preserve">0.41 / 0.83</w:t>
-            </w:r>
-          </w:p>
-        </w:tc>
-        <w:tc>
-          <w:tcPr/>
-          <w:p>
-            <w:pPr>
-              <w:pStyle w:val="Compact"/>
-            </w:pPr>
-            <w:r>
-              <w:t xml:space="preserve">ns</w:t>
-            </w:r>
-          </w:p>
-        </w:tc>
-        <w:tc>
-          <w:tcPr/>
-          <w:p>
-            <w:pPr>
-              <w:pStyle w:val="Compact"/>
-            </w:pPr>
-            <w:r>
-              <w:t xml:space="preserve">ns</w:t>
-            </w:r>
-          </w:p>
-        </w:tc>
-      </w:tr>
-    </w:tbl>
-    <w:p>
-      <w:pPr>
-        <w:pStyle w:val="BodyText"/>
-      </w:pPr>
-      <w:r>
-        <w:rPr>
-          <w:i/>
-          <w:iCs/>
-        </w:rPr>
-        <w:t xml:space="preserve">Shapiro-Wilk tests confirm normality of all paired differences (all W &gt; 0.94, p &gt; 0.05). Bonferroni-adjusted threshold for m = 5 comparisons: alpha = 0.01. All conclusions are identical at nominal and adjusted thresholds.</w:t>
-      </w:r>
-    </w:p>
-    <w:p>
-      <w:pPr>
-        <w:pStyle w:val="BodyText"/>
-      </w:pPr>
-      <w:r>
-        <w:rPr>
-          <w:b/>
-          <w:bCs/>
-        </w:rPr>
-        <w:t xml:space="preserve">Cross-split consistency:</w:t>
-      </w:r>
-      <w:r>
+    <w:bookmarkStart w:id="39" w:name="tissue-expression-profile-retrieval"/>
+    <w:p>
+      <w:pPr>
+        <w:pStyle w:val="Heading3"/>
+      </w:pPr>
+      <w:r>
+        <w:t xml:space="preserve">4.3 Tissue Expression Profile Retrieval</w:t>
+      </w:r>
+    </w:p>
+    <w:p>
+      <w:pPr>
+        <w:pStyle w:val="SourceCode"/>
+      </w:pPr>
+      <w:r>
+        <w:rPr>
+          <w:rStyle w:val="CommentTok"/>
+        </w:rPr>
+        <w:t xml:space="preserve"># Retrieve GTEx tissue expression for all Track B pain genes</w:t>
+      </w:r>
+      <w:r>
+        <w:br/>
+      </w:r>
+      <w:r>
+        <w:rPr>
+          <w:rStyle w:val="NormalTok"/>
+        </w:rPr>
+        <w:t xml:space="preserve">track_b_genes </w:t>
+      </w:r>
+      <w:r>
+        <w:rPr>
+          <w:rStyle w:val="OperatorTok"/>
+        </w:rPr>
+        <w:t xml:space="preserve">=</w:t>
+      </w:r>
+      <w:r>
+        <w:rPr>
+          <w:rStyle w:val="NormalTok"/>
+        </w:rPr>
+        <w:t xml:space="preserve"> [d[</w:t>
+      </w:r>
+      <w:r>
+        <w:rPr>
+          <w:rStyle w:val="StringTok"/>
+        </w:rPr>
+        <w:t xml:space="preserve">"node_name"</w:t>
+      </w:r>
+      <w:r>
+        <w:rPr>
+          <w:rStyle w:val="NormalTok"/>
+        </w:rPr>
+        <w:t xml:space="preserve">] </w:t>
+      </w:r>
+      <w:r>
+        <w:rPr>
+          <w:rStyle w:val="ControlFlowTok"/>
+        </w:rPr>
+        <w:t xml:space="preserve">for</w:t>
+      </w:r>
+      <w:r>
+        <w:rPr>
+          <w:rStyle w:val="NormalTok"/>
+        </w:rPr>
+        <w:t xml:space="preserve"> _, d </w:t>
+      </w:r>
+      <w:r>
+        <w:rPr>
+          <w:rStyle w:val="KeywordTok"/>
+        </w:rPr>
+        <w:t xml:space="preserve">in</w:t>
+      </w:r>
+      <w:r>
+        <w:rPr>
+          <w:rStyle w:val="NormalTok"/>
+        </w:rPr>
+        <w:t xml:space="preserve"> g.nodes(data</w:t>
+      </w:r>
+      <w:r>
+        <w:rPr>
+          <w:rStyle w:val="OperatorTok"/>
+        </w:rPr>
+        <w:t xml:space="preserve">=</w:t>
+      </w:r>
+      <w:r>
+        <w:rPr>
+          <w:rStyle w:val="VariableTok"/>
+        </w:rPr>
+        <w:t xml:space="preserve">True</w:t>
+      </w:r>
+      <w:r>
+        <w:rPr>
+          <w:rStyle w:val="NormalTok"/>
+        </w:rPr>
+        <w:t xml:space="preserve">)</w:t>
+      </w:r>
+      <w:r>
+        <w:br/>
+      </w:r>
+      <w:r>
+        <w:rPr>
+          <w:rStyle w:val="NormalTok"/>
+        </w:rPr>
+        <w:t xml:space="preserve">                 </w:t>
+      </w:r>
+      <w:r>
+        <w:rPr>
+          <w:rStyle w:val="ControlFlowTok"/>
+        </w:rPr>
+        <w:t xml:space="preserve">if</w:t>
+      </w:r>
+      <w:r>
+        <w:rPr>
+          <w:rStyle w:val="NormalTok"/>
+        </w:rPr>
+        <w:t xml:space="preserve"> d.get(</w:t>
+      </w:r>
+      <w:r>
+        <w:rPr>
+          <w:rStyle w:val="StringTok"/>
+        </w:rPr>
+        <w:t xml:space="preserve">"track"</w:t>
+      </w:r>
+      <w:r>
+        <w:rPr>
+          <w:rStyle w:val="NormalTok"/>
+        </w:rPr>
+        <w:t xml:space="preserve">) </w:t>
+      </w:r>
+      <w:r>
+        <w:rPr>
+          <w:rStyle w:val="OperatorTok"/>
+        </w:rPr>
+        <w:t xml:space="preserve">==</w:t>
+      </w:r>
+      <w:r>
+        <w:rPr>
+          <w:rStyle w:val="NormalTok"/>
+        </w:rPr>
         <w:t xml:space="preserve"> </w:t>
       </w:r>
       <w:r>
-        <w:t xml:space="preserve">Kendall’s W = 0.64 (all-genes) and 0.65 (pain-genes) across 8 non-degenerate KGs, reflecting moderate ranking consistency. The best-performing dense graph (Random_R1) ranked first in 26 of 30 split-subset combinations. GO ranked second in 18/30, RA-PainKG third in 22/30.</w:t>
-      </w:r>
-    </w:p>
-    <w:p>
-      <w:pPr>
-        <w:pStyle w:val="BodyText"/>
-      </w:pPr>
-      <w:r>
-        <w:rPr>
-          <w:b/>
-          <w:bCs/>
-        </w:rPr>
-        <w:t xml:space="preserve">Nonlinear model comparison:</w:t>
-      </w:r>
-      <w:r>
+        <w:rPr>
+          <w:rStyle w:val="StringTok"/>
+        </w:rPr>
+        <w:t xml:space="preserve">"B"</w:t>
+      </w:r>
+      <w:r>
+        <w:rPr>
+          <w:rStyle w:val="NormalTok"/>
+        </w:rPr>
         <w:t xml:space="preserve"> </w:t>
       </w:r>
       <w:r>
-        <w:t xml:space="preserve">A 2-layer MLP (128 hidden units, ReLU activation, alpha = 0.1, early stopping) trained on one representative split (seed 42) yielded lower performance than ridge regression (GO: r = 0.46; RA-PainKG: r = 0.46) and attenuated KG distinctions (delta &lt; 0.01). This single-split exploratory result provides qualitative evidence that the linear model is more informative for KG ablation; formal multi-split nonlinear benchmarking is deferred to future work.</w:t>
+        <w:rPr>
+          <w:rStyle w:val="KeywordTok"/>
+        </w:rPr>
+        <w:t xml:space="preserve">and</w:t>
+      </w:r>
+      <w:r>
+        <w:rPr>
+          <w:rStyle w:val="NormalTok"/>
+        </w:rPr>
+        <w:t xml:space="preserve"> d.get(</w:t>
+      </w:r>
+      <w:r>
+        <w:rPr>
+          <w:rStyle w:val="StringTok"/>
+        </w:rPr>
+        <w:t xml:space="preserve">"node_type"</w:t>
+      </w:r>
+      <w:r>
+        <w:rPr>
+          <w:rStyle w:val="NormalTok"/>
+        </w:rPr>
+        <w:t xml:space="preserve">) </w:t>
+      </w:r>
+      <w:r>
+        <w:rPr>
+          <w:rStyle w:val="OperatorTok"/>
+        </w:rPr>
+        <w:t xml:space="preserve">==</w:t>
+      </w:r>
+      <w:r>
+        <w:rPr>
+          <w:rStyle w:val="NormalTok"/>
+        </w:rPr>
+        <w:t xml:space="preserve"> </w:t>
+      </w:r>
+      <w:r>
+        <w:rPr>
+          <w:rStyle w:val="StringTok"/>
+        </w:rPr>
+        <w:t xml:space="preserve">"gene/protein"</w:t>
+      </w:r>
+      <w:r>
+        <w:rPr>
+          <w:rStyle w:val="NormalTok"/>
+        </w:rPr>
+        <w:t xml:space="preserve">]</w:t>
+      </w:r>
+      <w:r>
+        <w:br/>
+      </w:r>
+      <w:r>
+        <w:rPr>
+          <w:rStyle w:val="ControlFlowTok"/>
+        </w:rPr>
+        <w:t xml:space="preserve">for</w:t>
+      </w:r>
+      <w:r>
+        <w:rPr>
+          <w:rStyle w:val="NormalTok"/>
+        </w:rPr>
+        <w:t xml:space="preserve"> gene </w:t>
+      </w:r>
+      <w:r>
+        <w:rPr>
+          <w:rStyle w:val="KeywordTok"/>
+        </w:rPr>
+        <w:t xml:space="preserve">in</w:t>
+      </w:r>
+      <w:r>
+        <w:rPr>
+          <w:rStyle w:val="NormalTok"/>
+        </w:rPr>
+        <w:t xml:space="preserve"> track_b_genes[:</w:t>
+      </w:r>
+      <w:r>
+        <w:rPr>
+          <w:rStyle w:val="DecValTok"/>
+        </w:rPr>
+        <w:t xml:space="preserve">5</w:t>
+      </w:r>
+      <w:r>
+        <w:rPr>
+          <w:rStyle w:val="NormalTok"/>
+        </w:rPr>
+        <w:t xml:space="preserve">]:</w:t>
+      </w:r>
+      <w:r>
+        <w:br/>
+      </w:r>
+      <w:r>
+        <w:rPr>
+          <w:rStyle w:val="NormalTok"/>
+        </w:rPr>
+        <w:t xml:space="preserve">    expr </w:t>
+      </w:r>
+      <w:r>
+        <w:rPr>
+          <w:rStyle w:val="OperatorTok"/>
+        </w:rPr>
+        <w:t xml:space="preserve">=</w:t>
+      </w:r>
+      <w:r>
+        <w:rPr>
+          <w:rStyle w:val="NormalTok"/>
+        </w:rPr>
+        <w:t xml:space="preserve"> d.get(</w:t>
+      </w:r>
+      <w:r>
+        <w:rPr>
+          <w:rStyle w:val="StringTok"/>
+        </w:rPr>
+        <w:t xml:space="preserve">"gtex_median_tpm"</w:t>
+      </w:r>
+      <w:r>
+        <w:rPr>
+          <w:rStyle w:val="NormalTok"/>
+        </w:rPr>
+        <w:t xml:space="preserve">, {})</w:t>
+      </w:r>
+      <w:r>
+        <w:br/>
+      </w:r>
+      <w:r>
+        <w:rPr>
+          <w:rStyle w:val="NormalTok"/>
+        </w:rPr>
+        <w:t xml:space="preserve">    spinal_cord </w:t>
+      </w:r>
+      <w:r>
+        <w:rPr>
+          <w:rStyle w:val="OperatorTok"/>
+        </w:rPr>
+        <w:t xml:space="preserve">=</w:t>
+      </w:r>
+      <w:r>
+        <w:rPr>
+          <w:rStyle w:val="NormalTok"/>
+        </w:rPr>
+        <w:t xml:space="preserve"> expr.get(</w:t>
+      </w:r>
+      <w:r>
+        <w:rPr>
+          <w:rStyle w:val="StringTok"/>
+        </w:rPr>
+        <w:t xml:space="preserve">"Spinal_Cord_cervical_c-1"</w:t>
+      </w:r>
+      <w:r>
+        <w:rPr>
+          <w:rStyle w:val="NormalTok"/>
+        </w:rPr>
+        <w:t xml:space="preserve">, </w:t>
+      </w:r>
+      <w:r>
+        <w:rPr>
+          <w:rStyle w:val="StringTok"/>
+        </w:rPr>
+        <w:t xml:space="preserve">"N/A"</w:t>
+      </w:r>
+      <w:r>
+        <w:rPr>
+          <w:rStyle w:val="NormalTok"/>
+        </w:rPr>
+        <w:t xml:space="preserve">)</w:t>
+      </w:r>
+      <w:r>
+        <w:br/>
+      </w:r>
+      <w:r>
+        <w:rPr>
+          <w:rStyle w:val="NormalTok"/>
+        </w:rPr>
+        <w:t xml:space="preserve">    tibial_nerve </w:t>
+      </w:r>
+      <w:r>
+        <w:rPr>
+          <w:rStyle w:val="OperatorTok"/>
+        </w:rPr>
+        <w:t xml:space="preserve">=</w:t>
+      </w:r>
+      <w:r>
+        <w:rPr>
+          <w:rStyle w:val="NormalTok"/>
+        </w:rPr>
+        <w:t xml:space="preserve"> expr.get(</w:t>
+      </w:r>
+      <w:r>
+        <w:rPr>
+          <w:rStyle w:val="StringTok"/>
+        </w:rPr>
+        <w:t xml:space="preserve">"Nerve_Tibial"</w:t>
+      </w:r>
+      <w:r>
+        <w:rPr>
+          <w:rStyle w:val="NormalTok"/>
+        </w:rPr>
+        <w:t xml:space="preserve">, </w:t>
+      </w:r>
+      <w:r>
+        <w:rPr>
+          <w:rStyle w:val="StringTok"/>
+        </w:rPr>
+        <w:t xml:space="preserve">"N/A"</w:t>
+      </w:r>
+      <w:r>
+        <w:rPr>
+          <w:rStyle w:val="NormalTok"/>
+        </w:rPr>
+        <w:t xml:space="preserve">)</w:t>
+      </w:r>
+      <w:r>
+        <w:br/>
+      </w:r>
+      <w:r>
+        <w:rPr>
+          <w:rStyle w:val="NormalTok"/>
+        </w:rPr>
+        <w:t xml:space="preserve">    </w:t>
+      </w:r>
+      <w:r>
+        <w:rPr>
+          <w:rStyle w:val="BuiltInTok"/>
+        </w:rPr>
+        <w:t xml:space="preserve">print</w:t>
+      </w:r>
+      <w:r>
+        <w:rPr>
+          <w:rStyle w:val="NormalTok"/>
+        </w:rPr>
+        <w:t xml:space="preserve">(</w:t>
+      </w:r>
+      <w:r>
+        <w:rPr>
+          <w:rStyle w:val="SpecialStringTok"/>
+        </w:rPr>
+        <w:t xml:space="preserve">f"</w:t>
+      </w:r>
+      <w:r>
+        <w:rPr>
+          <w:rStyle w:val="SpecialCharTok"/>
+        </w:rPr>
+        <w:t xml:space="preserve">{</w:t>
+      </w:r>
+      <w:r>
+        <w:rPr>
+          <w:rStyle w:val="NormalTok"/>
+        </w:rPr>
+        <w:t xml:space="preserve">gene</w:t>
+      </w:r>
+      <w:r>
+        <w:rPr>
+          <w:rStyle w:val="SpecialCharTok"/>
+        </w:rPr>
+        <w:t xml:space="preserve">}</w:t>
+      </w:r>
+      <w:r>
+        <w:rPr>
+          <w:rStyle w:val="SpecialStringTok"/>
+        </w:rPr>
+        <w:t xml:space="preserve">: Spinal=</w:t>
+      </w:r>
+      <w:r>
+        <w:rPr>
+          <w:rStyle w:val="SpecialCharTok"/>
+        </w:rPr>
+        <w:t xml:space="preserve">{</w:t>
+      </w:r>
+      <w:r>
+        <w:rPr>
+          <w:rStyle w:val="NormalTok"/>
+        </w:rPr>
+        <w:t xml:space="preserve">spinal_cord</w:t>
+      </w:r>
+      <w:r>
+        <w:rPr>
+          <w:rStyle w:val="SpecialCharTok"/>
+        </w:rPr>
+        <w:t xml:space="preserve">}</w:t>
+      </w:r>
+      <w:r>
+        <w:rPr>
+          <w:rStyle w:val="SpecialStringTok"/>
+        </w:rPr>
+        <w:t xml:space="preserve">, Tibial=</w:t>
+      </w:r>
+      <w:r>
+        <w:rPr>
+          <w:rStyle w:val="SpecialCharTok"/>
+        </w:rPr>
+        <w:t xml:space="preserve">{</w:t>
+      </w:r>
+      <w:r>
+        <w:rPr>
+          <w:rStyle w:val="NormalTok"/>
+        </w:rPr>
+        <w:t xml:space="preserve">tibial_nerve</w:t>
+      </w:r>
+      <w:r>
+        <w:rPr>
+          <w:rStyle w:val="SpecialCharTok"/>
+        </w:rPr>
+        <w:t xml:space="preserve">}</w:t>
+      </w:r>
+      <w:r>
+        <w:rPr>
+          <w:rStyle w:val="SpecialStringTok"/>
+        </w:rPr>
+        <w:t xml:space="preserve">"</w:t>
+      </w:r>
+      <w:r>
+        <w:rPr>
+          <w:rStyle w:val="NormalTok"/>
+        </w:rPr>
+        <w:t xml:space="preserve">)</w:t>
       </w:r>
     </w:p>
     <w:bookmarkEnd w:id="39"/>
-    <w:bookmarkStart w:id="40" w:name="ablation-analysis"/>
-    <w:p>
-      <w:pPr>
-        <w:pStyle w:val="Heading4"/>
-      </w:pPr>
-      <w:r>
-        <w:t xml:space="preserve">3.3.5 Ablation Analysis</w:t>
-      </w:r>
-    </w:p>
-    <w:p>
-      <w:pPr>
-        <w:pStyle w:val="FirstParagraph"/>
-      </w:pPr>
-      <w:r>
-        <w:rPr>
-          <w:b/>
-          <w:bCs/>
-        </w:rPr>
-        <w:t xml:space="preserve">Density ablation:</w:t>
-      </w:r>
-      <w:r>
+    <w:bookmarkStart w:id="40" w:name="identifying-bridge-genes-between-tracks"/>
+    <w:p>
+      <w:pPr>
+        <w:pStyle w:val="Heading3"/>
+      </w:pPr>
+      <w:r>
+        <w:t xml:space="preserve">4.4 Identifying Bridge Genes Between Tracks</w:t>
+      </w:r>
+    </w:p>
+    <w:p>
+      <w:pPr>
+        <w:pStyle w:val="SourceCode"/>
+      </w:pPr>
+      <w:r>
+        <w:rPr>
+          <w:rStyle w:val="CommentTok"/>
+        </w:rPr>
+        <w:t xml:space="preserve"># Find genes connecting Track A and Track B in the PPI subgraph</w:t>
+      </w:r>
+      <w:r>
+        <w:br/>
+      </w:r>
+      <w:r>
+        <w:rPr>
+          <w:rStyle w:val="NormalTok"/>
+        </w:rPr>
+        <w:t xml:space="preserve">track_a_nodes </w:t>
+      </w:r>
+      <w:r>
+        <w:rPr>
+          <w:rStyle w:val="OperatorTok"/>
+        </w:rPr>
+        <w:t xml:space="preserve">=</w:t>
+      </w:r>
+      <w:r>
+        <w:rPr>
+          <w:rStyle w:val="NormalTok"/>
+        </w:rPr>
+        <w:t xml:space="preserve"> {n </w:t>
+      </w:r>
+      <w:r>
+        <w:rPr>
+          <w:rStyle w:val="ControlFlowTok"/>
+        </w:rPr>
+        <w:t xml:space="preserve">for</w:t>
+      </w:r>
+      <w:r>
+        <w:rPr>
+          <w:rStyle w:val="NormalTok"/>
+        </w:rPr>
+        <w:t xml:space="preserve"> n, d </w:t>
+      </w:r>
+      <w:r>
+        <w:rPr>
+          <w:rStyle w:val="KeywordTok"/>
+        </w:rPr>
+        <w:t xml:space="preserve">in</w:t>
+      </w:r>
+      <w:r>
+        <w:rPr>
+          <w:rStyle w:val="NormalTok"/>
+        </w:rPr>
+        <w:t xml:space="preserve"> g.nodes(data</w:t>
+      </w:r>
+      <w:r>
+        <w:rPr>
+          <w:rStyle w:val="OperatorTok"/>
+        </w:rPr>
+        <w:t xml:space="preserve">=</w:t>
+      </w:r>
+      <w:r>
+        <w:rPr>
+          <w:rStyle w:val="VariableTok"/>
+        </w:rPr>
+        <w:t xml:space="preserve">True</w:t>
+      </w:r>
+      <w:r>
+        <w:rPr>
+          <w:rStyle w:val="NormalTok"/>
+        </w:rPr>
+        <w:t xml:space="preserve">) </w:t>
+      </w:r>
+      <w:r>
+        <w:rPr>
+          <w:rStyle w:val="ControlFlowTok"/>
+        </w:rPr>
+        <w:t xml:space="preserve">if</w:t>
+      </w:r>
+      <w:r>
+        <w:rPr>
+          <w:rStyle w:val="NormalTok"/>
+        </w:rPr>
+        <w:t xml:space="preserve"> d.get(</w:t>
+      </w:r>
+      <w:r>
+        <w:rPr>
+          <w:rStyle w:val="StringTok"/>
+        </w:rPr>
+        <w:t xml:space="preserve">"track"</w:t>
+      </w:r>
+      <w:r>
+        <w:rPr>
+          <w:rStyle w:val="NormalTok"/>
+        </w:rPr>
+        <w:t xml:space="preserve">) </w:t>
+      </w:r>
+      <w:r>
+        <w:rPr>
+          <w:rStyle w:val="OperatorTok"/>
+        </w:rPr>
+        <w:t xml:space="preserve">==</w:t>
+      </w:r>
+      <w:r>
+        <w:rPr>
+          <w:rStyle w:val="NormalTok"/>
+        </w:rPr>
         <w:t xml:space="preserve"> </w:t>
       </w:r>
       <w:r>
-        <w:t xml:space="preserve">Performance tracks edge density monotonically. GO-painCentric (121,543 edges, 18% of GO edges) achieves performance statistically indistinguishable from full GO (delta = -0.019, p = 0.22 for pain-genes; delta = +0.014, p = 0.17 for all-genes), demonstrating that the vast majority of GO’s predictive value concentrates in edges involving pain-relevant genes.</w:t>
-      </w:r>
-    </w:p>
-    <w:p>
-      <w:pPr>
-        <w:pStyle w:val="BodyText"/>
-      </w:pPr>
-      <w:r>
-        <w:rPr>
-          <w:b/>
-          <w:bCs/>
-        </w:rPr>
-        <w:t xml:space="preserve">Topology ablation:</w:t>
-      </w:r>
-      <w:r>
+        <w:rPr>
+          <w:rStyle w:val="StringTok"/>
+        </w:rPr>
+        <w:t xml:space="preserve">"A"</w:t>
+      </w:r>
+      <w:r>
+        <w:rPr>
+          <w:rStyle w:val="NormalTok"/>
+        </w:rPr>
+        <w:t xml:space="preserve">}</w:t>
+      </w:r>
+      <w:r>
+        <w:br/>
+      </w:r>
+      <w:r>
+        <w:rPr>
+          <w:rStyle w:val="NormalTok"/>
+        </w:rPr>
+        <w:t xml:space="preserve">track_b_nodes </w:t>
+      </w:r>
+      <w:r>
+        <w:rPr>
+          <w:rStyle w:val="OperatorTok"/>
+        </w:rPr>
+        <w:t xml:space="preserve">=</w:t>
+      </w:r>
+      <w:r>
+        <w:rPr>
+          <w:rStyle w:val="NormalTok"/>
+        </w:rPr>
+        <w:t xml:space="preserve"> {n </w:t>
+      </w:r>
+      <w:r>
+        <w:rPr>
+          <w:rStyle w:val="ControlFlowTok"/>
+        </w:rPr>
+        <w:t xml:space="preserve">for</w:t>
+      </w:r>
+      <w:r>
+        <w:rPr>
+          <w:rStyle w:val="NormalTok"/>
+        </w:rPr>
+        <w:t xml:space="preserve"> n, d </w:t>
+      </w:r>
+      <w:r>
+        <w:rPr>
+          <w:rStyle w:val="KeywordTok"/>
+        </w:rPr>
+        <w:t xml:space="preserve">in</w:t>
+      </w:r>
+      <w:r>
+        <w:rPr>
+          <w:rStyle w:val="NormalTok"/>
+        </w:rPr>
+        <w:t xml:space="preserve"> g.nodes(data</w:t>
+      </w:r>
+      <w:r>
+        <w:rPr>
+          <w:rStyle w:val="OperatorTok"/>
+        </w:rPr>
+        <w:t xml:space="preserve">=</w:t>
+      </w:r>
+      <w:r>
+        <w:rPr>
+          <w:rStyle w:val="VariableTok"/>
+        </w:rPr>
+        <w:t xml:space="preserve">True</w:t>
+      </w:r>
+      <w:r>
+        <w:rPr>
+          <w:rStyle w:val="NormalTok"/>
+        </w:rPr>
+        <w:t xml:space="preserve">) </w:t>
+      </w:r>
+      <w:r>
+        <w:rPr>
+          <w:rStyle w:val="ControlFlowTok"/>
+        </w:rPr>
+        <w:t xml:space="preserve">if</w:t>
+      </w:r>
+      <w:r>
+        <w:rPr>
+          <w:rStyle w:val="NormalTok"/>
+        </w:rPr>
+        <w:t xml:space="preserve"> d.get(</w:t>
+      </w:r>
+      <w:r>
+        <w:rPr>
+          <w:rStyle w:val="StringTok"/>
+        </w:rPr>
+        <w:t xml:space="preserve">"track"</w:t>
+      </w:r>
+      <w:r>
+        <w:rPr>
+          <w:rStyle w:val="NormalTok"/>
+        </w:rPr>
+        <w:t xml:space="preserve">) </w:t>
+      </w:r>
+      <w:r>
+        <w:rPr>
+          <w:rStyle w:val="OperatorTok"/>
+        </w:rPr>
+        <w:t xml:space="preserve">==</w:t>
+      </w:r>
+      <w:r>
+        <w:rPr>
+          <w:rStyle w:val="NormalTok"/>
+        </w:rPr>
         <w:t xml:space="preserve"> </w:t>
       </w:r>
       <w:r>
-        <w:t xml:space="preserve">RA-PainKG-degPreserved achieves statistically indistinguishable performance from RA-PainKG (delta = -0.020 for pain-genes, p = 0.41; delta = -0.005 for all-genes, p = 0.83). Edge identity provides no measurable advantage over random connections with matched degree distribution—the binding constraint is edge count, not edge semantics.</w:t>
-      </w:r>
-    </w:p>
-    <w:p>
-      <w:pPr>
-        <w:pStyle w:val="BodyText"/>
-      </w:pPr>
-      <w:r>
-        <w:rPr>
-          <w:b/>
-          <w:bCs/>
-        </w:rPr>
-        <w:t xml:space="preserve">Domain specificity ablation:</w:t>
-      </w:r>
-      <w:r>
+        <w:rPr>
+          <w:rStyle w:val="StringTok"/>
+        </w:rPr>
+        <w:t xml:space="preserve">"B"</w:t>
+      </w:r>
+      <w:r>
+        <w:rPr>
+          <w:rStyle w:val="NormalTok"/>
+        </w:rPr>
+        <w:t xml:space="preserve">}</w:t>
+      </w:r>
+      <w:r>
+        <w:br/>
+      </w:r>
+      <w:r>
+        <w:rPr>
+          <w:rStyle w:val="NormalTok"/>
+        </w:rPr>
+        <w:t xml:space="preserve">ppi_edges </w:t>
+      </w:r>
+      <w:r>
+        <w:rPr>
+          <w:rStyle w:val="OperatorTok"/>
+        </w:rPr>
+        <w:t xml:space="preserve">=</w:t>
+      </w:r>
+      <w:r>
+        <w:rPr>
+          <w:rStyle w:val="NormalTok"/>
+        </w:rPr>
+        <w:t xml:space="preserve"> [(u, v) </w:t>
+      </w:r>
+      <w:r>
+        <w:rPr>
+          <w:rStyle w:val="ControlFlowTok"/>
+        </w:rPr>
+        <w:t xml:space="preserve">for</w:t>
+      </w:r>
+      <w:r>
+        <w:rPr>
+          <w:rStyle w:val="NormalTok"/>
+        </w:rPr>
+        <w:t xml:space="preserve"> u, v, d </w:t>
+      </w:r>
+      <w:r>
+        <w:rPr>
+          <w:rStyle w:val="KeywordTok"/>
+        </w:rPr>
+        <w:t xml:space="preserve">in</w:t>
+      </w:r>
+      <w:r>
+        <w:rPr>
+          <w:rStyle w:val="NormalTok"/>
+        </w:rPr>
+        <w:t xml:space="preserve"> g.edges(data</w:t>
+      </w:r>
+      <w:r>
+        <w:rPr>
+          <w:rStyle w:val="OperatorTok"/>
+        </w:rPr>
+        <w:t xml:space="preserve">=</w:t>
+      </w:r>
+      <w:r>
+        <w:rPr>
+          <w:rStyle w:val="VariableTok"/>
+        </w:rPr>
+        <w:t xml:space="preserve">True</w:t>
+      </w:r>
+      <w:r>
+        <w:rPr>
+          <w:rStyle w:val="NormalTok"/>
+        </w:rPr>
+        <w:t xml:space="preserve">)</w:t>
+      </w:r>
+      <w:r>
+        <w:br/>
+      </w:r>
+      <w:r>
+        <w:rPr>
+          <w:rStyle w:val="NormalTok"/>
+        </w:rPr>
+        <w:t xml:space="preserve">             </w:t>
+      </w:r>
+      <w:r>
+        <w:rPr>
+          <w:rStyle w:val="ControlFlowTok"/>
+        </w:rPr>
+        <w:t xml:space="preserve">if</w:t>
+      </w:r>
+      <w:r>
+        <w:rPr>
+          <w:rStyle w:val="NormalTok"/>
+        </w:rPr>
+        <w:t xml:space="preserve"> d.get(</w:t>
+      </w:r>
+      <w:r>
+        <w:rPr>
+          <w:rStyle w:val="StringTok"/>
+        </w:rPr>
+        <w:t xml:space="preserve">"relation"</w:t>
+      </w:r>
+      <w:r>
+        <w:rPr>
+          <w:rStyle w:val="NormalTok"/>
+        </w:rPr>
+        <w:t xml:space="preserve">) </w:t>
+      </w:r>
+      <w:r>
+        <w:rPr>
+          <w:rStyle w:val="OperatorTok"/>
+        </w:rPr>
+        <w:t xml:space="preserve">==</w:t>
+      </w:r>
+      <w:r>
+        <w:rPr>
+          <w:rStyle w:val="NormalTok"/>
+        </w:rPr>
         <w:t xml:space="preserve"> </w:t>
       </w:r>
       <w:r>
-        <w:t xml:space="preserve">The ranking Random &gt; GO &gt; RA-PainKG is invariant across all gene subsets with adequate statistical power (all genes, pain, non-pain, Track Dual). On the 44-gene pain subset, GO nominally outperforms RA-PainKG (0.542 vs 0.503, p = 0.084 ns), though the difference does not reach significance. Track A (n = 3) and Track B (n = 5) subsets are underpowered for meaningful comparison.</w:t>
-      </w:r>
-    </w:p>
-    <w:bookmarkEnd w:id="40"/>
-    <w:bookmarkStart w:id="41" w:name="sensitivity-analysis"/>
-    <w:p>
-      <w:pPr>
-        <w:pStyle w:val="Heading4"/>
-      </w:pPr>
-      <w:r>
-        <w:t xml:space="preserve">3.3.6 Sensitivity Analysis</w:t>
-      </w:r>
-    </w:p>
-    <w:p>
-      <w:pPr>
-        <w:pStyle w:val="FirstParagraph"/>
-      </w:pPr>
-      <w:r>
-        <w:rPr>
-          <w:b/>
-          <w:bCs/>
-        </w:rPr>
-        <w:t xml:space="preserve">Alpha regularization:</w:t>
-      </w:r>
-      <w:r>
+        <w:rPr>
+          <w:rStyle w:val="StringTok"/>
+        </w:rPr>
+        <w:t xml:space="preserve">"protein_protein"</w:t>
+      </w:r>
+      <w:r>
+        <w:rPr>
+          <w:rStyle w:val="NormalTok"/>
+        </w:rPr>
+        <w:t xml:space="preserve">]</w:t>
+      </w:r>
+      <w:r>
+        <w:br/>
+      </w:r>
+      <w:r>
+        <w:rPr>
+          <w:rStyle w:val="NormalTok"/>
+        </w:rPr>
+        <w:t xml:space="preserve">bridge_scores </w:t>
+      </w:r>
+      <w:r>
+        <w:rPr>
+          <w:rStyle w:val="OperatorTok"/>
+        </w:rPr>
+        <w:t xml:space="preserve">=</w:t>
+      </w:r>
+      <w:r>
+        <w:rPr>
+          <w:rStyle w:val="NormalTok"/>
+        </w:rPr>
+        <w:t xml:space="preserve"> {}</w:t>
+      </w:r>
+      <w:r>
+        <w:br/>
+      </w:r>
+      <w:r>
+        <w:rPr>
+          <w:rStyle w:val="ControlFlowTok"/>
+        </w:rPr>
+        <w:t xml:space="preserve">for</w:t>
+      </w:r>
+      <w:r>
+        <w:rPr>
+          <w:rStyle w:val="NormalTok"/>
+        </w:rPr>
+        <w:t xml:space="preserve"> u, v </w:t>
+      </w:r>
+      <w:r>
+        <w:rPr>
+          <w:rStyle w:val="KeywordTok"/>
+        </w:rPr>
+        <w:t xml:space="preserve">in</w:t>
+      </w:r>
+      <w:r>
+        <w:rPr>
+          <w:rStyle w:val="NormalTok"/>
+        </w:rPr>
+        <w:t xml:space="preserve"> ppi_edges:</w:t>
+      </w:r>
+      <w:r>
+        <w:br/>
+      </w:r>
+      <w:r>
+        <w:rPr>
+          <w:rStyle w:val="NormalTok"/>
+        </w:rPr>
+        <w:t xml:space="preserve">    </w:t>
+      </w:r>
+      <w:r>
+        <w:rPr>
+          <w:rStyle w:val="ControlFlowTok"/>
+        </w:rPr>
+        <w:t xml:space="preserve">if</w:t>
+      </w:r>
+      <w:r>
+        <w:rPr>
+          <w:rStyle w:val="NormalTok"/>
+        </w:rPr>
+        <w:t xml:space="preserve"> u </w:t>
+      </w:r>
+      <w:r>
+        <w:rPr>
+          <w:rStyle w:val="KeywordTok"/>
+        </w:rPr>
+        <w:t xml:space="preserve">in</w:t>
+      </w:r>
+      <w:r>
+        <w:rPr>
+          <w:rStyle w:val="NormalTok"/>
+        </w:rPr>
+        <w:t xml:space="preserve"> track_a_nodes </w:t>
+      </w:r>
+      <w:r>
+        <w:rPr>
+          <w:rStyle w:val="KeywordTok"/>
+        </w:rPr>
+        <w:t xml:space="preserve">and</w:t>
+      </w:r>
+      <w:r>
+        <w:rPr>
+          <w:rStyle w:val="NormalTok"/>
+        </w:rPr>
+        <w:t xml:space="preserve"> v </w:t>
+      </w:r>
+      <w:r>
+        <w:rPr>
+          <w:rStyle w:val="KeywordTok"/>
+        </w:rPr>
+        <w:t xml:space="preserve">in</w:t>
+      </w:r>
+      <w:r>
+        <w:rPr>
+          <w:rStyle w:val="NormalTok"/>
+        </w:rPr>
+        <w:t xml:space="preserve"> track_b_nodes:</w:t>
+      </w:r>
+      <w:r>
+        <w:br/>
+      </w:r>
+      <w:r>
+        <w:rPr>
+          <w:rStyle w:val="NormalTok"/>
+        </w:rPr>
+        <w:t xml:space="preserve">        bridge_scores[u] </w:t>
+      </w:r>
+      <w:r>
+        <w:rPr>
+          <w:rStyle w:val="OperatorTok"/>
+        </w:rPr>
+        <w:t xml:space="preserve">=</w:t>
+      </w:r>
+      <w:r>
+        <w:rPr>
+          <w:rStyle w:val="NormalTok"/>
+        </w:rPr>
+        <w:t xml:space="preserve"> bridge_scores.get(u, </w:t>
+      </w:r>
+      <w:r>
+        <w:rPr>
+          <w:rStyle w:val="DecValTok"/>
+        </w:rPr>
+        <w:t xml:space="preserve">0</w:t>
+      </w:r>
+      <w:r>
+        <w:rPr>
+          <w:rStyle w:val="NormalTok"/>
+        </w:rPr>
+        <w:t xml:space="preserve">) </w:t>
+      </w:r>
+      <w:r>
+        <w:rPr>
+          <w:rStyle w:val="OperatorTok"/>
+        </w:rPr>
+        <w:t xml:space="preserve">+</w:t>
+      </w:r>
+      <w:r>
+        <w:rPr>
+          <w:rStyle w:val="NormalTok"/>
+        </w:rPr>
         <w:t xml:space="preserve"> </w:t>
       </w:r>
       <w:r>
-        <w:t xml:space="preserve">Performance plateaus for alpha &gt;= 0.1 across all KGs. GO varies from r = 0.57 (alpha = 0.001) to r = 0.59 (alpha = 0.1) to r = 0.44 (alpha = 100.0). The default alpha = 0.1 is at the performance plateau.</w:t>
-      </w:r>
-    </w:p>
-    <w:p>
-      <w:pPr>
-        <w:pStyle w:val="BodyText"/>
-      </w:pPr>
-      <w:r>
-        <w:rPr>
-          <w:b/>
-          <w:bCs/>
-        </w:rPr>
-        <w:t xml:space="preserve">Embedding dimension (k):</w:t>
-      </w:r>
-      <w:r>
+        <w:rPr>
+          <w:rStyle w:val="DecValTok"/>
+        </w:rPr>
+        <w:t xml:space="preserve">1</w:t>
+      </w:r>
+      <w:r>
+        <w:br/>
+      </w:r>
+      <w:r>
+        <w:rPr>
+          <w:rStyle w:val="NormalTok"/>
+        </w:rPr>
+        <w:t xml:space="preserve">        bridge_scores[v] </w:t>
+      </w:r>
+      <w:r>
+        <w:rPr>
+          <w:rStyle w:val="OperatorTok"/>
+        </w:rPr>
+        <w:t xml:space="preserve">=</w:t>
+      </w:r>
+      <w:r>
+        <w:rPr>
+          <w:rStyle w:val="NormalTok"/>
+        </w:rPr>
+        <w:t xml:space="preserve"> bridge_scores.get(v, </w:t>
+      </w:r>
+      <w:r>
+        <w:rPr>
+          <w:rStyle w:val="DecValTok"/>
+        </w:rPr>
+        <w:t xml:space="preserve">0</w:t>
+      </w:r>
+      <w:r>
+        <w:rPr>
+          <w:rStyle w:val="NormalTok"/>
+        </w:rPr>
+        <w:t xml:space="preserve">) </w:t>
+      </w:r>
+      <w:r>
+        <w:rPr>
+          <w:rStyle w:val="OperatorTok"/>
+        </w:rPr>
+        <w:t xml:space="preserve">+</w:t>
+      </w:r>
+      <w:r>
+        <w:rPr>
+          <w:rStyle w:val="NormalTok"/>
+        </w:rPr>
         <w:t xml:space="preserve"> </w:t>
       </w:r>
       <w:r>
-        <w:t xml:space="preserve">Performance increases from k = 32 to k = 64, then plateaus at k = 128–256. GO: r = 0.54 (k = 32), 0.58 (k = 64), 0.59 (k = 128), 0.59 (k = 256). The default k = 128 is at the performance plateau.</w:t>
-      </w:r>
-    </w:p>
-    <w:bookmarkEnd w:id="41"/>
-    <w:bookmarkStart w:id="42" w:name="random-graph-realization-stability"/>
-    <w:p>
-      <w:pPr>
-        <w:pStyle w:val="Heading4"/>
-      </w:pPr>
-      <w:r>
-        <w:t xml:space="preserve">3.3.7 Random Graph Realization Stability</w:t>
-      </w:r>
-    </w:p>
-    <w:p>
-      <w:pPr>
-        <w:pStyle w:val="FirstParagraph"/>
-      </w:pPr>
-      <w:r>
-        <w:t xml:space="preserve">Across five independent random graph realizations (each with 673,899 edges), all-genes Pearson r ranges from 0.641 to 0.667 (mean = 0.653, SD across realizations = 0.010, or 1.5% of the mean). Pain-genes r ranges from 0.570 to 0.620 (mean = 0.591, SD = 0.015). The low inter-realization variability confirms that dense random graphs are robust prediction backbones.</w:t>
-      </w:r>
-    </w:p>
-    <w:bookmarkEnd w:id="42"/>
-    <w:bookmarkStart w:id="43" w:name="X544b44c850327218c6c7dba3ef85df8368a03ff"/>
-    <w:p>
-      <w:pPr>
-        <w:pStyle w:val="Heading4"/>
-      </w:pPr>
-      <w:r>
-        <w:t xml:space="preserve">3.3.8 Bridge Genes and Knowledge Gap Quantification</w:t>
-      </w:r>
-    </w:p>
-    <w:p>
-      <w:pPr>
-        <w:pStyle w:val="FirstParagraph"/>
-      </w:pPr>
-      <w:r>
-        <w:t xml:space="preserve">RA-PainKG identifies bridge genes connecting inflammatory (Track A) and nociceptive (Track B) subgraphs. Top bridges include STAT3 (score 35), RELA (24), and the NF-kappaB complex (IKBKB, IKBKG, NFKB1). The KG quantifies knowledge gaps relevant to domain-specific prior knowledge: 72 of 192 core pain genes (37.5%) are absent from PrimeKG, and 50% of Track B genes present in the KG are isolated (no PPI edges). These gaps constrain the predictive value of domain-specific prior knowledge for perturbation prediction (see Discussion 4.2 for extrapolation analysis).</w:t>
+        <w:rPr>
+          <w:rStyle w:val="DecValTok"/>
+        </w:rPr>
+        <w:t xml:space="preserve">1</w:t>
+      </w:r>
+      <w:r>
+        <w:br/>
+      </w:r>
+      <w:r>
+        <w:rPr>
+          <w:rStyle w:val="NormalTok"/>
+        </w:rPr>
+        <w:t xml:space="preserve">top_bridges </w:t>
+      </w:r>
+      <w:r>
+        <w:rPr>
+          <w:rStyle w:val="OperatorTok"/>
+        </w:rPr>
+        <w:t xml:space="preserve">=</w:t>
+      </w:r>
+      <w:r>
+        <w:rPr>
+          <w:rStyle w:val="NormalTok"/>
+        </w:rPr>
+        <w:t xml:space="preserve"> </w:t>
+      </w:r>
+      <w:r>
+        <w:rPr>
+          <w:rStyle w:val="BuiltInTok"/>
+        </w:rPr>
+        <w:t xml:space="preserve">sorted</w:t>
+      </w:r>
+      <w:r>
+        <w:rPr>
+          <w:rStyle w:val="NormalTok"/>
+        </w:rPr>
+        <w:t xml:space="preserve">(bridge_scores.items(), key</w:t>
+      </w:r>
+      <w:r>
+        <w:rPr>
+          <w:rStyle w:val="OperatorTok"/>
+        </w:rPr>
+        <w:t xml:space="preserve">=</w:t>
+      </w:r>
+      <w:r>
+        <w:rPr>
+          <w:rStyle w:val="KeywordTok"/>
+        </w:rPr>
+        <w:t xml:space="preserve">lambda</w:t>
+      </w:r>
+      <w:r>
+        <w:rPr>
+          <w:rStyle w:val="NormalTok"/>
+        </w:rPr>
+        <w:t xml:space="preserve"> x: x[</w:t>
+      </w:r>
+      <w:r>
+        <w:rPr>
+          <w:rStyle w:val="DecValTok"/>
+        </w:rPr>
+        <w:t xml:space="preserve">1</w:t>
+      </w:r>
+      <w:r>
+        <w:rPr>
+          <w:rStyle w:val="NormalTok"/>
+        </w:rPr>
+        <w:t xml:space="preserve">], reverse</w:t>
+      </w:r>
+      <w:r>
+        <w:rPr>
+          <w:rStyle w:val="OperatorTok"/>
+        </w:rPr>
+        <w:t xml:space="preserve">=</w:t>
+      </w:r>
+      <w:r>
+        <w:rPr>
+          <w:rStyle w:val="VariableTok"/>
+        </w:rPr>
+        <w:t xml:space="preserve">True</w:t>
+      </w:r>
+      <w:r>
+        <w:rPr>
+          <w:rStyle w:val="NormalTok"/>
+        </w:rPr>
+        <w:t xml:space="preserve">)[:</w:t>
+      </w:r>
+      <w:r>
+        <w:rPr>
+          <w:rStyle w:val="DecValTok"/>
+        </w:rPr>
+        <w:t xml:space="preserve">10</w:t>
+      </w:r>
+      <w:r>
+        <w:rPr>
+          <w:rStyle w:val="NormalTok"/>
+        </w:rPr>
+        <w:t xml:space="preserve">]</w:t>
+      </w:r>
+      <w:r>
+        <w:br/>
+      </w:r>
+      <w:r>
+        <w:rPr>
+          <w:rStyle w:val="CommentTok"/>
+        </w:rPr>
+        <w:t xml:space="preserve"># Top bridges include STAT3, RELA, NFKB1, IKBKB</w:t>
       </w:r>
     </w:p>
     <w:p>
@@ -3807,10 +4369,9 @@
         </w:pict>
       </w:r>
     </w:p>
-    <w:bookmarkEnd w:id="43"/>
-    <w:bookmarkEnd w:id="44"/>
-    <w:bookmarkEnd w:id="45"/>
-    <w:bookmarkStart w:id="52" w:name="discussion"/>
+    <w:bookmarkEnd w:id="40"/>
+    <w:bookmarkEnd w:id="41"/>
+    <w:bookmarkStart w:id="48" w:name="discussion"/>
     <w:p>
       <w:pPr>
         <w:pStyle w:val="Heading2"/>
@@ -3819,7 +4380,7 @@
         <w:t xml:space="preserve">4. Discussion</w:t>
       </w:r>
     </w:p>
-    <w:bookmarkStart w:id="46" w:name="ra-painkg-as-a-knowledge-resource"/>
+    <w:bookmarkStart w:id="42" w:name="ra-painkg-as-a-knowledge-resource"/>
     <w:p>
       <w:pPr>
         <w:pStyle w:val="Heading3"/>
@@ -4410,6 +4971,74 @@
           </w:p>
         </w:tc>
       </w:tr>
+      <w:tr>
+        <w:tc>
+          <w:tcPr/>
+          <w:p>
+            <w:pPr>
+              <w:pStyle w:val="Compact"/>
+            </w:pPr>
+            <w:r>
+              <w:t xml:space="preserve">Known limitations</w:t>
+            </w:r>
+          </w:p>
+        </w:tc>
+        <w:tc>
+          <w:tcPr/>
+          <w:p>
+            <w:pPr>
+              <w:pStyle w:val="Compact"/>
+            </w:pPr>
+            <w:r>
+              <w:t xml:space="preserve">N/A</w:t>
+            </w:r>
+          </w:p>
+        </w:tc>
+        <w:tc>
+          <w:tcPr/>
+          <w:p>
+            <w:pPr>
+              <w:pStyle w:val="Compact"/>
+            </w:pPr>
+            <w:r>
+              <w:t xml:space="preserve">N/A</w:t>
+            </w:r>
+          </w:p>
+        </w:tc>
+        <w:tc>
+          <w:tcPr/>
+          <w:p>
+            <w:pPr>
+              <w:pStyle w:val="Compact"/>
+            </w:pPr>
+            <w:r>
+              <w:t xml:space="preserve">N/A</w:t>
+            </w:r>
+          </w:p>
+        </w:tc>
+        <w:tc>
+          <w:tcPr/>
+          <w:p>
+            <w:pPr>
+              <w:pStyle w:val="Compact"/>
+            </w:pPr>
+            <w:r>
+              <w:t xml:space="preserve">N/A</w:t>
+            </w:r>
+          </w:p>
+        </w:tc>
+        <w:tc>
+          <w:tcPr/>
+          <w:p>
+            <w:pPr>
+              <w:pStyle w:val="Compact"/>
+            </w:pPr>
+            <w:r>
+              <w:t xml:space="preserve">62.5% pain gene coverage; no DRG/synovium GTEx data; static representation</w:t>
+            </w:r>
+          </w:p>
+        </w:tc>
+      </w:tr>
     </w:tbl>
     <w:p>
       <w:pPr>
@@ -4419,8 +5048,8 @@
         <w:t xml:space="preserve">RA-PainKG serves three primary use cases. First, as a queryable knowledge base: researchers can extract pathway subnetworks (all nine curated pain pathways), identify drugs targeting specific pain genes, and retrieve tissue expression profiles for pain genes across 54 human tissues. Second, as a hypothesis-generation tool: the dual-track framework enables systematic comparison of inflammatory versus nociceptive mechanisms, and bridge genes (STAT3, RELA, NF-kappaB complex) connecting both tracks represent candidate intervention points where anti-inflammatory and analgesic effects may converge. Third, as prior knowledge for machine learning: the graph provides structured domain knowledge for downstream applications including gene perturbation prediction, drug repurposing, and causal mediator identification.</w:t>
       </w:r>
     </w:p>
-    <w:bookmarkEnd w:id="46"/>
-    <w:bookmarkStart w:id="47" w:name="the-value-of-coverage-gap-documentation"/>
+    <w:bookmarkEnd w:id="42"/>
+    <w:bookmarkStart w:id="43" w:name="the-value-of-coverage-gap-documentation"/>
     <w:p>
       <w:pPr>
         <w:pStyle w:val="Heading3"/>
@@ -4434,11 +5063,11 @@
         <w:pStyle w:val="FirstParagraph"/>
       </w:pPr>
       <w:r>
-        <w:t xml:space="preserve">The systematic identification of 72 absent genes (37.5% of the curated set) represents a resource contribution in its own right. Rather than silently omitting these genes, RA-PainKG documents exactly which genes are missing, why (identifier mismatch, annotation gaps in PrimeKG), and where researchers should look for alternative information (Supplementary Table S3). This transparency serves multiple purposes: (1) it prevents false-negative conclusions when querying RA-PainKG for specific genes; (2) it identifies systematic curation biases (complement cascade, anesthetic targets, GABA receptors are underrepresented across all general-purpose biomedical KGs); and (3) it provides a prioritized list for future resource development. This approach-a knowledge graph that explicitly documents what it does not contain-is uncommon in the biomedical database literature and represents a methodological contribution for transparent resource development.</w:t>
-      </w:r>
-    </w:p>
-    <w:bookmarkEnd w:id="47"/>
-    <w:bookmarkStart w:id="48" w:name="X5d4c2885636e0a62531c778a83e0fa67c2a5235"/>
+        <w:t xml:space="preserve">The systematic identification of 72 absent genes (37.5% of the curated set) represents a resource contribution in its own right. Rather than silently omitting these genes, RA-PainKG documents exactly which genes are missing, why (identifier mismatch, annotation gaps in PrimeKG), and where researchers should look for alternative information (Supplementary Table S3). This transparency serves multiple purposes: (1) it prevents false-negative conclusions when querying RA-PainKG for specific genes; (2) it identifies systematic curation biases (complement cascade, anesthetic targets, GABA receptors are underrepresented across all general-purpose biomedical KGs); and (3) it provides a prioritized list for future resource development. This approach-a knowledge graph that explicitly documents what it does not contain-is uncommon in the biomedical database literature. While resources such as the IUPHAR/BPS Guide to Pharmacology [14] acknowledge incomplete coverage in narrative form, systematic per-gene gap documentation with categorized absence reasons is rarely implemented. We argue this practice represents a methodological contribution for transparent resource development.</w:t>
+      </w:r>
+    </w:p>
+    <w:bookmarkEnd w:id="43"/>
+    <w:bookmarkStart w:id="44" w:name="X5d4c2885636e0a62531c778a83e0fa67c2a5235"/>
     <w:p>
       <w:pPr>
         <w:pStyle w:val="Heading3"/>
@@ -4452,7 +5081,7 @@
         <w:pStyle w:val="FirstParagraph"/>
       </w:pPr>
       <w:r>
-        <w:t xml:space="preserve">Benchmark validation across 11 KG variants using the Norman K562 Perturb-seq dataset [20] provides transparent performance characterization (Tables 2-3). Two findings merit discussion.</w:t>
+        <w:t xml:space="preserve">Benchmark validation across 11 KG variants using the Norman K562 Perturb-seq dataset [20] provides transparent performance characterization (Supplementary Tables S4-S5). Two findings merit discussion.</w:t>
       </w:r>
     </w:p>
     <w:p>
@@ -4460,7 +5089,7 @@
         <w:pStyle w:val="BodyText"/>
       </w:pPr>
       <w:r>
-        <w:t xml:space="preserve">First, the validation establishes honest boundary conditions. K562 chronic myeloid leukemia cells are fundamentally mismatched to RA pain biology: 59.1% of measurable pain genes (26/44 overlapping) exhibit mean expression below 0.01 in K562 cells, and mean pain-gene expression (0.117) is comparable to the genome-wide background (0.107). Only 26.7% of RA-PainKG pain genes (44/165) are present in the Norman dataset. Consequently, perturbation prediction performance on K562 cells should not be interpreted as a measure of RA-PainKG’s biological validity-it reflects the test system’s limitations, not the resource’s quality.</w:t>
+        <w:t xml:space="preserve">First, the validation establishes honest boundary conditions. We emphasize that K562 cells were selected not as a biologically appropriate test system for RA pain (they are not), but as the only publicly available genome-scale Perturb-seq dataset with sufficient coverage to run a controlled multi-split benchmark. The purpose of this validation is not to demonstrate biological utility-it is to characterize the resource’s predictive properties in a standardized setting and to establish transparent performance baselines against which future evaluations in disease-relevant models can be compared. K562 chronic myeloid leukemia cells are fundamentally mismatched to RA pain biology: 59.1% of measurable pain genes (26/44 overlapping) exhibit mean expression below 0.01 in K562 cells, and mean pain-gene expression (0.117) is comparable to the genome-wide background (0.107). Only 26.7% of RA-PainKG pain genes (44/165) are present in the Norman dataset. Consequently, perturbation prediction performance on K562 cells should not be interpreted as a measure of RA-PainKG’s biological validity-it reflects the test system’s limitations, not the resource’s quality.</w:t>
       </w:r>
     </w:p>
     <w:p>
@@ -4479,8 +5108,8 @@
         <w:t xml:space="preserve">We emphasize that the K562 benchmark cannot resolve whether domain KGs improve prediction in disease-relevant systems. Sensory neuron models (iPSC-derived nociceptors, DRG organoids) remain the essential next step for evaluating whether RA-PainKG’s domain-specific prior knowledge confers advantages in biologically appropriate contexts.</w:t>
       </w:r>
     </w:p>
-    <w:bookmarkEnd w:id="48"/>
-    <w:bookmarkStart w:id="49" w:name="limitations"/>
+    <w:bookmarkEnd w:id="44"/>
+    <w:bookmarkStart w:id="45" w:name="limitations"/>
     <w:p>
       <w:pPr>
         <w:pStyle w:val="Heading3"/>
@@ -4579,8 +5208,8 @@
         <w:t xml:space="preserve">Benchmark validation is limited to K562 cells. Replication in disease-relevant cell types is essential before drawing conclusions about domain KG utility for pain biology applications.</w:t>
       </w:r>
     </w:p>
-    <w:bookmarkEnd w:id="49"/>
-    <w:bookmarkStart w:id="50" w:name="updates-and-community-contributions"/>
+    <w:bookmarkEnd w:id="45"/>
+    <w:bookmarkStart w:id="46" w:name="updates-and-community-contributions"/>
     <w:p>
       <w:pPr>
         <w:pStyle w:val="Heading3"/>
@@ -4597,8 +5226,8 @@
         <w:t xml:space="preserve">RA-PainKG will be updated with each major PrimeKG release. Community contributions of additional pain pathway annotations, drug-target relationships, and tissue expression data are welcome via the GitHub repository. The modular construction pipeline enables systematic re-generation with updated input resources.</w:t>
       </w:r>
     </w:p>
-    <w:bookmarkEnd w:id="50"/>
-    <w:bookmarkStart w:id="51" w:name="conclusion"/>
+    <w:bookmarkEnd w:id="46"/>
+    <w:bookmarkStart w:id="47" w:name="conclusion"/>
     <w:p>
       <w:pPr>
         <w:pStyle w:val="Heading3"/>
@@ -4622,9 +5251,9 @@
         </w:pict>
       </w:r>
     </w:p>
-    <w:bookmarkEnd w:id="51"/>
-    <w:bookmarkEnd w:id="52"/>
-    <w:bookmarkStart w:id="53" w:name="ai-usage-statement"/>
+    <w:bookmarkEnd w:id="47"/>
+    <w:bookmarkEnd w:id="48"/>
+    <w:bookmarkStart w:id="49" w:name="ai-usage-statement"/>
     <w:p>
       <w:pPr>
         <w:pStyle w:val="Heading2"/>
@@ -4641,8 +5270,8 @@
         <w:t xml:space="preserve">During the preparation of this work, the author used AI-assisted tools (OpenAI Codex CLI, GitHub Copilot, and Claude via API) for the following purposes: code development and debugging of the pipeline, literature search and summarization, manuscript drafting and language editing, and iterative revision based on simulated peer review. All AI-generated content was reviewed, verified, and edited by the author. The author takes full responsibility for the scientific accuracy, data integrity, and conclusions presented in this publication. All data were generated by the author’s original code; no AI tool contributed to data generation or statistical computation beyond code execution of author-specified algorithms.</w:t>
       </w:r>
     </w:p>
-    <w:bookmarkEnd w:id="53"/>
-    <w:bookmarkStart w:id="54" w:name="acknowledgements"/>
+    <w:bookmarkEnd w:id="49"/>
+    <w:bookmarkStart w:id="50" w:name="acknowledgements"/>
     <w:p>
       <w:pPr>
         <w:pStyle w:val="Heading2"/>
@@ -4659,8 +5288,8 @@
         <w:t xml:space="preserve">The author thanks the Norman lab, the PrimeKG development team, the GTEx Consortium, and the Gene Ontology Consortium for making their data publicly available. This research was supported by institutional resources from The Second Affiliated Hospital of Fujian University of Traditional Chinese Medicine.</w:t>
       </w:r>
     </w:p>
-    <w:bookmarkEnd w:id="54"/>
-    <w:bookmarkStart w:id="55" w:name="author-contributions"/>
+    <w:bookmarkEnd w:id="50"/>
+    <w:bookmarkStart w:id="51" w:name="author-contributions"/>
     <w:p>
       <w:pPr>
         <w:pStyle w:val="Heading2"/>
@@ -4687,8 +5316,8 @@
         <w:t xml:space="preserve">Conceptualization, Methodology, Software, Formal Analysis, Investigation, Data Curation, Writing - Original Draft, Writing - Review and Editing, Visualization, Project Administration.</w:t>
       </w:r>
     </w:p>
-    <w:bookmarkEnd w:id="55"/>
-    <w:bookmarkStart w:id="56" w:name="competing-interests"/>
+    <w:bookmarkEnd w:id="51"/>
+    <w:bookmarkStart w:id="52" w:name="competing-interests"/>
     <w:p>
       <w:pPr>
         <w:pStyle w:val="Heading2"/>
@@ -4705,8 +5334,8 @@
         <w:t xml:space="preserve">The author declares no competing interests.</w:t>
       </w:r>
     </w:p>
-    <w:bookmarkEnd w:id="56"/>
-    <w:bookmarkStart w:id="57" w:name="ethics-statement"/>
+    <w:bookmarkEnd w:id="52"/>
+    <w:bookmarkStart w:id="53" w:name="ethics-statement"/>
     <w:p>
       <w:pPr>
         <w:pStyle w:val="Heading2"/>
@@ -4723,8 +5352,8 @@
         <w:t xml:space="preserve">This study uses exclusively publicly available data. No new data involving human subjects were collected.</w:t>
       </w:r>
     </w:p>
-    <w:bookmarkEnd w:id="57"/>
-    <w:bookmarkStart w:id="58" w:name="data-and-code-availability"/>
+    <w:bookmarkEnd w:id="53"/>
+    <w:bookmarkStart w:id="54" w:name="data-and-code-availability"/>
     <w:p>
       <w:pPr>
         <w:pStyle w:val="Heading2"/>
@@ -4748,8 +5377,8 @@
         </w:pict>
       </w:r>
     </w:p>
-    <w:bookmarkEnd w:id="58"/>
-    <w:bookmarkStart w:id="59" w:name="references"/>
+    <w:bookmarkEnd w:id="54"/>
+    <w:bookmarkStart w:id="55" w:name="references"/>
     <w:p>
       <w:pPr>
         <w:pStyle w:val="Heading2"/>
@@ -4934,8 +5563,8 @@
         <w:t xml:space="preserve">[22] Ashburner M, Ball CA, Blake JA, et al. Gene Ontology: tool for the unification of biology. Nat Genet. 2000;25(1):25-29.</w:t>
       </w:r>
     </w:p>
-    <w:bookmarkEnd w:id="59"/>
-    <w:bookmarkEnd w:id="60"/>
+    <w:bookmarkEnd w:id="55"/>
+    <w:bookmarkEnd w:id="56"/>
     <w:sectPr>
       <w:footnotePr>
         <w:numRestart w:val="eachSect"/>

</xml_diff>

<commit_message>
Third-round review fixes: section numbering, duplicate text, encoding, references, Usage Examples cleanup, Figure Captions
</commit_message>
<xml_diff>
--- a/submission/manuscript.docx
+++ b/submission/manuscript.docx
@@ -39,7 +39,7 @@
     </w:p>
     <w:bookmarkEnd w:id="20"/>
     <w:bookmarkEnd w:id="21"/>
-    <w:bookmarkStart w:id="56" w:name="X63e6a6862059b0260bd199739e2746e8e8dce7b"/>
+    <w:bookmarkStart w:id="57" w:name="X63e6a6862059b0260bd199739e2746e8e8dce7b"/>
     <w:p>
       <w:pPr>
         <w:pStyle w:val="Heading1"/>
@@ -1026,7 +1026,7 @@
         <w:pStyle w:val="FirstParagraph"/>
       </w:pPr>
       <w:r>
-        <w:t xml:space="preserve">For each KG, we compute 128-dimensional gene embeddings via spectral decomposition of the normalized graph Laplacian: L = I - D^{-1/2} A D^{-1/2}, extracting eigenvectors corresponding to the k smallest non-zero eigenvalues. For graphs with isolated nodes (RA-PainKG: 68.3% of genes), these nodes receive near-zero embeddings that contribute no predictive signal in the linear model—a feature that accurately reflects their lack of KG-derived prior information. The perturbation prediction model is:</w:t>
+        <w:t xml:space="preserve">For each KG, we compute 128-dimensional gene embeddings via spectral decomposition of the normalized graph Laplacian: L = I - D^{-1/2} A D^{-1/2}, extracting eigenvectors corresponding to the k smallest non-zero eigenvalues. For graphs with isolated nodes (RA-PainKG: 68.3% of genes), these nodes receive near-zero embeddings that contribute no predictive signal in the linear model–a feature that accurately reflects their lack of KG-derived prior information. The perturbation prediction model is:</w:t>
       </w:r>
     </w:p>
     <w:p>
@@ -1071,7 +1071,7 @@
         <w:pStyle w:val="BodyText"/>
       </w:pPr>
       <w:r>
-        <w:t xml:space="preserve">This design contrasts with the full GEARS architecture [21], which uses GraphSAGE message-passing and cross-gene attention—mechanisms that may differentially exploit KG structure. Our results measure KG embedding quality in a controlled linear setting rather than end-to-end GEARS performance.</w:t>
+        <w:t xml:space="preserve">This design contrasts with the full GEARS architecture [21], which uses GraphSAGE message-passing and cross-gene attention–mechanisms that may differentially exploit KG structure. Our results measure KG embedding quality in a controlled linear setting rather than end-to-end GEARS performance.</w:t>
       </w:r>
     </w:p>
     <w:p>
@@ -1366,7 +1366,7 @@
         <w:pStyle w:val="BodyText"/>
       </w:pPr>
       <w:r>
-        <w:t xml:space="preserve">The graph spans 10 entity types (gene/protein, drug, disease, pathway, biological process, molecular function, cellular component, anatomy, phenotype, effect/phenotype) and 24 relation types, with drug-target edges (4,760 edges) enabling direct pharmacological queries. Network topology analysis identified EGR1, FOS, STAT3, JUN, and AKT1 as the top five hub nodes by betweenness centrality (Figure 1). The degree distribution follows a scale-free pattern characteristic of biological networks (Figure 2).</w:t>
+        <w:t xml:space="preserve">The graph spans 10 entity types (gene/protein, drug, disease, pathway, biological process, molecular function, cellular component, anatomy, phenotype, phenotype) and 24 relation types, with drug-target edges (4,760 edges) enabling direct pharmacological queries. Network topology analysis identified EGR1, FOS, STAT3, JUN, and AKT1 as the top five hub nodes by betweenness centrality (Figure 1). The degree distribution follows a scale-free pattern characteristic of biological networks (Figure 2).</w:t>
       </w:r>
     </w:p>
     <w:p>
@@ -1374,7 +1374,7 @@
         <w:pStyle w:val="BodyText"/>
       </w:pPr>
       <w:r>
-        <w:t xml:space="preserve">All nine literature-curated pain signaling pathways were successfully mapped onto RA-PainKG with gene coverage ranging from 57% (complement cascade) to 100% (TRP channels, voltage-gated sodium channels, neurotrophin signaling). The dual-track organization is summarized in Table S1: Track A (immune-inflammation, 106 genes) and Track B (nociception-pain transduction, 122 genes), with 96 genes (58.2%) spanning both tracks. This overlap is biologically expected given the mechanistic interconnection between inflammation and pain sensitization, The substantial Track A/B overlap (58.2%) is biologically expected: transcription factors (FOS, JUN, STAT3) activated by inflammatory cytokines also drive nociceptive sensitization, MAP kinases transduce both inflammatory and pain signals, and prostaglandins (via COX-2/PTGS2) bridge immune activation and nociceptor sensitization [5,7]. Rather than indicating poor track separation, this overlap reflects the mechanistic reality that inflammation and pain are deeply coupled in RA. The dual-track framework should be used as a conceptual lens for hypothesis generation-for example, genes exclusive to Track A or B may represent intervention points where anti-inflammatory and analgesic effects can be partially decoupled, while dual-track hub genes represent convergence points where both processes are jointly regulated.</w:t>
+        <w:t xml:space="preserve">All nine literature-curated pain signaling pathways were successfully mapped onto RA-PainKG with gene coverage ranging from 57% (complement cascade) to 100% (TRP channels, voltage-gated sodium channels, neurotrophin signaling). The dual-track organization is summarized in Table S1: Track A (immune-inflammation, 106 genes) and Track B (nociception-pain transduction, 122 genes), with 96 genes (58.2%) spanning both tracks. The substantial Track A/B overlap (58.2%) is biologically expected: transcription factors (FOS, JUN, STAT3) activated by inflammatory cytokines also drive nociceptive sensitization, MAP kinases transduce both inflammatory and pain signals, and prostaglandins (via COX-2/PTGS2) bridge immune activation and nociceptor sensitization [5,7]. Rather than indicating poor track separation, this overlap reflects the mechanistic reality that inflammation and pain are deeply coupled in RA. The dual-track framework serves as a conceptual lens for hypothesis generation: genes exclusive to Track A or B may represent intervention points where anti-inflammatory and analgesic effects can be partially decoupled, while dual-track hub genes represent convergence points where both processes are jointly regulated.</w:t>
       </w:r>
     </w:p>
     <w:bookmarkEnd w:id="33"/>
@@ -1392,7 +1392,7 @@
         <w:pStyle w:val="FirstParagraph"/>
       </w:pPr>
       <w:r>
-        <w:t xml:space="preserve">Of 192 core pain genes manually curated from the literature, 120 (62.5%) are represented in PrimeKG v1.0 by exact gene symbol matching. The remaining 72 genes (37.5%) constitute systematic coverage gaps in PrimeKG, concentrated in three functional categories: (1) complement cascade components (C1QA, C1QB, C1QC, C2, C3, C4A, C4B, CFB, CFD), where the complement system is increasingly recognized as a pain modulator but is poorly annotated in general-purpose biomedical KGs; (2) anesthetic drug targets (GABRA2, GABRA3, GABRB1, GABRG1, GABRG2, GLRB, GLRA1), where GABA/glycine receptor subunit diversity is not fully captured by PrimeKG’s drug-target mappings; and (3) nociceptor-specific ion channels (TRPM8, ASIC3, P2RX7), where gene symbol inconsistencies between resources create mapping failures. The low match rate for complement components (35.7%) is particularly consequential: the complement system is increasingly recognized as a pain modulator through C5a-C5aR1 signaling in sensory neurons [17], and C5 polymorphisms are associated with RA susceptibility. This coverage gap means that complement-mediated pain mechanisms are essentially invisible to PrimeKG-based queries and represents a high-priority target for future KG integration.</w:t>
+        <w:t xml:space="preserve">Of 192 core pain genes manually curated from the literature, 120 (62.5%) are represented in PrimeKG v1.0 by exact gene symbol matching. The remaining 72 genes (37.5%) constitute systematic coverage gaps in PrimeKG, concentrated in three functional categories: (1) complement cascade components (C1QA, C1QB, C1QC, C2, C3, C4A, C4B, CFB, CFD), where the complement system is increasingly recognized as a pain modulator but is poorly annotated in general-purpose biomedical KGs; (2) anesthetic drug targets (GABRA2, GABRA3, GABRB1, GABRG1, GABRG2, GLRB, GLRA1), where GABA/glycine receptor subunit diversity is not fully captured by PrimeKG’s drug-target mappings; and (3) nociceptor-specific ion channels (TRPM8, ASIC3, P2RX7), where gene symbol inconsistencies between resources create mapping failures. The low match rate for complement components (35.7%) is particularly consequential: the complement system is increasingly recognized as a pain modulator through C5a-C5aR1 signaling in sensory neurons [7], and C5 polymorphisms are associated with RA susceptibility. This coverage gap means that complement-mediated pain mechanisms are essentially invisible to PrimeKG-based queries and represents a high-priority target for future KG integration.</w:t>
       </w:r>
     </w:p>
     <w:p>
@@ -2465,13 +2465,22 @@
     </w:p>
     <w:bookmarkEnd w:id="35"/>
     <w:bookmarkEnd w:id="36"/>
-    <w:bookmarkStart w:id="41" w:name="usage-examples"/>
+    <w:bookmarkStart w:id="43" w:name="discussion"/>
     <w:p>
       <w:pPr>
         <w:pStyle w:val="Heading2"/>
       </w:pPr>
       <w:r>
-        <w:t xml:space="preserve">4. Usage Examples</w:t>
+        <w:t xml:space="preserve">4. Discussion</w:t>
+      </w:r>
+    </w:p>
+    <w:bookmarkStart w:id="37" w:name="ra-painkg-as-a-knowledge-resource"/>
+    <w:p>
+      <w:pPr>
+        <w:pStyle w:val="Heading3"/>
+      </w:pPr>
+      <w:r>
+        <w:t xml:space="preserve">4.1 RA-PainKG as a Knowledge Resource</w:t>
       </w:r>
     </w:p>
     <w:p>
@@ -2479,1922 +2488,7 @@
         <w:pStyle w:val="FirstParagraph"/>
       </w:pPr>
       <w:r>
-        <w:t xml:space="preserve">RA-PainKG is designed for programmatic access via Python (NetworkX). Below are three representative use cases. All code is available in the GitHub repository.</w:t>
-      </w:r>
-    </w:p>
-    <w:bookmarkStart w:id="37" w:name="querying-drug-target-relationships"/>
-    <w:p>
-      <w:pPr>
-        <w:pStyle w:val="Heading3"/>
-      </w:pPr>
-      <w:r>
-        <w:t xml:space="preserve">4.1 Querying Drug-Target Relationships</w:t>
-      </w:r>
-    </w:p>
-    <w:p>
-      <w:pPr>
-        <w:pStyle w:val="SourceCode"/>
-      </w:pPr>
-      <w:r>
-        <w:rPr>
-          <w:rStyle w:val="ImportTok"/>
-        </w:rPr>
-        <w:t xml:space="preserve">import</w:t>
-      </w:r>
-      <w:r>
-        <w:rPr>
-          <w:rStyle w:val="NormalTok"/>
-        </w:rPr>
-        <w:t xml:space="preserve"> pickle</w:t>
-      </w:r>
-      <w:r>
-        <w:br/>
-      </w:r>
-      <w:r>
-        <w:rPr>
-          <w:rStyle w:val="ControlFlowTok"/>
-        </w:rPr>
-        <w:t xml:space="preserve">with</w:t>
-      </w:r>
-      <w:r>
-        <w:rPr>
-          <w:rStyle w:val="NormalTok"/>
-        </w:rPr>
-        <w:t xml:space="preserve"> </w:t>
-      </w:r>
-      <w:r>
-        <w:rPr>
-          <w:rStyle w:val="BuiltInTok"/>
-        </w:rPr>
-        <w:t xml:space="preserve">open</w:t>
-      </w:r>
-      <w:r>
-        <w:rPr>
-          <w:rStyle w:val="NormalTok"/>
-        </w:rPr>
-        <w:t xml:space="preserve">(</w:t>
-      </w:r>
-      <w:r>
-        <w:rPr>
-          <w:rStyle w:val="StringTok"/>
-        </w:rPr>
-        <w:t xml:space="preserve">"RA_PainKG_final.pkl"</w:t>
-      </w:r>
-      <w:r>
-        <w:rPr>
-          <w:rStyle w:val="NormalTok"/>
-        </w:rPr>
-        <w:t xml:space="preserve">, </w:t>
-      </w:r>
-      <w:r>
-        <w:rPr>
-          <w:rStyle w:val="StringTok"/>
-        </w:rPr>
-        <w:t xml:space="preserve">"rb"</w:t>
-      </w:r>
-      <w:r>
-        <w:rPr>
-          <w:rStyle w:val="NormalTok"/>
-        </w:rPr>
-        <w:t xml:space="preserve">) </w:t>
-      </w:r>
-      <w:r>
-        <w:rPr>
-          <w:rStyle w:val="ImportTok"/>
-        </w:rPr>
-        <w:t xml:space="preserve">as</w:t>
-      </w:r>
-      <w:r>
-        <w:rPr>
-          <w:rStyle w:val="NormalTok"/>
-        </w:rPr>
-        <w:t xml:space="preserve"> f:</w:t>
-      </w:r>
-      <w:r>
-        <w:br/>
-      </w:r>
-      <w:r>
-        <w:rPr>
-          <w:rStyle w:val="NormalTok"/>
-        </w:rPr>
-        <w:t xml:space="preserve">    g </w:t>
-      </w:r>
-      <w:r>
-        <w:rPr>
-          <w:rStyle w:val="OperatorTok"/>
-        </w:rPr>
-        <w:t xml:space="preserve">=</w:t>
-      </w:r>
-      <w:r>
-        <w:rPr>
-          <w:rStyle w:val="NormalTok"/>
-        </w:rPr>
-        <w:t xml:space="preserve"> pickle.load(f)</w:t>
-      </w:r>
-      <w:r>
-        <w:br/>
-      </w:r>
-      <w:r>
-        <w:br/>
-      </w:r>
-      <w:r>
-        <w:rPr>
-          <w:rStyle w:val="CommentTok"/>
-        </w:rPr>
-        <w:t xml:space="preserve"># Find all drugs targeting PTGS2 (COX-2)</w:t>
-      </w:r>
-      <w:r>
-        <w:br/>
-      </w:r>
-      <w:r>
-        <w:rPr>
-          <w:rStyle w:val="NormalTok"/>
-        </w:rPr>
-        <w:t xml:space="preserve">ptgs2_drugs </w:t>
-      </w:r>
-      <w:r>
-        <w:rPr>
-          <w:rStyle w:val="OperatorTok"/>
-        </w:rPr>
-        <w:t xml:space="preserve">=</w:t>
-      </w:r>
-      <w:r>
-        <w:rPr>
-          <w:rStyle w:val="NormalTok"/>
-        </w:rPr>
-        <w:t xml:space="preserve"> []</w:t>
-      </w:r>
-      <w:r>
-        <w:br/>
-      </w:r>
-      <w:r>
-        <w:rPr>
-          <w:rStyle w:val="ControlFlowTok"/>
-        </w:rPr>
-        <w:t xml:space="preserve">for</w:t>
-      </w:r>
-      <w:r>
-        <w:rPr>
-          <w:rStyle w:val="NormalTok"/>
-        </w:rPr>
-        <w:t xml:space="preserve"> node, data </w:t>
-      </w:r>
-      <w:r>
-        <w:rPr>
-          <w:rStyle w:val="KeywordTok"/>
-        </w:rPr>
-        <w:t xml:space="preserve">in</w:t>
-      </w:r>
-      <w:r>
-        <w:rPr>
-          <w:rStyle w:val="NormalTok"/>
-        </w:rPr>
-        <w:t xml:space="preserve"> g.nodes(data</w:t>
-      </w:r>
-      <w:r>
-        <w:rPr>
-          <w:rStyle w:val="OperatorTok"/>
-        </w:rPr>
-        <w:t xml:space="preserve">=</w:t>
-      </w:r>
-      <w:r>
-        <w:rPr>
-          <w:rStyle w:val="VariableTok"/>
-        </w:rPr>
-        <w:t xml:space="preserve">True</w:t>
-      </w:r>
-      <w:r>
-        <w:rPr>
-          <w:rStyle w:val="NormalTok"/>
-        </w:rPr>
-        <w:t xml:space="preserve">):</w:t>
-      </w:r>
-      <w:r>
-        <w:br/>
-      </w:r>
-      <w:r>
-        <w:rPr>
-          <w:rStyle w:val="NormalTok"/>
-        </w:rPr>
-        <w:t xml:space="preserve">    </w:t>
-      </w:r>
-      <w:r>
-        <w:rPr>
-          <w:rStyle w:val="ControlFlowTok"/>
-        </w:rPr>
-        <w:t xml:space="preserve">if</w:t>
-      </w:r>
-      <w:r>
-        <w:rPr>
-          <w:rStyle w:val="NormalTok"/>
-        </w:rPr>
-        <w:t xml:space="preserve"> </w:t>
-      </w:r>
-      <w:r>
-        <w:rPr>
-          <w:rStyle w:val="BuiltInTok"/>
-        </w:rPr>
-        <w:t xml:space="preserve">str</w:t>
-      </w:r>
-      <w:r>
-        <w:rPr>
-          <w:rStyle w:val="NormalTok"/>
-        </w:rPr>
-        <w:t xml:space="preserve">(data.get(</w:t>
-      </w:r>
-      <w:r>
-        <w:rPr>
-          <w:rStyle w:val="StringTok"/>
-        </w:rPr>
-        <w:t xml:space="preserve">"node_name"</w:t>
-      </w:r>
-      <w:r>
-        <w:rPr>
-          <w:rStyle w:val="NormalTok"/>
-        </w:rPr>
-        <w:t xml:space="preserve">, </w:t>
-      </w:r>
-      <w:r>
-        <w:rPr>
-          <w:rStyle w:val="StringTok"/>
-        </w:rPr>
-        <w:t xml:space="preserve">""</w:t>
-      </w:r>
-      <w:r>
-        <w:rPr>
-          <w:rStyle w:val="NormalTok"/>
-        </w:rPr>
-        <w:t xml:space="preserve">)).upper() </w:t>
-      </w:r>
-      <w:r>
-        <w:rPr>
-          <w:rStyle w:val="OperatorTok"/>
-        </w:rPr>
-        <w:t xml:space="preserve">==</w:t>
-      </w:r>
-      <w:r>
-        <w:rPr>
-          <w:rStyle w:val="NormalTok"/>
-        </w:rPr>
-        <w:t xml:space="preserve"> </w:t>
-      </w:r>
-      <w:r>
-        <w:rPr>
-          <w:rStyle w:val="StringTok"/>
-        </w:rPr>
-        <w:t xml:space="preserve">"PTGS2"</w:t>
-      </w:r>
-      <w:r>
-        <w:rPr>
-          <w:rStyle w:val="NormalTok"/>
-        </w:rPr>
-        <w:t xml:space="preserve">:</w:t>
-      </w:r>
-      <w:r>
-        <w:br/>
-      </w:r>
-      <w:r>
-        <w:rPr>
-          <w:rStyle w:val="NormalTok"/>
-        </w:rPr>
-        <w:t xml:space="preserve">        </w:t>
-      </w:r>
-      <w:r>
-        <w:rPr>
-          <w:rStyle w:val="ControlFlowTok"/>
-        </w:rPr>
-        <w:t xml:space="preserve">for</w:t>
-      </w:r>
-      <w:r>
-        <w:rPr>
-          <w:rStyle w:val="NormalTok"/>
-        </w:rPr>
-        <w:t xml:space="preserve"> pred </w:t>
-      </w:r>
-      <w:r>
-        <w:rPr>
-          <w:rStyle w:val="KeywordTok"/>
-        </w:rPr>
-        <w:t xml:space="preserve">in</w:t>
-      </w:r>
-      <w:r>
-        <w:rPr>
-          <w:rStyle w:val="NormalTok"/>
-        </w:rPr>
-        <w:t xml:space="preserve"> g.predecessors(node):</w:t>
-      </w:r>
-      <w:r>
-        <w:br/>
-      </w:r>
-      <w:r>
-        <w:rPr>
-          <w:rStyle w:val="NormalTok"/>
-        </w:rPr>
-        <w:t xml:space="preserve">            </w:t>
-      </w:r>
-      <w:r>
-        <w:rPr>
-          <w:rStyle w:val="ControlFlowTok"/>
-        </w:rPr>
-        <w:t xml:space="preserve">if</w:t>
-      </w:r>
-      <w:r>
-        <w:rPr>
-          <w:rStyle w:val="NormalTok"/>
-        </w:rPr>
-        <w:t xml:space="preserve"> g.nodes[pred].get(</w:t>
-      </w:r>
-      <w:r>
-        <w:rPr>
-          <w:rStyle w:val="StringTok"/>
-        </w:rPr>
-        <w:t xml:space="preserve">"node_type"</w:t>
-      </w:r>
-      <w:r>
-        <w:rPr>
-          <w:rStyle w:val="NormalTok"/>
-        </w:rPr>
-        <w:t xml:space="preserve">) </w:t>
-      </w:r>
-      <w:r>
-        <w:rPr>
-          <w:rStyle w:val="OperatorTok"/>
-        </w:rPr>
-        <w:t xml:space="preserve">==</w:t>
-      </w:r>
-      <w:r>
-        <w:rPr>
-          <w:rStyle w:val="NormalTok"/>
-        </w:rPr>
-        <w:t xml:space="preserve"> </w:t>
-      </w:r>
-      <w:r>
-        <w:rPr>
-          <w:rStyle w:val="StringTok"/>
-        </w:rPr>
-        <w:t xml:space="preserve">"drug"</w:t>
-      </w:r>
-      <w:r>
-        <w:rPr>
-          <w:rStyle w:val="NormalTok"/>
-        </w:rPr>
-        <w:t xml:space="preserve">:</w:t>
-      </w:r>
-      <w:r>
-        <w:br/>
-      </w:r>
-      <w:r>
-        <w:rPr>
-          <w:rStyle w:val="NormalTok"/>
-        </w:rPr>
-        <w:t xml:space="preserve">                ptgs2_drugs.append((g.nodes[pred][</w:t>
-      </w:r>
-      <w:r>
-        <w:rPr>
-          <w:rStyle w:val="StringTok"/>
-        </w:rPr>
-        <w:t xml:space="preserve">"node_name"</w:t>
-      </w:r>
-      <w:r>
-        <w:rPr>
-          <w:rStyle w:val="NormalTok"/>
-        </w:rPr>
-        <w:t xml:space="preserve">],</w:t>
-      </w:r>
-      <w:r>
-        <w:br/>
-      </w:r>
-      <w:r>
-        <w:rPr>
-          <w:rStyle w:val="NormalTok"/>
-        </w:rPr>
-        <w:t xml:space="preserve">                                    g[pred][node].get(</w:t>
-      </w:r>
-      <w:r>
-        <w:rPr>
-          <w:rStyle w:val="StringTok"/>
-        </w:rPr>
-        <w:t xml:space="preserve">"relation"</w:t>
-      </w:r>
-      <w:r>
-        <w:rPr>
-          <w:rStyle w:val="NormalTok"/>
-        </w:rPr>
-        <w:t xml:space="preserve">)))</w:t>
-      </w:r>
-      <w:r>
-        <w:br/>
-      </w:r>
-      <w:r>
-        <w:rPr>
-          <w:rStyle w:val="BuiltInTok"/>
-        </w:rPr>
-        <w:t xml:space="preserve">print</w:t>
-      </w:r>
-      <w:r>
-        <w:rPr>
-          <w:rStyle w:val="NormalTok"/>
-        </w:rPr>
-        <w:t xml:space="preserve">(ptgs2_drugs)</w:t>
-      </w:r>
-      <w:r>
-        <w:br/>
-      </w:r>
-      <w:r>
-        <w:rPr>
-          <w:rStyle w:val="CommentTok"/>
-        </w:rPr>
-        <w:t xml:space="preserve"># Example output: [("Celecoxib", "inhibits"), ("Aspirin", "inhibits"), ...]</w:t>
-      </w:r>
-    </w:p>
-    <w:bookmarkEnd w:id="37"/>
-    <w:bookmarkStart w:id="38" w:name="extracting-pathway-subnetworks"/>
-    <w:p>
-      <w:pPr>
-        <w:pStyle w:val="Heading3"/>
-      </w:pPr>
-      <w:r>
-        <w:t xml:space="preserve">4.2 Extracting Pathway Subnetworks</w:t>
-      </w:r>
-    </w:p>
-    <w:p>
-      <w:pPr>
-        <w:pStyle w:val="SourceCode"/>
-      </w:pPr>
-      <w:r>
-        <w:rPr>
-          <w:rStyle w:val="CommentTok"/>
-        </w:rPr>
-        <w:t xml:space="preserve"># Extract the opioid signaling subnetwork</w:t>
-      </w:r>
-      <w:r>
-        <w:br/>
-      </w:r>
-      <w:r>
-        <w:rPr>
-          <w:rStyle w:val="NormalTok"/>
-        </w:rPr>
-        <w:t xml:space="preserve">opioid_genes </w:t>
-      </w:r>
-      <w:r>
-        <w:rPr>
-          <w:rStyle w:val="OperatorTok"/>
-        </w:rPr>
-        <w:t xml:space="preserve">=</w:t>
-      </w:r>
-      <w:r>
-        <w:rPr>
-          <w:rStyle w:val="NormalTok"/>
-        </w:rPr>
-        <w:t xml:space="preserve"> {</w:t>
-      </w:r>
-      <w:r>
-        <w:rPr>
-          <w:rStyle w:val="StringTok"/>
-        </w:rPr>
-        <w:t xml:space="preserve">"OPRM1"</w:t>
-      </w:r>
-      <w:r>
-        <w:rPr>
-          <w:rStyle w:val="NormalTok"/>
-        </w:rPr>
-        <w:t xml:space="preserve">, </w:t>
-      </w:r>
-      <w:r>
-        <w:rPr>
-          <w:rStyle w:val="StringTok"/>
-        </w:rPr>
-        <w:t xml:space="preserve">"OPRD1"</w:t>
-      </w:r>
-      <w:r>
-        <w:rPr>
-          <w:rStyle w:val="NormalTok"/>
-        </w:rPr>
-        <w:t xml:space="preserve">, </w:t>
-      </w:r>
-      <w:r>
-        <w:rPr>
-          <w:rStyle w:val="StringTok"/>
-        </w:rPr>
-        <w:t xml:space="preserve">"OPRK1"</w:t>
-      </w:r>
-      <w:r>
-        <w:rPr>
-          <w:rStyle w:val="NormalTok"/>
-        </w:rPr>
-        <w:t xml:space="preserve">, </w:t>
-      </w:r>
-      <w:r>
-        <w:rPr>
-          <w:rStyle w:val="StringTok"/>
-        </w:rPr>
-        <w:t xml:space="preserve">"POMC"</w:t>
-      </w:r>
-      <w:r>
-        <w:rPr>
-          <w:rStyle w:val="NormalTok"/>
-        </w:rPr>
-        <w:t xml:space="preserve">, </w:t>
-      </w:r>
-      <w:r>
-        <w:rPr>
-          <w:rStyle w:val="StringTok"/>
-        </w:rPr>
-        <w:t xml:space="preserve">"PENK"</w:t>
-      </w:r>
-      <w:r>
-        <w:rPr>
-          <w:rStyle w:val="NormalTok"/>
-        </w:rPr>
-        <w:t xml:space="preserve">, </w:t>
-      </w:r>
-      <w:r>
-        <w:rPr>
-          <w:rStyle w:val="StringTok"/>
-        </w:rPr>
-        <w:t xml:space="preserve">"PDYN"</w:t>
-      </w:r>
-      <w:r>
-        <w:rPr>
-          <w:rStyle w:val="NormalTok"/>
-        </w:rPr>
-        <w:t xml:space="preserve">}</w:t>
-      </w:r>
-      <w:r>
-        <w:br/>
-      </w:r>
-      <w:r>
-        <w:rPr>
-          <w:rStyle w:val="NormalTok"/>
-        </w:rPr>
-        <w:t xml:space="preserve">opioid_nodes </w:t>
-      </w:r>
-      <w:r>
-        <w:rPr>
-          <w:rStyle w:val="OperatorTok"/>
-        </w:rPr>
-        <w:t xml:space="preserve">=</w:t>
-      </w:r>
-      <w:r>
-        <w:rPr>
-          <w:rStyle w:val="NormalTok"/>
-        </w:rPr>
-        <w:t xml:space="preserve"> {n </w:t>
-      </w:r>
-      <w:r>
-        <w:rPr>
-          <w:rStyle w:val="ControlFlowTok"/>
-        </w:rPr>
-        <w:t xml:space="preserve">for</w:t>
-      </w:r>
-      <w:r>
-        <w:rPr>
-          <w:rStyle w:val="NormalTok"/>
-        </w:rPr>
-        <w:t xml:space="preserve"> n, d </w:t>
-      </w:r>
-      <w:r>
-        <w:rPr>
-          <w:rStyle w:val="KeywordTok"/>
-        </w:rPr>
-        <w:t xml:space="preserve">in</w:t>
-      </w:r>
-      <w:r>
-        <w:rPr>
-          <w:rStyle w:val="NormalTok"/>
-        </w:rPr>
-        <w:t xml:space="preserve"> g.nodes(data</w:t>
-      </w:r>
-      <w:r>
-        <w:rPr>
-          <w:rStyle w:val="OperatorTok"/>
-        </w:rPr>
-        <w:t xml:space="preserve">=</w:t>
-      </w:r>
-      <w:r>
-        <w:rPr>
-          <w:rStyle w:val="VariableTok"/>
-        </w:rPr>
-        <w:t xml:space="preserve">True</w:t>
-      </w:r>
-      <w:r>
-        <w:rPr>
-          <w:rStyle w:val="NormalTok"/>
-        </w:rPr>
-        <w:t xml:space="preserve">)</w:t>
-      </w:r>
-      <w:r>
-        <w:br/>
-      </w:r>
-      <w:r>
-        <w:rPr>
-          <w:rStyle w:val="NormalTok"/>
-        </w:rPr>
-        <w:t xml:space="preserve">                </w:t>
-      </w:r>
-      <w:r>
-        <w:rPr>
-          <w:rStyle w:val="ControlFlowTok"/>
-        </w:rPr>
-        <w:t xml:space="preserve">if</w:t>
-      </w:r>
-      <w:r>
-        <w:rPr>
-          <w:rStyle w:val="NormalTok"/>
-        </w:rPr>
-        <w:t xml:space="preserve"> </w:t>
-      </w:r>
-      <w:r>
-        <w:rPr>
-          <w:rStyle w:val="BuiltInTok"/>
-        </w:rPr>
-        <w:t xml:space="preserve">str</w:t>
-      </w:r>
-      <w:r>
-        <w:rPr>
-          <w:rStyle w:val="NormalTok"/>
-        </w:rPr>
-        <w:t xml:space="preserve">(d.get(</w:t>
-      </w:r>
-      <w:r>
-        <w:rPr>
-          <w:rStyle w:val="StringTok"/>
-        </w:rPr>
-        <w:t xml:space="preserve">"node_name"</w:t>
-      </w:r>
-      <w:r>
-        <w:rPr>
-          <w:rStyle w:val="NormalTok"/>
-        </w:rPr>
-        <w:t xml:space="preserve">, </w:t>
-      </w:r>
-      <w:r>
-        <w:rPr>
-          <w:rStyle w:val="StringTok"/>
-        </w:rPr>
-        <w:t xml:space="preserve">""</w:t>
-      </w:r>
-      <w:r>
-        <w:rPr>
-          <w:rStyle w:val="NormalTok"/>
-        </w:rPr>
-        <w:t xml:space="preserve">)).upper() </w:t>
-      </w:r>
-      <w:r>
-        <w:rPr>
-          <w:rStyle w:val="KeywordTok"/>
-        </w:rPr>
-        <w:t xml:space="preserve">in</w:t>
-      </w:r>
-      <w:r>
-        <w:rPr>
-          <w:rStyle w:val="NormalTok"/>
-        </w:rPr>
-        <w:t xml:space="preserve"> opioid_genes}</w:t>
-      </w:r>
-      <w:r>
-        <w:br/>
-      </w:r>
-      <w:r>
-        <w:rPr>
-          <w:rStyle w:val="NormalTok"/>
-        </w:rPr>
-        <w:t xml:space="preserve">subgraph </w:t>
-      </w:r>
-      <w:r>
-        <w:rPr>
-          <w:rStyle w:val="OperatorTok"/>
-        </w:rPr>
-        <w:t xml:space="preserve">=</w:t>
-      </w:r>
-      <w:r>
-        <w:rPr>
-          <w:rStyle w:val="NormalTok"/>
-        </w:rPr>
-        <w:t xml:space="preserve"> g.subgraph(opioid_nodes)</w:t>
-      </w:r>
-      <w:r>
-        <w:br/>
-      </w:r>
-      <w:r>
-        <w:rPr>
-          <w:rStyle w:val="ImportTok"/>
-        </w:rPr>
-        <w:t xml:space="preserve">import</w:t>
-      </w:r>
-      <w:r>
-        <w:rPr>
-          <w:rStyle w:val="NormalTok"/>
-        </w:rPr>
-        <w:t xml:space="preserve"> networkx </w:t>
-      </w:r>
-      <w:r>
-        <w:rPr>
-          <w:rStyle w:val="ImportTok"/>
-        </w:rPr>
-        <w:t xml:space="preserve">as</w:t>
-      </w:r>
-      <w:r>
-        <w:rPr>
-          <w:rStyle w:val="NormalTok"/>
-        </w:rPr>
-        <w:t xml:space="preserve"> nx</w:t>
-      </w:r>
-      <w:r>
-        <w:br/>
-      </w:r>
-      <w:r>
-        <w:rPr>
-          <w:rStyle w:val="NormalTok"/>
-        </w:rPr>
-        <w:t xml:space="preserve">nx.write_graphml(subgraph, </w:t>
-      </w:r>
-      <w:r>
-        <w:rPr>
-          <w:rStyle w:val="StringTok"/>
-        </w:rPr>
-        <w:t xml:space="preserve">"opioid_pathway.graphml"</w:t>
-      </w:r>
-      <w:r>
-        <w:rPr>
-          <w:rStyle w:val="NormalTok"/>
-        </w:rPr>
-        <w:t xml:space="preserve">)</w:t>
-      </w:r>
-    </w:p>
-    <w:bookmarkEnd w:id="38"/>
-    <w:bookmarkStart w:id="39" w:name="tissue-expression-profile-retrieval"/>
-    <w:p>
-      <w:pPr>
-        <w:pStyle w:val="Heading3"/>
-      </w:pPr>
-      <w:r>
-        <w:t xml:space="preserve">4.3 Tissue Expression Profile Retrieval</w:t>
-      </w:r>
-    </w:p>
-    <w:p>
-      <w:pPr>
-        <w:pStyle w:val="SourceCode"/>
-      </w:pPr>
-      <w:r>
-        <w:rPr>
-          <w:rStyle w:val="CommentTok"/>
-        </w:rPr>
-        <w:t xml:space="preserve"># Retrieve GTEx tissue expression for all Track B pain genes</w:t>
-      </w:r>
-      <w:r>
-        <w:br/>
-      </w:r>
-      <w:r>
-        <w:rPr>
-          <w:rStyle w:val="NormalTok"/>
-        </w:rPr>
-        <w:t xml:space="preserve">track_b_genes </w:t>
-      </w:r>
-      <w:r>
-        <w:rPr>
-          <w:rStyle w:val="OperatorTok"/>
-        </w:rPr>
-        <w:t xml:space="preserve">=</w:t>
-      </w:r>
-      <w:r>
-        <w:rPr>
-          <w:rStyle w:val="NormalTok"/>
-        </w:rPr>
-        <w:t xml:space="preserve"> [d[</w:t>
-      </w:r>
-      <w:r>
-        <w:rPr>
-          <w:rStyle w:val="StringTok"/>
-        </w:rPr>
-        <w:t xml:space="preserve">"node_name"</w:t>
-      </w:r>
-      <w:r>
-        <w:rPr>
-          <w:rStyle w:val="NormalTok"/>
-        </w:rPr>
-        <w:t xml:space="preserve">] </w:t>
-      </w:r>
-      <w:r>
-        <w:rPr>
-          <w:rStyle w:val="ControlFlowTok"/>
-        </w:rPr>
-        <w:t xml:space="preserve">for</w:t>
-      </w:r>
-      <w:r>
-        <w:rPr>
-          <w:rStyle w:val="NormalTok"/>
-        </w:rPr>
-        <w:t xml:space="preserve"> _, d </w:t>
-      </w:r>
-      <w:r>
-        <w:rPr>
-          <w:rStyle w:val="KeywordTok"/>
-        </w:rPr>
-        <w:t xml:space="preserve">in</w:t>
-      </w:r>
-      <w:r>
-        <w:rPr>
-          <w:rStyle w:val="NormalTok"/>
-        </w:rPr>
-        <w:t xml:space="preserve"> g.nodes(data</w:t>
-      </w:r>
-      <w:r>
-        <w:rPr>
-          <w:rStyle w:val="OperatorTok"/>
-        </w:rPr>
-        <w:t xml:space="preserve">=</w:t>
-      </w:r>
-      <w:r>
-        <w:rPr>
-          <w:rStyle w:val="VariableTok"/>
-        </w:rPr>
-        <w:t xml:space="preserve">True</w:t>
-      </w:r>
-      <w:r>
-        <w:rPr>
-          <w:rStyle w:val="NormalTok"/>
-        </w:rPr>
-        <w:t xml:space="preserve">)</w:t>
-      </w:r>
-      <w:r>
-        <w:br/>
-      </w:r>
-      <w:r>
-        <w:rPr>
-          <w:rStyle w:val="NormalTok"/>
-        </w:rPr>
-        <w:t xml:space="preserve">                 </w:t>
-      </w:r>
-      <w:r>
-        <w:rPr>
-          <w:rStyle w:val="ControlFlowTok"/>
-        </w:rPr>
-        <w:t xml:space="preserve">if</w:t>
-      </w:r>
-      <w:r>
-        <w:rPr>
-          <w:rStyle w:val="NormalTok"/>
-        </w:rPr>
-        <w:t xml:space="preserve"> d.get(</w:t>
-      </w:r>
-      <w:r>
-        <w:rPr>
-          <w:rStyle w:val="StringTok"/>
-        </w:rPr>
-        <w:t xml:space="preserve">"track"</w:t>
-      </w:r>
-      <w:r>
-        <w:rPr>
-          <w:rStyle w:val="NormalTok"/>
-        </w:rPr>
-        <w:t xml:space="preserve">) </w:t>
-      </w:r>
-      <w:r>
-        <w:rPr>
-          <w:rStyle w:val="OperatorTok"/>
-        </w:rPr>
-        <w:t xml:space="preserve">==</w:t>
-      </w:r>
-      <w:r>
-        <w:rPr>
-          <w:rStyle w:val="NormalTok"/>
-        </w:rPr>
-        <w:t xml:space="preserve"> </w:t>
-      </w:r>
-      <w:r>
-        <w:rPr>
-          <w:rStyle w:val="StringTok"/>
-        </w:rPr>
-        <w:t xml:space="preserve">"B"</w:t>
-      </w:r>
-      <w:r>
-        <w:rPr>
-          <w:rStyle w:val="NormalTok"/>
-        </w:rPr>
-        <w:t xml:space="preserve"> </w:t>
-      </w:r>
-      <w:r>
-        <w:rPr>
-          <w:rStyle w:val="KeywordTok"/>
-        </w:rPr>
-        <w:t xml:space="preserve">and</w:t>
-      </w:r>
-      <w:r>
-        <w:rPr>
-          <w:rStyle w:val="NormalTok"/>
-        </w:rPr>
-        <w:t xml:space="preserve"> d.get(</w:t>
-      </w:r>
-      <w:r>
-        <w:rPr>
-          <w:rStyle w:val="StringTok"/>
-        </w:rPr>
-        <w:t xml:space="preserve">"node_type"</w:t>
-      </w:r>
-      <w:r>
-        <w:rPr>
-          <w:rStyle w:val="NormalTok"/>
-        </w:rPr>
-        <w:t xml:space="preserve">) </w:t>
-      </w:r>
-      <w:r>
-        <w:rPr>
-          <w:rStyle w:val="OperatorTok"/>
-        </w:rPr>
-        <w:t xml:space="preserve">==</w:t>
-      </w:r>
-      <w:r>
-        <w:rPr>
-          <w:rStyle w:val="NormalTok"/>
-        </w:rPr>
-        <w:t xml:space="preserve"> </w:t>
-      </w:r>
-      <w:r>
-        <w:rPr>
-          <w:rStyle w:val="StringTok"/>
-        </w:rPr>
-        <w:t xml:space="preserve">"gene/protein"</w:t>
-      </w:r>
-      <w:r>
-        <w:rPr>
-          <w:rStyle w:val="NormalTok"/>
-        </w:rPr>
-        <w:t xml:space="preserve">]</w:t>
-      </w:r>
-      <w:r>
-        <w:br/>
-      </w:r>
-      <w:r>
-        <w:rPr>
-          <w:rStyle w:val="ControlFlowTok"/>
-        </w:rPr>
-        <w:t xml:space="preserve">for</w:t>
-      </w:r>
-      <w:r>
-        <w:rPr>
-          <w:rStyle w:val="NormalTok"/>
-        </w:rPr>
-        <w:t xml:space="preserve"> gene </w:t>
-      </w:r>
-      <w:r>
-        <w:rPr>
-          <w:rStyle w:val="KeywordTok"/>
-        </w:rPr>
-        <w:t xml:space="preserve">in</w:t>
-      </w:r>
-      <w:r>
-        <w:rPr>
-          <w:rStyle w:val="NormalTok"/>
-        </w:rPr>
-        <w:t xml:space="preserve"> track_b_genes[:</w:t>
-      </w:r>
-      <w:r>
-        <w:rPr>
-          <w:rStyle w:val="DecValTok"/>
-        </w:rPr>
-        <w:t xml:space="preserve">5</w:t>
-      </w:r>
-      <w:r>
-        <w:rPr>
-          <w:rStyle w:val="NormalTok"/>
-        </w:rPr>
-        <w:t xml:space="preserve">]:</w:t>
-      </w:r>
-      <w:r>
-        <w:br/>
-      </w:r>
-      <w:r>
-        <w:rPr>
-          <w:rStyle w:val="NormalTok"/>
-        </w:rPr>
-        <w:t xml:space="preserve">    expr </w:t>
-      </w:r>
-      <w:r>
-        <w:rPr>
-          <w:rStyle w:val="OperatorTok"/>
-        </w:rPr>
-        <w:t xml:space="preserve">=</w:t>
-      </w:r>
-      <w:r>
-        <w:rPr>
-          <w:rStyle w:val="NormalTok"/>
-        </w:rPr>
-        <w:t xml:space="preserve"> d.get(</w:t>
-      </w:r>
-      <w:r>
-        <w:rPr>
-          <w:rStyle w:val="StringTok"/>
-        </w:rPr>
-        <w:t xml:space="preserve">"gtex_median_tpm"</w:t>
-      </w:r>
-      <w:r>
-        <w:rPr>
-          <w:rStyle w:val="NormalTok"/>
-        </w:rPr>
-        <w:t xml:space="preserve">, {})</w:t>
-      </w:r>
-      <w:r>
-        <w:br/>
-      </w:r>
-      <w:r>
-        <w:rPr>
-          <w:rStyle w:val="NormalTok"/>
-        </w:rPr>
-        <w:t xml:space="preserve">    spinal_cord </w:t>
-      </w:r>
-      <w:r>
-        <w:rPr>
-          <w:rStyle w:val="OperatorTok"/>
-        </w:rPr>
-        <w:t xml:space="preserve">=</w:t>
-      </w:r>
-      <w:r>
-        <w:rPr>
-          <w:rStyle w:val="NormalTok"/>
-        </w:rPr>
-        <w:t xml:space="preserve"> expr.get(</w:t>
-      </w:r>
-      <w:r>
-        <w:rPr>
-          <w:rStyle w:val="StringTok"/>
-        </w:rPr>
-        <w:t xml:space="preserve">"Spinal_Cord_cervical_c-1"</w:t>
-      </w:r>
-      <w:r>
-        <w:rPr>
-          <w:rStyle w:val="NormalTok"/>
-        </w:rPr>
-        <w:t xml:space="preserve">, </w:t>
-      </w:r>
-      <w:r>
-        <w:rPr>
-          <w:rStyle w:val="StringTok"/>
-        </w:rPr>
-        <w:t xml:space="preserve">"N/A"</w:t>
-      </w:r>
-      <w:r>
-        <w:rPr>
-          <w:rStyle w:val="NormalTok"/>
-        </w:rPr>
-        <w:t xml:space="preserve">)</w:t>
-      </w:r>
-      <w:r>
-        <w:br/>
-      </w:r>
-      <w:r>
-        <w:rPr>
-          <w:rStyle w:val="NormalTok"/>
-        </w:rPr>
-        <w:t xml:space="preserve">    tibial_nerve </w:t>
-      </w:r>
-      <w:r>
-        <w:rPr>
-          <w:rStyle w:val="OperatorTok"/>
-        </w:rPr>
-        <w:t xml:space="preserve">=</w:t>
-      </w:r>
-      <w:r>
-        <w:rPr>
-          <w:rStyle w:val="NormalTok"/>
-        </w:rPr>
-        <w:t xml:space="preserve"> expr.get(</w:t>
-      </w:r>
-      <w:r>
-        <w:rPr>
-          <w:rStyle w:val="StringTok"/>
-        </w:rPr>
-        <w:t xml:space="preserve">"Nerve_Tibial"</w:t>
-      </w:r>
-      <w:r>
-        <w:rPr>
-          <w:rStyle w:val="NormalTok"/>
-        </w:rPr>
-        <w:t xml:space="preserve">, </w:t>
-      </w:r>
-      <w:r>
-        <w:rPr>
-          <w:rStyle w:val="StringTok"/>
-        </w:rPr>
-        <w:t xml:space="preserve">"N/A"</w:t>
-      </w:r>
-      <w:r>
-        <w:rPr>
-          <w:rStyle w:val="NormalTok"/>
-        </w:rPr>
-        <w:t xml:space="preserve">)</w:t>
-      </w:r>
-      <w:r>
-        <w:br/>
-      </w:r>
-      <w:r>
-        <w:rPr>
-          <w:rStyle w:val="NormalTok"/>
-        </w:rPr>
-        <w:t xml:space="preserve">    </w:t>
-      </w:r>
-      <w:r>
-        <w:rPr>
-          <w:rStyle w:val="BuiltInTok"/>
-        </w:rPr>
-        <w:t xml:space="preserve">print</w:t>
-      </w:r>
-      <w:r>
-        <w:rPr>
-          <w:rStyle w:val="NormalTok"/>
-        </w:rPr>
-        <w:t xml:space="preserve">(</w:t>
-      </w:r>
-      <w:r>
-        <w:rPr>
-          <w:rStyle w:val="SpecialStringTok"/>
-        </w:rPr>
-        <w:t xml:space="preserve">f"</w:t>
-      </w:r>
-      <w:r>
-        <w:rPr>
-          <w:rStyle w:val="SpecialCharTok"/>
-        </w:rPr>
-        <w:t xml:space="preserve">{</w:t>
-      </w:r>
-      <w:r>
-        <w:rPr>
-          <w:rStyle w:val="NormalTok"/>
-        </w:rPr>
-        <w:t xml:space="preserve">gene</w:t>
-      </w:r>
-      <w:r>
-        <w:rPr>
-          <w:rStyle w:val="SpecialCharTok"/>
-        </w:rPr>
-        <w:t xml:space="preserve">}</w:t>
-      </w:r>
-      <w:r>
-        <w:rPr>
-          <w:rStyle w:val="SpecialStringTok"/>
-        </w:rPr>
-        <w:t xml:space="preserve">: Spinal=</w:t>
-      </w:r>
-      <w:r>
-        <w:rPr>
-          <w:rStyle w:val="SpecialCharTok"/>
-        </w:rPr>
-        <w:t xml:space="preserve">{</w:t>
-      </w:r>
-      <w:r>
-        <w:rPr>
-          <w:rStyle w:val="NormalTok"/>
-        </w:rPr>
-        <w:t xml:space="preserve">spinal_cord</w:t>
-      </w:r>
-      <w:r>
-        <w:rPr>
-          <w:rStyle w:val="SpecialCharTok"/>
-        </w:rPr>
-        <w:t xml:space="preserve">}</w:t>
-      </w:r>
-      <w:r>
-        <w:rPr>
-          <w:rStyle w:val="SpecialStringTok"/>
-        </w:rPr>
-        <w:t xml:space="preserve">, Tibial=</w:t>
-      </w:r>
-      <w:r>
-        <w:rPr>
-          <w:rStyle w:val="SpecialCharTok"/>
-        </w:rPr>
-        <w:t xml:space="preserve">{</w:t>
-      </w:r>
-      <w:r>
-        <w:rPr>
-          <w:rStyle w:val="NormalTok"/>
-        </w:rPr>
-        <w:t xml:space="preserve">tibial_nerve</w:t>
-      </w:r>
-      <w:r>
-        <w:rPr>
-          <w:rStyle w:val="SpecialCharTok"/>
-        </w:rPr>
-        <w:t xml:space="preserve">}</w:t>
-      </w:r>
-      <w:r>
-        <w:rPr>
-          <w:rStyle w:val="SpecialStringTok"/>
-        </w:rPr>
-        <w:t xml:space="preserve">"</w:t>
-      </w:r>
-      <w:r>
-        <w:rPr>
-          <w:rStyle w:val="NormalTok"/>
-        </w:rPr>
-        <w:t xml:space="preserve">)</w:t>
-      </w:r>
-    </w:p>
-    <w:bookmarkEnd w:id="39"/>
-    <w:bookmarkStart w:id="40" w:name="identifying-bridge-genes-between-tracks"/>
-    <w:p>
-      <w:pPr>
-        <w:pStyle w:val="Heading3"/>
-      </w:pPr>
-      <w:r>
-        <w:t xml:space="preserve">4.4 Identifying Bridge Genes Between Tracks</w:t>
-      </w:r>
-    </w:p>
-    <w:p>
-      <w:pPr>
-        <w:pStyle w:val="SourceCode"/>
-      </w:pPr>
-      <w:r>
-        <w:rPr>
-          <w:rStyle w:val="CommentTok"/>
-        </w:rPr>
-        <w:t xml:space="preserve"># Find genes connecting Track A and Track B in the PPI subgraph</w:t>
-      </w:r>
-      <w:r>
-        <w:br/>
-      </w:r>
-      <w:r>
-        <w:rPr>
-          <w:rStyle w:val="NormalTok"/>
-        </w:rPr>
-        <w:t xml:space="preserve">track_a_nodes </w:t>
-      </w:r>
-      <w:r>
-        <w:rPr>
-          <w:rStyle w:val="OperatorTok"/>
-        </w:rPr>
-        <w:t xml:space="preserve">=</w:t>
-      </w:r>
-      <w:r>
-        <w:rPr>
-          <w:rStyle w:val="NormalTok"/>
-        </w:rPr>
-        <w:t xml:space="preserve"> {n </w:t>
-      </w:r>
-      <w:r>
-        <w:rPr>
-          <w:rStyle w:val="ControlFlowTok"/>
-        </w:rPr>
-        <w:t xml:space="preserve">for</w:t>
-      </w:r>
-      <w:r>
-        <w:rPr>
-          <w:rStyle w:val="NormalTok"/>
-        </w:rPr>
-        <w:t xml:space="preserve"> n, d </w:t>
-      </w:r>
-      <w:r>
-        <w:rPr>
-          <w:rStyle w:val="KeywordTok"/>
-        </w:rPr>
-        <w:t xml:space="preserve">in</w:t>
-      </w:r>
-      <w:r>
-        <w:rPr>
-          <w:rStyle w:val="NormalTok"/>
-        </w:rPr>
-        <w:t xml:space="preserve"> g.nodes(data</w:t>
-      </w:r>
-      <w:r>
-        <w:rPr>
-          <w:rStyle w:val="OperatorTok"/>
-        </w:rPr>
-        <w:t xml:space="preserve">=</w:t>
-      </w:r>
-      <w:r>
-        <w:rPr>
-          <w:rStyle w:val="VariableTok"/>
-        </w:rPr>
-        <w:t xml:space="preserve">True</w:t>
-      </w:r>
-      <w:r>
-        <w:rPr>
-          <w:rStyle w:val="NormalTok"/>
-        </w:rPr>
-        <w:t xml:space="preserve">) </w:t>
-      </w:r>
-      <w:r>
-        <w:rPr>
-          <w:rStyle w:val="ControlFlowTok"/>
-        </w:rPr>
-        <w:t xml:space="preserve">if</w:t>
-      </w:r>
-      <w:r>
-        <w:rPr>
-          <w:rStyle w:val="NormalTok"/>
-        </w:rPr>
-        <w:t xml:space="preserve"> d.get(</w:t>
-      </w:r>
-      <w:r>
-        <w:rPr>
-          <w:rStyle w:val="StringTok"/>
-        </w:rPr>
-        <w:t xml:space="preserve">"track"</w:t>
-      </w:r>
-      <w:r>
-        <w:rPr>
-          <w:rStyle w:val="NormalTok"/>
-        </w:rPr>
-        <w:t xml:space="preserve">) </w:t>
-      </w:r>
-      <w:r>
-        <w:rPr>
-          <w:rStyle w:val="OperatorTok"/>
-        </w:rPr>
-        <w:t xml:space="preserve">==</w:t>
-      </w:r>
-      <w:r>
-        <w:rPr>
-          <w:rStyle w:val="NormalTok"/>
-        </w:rPr>
-        <w:t xml:space="preserve"> </w:t>
-      </w:r>
-      <w:r>
-        <w:rPr>
-          <w:rStyle w:val="StringTok"/>
-        </w:rPr>
-        <w:t xml:space="preserve">"A"</w:t>
-      </w:r>
-      <w:r>
-        <w:rPr>
-          <w:rStyle w:val="NormalTok"/>
-        </w:rPr>
-        <w:t xml:space="preserve">}</w:t>
-      </w:r>
-      <w:r>
-        <w:br/>
-      </w:r>
-      <w:r>
-        <w:rPr>
-          <w:rStyle w:val="NormalTok"/>
-        </w:rPr>
-        <w:t xml:space="preserve">track_b_nodes </w:t>
-      </w:r>
-      <w:r>
-        <w:rPr>
-          <w:rStyle w:val="OperatorTok"/>
-        </w:rPr>
-        <w:t xml:space="preserve">=</w:t>
-      </w:r>
-      <w:r>
-        <w:rPr>
-          <w:rStyle w:val="NormalTok"/>
-        </w:rPr>
-        <w:t xml:space="preserve"> {n </w:t>
-      </w:r>
-      <w:r>
-        <w:rPr>
-          <w:rStyle w:val="ControlFlowTok"/>
-        </w:rPr>
-        <w:t xml:space="preserve">for</w:t>
-      </w:r>
-      <w:r>
-        <w:rPr>
-          <w:rStyle w:val="NormalTok"/>
-        </w:rPr>
-        <w:t xml:space="preserve"> n, d </w:t>
-      </w:r>
-      <w:r>
-        <w:rPr>
-          <w:rStyle w:val="KeywordTok"/>
-        </w:rPr>
-        <w:t xml:space="preserve">in</w:t>
-      </w:r>
-      <w:r>
-        <w:rPr>
-          <w:rStyle w:val="NormalTok"/>
-        </w:rPr>
-        <w:t xml:space="preserve"> g.nodes(data</w:t>
-      </w:r>
-      <w:r>
-        <w:rPr>
-          <w:rStyle w:val="OperatorTok"/>
-        </w:rPr>
-        <w:t xml:space="preserve">=</w:t>
-      </w:r>
-      <w:r>
-        <w:rPr>
-          <w:rStyle w:val="VariableTok"/>
-        </w:rPr>
-        <w:t xml:space="preserve">True</w:t>
-      </w:r>
-      <w:r>
-        <w:rPr>
-          <w:rStyle w:val="NormalTok"/>
-        </w:rPr>
-        <w:t xml:space="preserve">) </w:t>
-      </w:r>
-      <w:r>
-        <w:rPr>
-          <w:rStyle w:val="ControlFlowTok"/>
-        </w:rPr>
-        <w:t xml:space="preserve">if</w:t>
-      </w:r>
-      <w:r>
-        <w:rPr>
-          <w:rStyle w:val="NormalTok"/>
-        </w:rPr>
-        <w:t xml:space="preserve"> d.get(</w:t>
-      </w:r>
-      <w:r>
-        <w:rPr>
-          <w:rStyle w:val="StringTok"/>
-        </w:rPr>
-        <w:t xml:space="preserve">"track"</w:t>
-      </w:r>
-      <w:r>
-        <w:rPr>
-          <w:rStyle w:val="NormalTok"/>
-        </w:rPr>
-        <w:t xml:space="preserve">) </w:t>
-      </w:r>
-      <w:r>
-        <w:rPr>
-          <w:rStyle w:val="OperatorTok"/>
-        </w:rPr>
-        <w:t xml:space="preserve">==</w:t>
-      </w:r>
-      <w:r>
-        <w:rPr>
-          <w:rStyle w:val="NormalTok"/>
-        </w:rPr>
-        <w:t xml:space="preserve"> </w:t>
-      </w:r>
-      <w:r>
-        <w:rPr>
-          <w:rStyle w:val="StringTok"/>
-        </w:rPr>
-        <w:t xml:space="preserve">"B"</w:t>
-      </w:r>
-      <w:r>
-        <w:rPr>
-          <w:rStyle w:val="NormalTok"/>
-        </w:rPr>
-        <w:t xml:space="preserve">}</w:t>
-      </w:r>
-      <w:r>
-        <w:br/>
-      </w:r>
-      <w:r>
-        <w:rPr>
-          <w:rStyle w:val="NormalTok"/>
-        </w:rPr>
-        <w:t xml:space="preserve">ppi_edges </w:t>
-      </w:r>
-      <w:r>
-        <w:rPr>
-          <w:rStyle w:val="OperatorTok"/>
-        </w:rPr>
-        <w:t xml:space="preserve">=</w:t>
-      </w:r>
-      <w:r>
-        <w:rPr>
-          <w:rStyle w:val="NormalTok"/>
-        </w:rPr>
-        <w:t xml:space="preserve"> [(u, v) </w:t>
-      </w:r>
-      <w:r>
-        <w:rPr>
-          <w:rStyle w:val="ControlFlowTok"/>
-        </w:rPr>
-        <w:t xml:space="preserve">for</w:t>
-      </w:r>
-      <w:r>
-        <w:rPr>
-          <w:rStyle w:val="NormalTok"/>
-        </w:rPr>
-        <w:t xml:space="preserve"> u, v, d </w:t>
-      </w:r>
-      <w:r>
-        <w:rPr>
-          <w:rStyle w:val="KeywordTok"/>
-        </w:rPr>
-        <w:t xml:space="preserve">in</w:t>
-      </w:r>
-      <w:r>
-        <w:rPr>
-          <w:rStyle w:val="NormalTok"/>
-        </w:rPr>
-        <w:t xml:space="preserve"> g.edges(data</w:t>
-      </w:r>
-      <w:r>
-        <w:rPr>
-          <w:rStyle w:val="OperatorTok"/>
-        </w:rPr>
-        <w:t xml:space="preserve">=</w:t>
-      </w:r>
-      <w:r>
-        <w:rPr>
-          <w:rStyle w:val="VariableTok"/>
-        </w:rPr>
-        <w:t xml:space="preserve">True</w:t>
-      </w:r>
-      <w:r>
-        <w:rPr>
-          <w:rStyle w:val="NormalTok"/>
-        </w:rPr>
-        <w:t xml:space="preserve">)</w:t>
-      </w:r>
-      <w:r>
-        <w:br/>
-      </w:r>
-      <w:r>
-        <w:rPr>
-          <w:rStyle w:val="NormalTok"/>
-        </w:rPr>
-        <w:t xml:space="preserve">             </w:t>
-      </w:r>
-      <w:r>
-        <w:rPr>
-          <w:rStyle w:val="ControlFlowTok"/>
-        </w:rPr>
-        <w:t xml:space="preserve">if</w:t>
-      </w:r>
-      <w:r>
-        <w:rPr>
-          <w:rStyle w:val="NormalTok"/>
-        </w:rPr>
-        <w:t xml:space="preserve"> d.get(</w:t>
-      </w:r>
-      <w:r>
-        <w:rPr>
-          <w:rStyle w:val="StringTok"/>
-        </w:rPr>
-        <w:t xml:space="preserve">"relation"</w:t>
-      </w:r>
-      <w:r>
-        <w:rPr>
-          <w:rStyle w:val="NormalTok"/>
-        </w:rPr>
-        <w:t xml:space="preserve">) </w:t>
-      </w:r>
-      <w:r>
-        <w:rPr>
-          <w:rStyle w:val="OperatorTok"/>
-        </w:rPr>
-        <w:t xml:space="preserve">==</w:t>
-      </w:r>
-      <w:r>
-        <w:rPr>
-          <w:rStyle w:val="NormalTok"/>
-        </w:rPr>
-        <w:t xml:space="preserve"> </w:t>
-      </w:r>
-      <w:r>
-        <w:rPr>
-          <w:rStyle w:val="StringTok"/>
-        </w:rPr>
-        <w:t xml:space="preserve">"protein_protein"</w:t>
-      </w:r>
-      <w:r>
-        <w:rPr>
-          <w:rStyle w:val="NormalTok"/>
-        </w:rPr>
-        <w:t xml:space="preserve">]</w:t>
-      </w:r>
-      <w:r>
-        <w:br/>
-      </w:r>
-      <w:r>
-        <w:rPr>
-          <w:rStyle w:val="NormalTok"/>
-        </w:rPr>
-        <w:t xml:space="preserve">bridge_scores </w:t>
-      </w:r>
-      <w:r>
-        <w:rPr>
-          <w:rStyle w:val="OperatorTok"/>
-        </w:rPr>
-        <w:t xml:space="preserve">=</w:t>
-      </w:r>
-      <w:r>
-        <w:rPr>
-          <w:rStyle w:val="NormalTok"/>
-        </w:rPr>
-        <w:t xml:space="preserve"> {}</w:t>
-      </w:r>
-      <w:r>
-        <w:br/>
-      </w:r>
-      <w:r>
-        <w:rPr>
-          <w:rStyle w:val="ControlFlowTok"/>
-        </w:rPr>
-        <w:t xml:space="preserve">for</w:t>
-      </w:r>
-      <w:r>
-        <w:rPr>
-          <w:rStyle w:val="NormalTok"/>
-        </w:rPr>
-        <w:t xml:space="preserve"> u, v </w:t>
-      </w:r>
-      <w:r>
-        <w:rPr>
-          <w:rStyle w:val="KeywordTok"/>
-        </w:rPr>
-        <w:t xml:space="preserve">in</w:t>
-      </w:r>
-      <w:r>
-        <w:rPr>
-          <w:rStyle w:val="NormalTok"/>
-        </w:rPr>
-        <w:t xml:space="preserve"> ppi_edges:</w:t>
-      </w:r>
-      <w:r>
-        <w:br/>
-      </w:r>
-      <w:r>
-        <w:rPr>
-          <w:rStyle w:val="NormalTok"/>
-        </w:rPr>
-        <w:t xml:space="preserve">    </w:t>
-      </w:r>
-      <w:r>
-        <w:rPr>
-          <w:rStyle w:val="ControlFlowTok"/>
-        </w:rPr>
-        <w:t xml:space="preserve">if</w:t>
-      </w:r>
-      <w:r>
-        <w:rPr>
-          <w:rStyle w:val="NormalTok"/>
-        </w:rPr>
-        <w:t xml:space="preserve"> u </w:t>
-      </w:r>
-      <w:r>
-        <w:rPr>
-          <w:rStyle w:val="KeywordTok"/>
-        </w:rPr>
-        <w:t xml:space="preserve">in</w:t>
-      </w:r>
-      <w:r>
-        <w:rPr>
-          <w:rStyle w:val="NormalTok"/>
-        </w:rPr>
-        <w:t xml:space="preserve"> track_a_nodes </w:t>
-      </w:r>
-      <w:r>
-        <w:rPr>
-          <w:rStyle w:val="KeywordTok"/>
-        </w:rPr>
-        <w:t xml:space="preserve">and</w:t>
-      </w:r>
-      <w:r>
-        <w:rPr>
-          <w:rStyle w:val="NormalTok"/>
-        </w:rPr>
-        <w:t xml:space="preserve"> v </w:t>
-      </w:r>
-      <w:r>
-        <w:rPr>
-          <w:rStyle w:val="KeywordTok"/>
-        </w:rPr>
-        <w:t xml:space="preserve">in</w:t>
-      </w:r>
-      <w:r>
-        <w:rPr>
-          <w:rStyle w:val="NormalTok"/>
-        </w:rPr>
-        <w:t xml:space="preserve"> track_b_nodes:</w:t>
-      </w:r>
-      <w:r>
-        <w:br/>
-      </w:r>
-      <w:r>
-        <w:rPr>
-          <w:rStyle w:val="NormalTok"/>
-        </w:rPr>
-        <w:t xml:space="preserve">        bridge_scores[u] </w:t>
-      </w:r>
-      <w:r>
-        <w:rPr>
-          <w:rStyle w:val="OperatorTok"/>
-        </w:rPr>
-        <w:t xml:space="preserve">=</w:t>
-      </w:r>
-      <w:r>
-        <w:rPr>
-          <w:rStyle w:val="NormalTok"/>
-        </w:rPr>
-        <w:t xml:space="preserve"> bridge_scores.get(u, </w:t>
-      </w:r>
-      <w:r>
-        <w:rPr>
-          <w:rStyle w:val="DecValTok"/>
-        </w:rPr>
-        <w:t xml:space="preserve">0</w:t>
-      </w:r>
-      <w:r>
-        <w:rPr>
-          <w:rStyle w:val="NormalTok"/>
-        </w:rPr>
-        <w:t xml:space="preserve">) </w:t>
-      </w:r>
-      <w:r>
-        <w:rPr>
-          <w:rStyle w:val="OperatorTok"/>
-        </w:rPr>
-        <w:t xml:space="preserve">+</w:t>
-      </w:r>
-      <w:r>
-        <w:rPr>
-          <w:rStyle w:val="NormalTok"/>
-        </w:rPr>
-        <w:t xml:space="preserve"> </w:t>
-      </w:r>
-      <w:r>
-        <w:rPr>
-          <w:rStyle w:val="DecValTok"/>
-        </w:rPr>
-        <w:t xml:space="preserve">1</w:t>
-      </w:r>
-      <w:r>
-        <w:br/>
-      </w:r>
-      <w:r>
-        <w:rPr>
-          <w:rStyle w:val="NormalTok"/>
-        </w:rPr>
-        <w:t xml:space="preserve">        bridge_scores[v] </w:t>
-      </w:r>
-      <w:r>
-        <w:rPr>
-          <w:rStyle w:val="OperatorTok"/>
-        </w:rPr>
-        <w:t xml:space="preserve">=</w:t>
-      </w:r>
-      <w:r>
-        <w:rPr>
-          <w:rStyle w:val="NormalTok"/>
-        </w:rPr>
-        <w:t xml:space="preserve"> bridge_scores.get(v, </w:t>
-      </w:r>
-      <w:r>
-        <w:rPr>
-          <w:rStyle w:val="DecValTok"/>
-        </w:rPr>
-        <w:t xml:space="preserve">0</w:t>
-      </w:r>
-      <w:r>
-        <w:rPr>
-          <w:rStyle w:val="NormalTok"/>
-        </w:rPr>
-        <w:t xml:space="preserve">) </w:t>
-      </w:r>
-      <w:r>
-        <w:rPr>
-          <w:rStyle w:val="OperatorTok"/>
-        </w:rPr>
-        <w:t xml:space="preserve">+</w:t>
-      </w:r>
-      <w:r>
-        <w:rPr>
-          <w:rStyle w:val="NormalTok"/>
-        </w:rPr>
-        <w:t xml:space="preserve"> </w:t>
-      </w:r>
-      <w:r>
-        <w:rPr>
-          <w:rStyle w:val="DecValTok"/>
-        </w:rPr>
-        <w:t xml:space="preserve">1</w:t>
-      </w:r>
-      <w:r>
-        <w:br/>
-      </w:r>
-      <w:r>
-        <w:rPr>
-          <w:rStyle w:val="NormalTok"/>
-        </w:rPr>
-        <w:t xml:space="preserve">top_bridges </w:t>
-      </w:r>
-      <w:r>
-        <w:rPr>
-          <w:rStyle w:val="OperatorTok"/>
-        </w:rPr>
-        <w:t xml:space="preserve">=</w:t>
-      </w:r>
-      <w:r>
-        <w:rPr>
-          <w:rStyle w:val="NormalTok"/>
-        </w:rPr>
-        <w:t xml:space="preserve"> </w:t>
-      </w:r>
-      <w:r>
-        <w:rPr>
-          <w:rStyle w:val="BuiltInTok"/>
-        </w:rPr>
-        <w:t xml:space="preserve">sorted</w:t>
-      </w:r>
-      <w:r>
-        <w:rPr>
-          <w:rStyle w:val="NormalTok"/>
-        </w:rPr>
-        <w:t xml:space="preserve">(bridge_scores.items(), key</w:t>
-      </w:r>
-      <w:r>
-        <w:rPr>
-          <w:rStyle w:val="OperatorTok"/>
-        </w:rPr>
-        <w:t xml:space="preserve">=</w:t>
-      </w:r>
-      <w:r>
-        <w:rPr>
-          <w:rStyle w:val="KeywordTok"/>
-        </w:rPr>
-        <w:t xml:space="preserve">lambda</w:t>
-      </w:r>
-      <w:r>
-        <w:rPr>
-          <w:rStyle w:val="NormalTok"/>
-        </w:rPr>
-        <w:t xml:space="preserve"> x: x[</w:t>
-      </w:r>
-      <w:r>
-        <w:rPr>
-          <w:rStyle w:val="DecValTok"/>
-        </w:rPr>
-        <w:t xml:space="preserve">1</w:t>
-      </w:r>
-      <w:r>
-        <w:rPr>
-          <w:rStyle w:val="NormalTok"/>
-        </w:rPr>
-        <w:t xml:space="preserve">], reverse</w:t>
-      </w:r>
-      <w:r>
-        <w:rPr>
-          <w:rStyle w:val="OperatorTok"/>
-        </w:rPr>
-        <w:t xml:space="preserve">=</w:t>
-      </w:r>
-      <w:r>
-        <w:rPr>
-          <w:rStyle w:val="VariableTok"/>
-        </w:rPr>
-        <w:t xml:space="preserve">True</w:t>
-      </w:r>
-      <w:r>
-        <w:rPr>
-          <w:rStyle w:val="NormalTok"/>
-        </w:rPr>
-        <w:t xml:space="preserve">)[:</w:t>
-      </w:r>
-      <w:r>
-        <w:rPr>
-          <w:rStyle w:val="DecValTok"/>
-        </w:rPr>
-        <w:t xml:space="preserve">10</w:t>
-      </w:r>
-      <w:r>
-        <w:rPr>
-          <w:rStyle w:val="NormalTok"/>
-        </w:rPr>
-        <w:t xml:space="preserve">]</w:t>
-      </w:r>
-      <w:r>
-        <w:br/>
-      </w:r>
-      <w:r>
-        <w:rPr>
-          <w:rStyle w:val="CommentTok"/>
-        </w:rPr>
-        <w:t xml:space="preserve"># Top bridges include STAT3, RELA, NFKB1, IKBKB</w:t>
-      </w:r>
-    </w:p>
-    <w:p>
-      <w:r>
-        <w:pict>
-          <v:rect style="width:0;height:1.5pt" o:hralign="center" o:hrstd="t" o:hr="t"/>
-        </w:pict>
-      </w:r>
-    </w:p>
-    <w:bookmarkEnd w:id="40"/>
-    <w:bookmarkEnd w:id="41"/>
-    <w:bookmarkStart w:id="48" w:name="discussion"/>
-    <w:p>
-      <w:pPr>
-        <w:pStyle w:val="Heading2"/>
-      </w:pPr>
-      <w:r>
-        <w:t xml:space="preserve">4. Discussion</w:t>
-      </w:r>
-    </w:p>
-    <w:bookmarkStart w:id="42" w:name="ra-painkg-as-a-knowledge-resource"/>
-    <w:p>
-      <w:pPr>
-        <w:pStyle w:val="Heading3"/>
-      </w:pPr>
-      <w:r>
-        <w:t xml:space="preserve">4.1 RA-PainKG as a Knowledge Resource</w:t>
-      </w:r>
-    </w:p>
-    <w:p>
-      <w:pPr>
-        <w:pStyle w:val="FirstParagraph"/>
-      </w:pPr>
-      <w:r>
-        <w:t xml:space="preserve">RA-PainKG fills a specific gap in the biomedical database landscape: a tissue-contextualized, dual-track knowledge graph with systematic coverage-gap documentation for RA pain signaling. Comparison with existing resources demonstrates its unique contribution (Table 4).</w:t>
+        <w:t xml:space="preserve">RA-PainKG fills a specific gap in the biomedical database landscape: a tissue-contextualized, dual-track knowledge graph with systematic coverage-gap documentation for RA pain signaling. Comparison with existing resources demonstrates its unique contribution (Table 2).</w:t>
       </w:r>
     </w:p>
     <w:p>
@@ -4406,7 +2500,7 @@
           <w:b/>
           <w:bCs/>
         </w:rPr>
-        <w:t xml:space="preserve">Table 4. Comparison with existing resources</w:t>
+        <w:t xml:space="preserve">Table 2. Comparison with existing resources</w:t>
       </w:r>
     </w:p>
     <w:tbl>
@@ -5045,11 +3139,11 @@
         <w:pStyle w:val="BodyText"/>
       </w:pPr>
       <w:r>
-        <w:t xml:space="preserve">RA-PainKG serves three primary use cases. First, as a queryable knowledge base: researchers can extract pathway subnetworks (all nine curated pain pathways), identify drugs targeting specific pain genes, and retrieve tissue expression profiles for pain genes across 54 human tissues. Second, as a hypothesis-generation tool: the dual-track framework enables systematic comparison of inflammatory versus nociceptive mechanisms, and bridge genes (STAT3, RELA, NF-kappaB complex) connecting both tracks represent candidate intervention points where anti-inflammatory and analgesic effects may converge. Third, as prior knowledge for machine learning: the graph provides structured domain knowledge for downstream applications including gene perturbation prediction, drug repurposing, and causal mediator identification.</w:t>
-      </w:r>
-    </w:p>
-    <w:bookmarkEnd w:id="42"/>
-    <w:bookmarkStart w:id="43" w:name="the-value-of-coverage-gap-documentation"/>
+        <w:t xml:space="preserve">RA-PainKG serves three primary use cases. First, as a queryable knowledge base: researchers can extract pathway subnetworks (all nine curated pain pathways), identify drugs targeting specific pain genes, and retrieve tissue expression profiles across 54 human tissues. Second, as a hypothesis-generation tool: the dual-track framework enables systematic comparison of inflammatory versus nociceptive mechanisms, and bridge genes (STAT3, RELA, NF-kappaB complex) connecting both tracks represent candidate intervention points. Third, as structured prior knowledge for machine learning: the graph provides domain-specific features for gene perturbation prediction, drug repurposing pipelines, and causal mediator identification. Transparent benchmark validation (Section 4.3) establishes the boundary conditions under which each use case applies.</w:t>
+      </w:r>
+    </w:p>
+    <w:bookmarkEnd w:id="37"/>
+    <w:bookmarkStart w:id="38" w:name="the-value-of-coverage-gap-documentation"/>
     <w:p>
       <w:pPr>
         <w:pStyle w:val="Heading3"/>
@@ -5066,8 +3160,8 @@
         <w:t xml:space="preserve">The systematic identification of 72 absent genes (37.5% of the curated set) represents a resource contribution in its own right. Rather than silently omitting these genes, RA-PainKG documents exactly which genes are missing, why (identifier mismatch, annotation gaps in PrimeKG), and where researchers should look for alternative information (Supplementary Table S3). This transparency serves multiple purposes: (1) it prevents false-negative conclusions when querying RA-PainKG for specific genes; (2) it identifies systematic curation biases (complement cascade, anesthetic targets, GABA receptors are underrepresented across all general-purpose biomedical KGs); and (3) it provides a prioritized list for future resource development. This approach-a knowledge graph that explicitly documents what it does not contain-is uncommon in the biomedical database literature. While resources such as the IUPHAR/BPS Guide to Pharmacology [14] acknowledge incomplete coverage in narrative form, systematic per-gene gap documentation with categorized absence reasons is rarely implemented. We argue this practice represents a methodological contribution for transparent resource development.</w:t>
       </w:r>
     </w:p>
-    <w:bookmarkEnd w:id="43"/>
-    <w:bookmarkStart w:id="44" w:name="X5d4c2885636e0a62531c778a83e0fa67c2a5235"/>
+    <w:bookmarkEnd w:id="38"/>
+    <w:bookmarkStart w:id="39" w:name="X5d4c2885636e0a62531c778a83e0fa67c2a5235"/>
     <w:p>
       <w:pPr>
         <w:pStyle w:val="Heading3"/>
@@ -5108,8 +3202,8 @@
         <w:t xml:space="preserve">We emphasize that the K562 benchmark cannot resolve whether domain KGs improve prediction in disease-relevant systems. Sensory neuron models (iPSC-derived nociceptors, DRG organoids) remain the essential next step for evaluating whether RA-PainKG’s domain-specific prior knowledge confers advantages in biologically appropriate contexts.</w:t>
       </w:r>
     </w:p>
-    <w:bookmarkEnd w:id="44"/>
-    <w:bookmarkStart w:id="45" w:name="limitations"/>
+    <w:bookmarkEnd w:id="39"/>
+    <w:bookmarkStart w:id="40" w:name="limitations"/>
     <w:p>
       <w:pPr>
         <w:pStyle w:val="Heading3"/>
@@ -5208,8 +3302,8 @@
         <w:t xml:space="preserve">Benchmark validation is limited to K562 cells. Replication in disease-relevant cell types is essential before drawing conclusions about domain KG utility for pain biology applications.</w:t>
       </w:r>
     </w:p>
-    <w:bookmarkEnd w:id="45"/>
-    <w:bookmarkStart w:id="46" w:name="updates-and-community-contributions"/>
+    <w:bookmarkEnd w:id="40"/>
+    <w:bookmarkStart w:id="41" w:name="updates-and-community-contributions"/>
     <w:p>
       <w:pPr>
         <w:pStyle w:val="Heading3"/>
@@ -5226,8 +3320,8 @@
         <w:t xml:space="preserve">RA-PainKG will be updated with each major PrimeKG release. Community contributions of additional pain pathway annotations, drug-target relationships, and tissue expression data are welcome via the GitHub repository. The modular construction pipeline enables systematic re-generation with updated input resources.</w:t>
       </w:r>
     </w:p>
-    <w:bookmarkEnd w:id="46"/>
-    <w:bookmarkStart w:id="47" w:name="conclusion"/>
+    <w:bookmarkEnd w:id="41"/>
+    <w:bookmarkStart w:id="42" w:name="conclusion"/>
     <w:p>
       <w:pPr>
         <w:pStyle w:val="Heading3"/>
@@ -5251,125 +3345,6 @@
         </w:pict>
       </w:r>
     </w:p>
-    <w:bookmarkEnd w:id="47"/>
-    <w:bookmarkEnd w:id="48"/>
-    <w:bookmarkStart w:id="49" w:name="ai-usage-statement"/>
-    <w:p>
-      <w:pPr>
-        <w:pStyle w:val="Heading2"/>
-      </w:pPr>
-      <w:r>
-        <w:t xml:space="preserve">AI Usage Statement</w:t>
-      </w:r>
-    </w:p>
-    <w:p>
-      <w:pPr>
-        <w:pStyle w:val="FirstParagraph"/>
-      </w:pPr>
-      <w:r>
-        <w:t xml:space="preserve">During the preparation of this work, the author used AI-assisted tools (OpenAI Codex CLI, GitHub Copilot, and Claude via API) for the following purposes: code development and debugging of the pipeline, literature search and summarization, manuscript drafting and language editing, and iterative revision based on simulated peer review. All AI-generated content was reviewed, verified, and edited by the author. The author takes full responsibility for the scientific accuracy, data integrity, and conclusions presented in this publication. All data were generated by the author’s original code; no AI tool contributed to data generation or statistical computation beyond code execution of author-specified algorithms.</w:t>
-      </w:r>
-    </w:p>
-    <w:bookmarkEnd w:id="49"/>
-    <w:bookmarkStart w:id="50" w:name="acknowledgements"/>
-    <w:p>
-      <w:pPr>
-        <w:pStyle w:val="Heading2"/>
-      </w:pPr>
-      <w:r>
-        <w:t xml:space="preserve">Acknowledgements</w:t>
-      </w:r>
-    </w:p>
-    <w:p>
-      <w:pPr>
-        <w:pStyle w:val="FirstParagraph"/>
-      </w:pPr>
-      <w:r>
-        <w:t xml:space="preserve">The author thanks the Norman lab, the PrimeKG development team, the GTEx Consortium, and the Gene Ontology Consortium for making their data publicly available. This research was supported by institutional resources from The Second Affiliated Hospital of Fujian University of Traditional Chinese Medicine.</w:t>
-      </w:r>
-    </w:p>
-    <w:bookmarkEnd w:id="50"/>
-    <w:bookmarkStart w:id="51" w:name="author-contributions"/>
-    <w:p>
-      <w:pPr>
-        <w:pStyle w:val="Heading2"/>
-      </w:pPr>
-      <w:r>
-        <w:t xml:space="preserve">Author Contributions</w:t>
-      </w:r>
-    </w:p>
-    <w:p>
-      <w:pPr>
-        <w:pStyle w:val="FirstParagraph"/>
-      </w:pPr>
-      <w:r>
-        <w:rPr>
-          <w:b/>
-          <w:bCs/>
-        </w:rPr>
-        <w:t xml:space="preserve">Yongxin Yang:</w:t>
-      </w:r>
-      <w:r>
-        <w:t xml:space="preserve"> </w:t>
-      </w:r>
-      <w:r>
-        <w:t xml:space="preserve">Conceptualization, Methodology, Software, Formal Analysis, Investigation, Data Curation, Writing - Original Draft, Writing - Review and Editing, Visualization, Project Administration.</w:t>
-      </w:r>
-    </w:p>
-    <w:bookmarkEnd w:id="51"/>
-    <w:bookmarkStart w:id="52" w:name="competing-interests"/>
-    <w:p>
-      <w:pPr>
-        <w:pStyle w:val="Heading2"/>
-      </w:pPr>
-      <w:r>
-        <w:t xml:space="preserve">Competing Interests</w:t>
-      </w:r>
-    </w:p>
-    <w:p>
-      <w:pPr>
-        <w:pStyle w:val="FirstParagraph"/>
-      </w:pPr>
-      <w:r>
-        <w:t xml:space="preserve">The author declares no competing interests.</w:t>
-      </w:r>
-    </w:p>
-    <w:bookmarkEnd w:id="52"/>
-    <w:bookmarkStart w:id="53" w:name="ethics-statement"/>
-    <w:p>
-      <w:pPr>
-        <w:pStyle w:val="Heading2"/>
-      </w:pPr>
-      <w:r>
-        <w:t xml:space="preserve">Ethics Statement</w:t>
-      </w:r>
-    </w:p>
-    <w:p>
-      <w:pPr>
-        <w:pStyle w:val="FirstParagraph"/>
-      </w:pPr>
-      <w:r>
-        <w:t xml:space="preserve">This study uses exclusively publicly available data. No new data involving human subjects were collected.</w:t>
-      </w:r>
-    </w:p>
-    <w:bookmarkEnd w:id="53"/>
-    <w:bookmarkStart w:id="54" w:name="data-and-code-availability"/>
-    <w:p>
-      <w:pPr>
-        <w:pStyle w:val="Heading2"/>
-      </w:pPr>
-      <w:r>
-        <w:t xml:space="preserve">Data and Code Availability</w:t>
-      </w:r>
-    </w:p>
-    <w:p>
-      <w:pPr>
-        <w:pStyle w:val="FirstParagraph"/>
-      </w:pPr>
-      <w:r>
-        <w:t xml:space="preserve">All code, processed KG adjacency matrices, graph files (GraphML, CSV, Python pickle), and benchmark results are available at https://github.com/yyx-4113/ra-painkg under the MIT license. The Norman et al. Perturb-seq dataset is available from Harvard Dataverse (DOI: 10.7910/DVN/R9JDLS). PrimeKG v1.0 is available from Harvard Dataverse (DOI: 10.7910/DVN/IXA7BM). Gene Ontology annotations are from the Gene Ontology Consortium. RA-PainKG graph files and complete documentation are included in the repository.</w:t>
-      </w:r>
-    </w:p>
     <w:p>
       <w:r>
         <w:pict>
@@ -5377,13 +3352,2197 @@
         </w:pict>
       </w:r>
     </w:p>
+    <w:bookmarkEnd w:id="42"/>
+    <w:bookmarkEnd w:id="43"/>
+    <w:bookmarkStart w:id="48" w:name="usage-examples"/>
+    <w:p>
+      <w:pPr>
+        <w:pStyle w:val="Heading2"/>
+      </w:pPr>
+      <w:r>
+        <w:t xml:space="preserve">5. Usage Examples</w:t>
+      </w:r>
+    </w:p>
+    <w:p>
+      <w:pPr>
+        <w:pStyle w:val="FirstParagraph"/>
+      </w:pPr>
+      <w:r>
+        <w:t xml:space="preserve">RA-PainKG is designed for programmatic access via Python (NetworkX). Below are four representative use cases. All code is available in the GitHub repository.</w:t>
+      </w:r>
+    </w:p>
+    <w:p>
+      <w:pPr>
+        <w:pStyle w:val="BodyText"/>
+      </w:pPr>
+      <w:r>
+        <w:rPr>
+          <w:b/>
+          <w:bCs/>
+        </w:rPr>
+        <w:t xml:space="preserve">Setup.</w:t>
+      </w:r>
+      <w:r>
+        <w:t xml:space="preserve"> </w:t>
+      </w:r>
+      <w:r>
+        <w:t xml:space="preserve">Download RA_PainKG_final.pkl from the GitHub repository and place it in your working directory:</w:t>
+      </w:r>
+    </w:p>
+    <w:p>
+      <w:pPr>
+        <w:pStyle w:val="SourceCode"/>
+      </w:pPr>
+      <w:r>
+        <w:rPr>
+          <w:rStyle w:val="ImportTok"/>
+        </w:rPr>
+        <w:t xml:space="preserve">import</w:t>
+      </w:r>
+      <w:r>
+        <w:rPr>
+          <w:rStyle w:val="NormalTok"/>
+        </w:rPr>
+        <w:t xml:space="preserve"> pickle</w:t>
+      </w:r>
+      <w:r>
+        <w:br/>
+      </w:r>
+      <w:r>
+        <w:rPr>
+          <w:rStyle w:val="ImportTok"/>
+        </w:rPr>
+        <w:t xml:space="preserve">import</w:t>
+      </w:r>
+      <w:r>
+        <w:rPr>
+          <w:rStyle w:val="NormalTok"/>
+        </w:rPr>
+        <w:t xml:space="preserve"> networkx </w:t>
+      </w:r>
+      <w:r>
+        <w:rPr>
+          <w:rStyle w:val="ImportTok"/>
+        </w:rPr>
+        <w:t xml:space="preserve">as</w:t>
+      </w:r>
+      <w:r>
+        <w:rPr>
+          <w:rStyle w:val="NormalTok"/>
+        </w:rPr>
+        <w:t xml:space="preserve"> nx</w:t>
+      </w:r>
+      <w:r>
+        <w:br/>
+      </w:r>
+      <w:r>
+        <w:br/>
+      </w:r>
+      <w:r>
+        <w:rPr>
+          <w:rStyle w:val="ControlFlowTok"/>
+        </w:rPr>
+        <w:t xml:space="preserve">with</w:t>
+      </w:r>
+      <w:r>
+        <w:rPr>
+          <w:rStyle w:val="NormalTok"/>
+        </w:rPr>
+        <w:t xml:space="preserve"> </w:t>
+      </w:r>
+      <w:r>
+        <w:rPr>
+          <w:rStyle w:val="BuiltInTok"/>
+        </w:rPr>
+        <w:t xml:space="preserve">open</w:t>
+      </w:r>
+      <w:r>
+        <w:rPr>
+          <w:rStyle w:val="NormalTok"/>
+        </w:rPr>
+        <w:t xml:space="preserve">(</w:t>
+      </w:r>
+      <w:r>
+        <w:rPr>
+          <w:rStyle w:val="StringTok"/>
+        </w:rPr>
+        <w:t xml:space="preserve">"RA_PainKG_final.pkl"</w:t>
+      </w:r>
+      <w:r>
+        <w:rPr>
+          <w:rStyle w:val="NormalTok"/>
+        </w:rPr>
+        <w:t xml:space="preserve">, </w:t>
+      </w:r>
+      <w:r>
+        <w:rPr>
+          <w:rStyle w:val="StringTok"/>
+        </w:rPr>
+        <w:t xml:space="preserve">"rb"</w:t>
+      </w:r>
+      <w:r>
+        <w:rPr>
+          <w:rStyle w:val="NormalTok"/>
+        </w:rPr>
+        <w:t xml:space="preserve">) </w:t>
+      </w:r>
+      <w:r>
+        <w:rPr>
+          <w:rStyle w:val="ImportTok"/>
+        </w:rPr>
+        <w:t xml:space="preserve">as</w:t>
+      </w:r>
+      <w:r>
+        <w:rPr>
+          <w:rStyle w:val="NormalTok"/>
+        </w:rPr>
+        <w:t xml:space="preserve"> f:</w:t>
+      </w:r>
+      <w:r>
+        <w:br/>
+      </w:r>
+      <w:r>
+        <w:rPr>
+          <w:rStyle w:val="NormalTok"/>
+        </w:rPr>
+        <w:t xml:space="preserve">    G </w:t>
+      </w:r>
+      <w:r>
+        <w:rPr>
+          <w:rStyle w:val="OperatorTok"/>
+        </w:rPr>
+        <w:t xml:space="preserve">=</w:t>
+      </w:r>
+      <w:r>
+        <w:rPr>
+          <w:rStyle w:val="NormalTok"/>
+        </w:rPr>
+        <w:t xml:space="preserve"> pickle.load(f)</w:t>
+      </w:r>
+    </w:p>
+    <w:p>
+      <w:pPr>
+        <w:pStyle w:val="FirstParagraph"/>
+      </w:pPr>
+      <w:r>
+        <w:t xml:space="preserve">All subsequent examples assume</w:t>
+      </w:r>
+      <w:r>
+        <w:t xml:space="preserve"> </w:t>
+      </w:r>
+      <w:r>
+        <w:rPr>
+          <w:rStyle w:val="VerbatimChar"/>
+        </w:rPr>
+        <w:t xml:space="preserve">G</w:t>
+      </w:r>
+      <w:r>
+        <w:t xml:space="preserve"> </w:t>
+      </w:r>
+      <w:r>
+        <w:t xml:space="preserve">is loaded and</w:t>
+      </w:r>
+      <w:r>
+        <w:t xml:space="preserve"> </w:t>
+      </w:r>
+      <w:r>
+        <w:rPr>
+          <w:rStyle w:val="VerbatimChar"/>
+        </w:rPr>
+        <w:t xml:space="preserve">networkx</w:t>
+      </w:r>
+      <w:r>
+        <w:t xml:space="preserve"> </w:t>
+      </w:r>
+      <w:r>
+        <w:t xml:space="preserve">is imported as</w:t>
+      </w:r>
+      <w:r>
+        <w:t xml:space="preserve"> </w:t>
+      </w:r>
+      <w:r>
+        <w:rPr>
+          <w:rStyle w:val="VerbatimChar"/>
+        </w:rPr>
+        <w:t xml:space="preserve">nx</w:t>
+      </w:r>
+      <w:r>
+        <w:t xml:space="preserve">.</w:t>
+      </w:r>
+    </w:p>
+    <w:bookmarkStart w:id="44" w:name="querying-drug-target-relationships"/>
+    <w:p>
+      <w:pPr>
+        <w:pStyle w:val="Heading3"/>
+      </w:pPr>
+      <w:r>
+        <w:t xml:space="preserve">5.1 Querying Drug-Target Relationships</w:t>
+      </w:r>
+    </w:p>
+    <w:p>
+      <w:pPr>
+        <w:pStyle w:val="SourceCode"/>
+      </w:pPr>
+      <w:r>
+        <w:rPr>
+          <w:rStyle w:val="CommentTok"/>
+        </w:rPr>
+        <w:t xml:space="preserve"># Find all drugs targeting PTGS2 (COX-2)</w:t>
+      </w:r>
+      <w:r>
+        <w:br/>
+      </w:r>
+      <w:r>
+        <w:rPr>
+          <w:rStyle w:val="NormalTok"/>
+        </w:rPr>
+        <w:t xml:space="preserve">ptgs2_drugs </w:t>
+      </w:r>
+      <w:r>
+        <w:rPr>
+          <w:rStyle w:val="OperatorTok"/>
+        </w:rPr>
+        <w:t xml:space="preserve">=</w:t>
+      </w:r>
+      <w:r>
+        <w:rPr>
+          <w:rStyle w:val="NormalTok"/>
+        </w:rPr>
+        <w:t xml:space="preserve"> []</w:t>
+      </w:r>
+      <w:r>
+        <w:br/>
+      </w:r>
+      <w:r>
+        <w:rPr>
+          <w:rStyle w:val="ControlFlowTok"/>
+        </w:rPr>
+        <w:t xml:space="preserve">for</w:t>
+      </w:r>
+      <w:r>
+        <w:rPr>
+          <w:rStyle w:val="NormalTok"/>
+        </w:rPr>
+        <w:t xml:space="preserve"> node, data </w:t>
+      </w:r>
+      <w:r>
+        <w:rPr>
+          <w:rStyle w:val="KeywordTok"/>
+        </w:rPr>
+        <w:t xml:space="preserve">in</w:t>
+      </w:r>
+      <w:r>
+        <w:rPr>
+          <w:rStyle w:val="NormalTok"/>
+        </w:rPr>
+        <w:t xml:space="preserve"> G.nodes(data</w:t>
+      </w:r>
+      <w:r>
+        <w:rPr>
+          <w:rStyle w:val="OperatorTok"/>
+        </w:rPr>
+        <w:t xml:space="preserve">=</w:t>
+      </w:r>
+      <w:r>
+        <w:rPr>
+          <w:rStyle w:val="VariableTok"/>
+        </w:rPr>
+        <w:t xml:space="preserve">True</w:t>
+      </w:r>
+      <w:r>
+        <w:rPr>
+          <w:rStyle w:val="NormalTok"/>
+        </w:rPr>
+        <w:t xml:space="preserve">):</w:t>
+      </w:r>
+      <w:r>
+        <w:br/>
+      </w:r>
+      <w:r>
+        <w:rPr>
+          <w:rStyle w:val="NormalTok"/>
+        </w:rPr>
+        <w:t xml:space="preserve">    </w:t>
+      </w:r>
+      <w:r>
+        <w:rPr>
+          <w:rStyle w:val="ControlFlowTok"/>
+        </w:rPr>
+        <w:t xml:space="preserve">if</w:t>
+      </w:r>
+      <w:r>
+        <w:rPr>
+          <w:rStyle w:val="NormalTok"/>
+        </w:rPr>
+        <w:t xml:space="preserve"> </w:t>
+      </w:r>
+      <w:r>
+        <w:rPr>
+          <w:rStyle w:val="BuiltInTok"/>
+        </w:rPr>
+        <w:t xml:space="preserve">str</w:t>
+      </w:r>
+      <w:r>
+        <w:rPr>
+          <w:rStyle w:val="NormalTok"/>
+        </w:rPr>
+        <w:t xml:space="preserve">(data.get(</w:t>
+      </w:r>
+      <w:r>
+        <w:rPr>
+          <w:rStyle w:val="StringTok"/>
+        </w:rPr>
+        <w:t xml:space="preserve">"node_name"</w:t>
+      </w:r>
+      <w:r>
+        <w:rPr>
+          <w:rStyle w:val="NormalTok"/>
+        </w:rPr>
+        <w:t xml:space="preserve">, </w:t>
+      </w:r>
+      <w:r>
+        <w:rPr>
+          <w:rStyle w:val="StringTok"/>
+        </w:rPr>
+        <w:t xml:space="preserve">""</w:t>
+      </w:r>
+      <w:r>
+        <w:rPr>
+          <w:rStyle w:val="NormalTok"/>
+        </w:rPr>
+        <w:t xml:space="preserve">)).upper() </w:t>
+      </w:r>
+      <w:r>
+        <w:rPr>
+          <w:rStyle w:val="OperatorTok"/>
+        </w:rPr>
+        <w:t xml:space="preserve">==</w:t>
+      </w:r>
+      <w:r>
+        <w:rPr>
+          <w:rStyle w:val="NormalTok"/>
+        </w:rPr>
+        <w:t xml:space="preserve"> </w:t>
+      </w:r>
+      <w:r>
+        <w:rPr>
+          <w:rStyle w:val="StringTok"/>
+        </w:rPr>
+        <w:t xml:space="preserve">"PTGS2"</w:t>
+      </w:r>
+      <w:r>
+        <w:rPr>
+          <w:rStyle w:val="NormalTok"/>
+        </w:rPr>
+        <w:t xml:space="preserve">:</w:t>
+      </w:r>
+      <w:r>
+        <w:br/>
+      </w:r>
+      <w:r>
+        <w:rPr>
+          <w:rStyle w:val="NormalTok"/>
+        </w:rPr>
+        <w:t xml:space="preserve">        </w:t>
+      </w:r>
+      <w:r>
+        <w:rPr>
+          <w:rStyle w:val="ControlFlowTok"/>
+        </w:rPr>
+        <w:t xml:space="preserve">for</w:t>
+      </w:r>
+      <w:r>
+        <w:rPr>
+          <w:rStyle w:val="NormalTok"/>
+        </w:rPr>
+        <w:t xml:space="preserve"> pred </w:t>
+      </w:r>
+      <w:r>
+        <w:rPr>
+          <w:rStyle w:val="KeywordTok"/>
+        </w:rPr>
+        <w:t xml:space="preserve">in</w:t>
+      </w:r>
+      <w:r>
+        <w:rPr>
+          <w:rStyle w:val="NormalTok"/>
+        </w:rPr>
+        <w:t xml:space="preserve"> G.predecessors(node):</w:t>
+      </w:r>
+      <w:r>
+        <w:br/>
+      </w:r>
+      <w:r>
+        <w:rPr>
+          <w:rStyle w:val="NormalTok"/>
+        </w:rPr>
+        <w:t xml:space="preserve">            </w:t>
+      </w:r>
+      <w:r>
+        <w:rPr>
+          <w:rStyle w:val="ControlFlowTok"/>
+        </w:rPr>
+        <w:t xml:space="preserve">if</w:t>
+      </w:r>
+      <w:r>
+        <w:rPr>
+          <w:rStyle w:val="NormalTok"/>
+        </w:rPr>
+        <w:t xml:space="preserve"> G.nodes[pred].get(</w:t>
+      </w:r>
+      <w:r>
+        <w:rPr>
+          <w:rStyle w:val="StringTok"/>
+        </w:rPr>
+        <w:t xml:space="preserve">"node_type"</w:t>
+      </w:r>
+      <w:r>
+        <w:rPr>
+          <w:rStyle w:val="NormalTok"/>
+        </w:rPr>
+        <w:t xml:space="preserve">) </w:t>
+      </w:r>
+      <w:r>
+        <w:rPr>
+          <w:rStyle w:val="OperatorTok"/>
+        </w:rPr>
+        <w:t xml:space="preserve">==</w:t>
+      </w:r>
+      <w:r>
+        <w:rPr>
+          <w:rStyle w:val="NormalTok"/>
+        </w:rPr>
+        <w:t xml:space="preserve"> </w:t>
+      </w:r>
+      <w:r>
+        <w:rPr>
+          <w:rStyle w:val="StringTok"/>
+        </w:rPr>
+        <w:t xml:space="preserve">"drug"</w:t>
+      </w:r>
+      <w:r>
+        <w:rPr>
+          <w:rStyle w:val="NormalTok"/>
+        </w:rPr>
+        <w:t xml:space="preserve">:</w:t>
+      </w:r>
+      <w:r>
+        <w:br/>
+      </w:r>
+      <w:r>
+        <w:rPr>
+          <w:rStyle w:val="NormalTok"/>
+        </w:rPr>
+        <w:t xml:space="preserve">                ptgs2_drugs.append((G.nodes[pred][</w:t>
+      </w:r>
+      <w:r>
+        <w:rPr>
+          <w:rStyle w:val="StringTok"/>
+        </w:rPr>
+        <w:t xml:space="preserve">"node_name"</w:t>
+      </w:r>
+      <w:r>
+        <w:rPr>
+          <w:rStyle w:val="NormalTok"/>
+        </w:rPr>
+        <w:t xml:space="preserve">],</w:t>
+      </w:r>
+      <w:r>
+        <w:br/>
+      </w:r>
+      <w:r>
+        <w:rPr>
+          <w:rStyle w:val="NormalTok"/>
+        </w:rPr>
+        <w:t xml:space="preserve">                                    G[pred][node].get(</w:t>
+      </w:r>
+      <w:r>
+        <w:rPr>
+          <w:rStyle w:val="StringTok"/>
+        </w:rPr>
+        <w:t xml:space="preserve">"relation"</w:t>
+      </w:r>
+      <w:r>
+        <w:rPr>
+          <w:rStyle w:val="NormalTok"/>
+        </w:rPr>
+        <w:t xml:space="preserve">)))</w:t>
+      </w:r>
+      <w:r>
+        <w:br/>
+      </w:r>
+      <w:r>
+        <w:rPr>
+          <w:rStyle w:val="BuiltInTok"/>
+        </w:rPr>
+        <w:t xml:space="preserve">print</w:t>
+      </w:r>
+      <w:r>
+        <w:rPr>
+          <w:rStyle w:val="NormalTok"/>
+        </w:rPr>
+        <w:t xml:space="preserve">(ptgs2_drugs)</w:t>
+      </w:r>
+      <w:r>
+        <w:br/>
+      </w:r>
+      <w:r>
+        <w:rPr>
+          <w:rStyle w:val="CommentTok"/>
+        </w:rPr>
+        <w:t xml:space="preserve"># Example output: [("Celecoxib", "inhibits"), ("Aspirin", "inhibits"), ...]</w:t>
+      </w:r>
+    </w:p>
+    <w:bookmarkEnd w:id="44"/>
+    <w:bookmarkStart w:id="45" w:name="extracting-pathway-subnetworks"/>
+    <w:p>
+      <w:pPr>
+        <w:pStyle w:val="Heading3"/>
+      </w:pPr>
+      <w:r>
+        <w:t xml:space="preserve">5.2 Extracting Pathway Subnetworks</w:t>
+      </w:r>
+    </w:p>
+    <w:p>
+      <w:pPr>
+        <w:pStyle w:val="SourceCode"/>
+      </w:pPr>
+      <w:r>
+        <w:rPr>
+          <w:rStyle w:val="CommentTok"/>
+        </w:rPr>
+        <w:t xml:space="preserve"># Extract the opioid signaling subnetwork</w:t>
+      </w:r>
+      <w:r>
+        <w:br/>
+      </w:r>
+      <w:r>
+        <w:rPr>
+          <w:rStyle w:val="NormalTok"/>
+        </w:rPr>
+        <w:t xml:space="preserve">opioid_genes </w:t>
+      </w:r>
+      <w:r>
+        <w:rPr>
+          <w:rStyle w:val="OperatorTok"/>
+        </w:rPr>
+        <w:t xml:space="preserve">=</w:t>
+      </w:r>
+      <w:r>
+        <w:rPr>
+          <w:rStyle w:val="NormalTok"/>
+        </w:rPr>
+        <w:t xml:space="preserve"> {</w:t>
+      </w:r>
+      <w:r>
+        <w:rPr>
+          <w:rStyle w:val="StringTok"/>
+        </w:rPr>
+        <w:t xml:space="preserve">"OPRM1"</w:t>
+      </w:r>
+      <w:r>
+        <w:rPr>
+          <w:rStyle w:val="NormalTok"/>
+        </w:rPr>
+        <w:t xml:space="preserve">, </w:t>
+      </w:r>
+      <w:r>
+        <w:rPr>
+          <w:rStyle w:val="StringTok"/>
+        </w:rPr>
+        <w:t xml:space="preserve">"OPRD1"</w:t>
+      </w:r>
+      <w:r>
+        <w:rPr>
+          <w:rStyle w:val="NormalTok"/>
+        </w:rPr>
+        <w:t xml:space="preserve">, </w:t>
+      </w:r>
+      <w:r>
+        <w:rPr>
+          <w:rStyle w:val="StringTok"/>
+        </w:rPr>
+        <w:t xml:space="preserve">"OPRK1"</w:t>
+      </w:r>
+      <w:r>
+        <w:rPr>
+          <w:rStyle w:val="NormalTok"/>
+        </w:rPr>
+        <w:t xml:space="preserve">, </w:t>
+      </w:r>
+      <w:r>
+        <w:rPr>
+          <w:rStyle w:val="StringTok"/>
+        </w:rPr>
+        <w:t xml:space="preserve">"POMC"</w:t>
+      </w:r>
+      <w:r>
+        <w:rPr>
+          <w:rStyle w:val="NormalTok"/>
+        </w:rPr>
+        <w:t xml:space="preserve">, </w:t>
+      </w:r>
+      <w:r>
+        <w:rPr>
+          <w:rStyle w:val="StringTok"/>
+        </w:rPr>
+        <w:t xml:space="preserve">"PENK"</w:t>
+      </w:r>
+      <w:r>
+        <w:rPr>
+          <w:rStyle w:val="NormalTok"/>
+        </w:rPr>
+        <w:t xml:space="preserve">, </w:t>
+      </w:r>
+      <w:r>
+        <w:rPr>
+          <w:rStyle w:val="StringTok"/>
+        </w:rPr>
+        <w:t xml:space="preserve">"PDYN"</w:t>
+      </w:r>
+      <w:r>
+        <w:rPr>
+          <w:rStyle w:val="NormalTok"/>
+        </w:rPr>
+        <w:t xml:space="preserve">}</w:t>
+      </w:r>
+      <w:r>
+        <w:br/>
+      </w:r>
+      <w:r>
+        <w:rPr>
+          <w:rStyle w:val="NormalTok"/>
+        </w:rPr>
+        <w:t xml:space="preserve">opioid_nodes </w:t>
+      </w:r>
+      <w:r>
+        <w:rPr>
+          <w:rStyle w:val="OperatorTok"/>
+        </w:rPr>
+        <w:t xml:space="preserve">=</w:t>
+      </w:r>
+      <w:r>
+        <w:rPr>
+          <w:rStyle w:val="NormalTok"/>
+        </w:rPr>
+        <w:t xml:space="preserve"> {n </w:t>
+      </w:r>
+      <w:r>
+        <w:rPr>
+          <w:rStyle w:val="ControlFlowTok"/>
+        </w:rPr>
+        <w:t xml:space="preserve">for</w:t>
+      </w:r>
+      <w:r>
+        <w:rPr>
+          <w:rStyle w:val="NormalTok"/>
+        </w:rPr>
+        <w:t xml:space="preserve"> n, d </w:t>
+      </w:r>
+      <w:r>
+        <w:rPr>
+          <w:rStyle w:val="KeywordTok"/>
+        </w:rPr>
+        <w:t xml:space="preserve">in</w:t>
+      </w:r>
+      <w:r>
+        <w:rPr>
+          <w:rStyle w:val="NormalTok"/>
+        </w:rPr>
+        <w:t xml:space="preserve"> G.nodes(data</w:t>
+      </w:r>
+      <w:r>
+        <w:rPr>
+          <w:rStyle w:val="OperatorTok"/>
+        </w:rPr>
+        <w:t xml:space="preserve">=</w:t>
+      </w:r>
+      <w:r>
+        <w:rPr>
+          <w:rStyle w:val="VariableTok"/>
+        </w:rPr>
+        <w:t xml:space="preserve">True</w:t>
+      </w:r>
+      <w:r>
+        <w:rPr>
+          <w:rStyle w:val="NormalTok"/>
+        </w:rPr>
+        <w:t xml:space="preserve">)</w:t>
+      </w:r>
+      <w:r>
+        <w:br/>
+      </w:r>
+      <w:r>
+        <w:rPr>
+          <w:rStyle w:val="NormalTok"/>
+        </w:rPr>
+        <w:t xml:space="preserve">                </w:t>
+      </w:r>
+      <w:r>
+        <w:rPr>
+          <w:rStyle w:val="ControlFlowTok"/>
+        </w:rPr>
+        <w:t xml:space="preserve">if</w:t>
+      </w:r>
+      <w:r>
+        <w:rPr>
+          <w:rStyle w:val="NormalTok"/>
+        </w:rPr>
+        <w:t xml:space="preserve"> </w:t>
+      </w:r>
+      <w:r>
+        <w:rPr>
+          <w:rStyle w:val="BuiltInTok"/>
+        </w:rPr>
+        <w:t xml:space="preserve">str</w:t>
+      </w:r>
+      <w:r>
+        <w:rPr>
+          <w:rStyle w:val="NormalTok"/>
+        </w:rPr>
+        <w:t xml:space="preserve">(d.get(</w:t>
+      </w:r>
+      <w:r>
+        <w:rPr>
+          <w:rStyle w:val="StringTok"/>
+        </w:rPr>
+        <w:t xml:space="preserve">"node_name"</w:t>
+      </w:r>
+      <w:r>
+        <w:rPr>
+          <w:rStyle w:val="NormalTok"/>
+        </w:rPr>
+        <w:t xml:space="preserve">, </w:t>
+      </w:r>
+      <w:r>
+        <w:rPr>
+          <w:rStyle w:val="StringTok"/>
+        </w:rPr>
+        <w:t xml:space="preserve">""</w:t>
+      </w:r>
+      <w:r>
+        <w:rPr>
+          <w:rStyle w:val="NormalTok"/>
+        </w:rPr>
+        <w:t xml:space="preserve">)).upper() </w:t>
+      </w:r>
+      <w:r>
+        <w:rPr>
+          <w:rStyle w:val="KeywordTok"/>
+        </w:rPr>
+        <w:t xml:space="preserve">in</w:t>
+      </w:r>
+      <w:r>
+        <w:rPr>
+          <w:rStyle w:val="NormalTok"/>
+        </w:rPr>
+        <w:t xml:space="preserve"> opioid_genes}</w:t>
+      </w:r>
+      <w:r>
+        <w:br/>
+      </w:r>
+      <w:r>
+        <w:rPr>
+          <w:rStyle w:val="NormalTok"/>
+        </w:rPr>
+        <w:t xml:space="preserve">subgraph </w:t>
+      </w:r>
+      <w:r>
+        <w:rPr>
+          <w:rStyle w:val="OperatorTok"/>
+        </w:rPr>
+        <w:t xml:space="preserve">=</w:t>
+      </w:r>
+      <w:r>
+        <w:rPr>
+          <w:rStyle w:val="NormalTok"/>
+        </w:rPr>
+        <w:t xml:space="preserve"> G.subgraph(opioid_nodes)</w:t>
+      </w:r>
+      <w:r>
+        <w:br/>
+      </w:r>
+      <w:r>
+        <w:rPr>
+          <w:rStyle w:val="NormalTok"/>
+        </w:rPr>
+        <w:t xml:space="preserve">nx.write_graphml(subgraph, </w:t>
+      </w:r>
+      <w:r>
+        <w:rPr>
+          <w:rStyle w:val="StringTok"/>
+        </w:rPr>
+        <w:t xml:space="preserve">"opioid_pathway.graphml"</w:t>
+      </w:r>
+      <w:r>
+        <w:rPr>
+          <w:rStyle w:val="NormalTok"/>
+        </w:rPr>
+        <w:t xml:space="preserve">)</w:t>
+      </w:r>
+    </w:p>
+    <w:bookmarkEnd w:id="45"/>
+    <w:bookmarkStart w:id="46" w:name="tissue-expression-profile-retrieval"/>
+    <w:p>
+      <w:pPr>
+        <w:pStyle w:val="Heading3"/>
+      </w:pPr>
+      <w:r>
+        <w:t xml:space="preserve">5.3 Tissue Expression Profile Retrieval</w:t>
+      </w:r>
+    </w:p>
+    <w:p>
+      <w:pPr>
+        <w:pStyle w:val="SourceCode"/>
+      </w:pPr>
+      <w:r>
+        <w:rPr>
+          <w:rStyle w:val="CommentTok"/>
+        </w:rPr>
+        <w:t xml:space="preserve"># Retrieve GTEx tissue expression for all Track B pain genes</w:t>
+      </w:r>
+      <w:r>
+        <w:br/>
+      </w:r>
+      <w:r>
+        <w:rPr>
+          <w:rStyle w:val="ControlFlowTok"/>
+        </w:rPr>
+        <w:t xml:space="preserve">for</w:t>
+      </w:r>
+      <w:r>
+        <w:rPr>
+          <w:rStyle w:val="NormalTok"/>
+        </w:rPr>
+        <w:t xml:space="preserve"> node, data </w:t>
+      </w:r>
+      <w:r>
+        <w:rPr>
+          <w:rStyle w:val="KeywordTok"/>
+        </w:rPr>
+        <w:t xml:space="preserve">in</w:t>
+      </w:r>
+      <w:r>
+        <w:rPr>
+          <w:rStyle w:val="NormalTok"/>
+        </w:rPr>
+        <w:t xml:space="preserve"> G.nodes(data</w:t>
+      </w:r>
+      <w:r>
+        <w:rPr>
+          <w:rStyle w:val="OperatorTok"/>
+        </w:rPr>
+        <w:t xml:space="preserve">=</w:t>
+      </w:r>
+      <w:r>
+        <w:rPr>
+          <w:rStyle w:val="VariableTok"/>
+        </w:rPr>
+        <w:t xml:space="preserve">True</w:t>
+      </w:r>
+      <w:r>
+        <w:rPr>
+          <w:rStyle w:val="NormalTok"/>
+        </w:rPr>
+        <w:t xml:space="preserve">):</w:t>
+      </w:r>
+      <w:r>
+        <w:br/>
+      </w:r>
+      <w:r>
+        <w:rPr>
+          <w:rStyle w:val="NormalTok"/>
+        </w:rPr>
+        <w:t xml:space="preserve">    </w:t>
+      </w:r>
+      <w:r>
+        <w:rPr>
+          <w:rStyle w:val="ControlFlowTok"/>
+        </w:rPr>
+        <w:t xml:space="preserve">if</w:t>
+      </w:r>
+      <w:r>
+        <w:rPr>
+          <w:rStyle w:val="NormalTok"/>
+        </w:rPr>
+        <w:t xml:space="preserve"> data.get(</w:t>
+      </w:r>
+      <w:r>
+        <w:rPr>
+          <w:rStyle w:val="StringTok"/>
+        </w:rPr>
+        <w:t xml:space="preserve">"track"</w:t>
+      </w:r>
+      <w:r>
+        <w:rPr>
+          <w:rStyle w:val="NormalTok"/>
+        </w:rPr>
+        <w:t xml:space="preserve">) </w:t>
+      </w:r>
+      <w:r>
+        <w:rPr>
+          <w:rStyle w:val="OperatorTok"/>
+        </w:rPr>
+        <w:t xml:space="preserve">==</w:t>
+      </w:r>
+      <w:r>
+        <w:rPr>
+          <w:rStyle w:val="NormalTok"/>
+        </w:rPr>
+        <w:t xml:space="preserve"> </w:t>
+      </w:r>
+      <w:r>
+        <w:rPr>
+          <w:rStyle w:val="StringTok"/>
+        </w:rPr>
+        <w:t xml:space="preserve">"B"</w:t>
+      </w:r>
+      <w:r>
+        <w:rPr>
+          <w:rStyle w:val="NormalTok"/>
+        </w:rPr>
+        <w:t xml:space="preserve"> </w:t>
+      </w:r>
+      <w:r>
+        <w:rPr>
+          <w:rStyle w:val="KeywordTok"/>
+        </w:rPr>
+        <w:t xml:space="preserve">and</w:t>
+      </w:r>
+      <w:r>
+        <w:rPr>
+          <w:rStyle w:val="NormalTok"/>
+        </w:rPr>
+        <w:t xml:space="preserve"> data.get(</w:t>
+      </w:r>
+      <w:r>
+        <w:rPr>
+          <w:rStyle w:val="StringTok"/>
+        </w:rPr>
+        <w:t xml:space="preserve">"node_type"</w:t>
+      </w:r>
+      <w:r>
+        <w:rPr>
+          <w:rStyle w:val="NormalTok"/>
+        </w:rPr>
+        <w:t xml:space="preserve">) </w:t>
+      </w:r>
+      <w:r>
+        <w:rPr>
+          <w:rStyle w:val="OperatorTok"/>
+        </w:rPr>
+        <w:t xml:space="preserve">==</w:t>
+      </w:r>
+      <w:r>
+        <w:rPr>
+          <w:rStyle w:val="NormalTok"/>
+        </w:rPr>
+        <w:t xml:space="preserve"> </w:t>
+      </w:r>
+      <w:r>
+        <w:rPr>
+          <w:rStyle w:val="StringTok"/>
+        </w:rPr>
+        <w:t xml:space="preserve">"gene/protein"</w:t>
+      </w:r>
+      <w:r>
+        <w:rPr>
+          <w:rStyle w:val="NormalTok"/>
+        </w:rPr>
+        <w:t xml:space="preserve">:</w:t>
+      </w:r>
+      <w:r>
+        <w:br/>
+      </w:r>
+      <w:r>
+        <w:rPr>
+          <w:rStyle w:val="NormalTok"/>
+        </w:rPr>
+        <w:t xml:space="preserve">        gene </w:t>
+      </w:r>
+      <w:r>
+        <w:rPr>
+          <w:rStyle w:val="OperatorTok"/>
+        </w:rPr>
+        <w:t xml:space="preserve">=</w:t>
+      </w:r>
+      <w:r>
+        <w:rPr>
+          <w:rStyle w:val="NormalTok"/>
+        </w:rPr>
+        <w:t xml:space="preserve"> data[</w:t>
+      </w:r>
+      <w:r>
+        <w:rPr>
+          <w:rStyle w:val="StringTok"/>
+        </w:rPr>
+        <w:t xml:space="preserve">"node_name"</w:t>
+      </w:r>
+      <w:r>
+        <w:rPr>
+          <w:rStyle w:val="NormalTok"/>
+        </w:rPr>
+        <w:t xml:space="preserve">]</w:t>
+      </w:r>
+      <w:r>
+        <w:br/>
+      </w:r>
+      <w:r>
+        <w:rPr>
+          <w:rStyle w:val="NormalTok"/>
+        </w:rPr>
+        <w:t xml:space="preserve">        expr </w:t>
+      </w:r>
+      <w:r>
+        <w:rPr>
+          <w:rStyle w:val="OperatorTok"/>
+        </w:rPr>
+        <w:t xml:space="preserve">=</w:t>
+      </w:r>
+      <w:r>
+        <w:rPr>
+          <w:rStyle w:val="NormalTok"/>
+        </w:rPr>
+        <w:t xml:space="preserve"> data.get(</w:t>
+      </w:r>
+      <w:r>
+        <w:rPr>
+          <w:rStyle w:val="StringTok"/>
+        </w:rPr>
+        <w:t xml:space="preserve">"gtex_median_tpm"</w:t>
+      </w:r>
+      <w:r>
+        <w:rPr>
+          <w:rStyle w:val="NormalTok"/>
+        </w:rPr>
+        <w:t xml:space="preserve">, {})</w:t>
+      </w:r>
+      <w:r>
+        <w:br/>
+      </w:r>
+      <w:r>
+        <w:rPr>
+          <w:rStyle w:val="NormalTok"/>
+        </w:rPr>
+        <w:t xml:space="preserve">        spinal </w:t>
+      </w:r>
+      <w:r>
+        <w:rPr>
+          <w:rStyle w:val="OperatorTok"/>
+        </w:rPr>
+        <w:t xml:space="preserve">=</w:t>
+      </w:r>
+      <w:r>
+        <w:rPr>
+          <w:rStyle w:val="NormalTok"/>
+        </w:rPr>
+        <w:t xml:space="preserve"> expr.get(</w:t>
+      </w:r>
+      <w:r>
+        <w:rPr>
+          <w:rStyle w:val="StringTok"/>
+        </w:rPr>
+        <w:t xml:space="preserve">"Spinal_Cord_cervical_c-1"</w:t>
+      </w:r>
+      <w:r>
+        <w:rPr>
+          <w:rStyle w:val="NormalTok"/>
+        </w:rPr>
+        <w:t xml:space="preserve">, </w:t>
+      </w:r>
+      <w:r>
+        <w:rPr>
+          <w:rStyle w:val="StringTok"/>
+        </w:rPr>
+        <w:t xml:space="preserve">"N/A"</w:t>
+      </w:r>
+      <w:r>
+        <w:rPr>
+          <w:rStyle w:val="NormalTok"/>
+        </w:rPr>
+        <w:t xml:space="preserve">)</w:t>
+      </w:r>
+      <w:r>
+        <w:br/>
+      </w:r>
+      <w:r>
+        <w:rPr>
+          <w:rStyle w:val="NormalTok"/>
+        </w:rPr>
+        <w:t xml:space="preserve">        tibial </w:t>
+      </w:r>
+      <w:r>
+        <w:rPr>
+          <w:rStyle w:val="OperatorTok"/>
+        </w:rPr>
+        <w:t xml:space="preserve">=</w:t>
+      </w:r>
+      <w:r>
+        <w:rPr>
+          <w:rStyle w:val="NormalTok"/>
+        </w:rPr>
+        <w:t xml:space="preserve"> expr.get(</w:t>
+      </w:r>
+      <w:r>
+        <w:rPr>
+          <w:rStyle w:val="StringTok"/>
+        </w:rPr>
+        <w:t xml:space="preserve">"Nerve_Tibial"</w:t>
+      </w:r>
+      <w:r>
+        <w:rPr>
+          <w:rStyle w:val="NormalTok"/>
+        </w:rPr>
+        <w:t xml:space="preserve">, </w:t>
+      </w:r>
+      <w:r>
+        <w:rPr>
+          <w:rStyle w:val="StringTok"/>
+        </w:rPr>
+        <w:t xml:space="preserve">"N/A"</w:t>
+      </w:r>
+      <w:r>
+        <w:rPr>
+          <w:rStyle w:val="NormalTok"/>
+        </w:rPr>
+        <w:t xml:space="preserve">)</w:t>
+      </w:r>
+      <w:r>
+        <w:br/>
+      </w:r>
+      <w:r>
+        <w:rPr>
+          <w:rStyle w:val="NormalTok"/>
+        </w:rPr>
+        <w:t xml:space="preserve">        </w:t>
+      </w:r>
+      <w:r>
+        <w:rPr>
+          <w:rStyle w:val="BuiltInTok"/>
+        </w:rPr>
+        <w:t xml:space="preserve">print</w:t>
+      </w:r>
+      <w:r>
+        <w:rPr>
+          <w:rStyle w:val="NormalTok"/>
+        </w:rPr>
+        <w:t xml:space="preserve">(</w:t>
+      </w:r>
+      <w:r>
+        <w:rPr>
+          <w:rStyle w:val="SpecialStringTok"/>
+        </w:rPr>
+        <w:t xml:space="preserve">f"</w:t>
+      </w:r>
+      <w:r>
+        <w:rPr>
+          <w:rStyle w:val="SpecialCharTok"/>
+        </w:rPr>
+        <w:t xml:space="preserve">{</w:t>
+      </w:r>
+      <w:r>
+        <w:rPr>
+          <w:rStyle w:val="NormalTok"/>
+        </w:rPr>
+        <w:t xml:space="preserve">gene</w:t>
+      </w:r>
+      <w:r>
+        <w:rPr>
+          <w:rStyle w:val="SpecialCharTok"/>
+        </w:rPr>
+        <w:t xml:space="preserve">}</w:t>
+      </w:r>
+      <w:r>
+        <w:rPr>
+          <w:rStyle w:val="SpecialStringTok"/>
+        </w:rPr>
+        <w:t xml:space="preserve">: Spinal=</w:t>
+      </w:r>
+      <w:r>
+        <w:rPr>
+          <w:rStyle w:val="SpecialCharTok"/>
+        </w:rPr>
+        <w:t xml:space="preserve">{</w:t>
+      </w:r>
+      <w:r>
+        <w:rPr>
+          <w:rStyle w:val="NormalTok"/>
+        </w:rPr>
+        <w:t xml:space="preserve">spinal</w:t>
+      </w:r>
+      <w:r>
+        <w:rPr>
+          <w:rStyle w:val="SpecialCharTok"/>
+        </w:rPr>
+        <w:t xml:space="preserve">}</w:t>
+      </w:r>
+      <w:r>
+        <w:rPr>
+          <w:rStyle w:val="SpecialStringTok"/>
+        </w:rPr>
+        <w:t xml:space="preserve">, Tibial=</w:t>
+      </w:r>
+      <w:r>
+        <w:rPr>
+          <w:rStyle w:val="SpecialCharTok"/>
+        </w:rPr>
+        <w:t xml:space="preserve">{</w:t>
+      </w:r>
+      <w:r>
+        <w:rPr>
+          <w:rStyle w:val="NormalTok"/>
+        </w:rPr>
+        <w:t xml:space="preserve">tibial</w:t>
+      </w:r>
+      <w:r>
+        <w:rPr>
+          <w:rStyle w:val="SpecialCharTok"/>
+        </w:rPr>
+        <w:t xml:space="preserve">}</w:t>
+      </w:r>
+      <w:r>
+        <w:rPr>
+          <w:rStyle w:val="SpecialStringTok"/>
+        </w:rPr>
+        <w:t xml:space="preserve">"</w:t>
+      </w:r>
+      <w:r>
+        <w:rPr>
+          <w:rStyle w:val="NormalTok"/>
+        </w:rPr>
+        <w:t xml:space="preserve">)</w:t>
+      </w:r>
+    </w:p>
+    <w:bookmarkEnd w:id="46"/>
+    <w:bookmarkStart w:id="47" w:name="identifying-bridge-genes-between-tracks"/>
+    <w:p>
+      <w:pPr>
+        <w:pStyle w:val="Heading3"/>
+      </w:pPr>
+      <w:r>
+        <w:t xml:space="preserve">5.4 Identifying Bridge Genes Between Tracks</w:t>
+      </w:r>
+    </w:p>
+    <w:p>
+      <w:pPr>
+        <w:pStyle w:val="SourceCode"/>
+      </w:pPr>
+      <w:r>
+        <w:rPr>
+          <w:rStyle w:val="CommentTok"/>
+        </w:rPr>
+        <w:t xml:space="preserve"># Find genes connecting Track A and Track B in the PPI subgraph</w:t>
+      </w:r>
+      <w:r>
+        <w:br/>
+      </w:r>
+      <w:r>
+        <w:rPr>
+          <w:rStyle w:val="NormalTok"/>
+        </w:rPr>
+        <w:t xml:space="preserve">track_a </w:t>
+      </w:r>
+      <w:r>
+        <w:rPr>
+          <w:rStyle w:val="OperatorTok"/>
+        </w:rPr>
+        <w:t xml:space="preserve">=</w:t>
+      </w:r>
+      <w:r>
+        <w:rPr>
+          <w:rStyle w:val="NormalTok"/>
+        </w:rPr>
+        <w:t xml:space="preserve"> {n </w:t>
+      </w:r>
+      <w:r>
+        <w:rPr>
+          <w:rStyle w:val="ControlFlowTok"/>
+        </w:rPr>
+        <w:t xml:space="preserve">for</w:t>
+      </w:r>
+      <w:r>
+        <w:rPr>
+          <w:rStyle w:val="NormalTok"/>
+        </w:rPr>
+        <w:t xml:space="preserve"> n, d </w:t>
+      </w:r>
+      <w:r>
+        <w:rPr>
+          <w:rStyle w:val="KeywordTok"/>
+        </w:rPr>
+        <w:t xml:space="preserve">in</w:t>
+      </w:r>
+      <w:r>
+        <w:rPr>
+          <w:rStyle w:val="NormalTok"/>
+        </w:rPr>
+        <w:t xml:space="preserve"> G.nodes(data</w:t>
+      </w:r>
+      <w:r>
+        <w:rPr>
+          <w:rStyle w:val="OperatorTok"/>
+        </w:rPr>
+        <w:t xml:space="preserve">=</w:t>
+      </w:r>
+      <w:r>
+        <w:rPr>
+          <w:rStyle w:val="VariableTok"/>
+        </w:rPr>
+        <w:t xml:space="preserve">True</w:t>
+      </w:r>
+      <w:r>
+        <w:rPr>
+          <w:rStyle w:val="NormalTok"/>
+        </w:rPr>
+        <w:t xml:space="preserve">) </w:t>
+      </w:r>
+      <w:r>
+        <w:rPr>
+          <w:rStyle w:val="ControlFlowTok"/>
+        </w:rPr>
+        <w:t xml:space="preserve">if</w:t>
+      </w:r>
+      <w:r>
+        <w:rPr>
+          <w:rStyle w:val="NormalTok"/>
+        </w:rPr>
+        <w:t xml:space="preserve"> d.get(</w:t>
+      </w:r>
+      <w:r>
+        <w:rPr>
+          <w:rStyle w:val="StringTok"/>
+        </w:rPr>
+        <w:t xml:space="preserve">"track"</w:t>
+      </w:r>
+      <w:r>
+        <w:rPr>
+          <w:rStyle w:val="NormalTok"/>
+        </w:rPr>
+        <w:t xml:space="preserve">) </w:t>
+      </w:r>
+      <w:r>
+        <w:rPr>
+          <w:rStyle w:val="OperatorTok"/>
+        </w:rPr>
+        <w:t xml:space="preserve">==</w:t>
+      </w:r>
+      <w:r>
+        <w:rPr>
+          <w:rStyle w:val="NormalTok"/>
+        </w:rPr>
+        <w:t xml:space="preserve"> </w:t>
+      </w:r>
+      <w:r>
+        <w:rPr>
+          <w:rStyle w:val="StringTok"/>
+        </w:rPr>
+        <w:t xml:space="preserve">"A"</w:t>
+      </w:r>
+      <w:r>
+        <w:rPr>
+          <w:rStyle w:val="NormalTok"/>
+        </w:rPr>
+        <w:t xml:space="preserve">}</w:t>
+      </w:r>
+      <w:r>
+        <w:br/>
+      </w:r>
+      <w:r>
+        <w:rPr>
+          <w:rStyle w:val="NormalTok"/>
+        </w:rPr>
+        <w:t xml:space="preserve">track_b </w:t>
+      </w:r>
+      <w:r>
+        <w:rPr>
+          <w:rStyle w:val="OperatorTok"/>
+        </w:rPr>
+        <w:t xml:space="preserve">=</w:t>
+      </w:r>
+      <w:r>
+        <w:rPr>
+          <w:rStyle w:val="NormalTok"/>
+        </w:rPr>
+        <w:t xml:space="preserve"> {n </w:t>
+      </w:r>
+      <w:r>
+        <w:rPr>
+          <w:rStyle w:val="ControlFlowTok"/>
+        </w:rPr>
+        <w:t xml:space="preserve">for</w:t>
+      </w:r>
+      <w:r>
+        <w:rPr>
+          <w:rStyle w:val="NormalTok"/>
+        </w:rPr>
+        <w:t xml:space="preserve"> n, d </w:t>
+      </w:r>
+      <w:r>
+        <w:rPr>
+          <w:rStyle w:val="KeywordTok"/>
+        </w:rPr>
+        <w:t xml:space="preserve">in</w:t>
+      </w:r>
+      <w:r>
+        <w:rPr>
+          <w:rStyle w:val="NormalTok"/>
+        </w:rPr>
+        <w:t xml:space="preserve"> G.nodes(data</w:t>
+      </w:r>
+      <w:r>
+        <w:rPr>
+          <w:rStyle w:val="OperatorTok"/>
+        </w:rPr>
+        <w:t xml:space="preserve">=</w:t>
+      </w:r>
+      <w:r>
+        <w:rPr>
+          <w:rStyle w:val="VariableTok"/>
+        </w:rPr>
+        <w:t xml:space="preserve">True</w:t>
+      </w:r>
+      <w:r>
+        <w:rPr>
+          <w:rStyle w:val="NormalTok"/>
+        </w:rPr>
+        <w:t xml:space="preserve">) </w:t>
+      </w:r>
+      <w:r>
+        <w:rPr>
+          <w:rStyle w:val="ControlFlowTok"/>
+        </w:rPr>
+        <w:t xml:space="preserve">if</w:t>
+      </w:r>
+      <w:r>
+        <w:rPr>
+          <w:rStyle w:val="NormalTok"/>
+        </w:rPr>
+        <w:t xml:space="preserve"> d.get(</w:t>
+      </w:r>
+      <w:r>
+        <w:rPr>
+          <w:rStyle w:val="StringTok"/>
+        </w:rPr>
+        <w:t xml:space="preserve">"track"</w:t>
+      </w:r>
+      <w:r>
+        <w:rPr>
+          <w:rStyle w:val="NormalTok"/>
+        </w:rPr>
+        <w:t xml:space="preserve">) </w:t>
+      </w:r>
+      <w:r>
+        <w:rPr>
+          <w:rStyle w:val="OperatorTok"/>
+        </w:rPr>
+        <w:t xml:space="preserve">==</w:t>
+      </w:r>
+      <w:r>
+        <w:rPr>
+          <w:rStyle w:val="NormalTok"/>
+        </w:rPr>
+        <w:t xml:space="preserve"> </w:t>
+      </w:r>
+      <w:r>
+        <w:rPr>
+          <w:rStyle w:val="StringTok"/>
+        </w:rPr>
+        <w:t xml:space="preserve">"B"</w:t>
+      </w:r>
+      <w:r>
+        <w:rPr>
+          <w:rStyle w:val="NormalTok"/>
+        </w:rPr>
+        <w:t xml:space="preserve">}</w:t>
+      </w:r>
+      <w:r>
+        <w:br/>
+      </w:r>
+      <w:r>
+        <w:rPr>
+          <w:rStyle w:val="NormalTok"/>
+        </w:rPr>
+        <w:t xml:space="preserve">ppi </w:t>
+      </w:r>
+      <w:r>
+        <w:rPr>
+          <w:rStyle w:val="OperatorTok"/>
+        </w:rPr>
+        <w:t xml:space="preserve">=</w:t>
+      </w:r>
+      <w:r>
+        <w:rPr>
+          <w:rStyle w:val="NormalTok"/>
+        </w:rPr>
+        <w:t xml:space="preserve"> [(u, v) </w:t>
+      </w:r>
+      <w:r>
+        <w:rPr>
+          <w:rStyle w:val="ControlFlowTok"/>
+        </w:rPr>
+        <w:t xml:space="preserve">for</w:t>
+      </w:r>
+      <w:r>
+        <w:rPr>
+          <w:rStyle w:val="NormalTok"/>
+        </w:rPr>
+        <w:t xml:space="preserve"> u, v, d </w:t>
+      </w:r>
+      <w:r>
+        <w:rPr>
+          <w:rStyle w:val="KeywordTok"/>
+        </w:rPr>
+        <w:t xml:space="preserve">in</w:t>
+      </w:r>
+      <w:r>
+        <w:rPr>
+          <w:rStyle w:val="NormalTok"/>
+        </w:rPr>
+        <w:t xml:space="preserve"> G.edges(data</w:t>
+      </w:r>
+      <w:r>
+        <w:rPr>
+          <w:rStyle w:val="OperatorTok"/>
+        </w:rPr>
+        <w:t xml:space="preserve">=</w:t>
+      </w:r>
+      <w:r>
+        <w:rPr>
+          <w:rStyle w:val="VariableTok"/>
+        </w:rPr>
+        <w:t xml:space="preserve">True</w:t>
+      </w:r>
+      <w:r>
+        <w:rPr>
+          <w:rStyle w:val="NormalTok"/>
+        </w:rPr>
+        <w:t xml:space="preserve">)</w:t>
+      </w:r>
+      <w:r>
+        <w:br/>
+      </w:r>
+      <w:r>
+        <w:rPr>
+          <w:rStyle w:val="NormalTok"/>
+        </w:rPr>
+        <w:t xml:space="preserve">       </w:t>
+      </w:r>
+      <w:r>
+        <w:rPr>
+          <w:rStyle w:val="ControlFlowTok"/>
+        </w:rPr>
+        <w:t xml:space="preserve">if</w:t>
+      </w:r>
+      <w:r>
+        <w:rPr>
+          <w:rStyle w:val="NormalTok"/>
+        </w:rPr>
+        <w:t xml:space="preserve"> d.get(</w:t>
+      </w:r>
+      <w:r>
+        <w:rPr>
+          <w:rStyle w:val="StringTok"/>
+        </w:rPr>
+        <w:t xml:space="preserve">"relation"</w:t>
+      </w:r>
+      <w:r>
+        <w:rPr>
+          <w:rStyle w:val="NormalTok"/>
+        </w:rPr>
+        <w:t xml:space="preserve">) </w:t>
+      </w:r>
+      <w:r>
+        <w:rPr>
+          <w:rStyle w:val="OperatorTok"/>
+        </w:rPr>
+        <w:t xml:space="preserve">==</w:t>
+      </w:r>
+      <w:r>
+        <w:rPr>
+          <w:rStyle w:val="NormalTok"/>
+        </w:rPr>
+        <w:t xml:space="preserve"> </w:t>
+      </w:r>
+      <w:r>
+        <w:rPr>
+          <w:rStyle w:val="StringTok"/>
+        </w:rPr>
+        <w:t xml:space="preserve">"protein_protein"</w:t>
+      </w:r>
+      <w:r>
+        <w:rPr>
+          <w:rStyle w:val="NormalTok"/>
+        </w:rPr>
+        <w:t xml:space="preserve">]</w:t>
+      </w:r>
+      <w:r>
+        <w:br/>
+      </w:r>
+      <w:r>
+        <w:rPr>
+          <w:rStyle w:val="NormalTok"/>
+        </w:rPr>
+        <w:t xml:space="preserve">scores </w:t>
+      </w:r>
+      <w:r>
+        <w:rPr>
+          <w:rStyle w:val="OperatorTok"/>
+        </w:rPr>
+        <w:t xml:space="preserve">=</w:t>
+      </w:r>
+      <w:r>
+        <w:rPr>
+          <w:rStyle w:val="NormalTok"/>
+        </w:rPr>
+        <w:t xml:space="preserve"> {}</w:t>
+      </w:r>
+      <w:r>
+        <w:br/>
+      </w:r>
+      <w:r>
+        <w:rPr>
+          <w:rStyle w:val="ControlFlowTok"/>
+        </w:rPr>
+        <w:t xml:space="preserve">for</w:t>
+      </w:r>
+      <w:r>
+        <w:rPr>
+          <w:rStyle w:val="NormalTok"/>
+        </w:rPr>
+        <w:t xml:space="preserve"> u, v </w:t>
+      </w:r>
+      <w:r>
+        <w:rPr>
+          <w:rStyle w:val="KeywordTok"/>
+        </w:rPr>
+        <w:t xml:space="preserve">in</w:t>
+      </w:r>
+      <w:r>
+        <w:rPr>
+          <w:rStyle w:val="NormalTok"/>
+        </w:rPr>
+        <w:t xml:space="preserve"> ppi:</w:t>
+      </w:r>
+      <w:r>
+        <w:br/>
+      </w:r>
+      <w:r>
+        <w:rPr>
+          <w:rStyle w:val="NormalTok"/>
+        </w:rPr>
+        <w:t xml:space="preserve">    </w:t>
+      </w:r>
+      <w:r>
+        <w:rPr>
+          <w:rStyle w:val="ControlFlowTok"/>
+        </w:rPr>
+        <w:t xml:space="preserve">if</w:t>
+      </w:r>
+      <w:r>
+        <w:rPr>
+          <w:rStyle w:val="NormalTok"/>
+        </w:rPr>
+        <w:t xml:space="preserve"> u </w:t>
+      </w:r>
+      <w:r>
+        <w:rPr>
+          <w:rStyle w:val="KeywordTok"/>
+        </w:rPr>
+        <w:t xml:space="preserve">in</w:t>
+      </w:r>
+      <w:r>
+        <w:rPr>
+          <w:rStyle w:val="NormalTok"/>
+        </w:rPr>
+        <w:t xml:space="preserve"> track_a </w:t>
+      </w:r>
+      <w:r>
+        <w:rPr>
+          <w:rStyle w:val="KeywordTok"/>
+        </w:rPr>
+        <w:t xml:space="preserve">and</w:t>
+      </w:r>
+      <w:r>
+        <w:rPr>
+          <w:rStyle w:val="NormalTok"/>
+        </w:rPr>
+        <w:t xml:space="preserve"> v </w:t>
+      </w:r>
+      <w:r>
+        <w:rPr>
+          <w:rStyle w:val="KeywordTok"/>
+        </w:rPr>
+        <w:t xml:space="preserve">in</w:t>
+      </w:r>
+      <w:r>
+        <w:rPr>
+          <w:rStyle w:val="NormalTok"/>
+        </w:rPr>
+        <w:t xml:space="preserve"> track_b:</w:t>
+      </w:r>
+      <w:r>
+        <w:br/>
+      </w:r>
+      <w:r>
+        <w:rPr>
+          <w:rStyle w:val="NormalTok"/>
+        </w:rPr>
+        <w:t xml:space="preserve">        scores[u] </w:t>
+      </w:r>
+      <w:r>
+        <w:rPr>
+          <w:rStyle w:val="OperatorTok"/>
+        </w:rPr>
+        <w:t xml:space="preserve">=</w:t>
+      </w:r>
+      <w:r>
+        <w:rPr>
+          <w:rStyle w:val="NormalTok"/>
+        </w:rPr>
+        <w:t xml:space="preserve"> scores.get(u, </w:t>
+      </w:r>
+      <w:r>
+        <w:rPr>
+          <w:rStyle w:val="DecValTok"/>
+        </w:rPr>
+        <w:t xml:space="preserve">0</w:t>
+      </w:r>
+      <w:r>
+        <w:rPr>
+          <w:rStyle w:val="NormalTok"/>
+        </w:rPr>
+        <w:t xml:space="preserve">) </w:t>
+      </w:r>
+      <w:r>
+        <w:rPr>
+          <w:rStyle w:val="OperatorTok"/>
+        </w:rPr>
+        <w:t xml:space="preserve">+</w:t>
+      </w:r>
+      <w:r>
+        <w:rPr>
+          <w:rStyle w:val="NormalTok"/>
+        </w:rPr>
+        <w:t xml:space="preserve"> </w:t>
+      </w:r>
+      <w:r>
+        <w:rPr>
+          <w:rStyle w:val="DecValTok"/>
+        </w:rPr>
+        <w:t xml:space="preserve">1</w:t>
+      </w:r>
+      <w:r>
+        <w:br/>
+      </w:r>
+      <w:r>
+        <w:rPr>
+          <w:rStyle w:val="NormalTok"/>
+        </w:rPr>
+        <w:t xml:space="preserve">        scores[v] </w:t>
+      </w:r>
+      <w:r>
+        <w:rPr>
+          <w:rStyle w:val="OperatorTok"/>
+        </w:rPr>
+        <w:t xml:space="preserve">=</w:t>
+      </w:r>
+      <w:r>
+        <w:rPr>
+          <w:rStyle w:val="NormalTok"/>
+        </w:rPr>
+        <w:t xml:space="preserve"> scores.get(v, </w:t>
+      </w:r>
+      <w:r>
+        <w:rPr>
+          <w:rStyle w:val="DecValTok"/>
+        </w:rPr>
+        <w:t xml:space="preserve">0</w:t>
+      </w:r>
+      <w:r>
+        <w:rPr>
+          <w:rStyle w:val="NormalTok"/>
+        </w:rPr>
+        <w:t xml:space="preserve">) </w:t>
+      </w:r>
+      <w:r>
+        <w:rPr>
+          <w:rStyle w:val="OperatorTok"/>
+        </w:rPr>
+        <w:t xml:space="preserve">+</w:t>
+      </w:r>
+      <w:r>
+        <w:rPr>
+          <w:rStyle w:val="NormalTok"/>
+        </w:rPr>
+        <w:t xml:space="preserve"> </w:t>
+      </w:r>
+      <w:r>
+        <w:rPr>
+          <w:rStyle w:val="DecValTok"/>
+        </w:rPr>
+        <w:t xml:space="preserve">1</w:t>
+      </w:r>
+      <w:r>
+        <w:br/>
+      </w:r>
+      <w:r>
+        <w:rPr>
+          <w:rStyle w:val="NormalTok"/>
+        </w:rPr>
+        <w:t xml:space="preserve">top_bridges </w:t>
+      </w:r>
+      <w:r>
+        <w:rPr>
+          <w:rStyle w:val="OperatorTok"/>
+        </w:rPr>
+        <w:t xml:space="preserve">=</w:t>
+      </w:r>
+      <w:r>
+        <w:rPr>
+          <w:rStyle w:val="NormalTok"/>
+        </w:rPr>
+        <w:t xml:space="preserve"> </w:t>
+      </w:r>
+      <w:r>
+        <w:rPr>
+          <w:rStyle w:val="BuiltInTok"/>
+        </w:rPr>
+        <w:t xml:space="preserve">sorted</w:t>
+      </w:r>
+      <w:r>
+        <w:rPr>
+          <w:rStyle w:val="NormalTok"/>
+        </w:rPr>
+        <w:t xml:space="preserve">(scores.items(), key</w:t>
+      </w:r>
+      <w:r>
+        <w:rPr>
+          <w:rStyle w:val="OperatorTok"/>
+        </w:rPr>
+        <w:t xml:space="preserve">=</w:t>
+      </w:r>
+      <w:r>
+        <w:rPr>
+          <w:rStyle w:val="KeywordTok"/>
+        </w:rPr>
+        <w:t xml:space="preserve">lambda</w:t>
+      </w:r>
+      <w:r>
+        <w:rPr>
+          <w:rStyle w:val="NormalTok"/>
+        </w:rPr>
+        <w:t xml:space="preserve"> x: x[</w:t>
+      </w:r>
+      <w:r>
+        <w:rPr>
+          <w:rStyle w:val="DecValTok"/>
+        </w:rPr>
+        <w:t xml:space="preserve">1</w:t>
+      </w:r>
+      <w:r>
+        <w:rPr>
+          <w:rStyle w:val="NormalTok"/>
+        </w:rPr>
+        <w:t xml:space="preserve">], reverse</w:t>
+      </w:r>
+      <w:r>
+        <w:rPr>
+          <w:rStyle w:val="OperatorTok"/>
+        </w:rPr>
+        <w:t xml:space="preserve">=</w:t>
+      </w:r>
+      <w:r>
+        <w:rPr>
+          <w:rStyle w:val="VariableTok"/>
+        </w:rPr>
+        <w:t xml:space="preserve">True</w:t>
+      </w:r>
+      <w:r>
+        <w:rPr>
+          <w:rStyle w:val="NormalTok"/>
+        </w:rPr>
+        <w:t xml:space="preserve">)[:</w:t>
+      </w:r>
+      <w:r>
+        <w:rPr>
+          <w:rStyle w:val="DecValTok"/>
+        </w:rPr>
+        <w:t xml:space="preserve">10</w:t>
+      </w:r>
+      <w:r>
+        <w:rPr>
+          <w:rStyle w:val="NormalTok"/>
+        </w:rPr>
+        <w:t xml:space="preserve">]</w:t>
+      </w:r>
+      <w:r>
+        <w:br/>
+      </w:r>
+      <w:r>
+        <w:rPr>
+          <w:rStyle w:val="CommentTok"/>
+        </w:rPr>
+        <w:t xml:space="preserve"># Top bridges include STAT3, RELA, NFKB1, IKBKB</w:t>
+      </w:r>
+    </w:p>
+    <w:p>
+      <w:r>
+        <w:pict>
+          <v:rect style="width:0;height:1.5pt" o:hralign="center" o:hrstd="t" o:hr="t"/>
+        </w:pict>
+      </w:r>
+    </w:p>
+    <w:bookmarkEnd w:id="47"/>
+    <w:bookmarkEnd w:id="48"/>
+    <w:bookmarkStart w:id="49" w:name="figure-captions"/>
+    <w:p>
+      <w:pPr>
+        <w:pStyle w:val="Heading2"/>
+      </w:pPr>
+      <w:r>
+        <w:t xml:space="preserve">Figure Captions</w:t>
+      </w:r>
+    </w:p>
+    <w:p>
+      <w:pPr>
+        <w:pStyle w:val="FirstParagraph"/>
+      </w:pPr>
+      <w:r>
+        <w:rPr>
+          <w:b/>
+          <w:bCs/>
+        </w:rPr>
+        <w:t xml:space="preserve">Figure 1.</w:t>
+      </w:r>
+      <w:r>
+        <w:t xml:space="preserve"> </w:t>
+      </w:r>
+      <w:r>
+        <w:t xml:space="preserve">Top 20 hub nodes ranked by betweenness centrality in RA-PainKG. Node size is proportional to betweenness score.</w:t>
+      </w:r>
+    </w:p>
+    <w:p>
+      <w:pPr>
+        <w:pStyle w:val="BodyText"/>
+      </w:pPr>
+      <w:r>
+        <w:rPr>
+          <w:b/>
+          <w:bCs/>
+        </w:rPr>
+        <w:t xml:space="preserve">Figure 2.</w:t>
+      </w:r>
+      <w:r>
+        <w:t xml:space="preserve"> </w:t>
+      </w:r>
+      <w:r>
+        <w:t xml:space="preserve">Degree distribution of RA-PainKG (log-log scale) with power-law fit. The scale-free topology is characteristic of biological networks.</w:t>
+      </w:r>
+    </w:p>
+    <w:p>
+      <w:pPr>
+        <w:pStyle w:val="BodyText"/>
+      </w:pPr>
+      <w:r>
+        <w:rPr>
+          <w:b/>
+          <w:bCs/>
+        </w:rPr>
+        <w:t xml:space="preserve">Figure 3.</w:t>
+      </w:r>
+      <w:r>
+        <w:t xml:space="preserve"> </w:t>
+      </w:r>
+      <w:r>
+        <w:t xml:space="preserve">Comparison of centrality distributions between Track A (immune-inflammation) and Track B (nociception-pain transduction) gene subsets.</w:t>
+      </w:r>
+    </w:p>
+    <w:p>
+      <w:pPr>
+        <w:pStyle w:val="BodyText"/>
+      </w:pPr>
+      <w:r>
+        <w:rPr>
+          <w:b/>
+          <w:bCs/>
+        </w:rPr>
+        <w:t xml:space="preserve">Figure 4.</w:t>
+      </w:r>
+      <w:r>
+        <w:t xml:space="preserve"> </w:t>
+      </w:r>
+      <w:r>
+        <w:t xml:space="preserve">Node type composition and edge relation distribution in RA-PainKG. The graph spans 10 entity types and 24 relation types.</w:t>
+      </w:r>
+    </w:p>
+    <w:p>
+      <w:pPr>
+        <w:pStyle w:val="BodyText"/>
+      </w:pPr>
+      <w:r>
+        <w:rPr>
+          <w:b/>
+          <w:bCs/>
+        </w:rPr>
+        <w:t xml:space="preserve">Figure 5.</w:t>
+      </w:r>
+      <w:r>
+        <w:t xml:space="preserve"> </w:t>
+      </w:r>
+      <w:r>
+        <w:t xml:space="preserve">Core signaling network visualization showing the top 50 hub nodes and their interconnections. Node color indicates track assignment.</w:t>
+      </w:r>
+    </w:p>
+    <w:p>
+      <w:pPr>
+        <w:pStyle w:val="BodyText"/>
+      </w:pPr>
+      <w:r>
+        <w:rPr>
+          <w:b/>
+          <w:bCs/>
+        </w:rPr>
+        <w:t xml:space="preserve">Figure 6.</w:t>
+      </w:r>
+      <w:r>
+        <w:t xml:space="preserve"> </w:t>
+      </w:r>
+      <w:r>
+        <w:t xml:space="preserve">Pathway subnetwork visualizations for nine curated pain signaling pathways mapped onto RA-PainKG.</w:t>
+      </w:r>
+    </w:p>
+    <w:bookmarkEnd w:id="49"/>
+    <w:bookmarkStart w:id="50" w:name="ai-usage-statement"/>
+    <w:p>
+      <w:pPr>
+        <w:pStyle w:val="Heading2"/>
+      </w:pPr>
+      <w:r>
+        <w:t xml:space="preserve">AI Usage Statement</w:t>
+      </w:r>
+    </w:p>
+    <w:p>
+      <w:pPr>
+        <w:pStyle w:val="FirstParagraph"/>
+      </w:pPr>
+      <w:r>
+        <w:t xml:space="preserve">During the preparation of this work, the author used AI-assisted tools (OpenAI Codex CLI, GitHub Copilot, and Claude via API) for the following purposes: code development and debugging of the pipeline, literature search and summarization, manuscript drafting and language editing, and iterative revision based on simulated peer review. All AI-generated content was reviewed, verified, and edited by the author. The author takes full responsibility for the scientific accuracy, data integrity, and conclusions presented in this publication. All data were generated by the author’s original code; no AI tool contributed to data generation or statistical computation beyond code execution of author-specified algorithms.</w:t>
+      </w:r>
+    </w:p>
+    <w:bookmarkEnd w:id="50"/>
+    <w:bookmarkStart w:id="51" w:name="acknowledgements"/>
+    <w:p>
+      <w:pPr>
+        <w:pStyle w:val="Heading2"/>
+      </w:pPr>
+      <w:r>
+        <w:t xml:space="preserve">Acknowledgements</w:t>
+      </w:r>
+    </w:p>
+    <w:p>
+      <w:pPr>
+        <w:pStyle w:val="FirstParagraph"/>
+      </w:pPr>
+      <w:r>
+        <w:t xml:space="preserve">The author thanks the Norman lab, the PrimeKG development team, the GTEx Consortium, and the Gene Ontology Consortium for making their data publicly available. This research was supported by institutional resources from The Second Affiliated Hospital of Fujian University of Traditional Chinese Medicine.</w:t>
+      </w:r>
+    </w:p>
+    <w:bookmarkEnd w:id="51"/>
+    <w:bookmarkStart w:id="52" w:name="author-contributions"/>
+    <w:p>
+      <w:pPr>
+        <w:pStyle w:val="Heading2"/>
+      </w:pPr>
+      <w:r>
+        <w:t xml:space="preserve">Author Contributions</w:t>
+      </w:r>
+    </w:p>
+    <w:p>
+      <w:pPr>
+        <w:pStyle w:val="FirstParagraph"/>
+      </w:pPr>
+      <w:r>
+        <w:rPr>
+          <w:b/>
+          <w:bCs/>
+        </w:rPr>
+        <w:t xml:space="preserve">Yongxin Yang:</w:t>
+      </w:r>
+      <w:r>
+        <w:t xml:space="preserve"> </w:t>
+      </w:r>
+      <w:r>
+        <w:t xml:space="preserve">Conceptualization, Methodology, Software, Formal Analysis, Investigation, Data Curation, Writing - Original Draft, Writing - Review and Editing, Visualization, Project Administration.</w:t>
+      </w:r>
+    </w:p>
+    <w:bookmarkEnd w:id="52"/>
+    <w:bookmarkStart w:id="53" w:name="competing-interests"/>
+    <w:p>
+      <w:pPr>
+        <w:pStyle w:val="Heading2"/>
+      </w:pPr>
+      <w:r>
+        <w:t xml:space="preserve">Competing Interests</w:t>
+      </w:r>
+    </w:p>
+    <w:p>
+      <w:pPr>
+        <w:pStyle w:val="FirstParagraph"/>
+      </w:pPr>
+      <w:r>
+        <w:t xml:space="preserve">The author declares no competing interests.</w:t>
+      </w:r>
+    </w:p>
+    <w:bookmarkEnd w:id="53"/>
+    <w:bookmarkStart w:id="54" w:name="ethics-statement"/>
+    <w:p>
+      <w:pPr>
+        <w:pStyle w:val="Heading2"/>
+      </w:pPr>
+      <w:r>
+        <w:t xml:space="preserve">Ethics Statement</w:t>
+      </w:r>
+    </w:p>
+    <w:p>
+      <w:pPr>
+        <w:pStyle w:val="FirstParagraph"/>
+      </w:pPr>
+      <w:r>
+        <w:t xml:space="preserve">This study uses exclusively publicly available data. No new data involving human subjects were collected.</w:t>
+      </w:r>
+    </w:p>
     <w:bookmarkEnd w:id="54"/>
-    <w:bookmarkStart w:id="55" w:name="references"/>
+    <w:bookmarkStart w:id="55" w:name="data-and-code-availability"/>
     <w:p>
       <w:pPr>
         <w:pStyle w:val="Heading2"/>
       </w:pPr>
       <w:r>
+        <w:t xml:space="preserve">Data and Code Availability</w:t>
+      </w:r>
+    </w:p>
+    <w:p>
+      <w:pPr>
+        <w:pStyle w:val="FirstParagraph"/>
+      </w:pPr>
+      <w:r>
+        <w:t xml:space="preserve">All code, processed KG adjacency matrices, graph files (GraphML, CSV, Python pickle), and benchmark results are available at https://github.com/yyx-4113/ra-painkg under the MIT license. The Norman et al. Perturb-seq dataset is available from Harvard Dataverse (DOI: 10.7910/DVN/R9JDLS). PrimeKG v1.0 is available from Harvard Dataverse (DOI: 10.7910/DVN/IXA7BM). Gene Ontology annotations are from the Gene Ontology Consortium. RA-PainKG graph files and complete documentation are included in the repository.</w:t>
+      </w:r>
+    </w:p>
+    <w:p>
+      <w:r>
+        <w:pict>
+          <v:rect style="width:0;height:1.5pt" o:hralign="center" o:hrstd="t" o:hr="t"/>
+        </w:pict>
+      </w:r>
+    </w:p>
+    <w:bookmarkEnd w:id="55"/>
+    <w:bookmarkStart w:id="56" w:name="references"/>
+    <w:p>
+      <w:pPr>
+        <w:pStyle w:val="Heading2"/>
+      </w:pPr>
+      <w:r>
         <w:t xml:space="preserve">References</w:t>
       </w:r>
     </w:p>
@@ -5563,8 +5722,8 @@
         <w:t xml:space="preserve">[22] Ashburner M, Ball CA, Blake JA, et al. Gene Ontology: tool for the unification of biology. Nat Genet. 2000;25(1):25-29.</w:t>
       </w:r>
     </w:p>
-    <w:bookmarkEnd w:id="55"/>
     <w:bookmarkEnd w:id="56"/>
+    <w:bookmarkEnd w:id="57"/>
     <w:sectPr>
       <w:footnotePr>
         <w:numRestart w:val="eachSect"/>

</xml_diff>

<commit_message>
Round 5: compress Methods 2.5-2.8, fix encoding artifacts, remove duplicate phenotype, fix blank line
</commit_message>
<xml_diff>
--- a/submission/manuscript.docx
+++ b/submission/manuscript.docx
@@ -2,7 +2,7 @@
 <file path=word/document.xml><?xml version="1.0" encoding="utf-8"?>
 <w:document xmlns:w="http://schemas.openxmlformats.org/wordprocessingml/2006/main" xmlns:m="http://schemas.openxmlformats.org/officeDocument/2006/math" xmlns:r="http://schemas.openxmlformats.org/officeDocument/2006/relationships" xmlns:o="urn:schemas-microsoft-com:office:office" xmlns:v="urn:schemas-microsoft-com:vml" xmlns:w10="urn:schemas-microsoft-com:office:word" xmlns:a="http://schemas.openxmlformats.org/drawingml/2006/main" xmlns:pic="http://schemas.openxmlformats.org/drawingml/2006/picture" xmlns:wp="http://schemas.openxmlformats.org/drawingml/2006/wordprocessingDrawing">
   <w:body>
-    <w:bookmarkStart w:id="57" w:name="X86057564cd223f25774b1dcecee05ca31ed1e18"/>
+    <w:bookmarkStart w:id="55" w:name="X86057564cd223f25774b1dcecee05ca31ed1e18"/>
     <w:p>
       <w:pPr>
         <w:pStyle w:val="Heading1"/>
@@ -288,7 +288,7 @@
       </w:r>
     </w:p>
     <w:bookmarkEnd w:id="21"/>
-    <w:bookmarkStart w:id="30" w:name="materials-and-methods"/>
+    <w:bookmarkStart w:id="28" w:name="materials-and-methods"/>
     <w:p>
       <w:pPr>
         <w:pStyle w:val="Heading2"/>
@@ -935,13 +935,13 @@
       </w:r>
     </w:p>
     <w:bookmarkEnd w:id="25"/>
-    <w:bookmarkStart w:id="26" w:name="gene-embedding-and-prediction-model"/>
+    <w:bookmarkStart w:id="26" w:name="benchmark-validation-methods"/>
     <w:p>
       <w:pPr>
         <w:pStyle w:val="Heading3"/>
       </w:pPr>
       <w:r>
-        <w:t xml:space="preserve">2.5 Gene Embedding and Prediction Model</w:t>
+        <w:t xml:space="preserve">2.5 Benchmark Validation Methods</w:t>
       </w:r>
     </w:p>
     <w:p>
@@ -949,18 +949,17 @@
         <w:pStyle w:val="FirstParagraph"/>
       </w:pPr>
       <w:r>
-        <w:t xml:space="preserve">For each KG, we compute 128-dimensional gene embeddings via spectral decomposition of the normalized graph Laplacian: L = I - D^{-1/2} A D^{-1/2}, extracting eigenvectors corresponding to the k smallest non-zero eigenvalues. For graphs with isolated nodes (RA-PainKG: 68.3% of genes), these nodes receive near-zero embeddings that contribute no predictive signal in the linear model–a feature that accurately reflects their lack of KG-derived prior information. The perturbation prediction model is:</w:t>
-      </w:r>
-    </w:p>
-    <w:p>
-      <w:pPr>
-        <w:pStyle w:val="SourceCode"/>
-      </w:pPr>
-      <w:r>
-        <w:rPr>
-          <w:rStyle w:val="VerbatimChar"/>
-        </w:rPr>
-        <w:t xml:space="preserve">predicted_delta = W^T * emb(perturbed_gene)</w:t>
+        <w:t xml:space="preserve">For validation, 128-dimensional gene embeddings were computed via spectral decomposition of the normalized graph Laplacian (k = 128) for each KG [22]. Perturbation effects were predicted via ridge regression (lambda = 0.1) across 10 independent train/test splits (80%/20%). This linear architecture isolates KG contribution from model capacity. Paired t-tests with Bonferroni correction (alpha = 0.01, m = 5) and Kendall’s W ranking consistency were used for statistical comparison. Sensitivity analyses for regularization (alpha = 0.001–100.0) and embedding dimension (k = 32–512) confirmed robustness. K562 pain gene expression was quantified per-gene for all 44 pain-annotated genes (mean expression, percent expressing cells). Complete methods, including spectral decomposition details, nonlinear model comparison (MLP vs ridge), GEARS architecture comparison [21], evaluation protocol, and power analysis, are provided in Supplementary Methods.</w:t>
+      </w:r>
+    </w:p>
+    <w:bookmarkEnd w:id="26"/>
+    <w:bookmarkStart w:id="27" w:name="implementation"/>
+    <w:p>
+      <w:pPr>
+        <w:pStyle w:val="Heading3"/>
+      </w:pPr>
+      <w:r>
+        <w:t xml:space="preserve">2.6 Implementation</w:t>
       </w:r>
     </w:p>
     <w:p>
@@ -968,7 +967,35 @@
         <w:pStyle w:val="FirstParagraph"/>
       </w:pPr>
       <w:r>
-        <w:t xml:space="preserve">where W (128 x 5045) is learned via ridge regression (lambda = 0.1). This deliberately simplified architecture isolates KG contribution from model capacity. We validate robustness across regularization strengths (alpha = 0.001, 0.01, 0.1, 1.0, 10.0, 100.0) and embedding dimensions (k = 32, 64, 128, 256, 512).</w:t>
+        <w:t xml:space="preserve">Python 3.10+, ScanPy 1.12, NetworkX 3.6, NumPy, SciPy, scikit-learn. Total compute time: approximately 12 minutes (Intel i9-13900K, 64 GB RAM). Full pipeline and processed data at https://github.com/yyx-4113/ra-painkg.</w:t>
+      </w:r>
+    </w:p>
+    <w:bookmarkEnd w:id="27"/>
+    <w:bookmarkEnd w:id="28"/>
+    <w:bookmarkStart w:id="32" w:name="results"/>
+    <w:p>
+      <w:pPr>
+        <w:pStyle w:val="Heading2"/>
+      </w:pPr>
+      <w:r>
+        <w:t xml:space="preserve">3. Results</w:t>
+      </w:r>
+    </w:p>
+    <w:bookmarkStart w:id="29" w:name="ra-painkg-resource-description"/>
+    <w:p>
+      <w:pPr>
+        <w:pStyle w:val="Heading3"/>
+      </w:pPr>
+      <w:r>
+        <w:t xml:space="preserve">3.1 RA-PainKG Resource Description</w:t>
+      </w:r>
+    </w:p>
+    <w:p>
+      <w:pPr>
+        <w:pStyle w:val="FirstParagraph"/>
+      </w:pPr>
+      <w:r>
+        <w:t xml:space="preserve">RA-PainKG is publicly available in three formats: GraphML (network visualization), CSV (edge and node tables), and Python pickle (programmatic access via NetworkX). The complete resource includes: (1) the full knowledge graph with 18,069 nodes and 127,226 directed edges; (2) GTEx v8 tissue expression annotations for 165 pain-annotated genes across 54 human tissues; (3) dual-track gene assignments with supporting literature evidence; and (4) mapping of nine curated pain signaling pathways onto the graph structure.</w:t>
       </w:r>
     </w:p>
     <w:p>
@@ -976,17 +1003,7 @@
         <w:pStyle w:val="BodyText"/>
       </w:pPr>
       <w:r>
-        <w:rPr>
-          <w:b/>
-          <w:bCs/>
-        </w:rPr>
-        <w:t xml:space="preserve">Justification of linear model choice:</w:t>
-      </w:r>
-      <w:r>
-        <w:t xml:space="preserve"> </w:t>
-      </w:r>
-      <w:r>
-        <w:t xml:space="preserve">We compared ridge regression against a 2-layer multilayer perceptron (MLP) with 128 hidden units and ReLU activation, trained on one representative split (seed 42). The MLP yielded lower performance (r = 0.46 vs r = 0.52–0.59 for ridge) and attenuated KG distinctions (GO: r = 0.459, RA-PainKG: r = 0.458, delta &lt; 0.01), likely due to overfitting given the high-dimensional output space (5,045 genes) relative to training samples (227 conditions). The linear model preserves KG-specific signal and provides a more informative comparison. We note the MLP evaluation is single-split and should be interpreted as qualitative evidence for the linear model’s suitability rather than a formal nonlinear benchmark.</w:t>
+        <w:t xml:space="preserve">The graph spans 10 entity types (gene/protein, drug, disease, pathway, biological process, molecular function, cellular component, anatomy, phenotype) and 24 relation types, with drug-target edges (4,760 edges) enabling direct pharmacological queries. Network topology analysis identified EGR1, FOS, STAT3, JUN, and AKT1 as the top five hub nodes by betweenness centrality (Figure 1). The degree distribution follows a scale-free pattern characteristic of biological networks (Figure 2).</w:t>
       </w:r>
     </w:p>
     <w:p>
@@ -994,314 +1011,11 @@
         <w:pStyle w:val="BodyText"/>
       </w:pPr>
       <w:r>
-        <w:t xml:space="preserve">This design contrasts with the full GEARS architecture [21], which uses GraphSAGE message-passing and cross-gene attention–mechanisms that may differentially exploit KG structure. Our results measure KG embedding quality in a controlled linear setting rather than end-to-end GEARS performance.</w:t>
-      </w:r>
-    </w:p>
-    <w:p>
-      <w:pPr>
-        <w:pStyle w:val="BodyText"/>
-      </w:pPr>
-      <w:r>
-        <w:rPr>
-          <w:b/>
-          <w:bCs/>
-        </w:rPr>
-        <w:t xml:space="preserve">Compute requirements:</w:t>
-      </w:r>
-      <w:r>
-        <w:t xml:space="preserve"> </w:t>
-      </w:r>
-      <w:r>
-        <w:t xml:space="preserve">Spectral decomposition of each 5,045 x 5,045 adjacency matrix required 40–66 seconds (Intel i9-13900K, 64 GB RAM, single core). Data loading (40 seconds), KG construction (GO: 100 seconds; RA-PainKG: 12 seconds), and benchmark execution (10 splits x 11 KGs, &lt;1 second per split-KG combination) brought the total wall-clock time to approximately 12 minutes. Peak memory usage was approximately 2.5 GB during simultaneous matrix operations.</w:t>
-      </w:r>
-    </w:p>
-    <w:bookmarkEnd w:id="26"/>
-    <w:bookmarkStart w:id="27" w:name="evaluation-protocol"/>
-    <w:p>
-      <w:pPr>
-        <w:pStyle w:val="Heading3"/>
-      </w:pPr>
-      <w:r>
-        <w:t xml:space="preserve">2.6 Evaluation Protocol</w:t>
-      </w:r>
-    </w:p>
-    <w:p>
-      <w:pPr>
-        <w:pStyle w:val="FirstParagraph"/>
-      </w:pPr>
-      <w:r>
-        <w:t xml:space="preserve">Perturbation conditions (n = 283, excluding ctrl) are split into train (80%, approximately 227 conditions) and test (20%, approximately 56 conditions). We run 10 independent splits with different random seeds (42, 179, 316, …, 1275). For each split:</w:t>
-      </w:r>
-    </w:p>
-    <w:p>
-      <w:pPr>
-        <w:pStyle w:val="Compact"/>
-        <w:numPr>
-          <w:ilvl w:val="0"/>
-          <w:numId w:val="1001"/>
-        </w:numPr>
-      </w:pPr>
-      <w:r>
-        <w:t xml:space="preserve">Train ridge regression on training conditions; predict on test conditions</w:t>
-      </w:r>
-    </w:p>
-    <w:p>
-      <w:pPr>
-        <w:pStyle w:val="Compact"/>
-        <w:numPr>
-          <w:ilvl w:val="0"/>
-          <w:numId w:val="1001"/>
-        </w:numPr>
-      </w:pPr>
-      <w:r>
-        <w:t xml:space="preserve">Compute Pearson r, MSE, and RMSE as fraction of control expression SD</w:t>
-      </w:r>
-    </w:p>
-    <w:p>
-      <w:pPr>
-        <w:pStyle w:val="Compact"/>
-        <w:numPr>
-          <w:ilvl w:val="0"/>
-          <w:numId w:val="1001"/>
-        </w:numPr>
-      </w:pPr>
-      <w:r>
-        <w:t xml:space="preserve">Stratify metrics by gene subset: all genes (5,045), pain-annotated (n = 44), non-pain (5,001), Track A (n = 3), Track B (n = 5), Dual (n = 36)</w:t>
-      </w:r>
-    </w:p>
-    <w:p>
-      <w:pPr>
-        <w:pStyle w:val="FirstParagraph"/>
-      </w:pPr>
-      <w:r>
-        <w:t xml:space="preserve">Statistical comparisons:</w:t>
-      </w:r>
-      <w:r>
-        <w:t xml:space="preserve"> </w:t>
-      </w:r>
-      <w:r>
-        <w:t xml:space="preserve">-</w:t>
-      </w:r>
-      <w:r>
-        <w:t xml:space="preserve"> </w:t>
-      </w:r>
-      <w:r>
-        <w:rPr>
-          <w:b/>
-          <w:bCs/>
-        </w:rPr>
-        <w:t xml:space="preserve">Paired t-tests</w:t>
-      </w:r>
-      <w:r>
-        <w:t xml:space="preserve"> </w:t>
-      </w:r>
-      <w:r>
-        <w:t xml:space="preserve">across 10 splits, validated by Shapiro-Wilk normality tests</w:t>
-      </w:r>
-      <w:r>
-        <w:t xml:space="preserve"> </w:t>
-      </w:r>
-      <w:r>
-        <w:t xml:space="preserve">-</w:t>
-      </w:r>
-      <w:r>
-        <w:t xml:space="preserve"> </w:t>
-      </w:r>
-      <w:r>
-        <w:rPr>
-          <w:b/>
-          <w:bCs/>
-        </w:rPr>
-        <w:t xml:space="preserve">Delta-r 95% confidence intervals</w:t>
-      </w:r>
-      <w:r>
-        <w:t xml:space="preserve"> </w:t>
-      </w:r>
-      <w:r>
-        <w:t xml:space="preserve">via t-distribution</w:t>
-      </w:r>
-      <w:r>
-        <w:t xml:space="preserve"> </w:t>
-      </w:r>
-      <w:r>
-        <w:t xml:space="preserve">-</w:t>
-      </w:r>
-      <w:r>
-        <w:t xml:space="preserve"> </w:t>
-      </w:r>
-      <w:r>
-        <w:rPr>
-          <w:b/>
-          <w:bCs/>
-        </w:rPr>
-        <w:t xml:space="preserve">Bonferroni correction</w:t>
-      </w:r>
-      <w:r>
-        <w:t xml:space="preserve"> </w:t>
-      </w:r>
-      <w:r>
-        <w:t xml:space="preserve">for multiple comparisons: with m = 5 primary tests (Supplementary Table S5), the adjusted significance threshold is alpha = 0.05/5 = 0.01. All conclusions reported at both nominal and adjusted thresholds.</w:t>
-      </w:r>
-      <w:r>
-        <w:t xml:space="preserve"> </w:t>
-      </w:r>
-      <w:r>
-        <w:t xml:space="preserve">-</w:t>
-      </w:r>
-      <w:r>
-        <w:t xml:space="preserve"> </w:t>
-      </w:r>
-      <w:r>
-        <w:rPr>
-          <w:b/>
-          <w:bCs/>
-        </w:rPr>
-        <w:t xml:space="preserve">Cross-split ranking consistency</w:t>
-      </w:r>
-      <w:r>
-        <w:t xml:space="preserve"> </w:t>
-      </w:r>
-      <w:r>
-        <w:t xml:space="preserve">via Kendall’s W coefficient</w:t>
-      </w:r>
-      <w:r>
-        <w:t xml:space="preserve"> </w:t>
-      </w:r>
-      <w:r>
-        <w:t xml:space="preserve">-</w:t>
-      </w:r>
-      <w:r>
-        <w:t xml:space="preserve"> </w:t>
-      </w:r>
-      <w:r>
-        <w:rPr>
-          <w:b/>
-          <w:bCs/>
-        </w:rPr>
-        <w:t xml:space="preserve">Effect sizes</w:t>
-      </w:r>
-      <w:r>
-        <w:t xml:space="preserve"> </w:t>
-      </w:r>
-      <w:r>
-        <w:t xml:space="preserve">reported as Cohen’s d</w:t>
-      </w:r>
-    </w:p>
-    <w:p>
-      <w:pPr>
-        <w:pStyle w:val="BodyText"/>
-      </w:pPr>
-      <w:r>
-        <w:t xml:space="preserve">Power analysis: the RA-PainKG vs GO comparison (d = -0.61) requires 21 splits for 80% power at two-sided alpha = 0.05; our 10 splits provide 55% power for this comparison. Results are interpreted as</w:t>
-      </w:r>
-      <w:r>
-        <w:t xml:space="preserve"> </w:t>
-      </w:r>
-      <w:r>
-        <w:t xml:space="preserve">“insufficient evidence for a difference”</w:t>
-      </w:r>
-      <w:r>
-        <w:t xml:space="preserve"> </w:t>
-      </w:r>
-      <w:r>
-        <w:t xml:space="preserve">rather than</w:t>
-      </w:r>
-      <w:r>
-        <w:t xml:space="preserve"> </w:t>
-      </w:r>
-      <w:r>
-        <w:t xml:space="preserve">“evidence of equivalence.”</w:t>
-      </w:r>
-    </w:p>
-    <w:bookmarkEnd w:id="27"/>
-    <w:bookmarkStart w:id="28" w:name="k562-pain-gene-expression-quantification"/>
-    <w:p>
-      <w:pPr>
-        <w:pStyle w:val="Heading3"/>
-      </w:pPr>
-      <w:r>
-        <w:t xml:space="preserve">2.7 K562 Pain Gene Expression Quantification</w:t>
-      </w:r>
-    </w:p>
-    <w:p>
-      <w:pPr>
-        <w:pStyle w:val="FirstParagraph"/>
-      </w:pPr>
-      <w:r>
-        <w:t xml:space="preserve">To assess biological relevance of pain gene perturbation effects in K562 cells, we computed per-gene mean expression (log-normalized units) and percentage of expressing cells (non-zero entries) for all 44 pain-annotated genes in the Norman vocabulary. Given that 59.1% of measurable pain genes fall below the expression threshold and mean pain-gene expression (0.117) is comparable to the genome-wide mean (0.107), we treat the pain-gene subset results as exploratory and interpret density-driven conclusions primarily through the non-pain gene subset (n = 5,001), where the benchmark is adequately powered.</w:t>
-      </w:r>
-    </w:p>
-    <w:bookmarkEnd w:id="28"/>
-    <w:bookmarkStart w:id="29" w:name="implementation"/>
-    <w:p>
-      <w:pPr>
-        <w:pStyle w:val="Heading3"/>
-      </w:pPr>
-      <w:r>
-        <w:t xml:space="preserve">2.8 Implementation</w:t>
-      </w:r>
-    </w:p>
-    <w:p>
-      <w:pPr>
-        <w:pStyle w:val="FirstParagraph"/>
-      </w:pPr>
-      <w:r>
-        <w:t xml:space="preserve">Python 3.10+, ScanPy 1.12, NetworkX 3.6, NumPy, SciPy, scikit-learn. Full pipeline and processed KG adjacency matrices are available at https://github.com/yyx-4113/ra-painkg.</w:t>
-      </w:r>
-    </w:p>
-    <w:p>
-      <w:r>
-        <w:pict>
-          <v:rect style="width:0;height:1.5pt" o:hralign="center" o:hrstd="t" o:hr="t"/>
-        </w:pict>
+        <w:t xml:space="preserve">All nine literature-curated pain signaling pathways were successfully mapped onto RA-PainKG with gene coverage ranging from 57% (complement cascade) to 100% (TRP channels, voltage-gated sodium channels, neurotrophin signaling). The dual-track organization is summarized in Table S1: Track A (immune-inflammation, 106 genes) and Track B (nociception-pain transduction, 122 genes), with 96 genes (58.2%) spanning both tracks. The substantial Track A/B overlap (58.2%) is biologically expected: transcription factors (FOS, JUN, STAT3) activated by inflammatory cytokines also drive nociceptive sensitization, MAP kinases transduce both inflammatory and pain signals, and prostaglandins (via COX-2/PTGS2) bridge immune activation and nociceptor sensitization [5,7]. Rather than indicating poor track separation, this overlap reflects the mechanistic reality that inflammation and pain are deeply coupled in RA. The dual-track framework serves as a conceptual lens for hypothesis generation: genes exclusive to Track A or B may represent intervention points where anti-inflammatory and analgesic effects can be partially decoupled, while dual-track hub genes represent convergence points where both processes are jointly regulated.</w:t>
       </w:r>
     </w:p>
     <w:bookmarkEnd w:id="29"/>
-    <w:bookmarkEnd w:id="30"/>
-    <w:bookmarkStart w:id="34" w:name="results"/>
-    <w:p>
-      <w:pPr>
-        <w:pStyle w:val="Heading2"/>
-      </w:pPr>
-      <w:r>
-        <w:t xml:space="preserve">3. Results</w:t>
-      </w:r>
-    </w:p>
-    <w:bookmarkStart w:id="31" w:name="ra-painkg-resource-description"/>
-    <w:p>
-      <w:pPr>
-        <w:pStyle w:val="Heading3"/>
-      </w:pPr>
-      <w:r>
-        <w:t xml:space="preserve">3.1 RA-PainKG Resource Description</w:t>
-      </w:r>
-    </w:p>
-    <w:p>
-      <w:pPr>
-        <w:pStyle w:val="FirstParagraph"/>
-      </w:pPr>
-      <w:r>
-        <w:t xml:space="preserve">RA-PainKG is publicly available in three formats: GraphML (network visualization), CSV (edge and node tables), and Python pickle (programmatic access via NetworkX). The complete resource includes: (1) the full knowledge graph with 18,069 nodes and 127,226 directed edges; (2) GTEx v8 tissue expression annotations for 165 pain-annotated genes across 54 human tissues; (3) dual-track gene assignments with supporting literature evidence; and (4) mapping of nine curated pain signaling pathways onto the graph structure.</w:t>
-      </w:r>
-    </w:p>
-    <w:p>
-      <w:pPr>
-        <w:pStyle w:val="BodyText"/>
-      </w:pPr>
-      <w:r>
-        <w:t xml:space="preserve">The graph spans 10 entity types (gene/protein, drug, disease, pathway, biological process, molecular function, cellular component, anatomy, phenotype, phenotype) and 24 relation types, with drug-target edges (4,760 edges) enabling direct pharmacological queries. Network topology analysis identified EGR1, FOS, STAT3, JUN, and AKT1 as the top five hub nodes by betweenness centrality (Figure 1). The degree distribution follows a scale-free pattern characteristic of biological networks (Figure 2).</w:t>
-      </w:r>
-    </w:p>
-    <w:p>
-      <w:pPr>
-        <w:pStyle w:val="BodyText"/>
-      </w:pPr>
-      <w:r>
-        <w:t xml:space="preserve">All nine literature-curated pain signaling pathways were successfully mapped onto RA-PainKG with gene coverage ranging from 57% (complement cascade) to 100% (TRP channels, voltage-gated sodium channels, neurotrophin signaling). The dual-track organization is summarized in Table S1: Track A (immune-inflammation, 106 genes) and Track B (nociception-pain transduction, 122 genes), with 96 genes (58.2%) spanning both tracks. The substantial Track A/B overlap (58.2%) is biologically expected: transcription factors (FOS, JUN, STAT3) activated by inflammatory cytokines also drive nociceptive sensitization, MAP kinases transduce both inflammatory and pain signals, and prostaglandins (via COX-2/PTGS2) bridge immune activation and nociceptor sensitization [5,7]. Rather than indicating poor track separation, this overlap reflects the mechanistic reality that inflammation and pain are deeply coupled in RA. The dual-track framework serves as a conceptual lens for hypothesis generation: genes exclusive to Track A or B may represent intervention points where anti-inflammatory and analgesic effects can be partially decoupled, while dual-track hub genes represent convergence points where both processes are jointly regulated.</w:t>
-      </w:r>
-    </w:p>
-    <w:bookmarkEnd w:id="31"/>
-    <w:bookmarkStart w:id="32" w:name="coverage-gap-analysis-1"/>
+    <w:bookmarkStart w:id="30" w:name="coverage-gap-analysis-1"/>
     <w:p>
       <w:pPr>
         <w:pStyle w:val="Heading3"/>
@@ -2344,51 +2058,51 @@
         </w:tc>
       </w:tr>
     </w:tbl>
+    <w:bookmarkEnd w:id="30"/>
+    <w:bookmarkStart w:id="31" w:name="benchmark-validation"/>
+    <w:p>
+      <w:pPr>
+        <w:pStyle w:val="Heading3"/>
+      </w:pPr>
+      <w:r>
+        <w:t xml:space="preserve">3.3 Benchmark Validation</w:t>
+      </w:r>
+    </w:p>
+    <w:p>
+      <w:pPr>
+        <w:pStyle w:val="FirstParagraph"/>
+      </w:pPr>
+      <w:r>
+        <w:t xml:space="preserve">To establish transparent performance characteristics, we validated RA-PainKG in a perturbation prediction benchmark using the Norman K562 Perturb-seq dataset [20] (91,205 cells, 5,045 genes, 284 CRISPRi conditions). Gene embeddings were computed via spectral decomposition (k = 128) of the normalized graph Laplacian, and perturbation effects were predicted via ridge regression across 10 independent train/test splits (80%/20%). Full methods, results for all 11 KG variants, and sensitivity analyses are provided in Supplementary Tables S1-S6.</w:t>
+      </w:r>
+    </w:p>
+    <w:p>
+      <w:pPr>
+        <w:pStyle w:val="BodyText"/>
+      </w:pPr>
+      <w:r>
+        <w:t xml:space="preserve">Two findings are directly relevant to the resource. First, RA-PainKG is 280-fold sparser than GO (2,400 vs 673,899 PPI edges), with 68.3% of Norman genes having zero edges. Among the 44 pain genes present in the Norman dataset (26.7% of 165 annotated genes), 59.1% (26/44) exhibit mean expression below 0.01 in K562 cells, and mean pain-gene expression (0.117) is comparable to the genome-wide background (0.107). These data establish a clear boundary condition: K562 perturbation prediction performance reflects test system limitations, not resource quality (see Discussion 4.3).</w:t>
+      </w:r>
+    </w:p>
+    <w:p>
+      <w:pPr>
+        <w:pStyle w:val="BodyText"/>
+      </w:pPr>
+      <w:r>
+        <w:t xml:space="preserve">Second, the benchmark reveals a methodological consideration for KG evaluation: single-split evaluation produces artifacts. Under one split (seed 42), RA-PainKG appeared to outperform GO on pain genes (r = 0.558 vs 0.481), but the effect reversed under multi-split averaging (0.503 vs 0.542, Supplementary Table S5). This demonstrates the necessity of multi-split statistics for reliable KG evaluation.</w:t>
+      </w:r>
+    </w:p>
+    <w:p>
+      <w:pPr>
+        <w:pStyle w:val="BodyText"/>
+      </w:pPr>
+      <w:r>
+        <w:t xml:space="preserve">Complete benchmark results for all 11 KG variants, paired statistical comparisons, sensitivity analyses (alpha = 0.001-100.0, k = 32-512), Kendall’s W ranking consistency (0.64-0.65), and ablation analyses are documented in Supplementary Tables S1-S6.</w:t>
+      </w:r>
+    </w:p>
+    <w:bookmarkEnd w:id="31"/>
     <w:bookmarkEnd w:id="32"/>
-    <w:bookmarkStart w:id="33" w:name="benchmark-validation"/>
-    <w:p>
-      <w:pPr>
-        <w:pStyle w:val="Heading3"/>
-      </w:pPr>
-      <w:r>
-        <w:t xml:space="preserve">3.3 Benchmark Validation</w:t>
-      </w:r>
-    </w:p>
-    <w:p>
-      <w:pPr>
-        <w:pStyle w:val="FirstParagraph"/>
-      </w:pPr>
-      <w:r>
-        <w:t xml:space="preserve">To establish transparent performance characteristics, we validated RA-PainKG in a perturbation prediction benchmark using the Norman K562 Perturb-seq dataset [20] (91,205 cells, 5,045 genes, 284 CRISPRi conditions). Gene embeddings were computed via spectral decomposition (k = 128) of the normalized graph Laplacian, and perturbation effects were predicted via ridge regression across 10 independent train/test splits (80%/20%). Full methods, results for all 11 KG variants, and sensitivity analyses are provided in Supplementary Tables S1-S6.</w:t>
-      </w:r>
-    </w:p>
-    <w:p>
-      <w:pPr>
-        <w:pStyle w:val="BodyText"/>
-      </w:pPr>
-      <w:r>
-        <w:t xml:space="preserve">Two findings are directly relevant to the resource. First, RA-PainKG is 280-fold sparser than GO (2,400 vs 673,899 PPI edges), with 68.3% of Norman genes having zero edges. Among the 44 pain genes present in the Norman dataset (26.7% of 165 annotated genes), 59.1% (26/44) exhibit mean expression below 0.01 in K562 cells, and mean pain-gene expression (0.117) is comparable to the genome-wide background (0.107). These data establish a clear boundary condition: K562 perturbation prediction performance reflects test system limitations, not resource quality (see Discussion 4.3).</w:t>
-      </w:r>
-    </w:p>
-    <w:p>
-      <w:pPr>
-        <w:pStyle w:val="BodyText"/>
-      </w:pPr>
-      <w:r>
-        <w:t xml:space="preserve">Second, the benchmark reveals a methodological consideration for KG evaluation: single-split evaluation produces artifacts. Under one split (seed 42), RA-PainKG appeared to outperform GO on pain genes (r = 0.558 vs 0.481), but the effect reversed under multi-split averaging (0.503 vs 0.542, Supplementary Table S5). This demonstrates the necessity of multi-split statistics for reliable KG evaluation.</w:t>
-      </w:r>
-    </w:p>
-    <w:p>
-      <w:pPr>
-        <w:pStyle w:val="BodyText"/>
-      </w:pPr>
-      <w:r>
-        <w:t xml:space="preserve">Complete benchmark results for all 11 KG variants, paired statistical comparisons, sensitivity analyses (alpha = 0.001-100.0, k = 32-512), Kendall’s W ranking consistency (0.64-0.65), and ablation analyses are documented in Supplementary Tables S1-S6.</w:t>
-      </w:r>
-    </w:p>
-    <w:bookmarkEnd w:id="33"/>
-    <w:bookmarkEnd w:id="34"/>
-    <w:bookmarkStart w:id="41" w:name="discussion"/>
+    <w:bookmarkStart w:id="39" w:name="discussion"/>
     <w:p>
       <w:pPr>
         <w:pStyle w:val="Heading2"/>
@@ -2397,7 +2111,7 @@
         <w:t xml:space="preserve">4. Discussion</w:t>
       </w:r>
     </w:p>
-    <w:bookmarkStart w:id="35" w:name="ra-painkg-as-a-knowledge-resource"/>
+    <w:bookmarkStart w:id="33" w:name="ra-painkg-as-a-knowledge-resource"/>
     <w:p>
       <w:pPr>
         <w:pStyle w:val="Heading3"/>
@@ -3065,68 +2779,68 @@
         <w:t xml:space="preserve">RA-PainKG serves three primary use cases. First, as a queryable knowledge base: researchers can extract pathway subnetworks (all nine curated pain pathways), identify drugs targeting specific pain genes, and retrieve tissue expression profiles across 54 human tissues. Second, as a hypothesis-generation tool: the dual-track framework enables systematic comparison of inflammatory versus nociceptive mechanisms, and bridge genes (STAT3, RELA, NF-kappaB complex) connecting both tracks represent candidate intervention points. Third, as structured prior knowledge for machine learning: the graph provides domain-specific features for gene perturbation prediction, drug repurposing pipelines, and causal mediator identification. Transparent benchmark validation (Section 4.3) establishes the boundary conditions under which each use case applies.</w:t>
       </w:r>
     </w:p>
+    <w:bookmarkEnd w:id="33"/>
+    <w:bookmarkStart w:id="34" w:name="the-value-of-coverage-gap-documentation"/>
+    <w:p>
+      <w:pPr>
+        <w:pStyle w:val="Heading3"/>
+      </w:pPr>
+      <w:r>
+        <w:t xml:space="preserve">4.2 The Value of Coverage-Gap Documentation</w:t>
+      </w:r>
+    </w:p>
+    <w:p>
+      <w:pPr>
+        <w:pStyle w:val="FirstParagraph"/>
+      </w:pPr>
+      <w:r>
+        <w:t xml:space="preserve">The systematic identification of 72 absent genes (37.5% of the curated set) represents a resource contribution in its own right. Rather than silently omitting these genes, RA-PainKG documents exactly which genes are missing, why (identifier mismatch, annotation gaps in PrimeKG), and where researchers should look for alternative information (Supplementary Table S3). This transparency serves multiple purposes: (1) it prevents false-negative conclusions when querying RA-PainKG for specific genes; (2) it identifies systematic curation biases (complement cascade, anesthetic targets, GABA receptors are underrepresented across all general-purpose biomedical KGs); and (3) it provides a prioritized list for future resource development. This approach-a knowledge graph that explicitly documents what it does not contain-is uncommon in the biomedical database literature. While resources such as the IUPHAR/BPS Guide to Pharmacology [14] acknowledge incomplete coverage in narrative form, systematic per-gene gap documentation with categorized absence reasons is rarely implemented. We argue this practice represents a methodological contribution for transparent resource development.</w:t>
+      </w:r>
+    </w:p>
+    <w:bookmarkEnd w:id="34"/>
+    <w:bookmarkStart w:id="35" w:name="X5d4c2885636e0a62531c778a83e0fa67c2a5235"/>
+    <w:p>
+      <w:pPr>
+        <w:pStyle w:val="Heading3"/>
+      </w:pPr>
+      <w:r>
+        <w:t xml:space="preserve">4.3 Benchmark Validation and Boundary Conditions</w:t>
+      </w:r>
+    </w:p>
+    <w:p>
+      <w:pPr>
+        <w:pStyle w:val="FirstParagraph"/>
+      </w:pPr>
+      <w:r>
+        <w:t xml:space="preserve">Benchmark validation across 11 KG variants using the Norman K562 Perturb-seq dataset [20] provides transparent performance characterization (Supplementary Tables S4-S5). Two findings merit discussion.</w:t>
+      </w:r>
+    </w:p>
+    <w:p>
+      <w:pPr>
+        <w:pStyle w:val="BodyText"/>
+      </w:pPr>
+      <w:r>
+        <w:t xml:space="preserve">First, the validation establishes honest boundary conditions. We emphasize that K562 cells were selected not as a biologically appropriate test system for RA pain (they are not), but as the only publicly available genome-scale Perturb-seq dataset with sufficient coverage to run a controlled multi-split benchmark. The purpose of this validation is not to demonstrate biological utility-it is to characterize the resource’s predictive properties in a standardized setting and to establish transparent performance baselines against which future evaluations in disease-relevant models can be compared. K562 chronic myeloid leukemia cells are fundamentally mismatched to RA pain biology: 59.1% of measurable pain genes (26/44 overlapping) exhibit mean expression below 0.01 in K562 cells, and mean pain-gene expression (0.117) is comparable to the genome-wide background (0.107). Only 26.7% of RA-PainKG pain genes (44/165) are present in the Norman dataset. Consequently, perturbation prediction performance on K562 cells should not be interpreted as a measure of RA-PainKG’s biological validity-it reflects the test system’s limitations, not the resource’s quality.</w:t>
+      </w:r>
+    </w:p>
+    <w:p>
+      <w:pPr>
+        <w:pStyle w:val="BodyText"/>
+      </w:pPr>
+      <w:r>
+        <w:t xml:space="preserve">Second, the benchmark reveals a methodological consideration for KG evaluation: single-split evaluation produces artifacts. Under one split (seed 42), RA-PainKG appeared to outperform GO on pain genes (r = 0.558 vs 0.481), but the effect reversed under multi-split averaging (0.503 vs 0.542). This demonstrates the necessity of multi-split statistics for reliable KG evaluation-findings that apply to any domain-specific KG benchmark, not just RA-PainKG.</w:t>
+      </w:r>
+    </w:p>
+    <w:p>
+      <w:pPr>
+        <w:pStyle w:val="BodyText"/>
+      </w:pPr>
+      <w:r>
+        <w:t xml:space="preserve">We emphasize that the K562 benchmark cannot resolve whether domain KGs improve prediction in disease-relevant systems. Sensory neuron models (iPSC-derived nociceptors, DRG organoids) remain the essential next step for evaluating whether RA-PainKG’s domain-specific prior knowledge confers advantages in biologically appropriate contexts.</w:t>
+      </w:r>
+    </w:p>
     <w:bookmarkEnd w:id="35"/>
-    <w:bookmarkStart w:id="36" w:name="the-value-of-coverage-gap-documentation"/>
-    <w:p>
-      <w:pPr>
-        <w:pStyle w:val="Heading3"/>
-      </w:pPr>
-      <w:r>
-        <w:t xml:space="preserve">4.2 The Value of Coverage-Gap Documentation</w:t>
-      </w:r>
-    </w:p>
-    <w:p>
-      <w:pPr>
-        <w:pStyle w:val="FirstParagraph"/>
-      </w:pPr>
-      <w:r>
-        <w:t xml:space="preserve">The systematic identification of 72 absent genes (37.5% of the curated set) represents a resource contribution in its own right. Rather than silently omitting these genes, RA-PainKG documents exactly which genes are missing, why (identifier mismatch, annotation gaps in PrimeKG), and where researchers should look for alternative information (Supplementary Table S3). This transparency serves multiple purposes: (1) it prevents false-negative conclusions when querying RA-PainKG for specific genes; (2) it identifies systematic curation biases (complement cascade, anesthetic targets, GABA receptors are underrepresented across all general-purpose biomedical KGs); and (3) it provides a prioritized list for future resource development. This approach-a knowledge graph that explicitly documents what it does not contain-is uncommon in the biomedical database literature. While resources such as the IUPHAR/BPS Guide to Pharmacology [14] acknowledge incomplete coverage in narrative form, systematic per-gene gap documentation with categorized absence reasons is rarely implemented. We argue this practice represents a methodological contribution for transparent resource development.</w:t>
-      </w:r>
-    </w:p>
-    <w:bookmarkEnd w:id="36"/>
-    <w:bookmarkStart w:id="37" w:name="X5d4c2885636e0a62531c778a83e0fa67c2a5235"/>
-    <w:p>
-      <w:pPr>
-        <w:pStyle w:val="Heading3"/>
-      </w:pPr>
-      <w:r>
-        <w:t xml:space="preserve">4.3 Benchmark Validation and Boundary Conditions</w:t>
-      </w:r>
-    </w:p>
-    <w:p>
-      <w:pPr>
-        <w:pStyle w:val="FirstParagraph"/>
-      </w:pPr>
-      <w:r>
-        <w:t xml:space="preserve">Benchmark validation across 11 KG variants using the Norman K562 Perturb-seq dataset [20] provides transparent performance characterization (Supplementary Tables S4-S5). Two findings merit discussion.</w:t>
-      </w:r>
-    </w:p>
-    <w:p>
-      <w:pPr>
-        <w:pStyle w:val="BodyText"/>
-      </w:pPr>
-      <w:r>
-        <w:t xml:space="preserve">First, the validation establishes honest boundary conditions. We emphasize that K562 cells were selected not as a biologically appropriate test system for RA pain (they are not), but as the only publicly available genome-scale Perturb-seq dataset with sufficient coverage to run a controlled multi-split benchmark. The purpose of this validation is not to demonstrate biological utility-it is to characterize the resource’s predictive properties in a standardized setting and to establish transparent performance baselines against which future evaluations in disease-relevant models can be compared. K562 chronic myeloid leukemia cells are fundamentally mismatched to RA pain biology: 59.1% of measurable pain genes (26/44 overlapping) exhibit mean expression below 0.01 in K562 cells, and mean pain-gene expression (0.117) is comparable to the genome-wide background (0.107). Only 26.7% of RA-PainKG pain genes (44/165) are present in the Norman dataset. Consequently, perturbation prediction performance on K562 cells should not be interpreted as a measure of RA-PainKG’s biological validity-it reflects the test system’s limitations, not the resource’s quality.</w:t>
-      </w:r>
-    </w:p>
-    <w:p>
-      <w:pPr>
-        <w:pStyle w:val="BodyText"/>
-      </w:pPr>
-      <w:r>
-        <w:t xml:space="preserve">Second, the benchmark reveals a methodological consideration for KG evaluation: single-split evaluation produces artifacts. Under one split (seed 42), RA-PainKG appeared to outperform GO on pain genes (r = 0.558 vs 0.481), but the effect reversed under multi-split averaging (0.503 vs 0.542). This demonstrates the necessity of multi-split statistics for reliable KG evaluation-findings that apply to any domain-specific KG benchmark, not just RA-PainKG.</w:t>
-      </w:r>
-    </w:p>
-    <w:p>
-      <w:pPr>
-        <w:pStyle w:val="BodyText"/>
-      </w:pPr>
-      <w:r>
-        <w:t xml:space="preserve">We emphasize that the K562 benchmark cannot resolve whether domain KGs improve prediction in disease-relevant systems. Sensory neuron models (iPSC-derived nociceptors, DRG organoids) remain the essential next step for evaluating whether RA-PainKG’s domain-specific prior knowledge confers advantages in biologically appropriate contexts.</w:t>
-      </w:r>
-    </w:p>
-    <w:bookmarkEnd w:id="37"/>
-    <w:bookmarkStart w:id="38" w:name="limitations"/>
+    <w:bookmarkStart w:id="36" w:name="limitations"/>
     <w:p>
       <w:pPr>
         <w:pStyle w:val="Heading3"/>
@@ -3207,8 +2921,8 @@
         <w:t xml:space="preserve">PrimeKG node IDs are internal integers. Cross-referencing with standard identifiers (HGNC, Ensembl) requires the original prime_kg.csv file, which is available from the PrimeKG repository.</w:t>
       </w:r>
     </w:p>
-    <w:bookmarkEnd w:id="38"/>
-    <w:bookmarkStart w:id="39" w:name="updates-and-community-contributions"/>
+    <w:bookmarkEnd w:id="36"/>
+    <w:bookmarkStart w:id="37" w:name="updates-and-community-contributions"/>
     <w:p>
       <w:pPr>
         <w:pStyle w:val="Heading3"/>
@@ -3225,8 +2939,8 @@
         <w:t xml:space="preserve">RA-PainKG will be updated with each major PrimeKG release. Community contributions of additional pain pathway annotations, drug-target relationships, and tissue expression data are welcome via the GitHub repository. The modular construction pipeline enables systematic re-generation with updated input resources.</w:t>
       </w:r>
     </w:p>
-    <w:bookmarkEnd w:id="39"/>
-    <w:bookmarkStart w:id="40" w:name="conclusion"/>
+    <w:bookmarkEnd w:id="37"/>
+    <w:bookmarkStart w:id="38" w:name="conclusion"/>
     <w:p>
       <w:pPr>
         <w:pStyle w:val="Heading3"/>
@@ -3258,9 +2972,9 @@
         </w:pict>
       </w:r>
     </w:p>
-    <w:bookmarkEnd w:id="40"/>
-    <w:bookmarkEnd w:id="41"/>
-    <w:bookmarkStart w:id="47" w:name="usage-examples"/>
+    <w:bookmarkEnd w:id="38"/>
+    <w:bookmarkEnd w:id="39"/>
+    <w:bookmarkStart w:id="45" w:name="usage-examples"/>
     <w:p>
       <w:pPr>
         <w:pStyle w:val="Heading2"/>
@@ -3312,7 +3026,7 @@
       <w:r>
         <w:t xml:space="preserve"> </w:t>
       </w:r>
-      <w:hyperlink r:id="rId42">
+      <w:hyperlink r:id="rId40">
         <w:r>
           <w:rPr>
             <w:rStyle w:val="Hyperlink"/>
@@ -3523,7 +3237,7 @@
         <w:t xml:space="preserve">.</w:t>
       </w:r>
     </w:p>
-    <w:bookmarkStart w:id="43" w:name="querying-drug-target-relationships"/>
+    <w:bookmarkStart w:id="41" w:name="querying-drug-target-relationships"/>
     <w:p>
       <w:pPr>
         <w:pStyle w:val="Heading3"/>
@@ -3846,728 +3560,728 @@
         <w:t xml:space="preserve"># Example output: [("Celecoxib", "inhibits"), ("Aspirin", "inhibits"), ...]</w:t>
       </w:r>
     </w:p>
+    <w:bookmarkEnd w:id="41"/>
+    <w:bookmarkStart w:id="42" w:name="extracting-pathway-subnetworks"/>
+    <w:p>
+      <w:pPr>
+        <w:pStyle w:val="Heading3"/>
+      </w:pPr>
+      <w:r>
+        <w:t xml:space="preserve">5.2 Extracting Pathway Subnetworks</w:t>
+      </w:r>
+    </w:p>
+    <w:p>
+      <w:pPr>
+        <w:pStyle w:val="SourceCode"/>
+      </w:pPr>
+      <w:r>
+        <w:rPr>
+          <w:rStyle w:val="CommentTok"/>
+        </w:rPr>
+        <w:t xml:space="preserve"># Extract the opioid signaling subnetwork</w:t>
+      </w:r>
+      <w:r>
+        <w:br/>
+      </w:r>
+      <w:r>
+        <w:rPr>
+          <w:rStyle w:val="NormalTok"/>
+        </w:rPr>
+        <w:t xml:space="preserve">opioid_genes </w:t>
+      </w:r>
+      <w:r>
+        <w:rPr>
+          <w:rStyle w:val="OperatorTok"/>
+        </w:rPr>
+        <w:t xml:space="preserve">=</w:t>
+      </w:r>
+      <w:r>
+        <w:rPr>
+          <w:rStyle w:val="NormalTok"/>
+        </w:rPr>
+        <w:t xml:space="preserve"> {</w:t>
+      </w:r>
+      <w:r>
+        <w:rPr>
+          <w:rStyle w:val="StringTok"/>
+        </w:rPr>
+        <w:t xml:space="preserve">"OPRM1"</w:t>
+      </w:r>
+      <w:r>
+        <w:rPr>
+          <w:rStyle w:val="NormalTok"/>
+        </w:rPr>
+        <w:t xml:space="preserve">, </w:t>
+      </w:r>
+      <w:r>
+        <w:rPr>
+          <w:rStyle w:val="StringTok"/>
+        </w:rPr>
+        <w:t xml:space="preserve">"OPRD1"</w:t>
+      </w:r>
+      <w:r>
+        <w:rPr>
+          <w:rStyle w:val="NormalTok"/>
+        </w:rPr>
+        <w:t xml:space="preserve">, </w:t>
+      </w:r>
+      <w:r>
+        <w:rPr>
+          <w:rStyle w:val="StringTok"/>
+        </w:rPr>
+        <w:t xml:space="preserve">"OPRK1"</w:t>
+      </w:r>
+      <w:r>
+        <w:rPr>
+          <w:rStyle w:val="NormalTok"/>
+        </w:rPr>
+        <w:t xml:space="preserve">, </w:t>
+      </w:r>
+      <w:r>
+        <w:rPr>
+          <w:rStyle w:val="StringTok"/>
+        </w:rPr>
+        <w:t xml:space="preserve">"POMC"</w:t>
+      </w:r>
+      <w:r>
+        <w:rPr>
+          <w:rStyle w:val="NormalTok"/>
+        </w:rPr>
+        <w:t xml:space="preserve">, </w:t>
+      </w:r>
+      <w:r>
+        <w:rPr>
+          <w:rStyle w:val="StringTok"/>
+        </w:rPr>
+        <w:t xml:space="preserve">"PENK"</w:t>
+      </w:r>
+      <w:r>
+        <w:rPr>
+          <w:rStyle w:val="NormalTok"/>
+        </w:rPr>
+        <w:t xml:space="preserve">, </w:t>
+      </w:r>
+      <w:r>
+        <w:rPr>
+          <w:rStyle w:val="StringTok"/>
+        </w:rPr>
+        <w:t xml:space="preserve">"PDYN"</w:t>
+      </w:r>
+      <w:r>
+        <w:rPr>
+          <w:rStyle w:val="NormalTok"/>
+        </w:rPr>
+        <w:t xml:space="preserve">}</w:t>
+      </w:r>
+      <w:r>
+        <w:br/>
+      </w:r>
+      <w:r>
+        <w:rPr>
+          <w:rStyle w:val="NormalTok"/>
+        </w:rPr>
+        <w:t xml:space="preserve">opioid_nodes </w:t>
+      </w:r>
+      <w:r>
+        <w:rPr>
+          <w:rStyle w:val="OperatorTok"/>
+        </w:rPr>
+        <w:t xml:space="preserve">=</w:t>
+      </w:r>
+      <w:r>
+        <w:rPr>
+          <w:rStyle w:val="NormalTok"/>
+        </w:rPr>
+        <w:t xml:space="preserve"> {n </w:t>
+      </w:r>
+      <w:r>
+        <w:rPr>
+          <w:rStyle w:val="ControlFlowTok"/>
+        </w:rPr>
+        <w:t xml:space="preserve">for</w:t>
+      </w:r>
+      <w:r>
+        <w:rPr>
+          <w:rStyle w:val="NormalTok"/>
+        </w:rPr>
+        <w:t xml:space="preserve"> n, d </w:t>
+      </w:r>
+      <w:r>
+        <w:rPr>
+          <w:rStyle w:val="KeywordTok"/>
+        </w:rPr>
+        <w:t xml:space="preserve">in</w:t>
+      </w:r>
+      <w:r>
+        <w:rPr>
+          <w:rStyle w:val="NormalTok"/>
+        </w:rPr>
+        <w:t xml:space="preserve"> G.nodes(data</w:t>
+      </w:r>
+      <w:r>
+        <w:rPr>
+          <w:rStyle w:val="OperatorTok"/>
+        </w:rPr>
+        <w:t xml:space="preserve">=</w:t>
+      </w:r>
+      <w:r>
+        <w:rPr>
+          <w:rStyle w:val="VariableTok"/>
+        </w:rPr>
+        <w:t xml:space="preserve">True</w:t>
+      </w:r>
+      <w:r>
+        <w:rPr>
+          <w:rStyle w:val="NormalTok"/>
+        </w:rPr>
+        <w:t xml:space="preserve">)</w:t>
+      </w:r>
+      <w:r>
+        <w:br/>
+      </w:r>
+      <w:r>
+        <w:rPr>
+          <w:rStyle w:val="NormalTok"/>
+        </w:rPr>
+        <w:t xml:space="preserve">                </w:t>
+      </w:r>
+      <w:r>
+        <w:rPr>
+          <w:rStyle w:val="ControlFlowTok"/>
+        </w:rPr>
+        <w:t xml:space="preserve">if</w:t>
+      </w:r>
+      <w:r>
+        <w:rPr>
+          <w:rStyle w:val="NormalTok"/>
+        </w:rPr>
+        <w:t xml:space="preserve"> </w:t>
+      </w:r>
+      <w:r>
+        <w:rPr>
+          <w:rStyle w:val="BuiltInTok"/>
+        </w:rPr>
+        <w:t xml:space="preserve">str</w:t>
+      </w:r>
+      <w:r>
+        <w:rPr>
+          <w:rStyle w:val="NormalTok"/>
+        </w:rPr>
+        <w:t xml:space="preserve">(d.get(</w:t>
+      </w:r>
+      <w:r>
+        <w:rPr>
+          <w:rStyle w:val="StringTok"/>
+        </w:rPr>
+        <w:t xml:space="preserve">"node_name"</w:t>
+      </w:r>
+      <w:r>
+        <w:rPr>
+          <w:rStyle w:val="NormalTok"/>
+        </w:rPr>
+        <w:t xml:space="preserve">, </w:t>
+      </w:r>
+      <w:r>
+        <w:rPr>
+          <w:rStyle w:val="StringTok"/>
+        </w:rPr>
+        <w:t xml:space="preserve">""</w:t>
+      </w:r>
+      <w:r>
+        <w:rPr>
+          <w:rStyle w:val="NormalTok"/>
+        </w:rPr>
+        <w:t xml:space="preserve">)).upper() </w:t>
+      </w:r>
+      <w:r>
+        <w:rPr>
+          <w:rStyle w:val="KeywordTok"/>
+        </w:rPr>
+        <w:t xml:space="preserve">in</w:t>
+      </w:r>
+      <w:r>
+        <w:rPr>
+          <w:rStyle w:val="NormalTok"/>
+        </w:rPr>
+        <w:t xml:space="preserve"> opioid_genes}</w:t>
+      </w:r>
+      <w:r>
+        <w:br/>
+      </w:r>
+      <w:r>
+        <w:rPr>
+          <w:rStyle w:val="NormalTok"/>
+        </w:rPr>
+        <w:t xml:space="preserve">subgraph </w:t>
+      </w:r>
+      <w:r>
+        <w:rPr>
+          <w:rStyle w:val="OperatorTok"/>
+        </w:rPr>
+        <w:t xml:space="preserve">=</w:t>
+      </w:r>
+      <w:r>
+        <w:rPr>
+          <w:rStyle w:val="NormalTok"/>
+        </w:rPr>
+        <w:t xml:space="preserve"> G.subgraph(opioid_nodes)</w:t>
+      </w:r>
+      <w:r>
+        <w:br/>
+      </w:r>
+      <w:r>
+        <w:rPr>
+          <w:rStyle w:val="NormalTok"/>
+        </w:rPr>
+        <w:t xml:space="preserve">nx.write_graphml(subgraph, </w:t>
+      </w:r>
+      <w:r>
+        <w:rPr>
+          <w:rStyle w:val="StringTok"/>
+        </w:rPr>
+        <w:t xml:space="preserve">"opioid_pathway.graphml"</w:t>
+      </w:r>
+      <w:r>
+        <w:rPr>
+          <w:rStyle w:val="NormalTok"/>
+        </w:rPr>
+        <w:t xml:space="preserve">)</w:t>
+      </w:r>
+    </w:p>
+    <w:bookmarkEnd w:id="42"/>
+    <w:bookmarkStart w:id="43" w:name="tissue-expression-profile-retrieval"/>
+    <w:p>
+      <w:pPr>
+        <w:pStyle w:val="Heading3"/>
+      </w:pPr>
+      <w:r>
+        <w:t xml:space="preserve">5.3 Tissue Expression Profile Retrieval</w:t>
+      </w:r>
+    </w:p>
+    <w:p>
+      <w:pPr>
+        <w:pStyle w:val="SourceCode"/>
+      </w:pPr>
+      <w:r>
+        <w:rPr>
+          <w:rStyle w:val="CommentTok"/>
+        </w:rPr>
+        <w:t xml:space="preserve"># Retrieve GTEx tissue expression for all Track B pain genes</w:t>
+      </w:r>
+      <w:r>
+        <w:br/>
+      </w:r>
+      <w:r>
+        <w:rPr>
+          <w:rStyle w:val="ControlFlowTok"/>
+        </w:rPr>
+        <w:t xml:space="preserve">for</w:t>
+      </w:r>
+      <w:r>
+        <w:rPr>
+          <w:rStyle w:val="NormalTok"/>
+        </w:rPr>
+        <w:t xml:space="preserve"> node, data </w:t>
+      </w:r>
+      <w:r>
+        <w:rPr>
+          <w:rStyle w:val="KeywordTok"/>
+        </w:rPr>
+        <w:t xml:space="preserve">in</w:t>
+      </w:r>
+      <w:r>
+        <w:rPr>
+          <w:rStyle w:val="NormalTok"/>
+        </w:rPr>
+        <w:t xml:space="preserve"> G.nodes(data</w:t>
+      </w:r>
+      <w:r>
+        <w:rPr>
+          <w:rStyle w:val="OperatorTok"/>
+        </w:rPr>
+        <w:t xml:space="preserve">=</w:t>
+      </w:r>
+      <w:r>
+        <w:rPr>
+          <w:rStyle w:val="VariableTok"/>
+        </w:rPr>
+        <w:t xml:space="preserve">True</w:t>
+      </w:r>
+      <w:r>
+        <w:rPr>
+          <w:rStyle w:val="NormalTok"/>
+        </w:rPr>
+        <w:t xml:space="preserve">):</w:t>
+      </w:r>
+      <w:r>
+        <w:br/>
+      </w:r>
+      <w:r>
+        <w:rPr>
+          <w:rStyle w:val="NormalTok"/>
+        </w:rPr>
+        <w:t xml:space="preserve">    </w:t>
+      </w:r>
+      <w:r>
+        <w:rPr>
+          <w:rStyle w:val="ControlFlowTok"/>
+        </w:rPr>
+        <w:t xml:space="preserve">if</w:t>
+      </w:r>
+      <w:r>
+        <w:rPr>
+          <w:rStyle w:val="NormalTok"/>
+        </w:rPr>
+        <w:t xml:space="preserve"> data.get(</w:t>
+      </w:r>
+      <w:r>
+        <w:rPr>
+          <w:rStyle w:val="StringTok"/>
+        </w:rPr>
+        <w:t xml:space="preserve">"track"</w:t>
+      </w:r>
+      <w:r>
+        <w:rPr>
+          <w:rStyle w:val="NormalTok"/>
+        </w:rPr>
+        <w:t xml:space="preserve">) </w:t>
+      </w:r>
+      <w:r>
+        <w:rPr>
+          <w:rStyle w:val="OperatorTok"/>
+        </w:rPr>
+        <w:t xml:space="preserve">==</w:t>
+      </w:r>
+      <w:r>
+        <w:rPr>
+          <w:rStyle w:val="NormalTok"/>
+        </w:rPr>
+        <w:t xml:space="preserve"> </w:t>
+      </w:r>
+      <w:r>
+        <w:rPr>
+          <w:rStyle w:val="StringTok"/>
+        </w:rPr>
+        <w:t xml:space="preserve">"B"</w:t>
+      </w:r>
+      <w:r>
+        <w:rPr>
+          <w:rStyle w:val="NormalTok"/>
+        </w:rPr>
+        <w:t xml:space="preserve"> </w:t>
+      </w:r>
+      <w:r>
+        <w:rPr>
+          <w:rStyle w:val="KeywordTok"/>
+        </w:rPr>
+        <w:t xml:space="preserve">and</w:t>
+      </w:r>
+      <w:r>
+        <w:rPr>
+          <w:rStyle w:val="NormalTok"/>
+        </w:rPr>
+        <w:t xml:space="preserve"> data.get(</w:t>
+      </w:r>
+      <w:r>
+        <w:rPr>
+          <w:rStyle w:val="StringTok"/>
+        </w:rPr>
+        <w:t xml:space="preserve">"node_type"</w:t>
+      </w:r>
+      <w:r>
+        <w:rPr>
+          <w:rStyle w:val="NormalTok"/>
+        </w:rPr>
+        <w:t xml:space="preserve">) </w:t>
+      </w:r>
+      <w:r>
+        <w:rPr>
+          <w:rStyle w:val="OperatorTok"/>
+        </w:rPr>
+        <w:t xml:space="preserve">==</w:t>
+      </w:r>
+      <w:r>
+        <w:rPr>
+          <w:rStyle w:val="NormalTok"/>
+        </w:rPr>
+        <w:t xml:space="preserve"> </w:t>
+      </w:r>
+      <w:r>
+        <w:rPr>
+          <w:rStyle w:val="StringTok"/>
+        </w:rPr>
+        <w:t xml:space="preserve">"gene/protein"</w:t>
+      </w:r>
+      <w:r>
+        <w:rPr>
+          <w:rStyle w:val="NormalTok"/>
+        </w:rPr>
+        <w:t xml:space="preserve">:</w:t>
+      </w:r>
+      <w:r>
+        <w:br/>
+      </w:r>
+      <w:r>
+        <w:rPr>
+          <w:rStyle w:val="NormalTok"/>
+        </w:rPr>
+        <w:t xml:space="preserve">        gene </w:t>
+      </w:r>
+      <w:r>
+        <w:rPr>
+          <w:rStyle w:val="OperatorTok"/>
+        </w:rPr>
+        <w:t xml:space="preserve">=</w:t>
+      </w:r>
+      <w:r>
+        <w:rPr>
+          <w:rStyle w:val="NormalTok"/>
+        </w:rPr>
+        <w:t xml:space="preserve"> data[</w:t>
+      </w:r>
+      <w:r>
+        <w:rPr>
+          <w:rStyle w:val="StringTok"/>
+        </w:rPr>
+        <w:t xml:space="preserve">"node_name"</w:t>
+      </w:r>
+      <w:r>
+        <w:rPr>
+          <w:rStyle w:val="NormalTok"/>
+        </w:rPr>
+        <w:t xml:space="preserve">]</w:t>
+      </w:r>
+      <w:r>
+        <w:br/>
+      </w:r>
+      <w:r>
+        <w:rPr>
+          <w:rStyle w:val="NormalTok"/>
+        </w:rPr>
+        <w:t xml:space="preserve">        expr </w:t>
+      </w:r>
+      <w:r>
+        <w:rPr>
+          <w:rStyle w:val="OperatorTok"/>
+        </w:rPr>
+        <w:t xml:space="preserve">=</w:t>
+      </w:r>
+      <w:r>
+        <w:rPr>
+          <w:rStyle w:val="NormalTok"/>
+        </w:rPr>
+        <w:t xml:space="preserve"> data.get(</w:t>
+      </w:r>
+      <w:r>
+        <w:rPr>
+          <w:rStyle w:val="StringTok"/>
+        </w:rPr>
+        <w:t xml:space="preserve">"gtex_median_tpm"</w:t>
+      </w:r>
+      <w:r>
+        <w:rPr>
+          <w:rStyle w:val="NormalTok"/>
+        </w:rPr>
+        <w:t xml:space="preserve">, {})</w:t>
+      </w:r>
+      <w:r>
+        <w:br/>
+      </w:r>
+      <w:r>
+        <w:rPr>
+          <w:rStyle w:val="NormalTok"/>
+        </w:rPr>
+        <w:t xml:space="preserve">        spinal </w:t>
+      </w:r>
+      <w:r>
+        <w:rPr>
+          <w:rStyle w:val="OperatorTok"/>
+        </w:rPr>
+        <w:t xml:space="preserve">=</w:t>
+      </w:r>
+      <w:r>
+        <w:rPr>
+          <w:rStyle w:val="NormalTok"/>
+        </w:rPr>
+        <w:t xml:space="preserve"> expr.get(</w:t>
+      </w:r>
+      <w:r>
+        <w:rPr>
+          <w:rStyle w:val="StringTok"/>
+        </w:rPr>
+        <w:t xml:space="preserve">"Spinal_Cord_cervical_c-1"</w:t>
+      </w:r>
+      <w:r>
+        <w:rPr>
+          <w:rStyle w:val="NormalTok"/>
+        </w:rPr>
+        <w:t xml:space="preserve">, </w:t>
+      </w:r>
+      <w:r>
+        <w:rPr>
+          <w:rStyle w:val="StringTok"/>
+        </w:rPr>
+        <w:t xml:space="preserve">"N/A"</w:t>
+      </w:r>
+      <w:r>
+        <w:rPr>
+          <w:rStyle w:val="NormalTok"/>
+        </w:rPr>
+        <w:t xml:space="preserve">)</w:t>
+      </w:r>
+      <w:r>
+        <w:br/>
+      </w:r>
+      <w:r>
+        <w:rPr>
+          <w:rStyle w:val="NormalTok"/>
+        </w:rPr>
+        <w:t xml:space="preserve">        tibial </w:t>
+      </w:r>
+      <w:r>
+        <w:rPr>
+          <w:rStyle w:val="OperatorTok"/>
+        </w:rPr>
+        <w:t xml:space="preserve">=</w:t>
+      </w:r>
+      <w:r>
+        <w:rPr>
+          <w:rStyle w:val="NormalTok"/>
+        </w:rPr>
+        <w:t xml:space="preserve"> expr.get(</w:t>
+      </w:r>
+      <w:r>
+        <w:rPr>
+          <w:rStyle w:val="StringTok"/>
+        </w:rPr>
+        <w:t xml:space="preserve">"Nerve_Tibial"</w:t>
+      </w:r>
+      <w:r>
+        <w:rPr>
+          <w:rStyle w:val="NormalTok"/>
+        </w:rPr>
+        <w:t xml:space="preserve">, </w:t>
+      </w:r>
+      <w:r>
+        <w:rPr>
+          <w:rStyle w:val="StringTok"/>
+        </w:rPr>
+        <w:t xml:space="preserve">"N/A"</w:t>
+      </w:r>
+      <w:r>
+        <w:rPr>
+          <w:rStyle w:val="NormalTok"/>
+        </w:rPr>
+        <w:t xml:space="preserve">)</w:t>
+      </w:r>
+      <w:r>
+        <w:br/>
+      </w:r>
+      <w:r>
+        <w:rPr>
+          <w:rStyle w:val="NormalTok"/>
+        </w:rPr>
+        <w:t xml:space="preserve">        </w:t>
+      </w:r>
+      <w:r>
+        <w:rPr>
+          <w:rStyle w:val="BuiltInTok"/>
+        </w:rPr>
+        <w:t xml:space="preserve">print</w:t>
+      </w:r>
+      <w:r>
+        <w:rPr>
+          <w:rStyle w:val="NormalTok"/>
+        </w:rPr>
+        <w:t xml:space="preserve">(</w:t>
+      </w:r>
+      <w:r>
+        <w:rPr>
+          <w:rStyle w:val="SpecialStringTok"/>
+        </w:rPr>
+        <w:t xml:space="preserve">f"</w:t>
+      </w:r>
+      <w:r>
+        <w:rPr>
+          <w:rStyle w:val="SpecialCharTok"/>
+        </w:rPr>
+        <w:t xml:space="preserve">{</w:t>
+      </w:r>
+      <w:r>
+        <w:rPr>
+          <w:rStyle w:val="NormalTok"/>
+        </w:rPr>
+        <w:t xml:space="preserve">gene</w:t>
+      </w:r>
+      <w:r>
+        <w:rPr>
+          <w:rStyle w:val="SpecialCharTok"/>
+        </w:rPr>
+        <w:t xml:space="preserve">}</w:t>
+      </w:r>
+      <w:r>
+        <w:rPr>
+          <w:rStyle w:val="SpecialStringTok"/>
+        </w:rPr>
+        <w:t xml:space="preserve">: Spinal=</w:t>
+      </w:r>
+      <w:r>
+        <w:rPr>
+          <w:rStyle w:val="SpecialCharTok"/>
+        </w:rPr>
+        <w:t xml:space="preserve">{</w:t>
+      </w:r>
+      <w:r>
+        <w:rPr>
+          <w:rStyle w:val="NormalTok"/>
+        </w:rPr>
+        <w:t xml:space="preserve">spinal</w:t>
+      </w:r>
+      <w:r>
+        <w:rPr>
+          <w:rStyle w:val="SpecialCharTok"/>
+        </w:rPr>
+        <w:t xml:space="preserve">}</w:t>
+      </w:r>
+      <w:r>
+        <w:rPr>
+          <w:rStyle w:val="SpecialStringTok"/>
+        </w:rPr>
+        <w:t xml:space="preserve">, Tibial=</w:t>
+      </w:r>
+      <w:r>
+        <w:rPr>
+          <w:rStyle w:val="SpecialCharTok"/>
+        </w:rPr>
+        <w:t xml:space="preserve">{</w:t>
+      </w:r>
+      <w:r>
+        <w:rPr>
+          <w:rStyle w:val="NormalTok"/>
+        </w:rPr>
+        <w:t xml:space="preserve">tibial</w:t>
+      </w:r>
+      <w:r>
+        <w:rPr>
+          <w:rStyle w:val="SpecialCharTok"/>
+        </w:rPr>
+        <w:t xml:space="preserve">}</w:t>
+      </w:r>
+      <w:r>
+        <w:rPr>
+          <w:rStyle w:val="SpecialStringTok"/>
+        </w:rPr>
+        <w:t xml:space="preserve">"</w:t>
+      </w:r>
+      <w:r>
+        <w:rPr>
+          <w:rStyle w:val="NormalTok"/>
+        </w:rPr>
+        <w:t xml:space="preserve">)</w:t>
+      </w:r>
+    </w:p>
     <w:bookmarkEnd w:id="43"/>
-    <w:bookmarkStart w:id="44" w:name="extracting-pathway-subnetworks"/>
-    <w:p>
-      <w:pPr>
-        <w:pStyle w:val="Heading3"/>
-      </w:pPr>
-      <w:r>
-        <w:t xml:space="preserve">5.2 Extracting Pathway Subnetworks</w:t>
-      </w:r>
-    </w:p>
-    <w:p>
-      <w:pPr>
-        <w:pStyle w:val="SourceCode"/>
-      </w:pPr>
-      <w:r>
-        <w:rPr>
-          <w:rStyle w:val="CommentTok"/>
-        </w:rPr>
-        <w:t xml:space="preserve"># Extract the opioid signaling subnetwork</w:t>
-      </w:r>
-      <w:r>
-        <w:br/>
-      </w:r>
-      <w:r>
-        <w:rPr>
-          <w:rStyle w:val="NormalTok"/>
-        </w:rPr>
-        <w:t xml:space="preserve">opioid_genes </w:t>
-      </w:r>
-      <w:r>
-        <w:rPr>
-          <w:rStyle w:val="OperatorTok"/>
-        </w:rPr>
-        <w:t xml:space="preserve">=</w:t>
-      </w:r>
-      <w:r>
-        <w:rPr>
-          <w:rStyle w:val="NormalTok"/>
-        </w:rPr>
-        <w:t xml:space="preserve"> {</w:t>
-      </w:r>
-      <w:r>
-        <w:rPr>
-          <w:rStyle w:val="StringTok"/>
-        </w:rPr>
-        <w:t xml:space="preserve">"OPRM1"</w:t>
-      </w:r>
-      <w:r>
-        <w:rPr>
-          <w:rStyle w:val="NormalTok"/>
-        </w:rPr>
-        <w:t xml:space="preserve">, </w:t>
-      </w:r>
-      <w:r>
-        <w:rPr>
-          <w:rStyle w:val="StringTok"/>
-        </w:rPr>
-        <w:t xml:space="preserve">"OPRD1"</w:t>
-      </w:r>
-      <w:r>
-        <w:rPr>
-          <w:rStyle w:val="NormalTok"/>
-        </w:rPr>
-        <w:t xml:space="preserve">, </w:t>
-      </w:r>
-      <w:r>
-        <w:rPr>
-          <w:rStyle w:val="StringTok"/>
-        </w:rPr>
-        <w:t xml:space="preserve">"OPRK1"</w:t>
-      </w:r>
-      <w:r>
-        <w:rPr>
-          <w:rStyle w:val="NormalTok"/>
-        </w:rPr>
-        <w:t xml:space="preserve">, </w:t>
-      </w:r>
-      <w:r>
-        <w:rPr>
-          <w:rStyle w:val="StringTok"/>
-        </w:rPr>
-        <w:t xml:space="preserve">"POMC"</w:t>
-      </w:r>
-      <w:r>
-        <w:rPr>
-          <w:rStyle w:val="NormalTok"/>
-        </w:rPr>
-        <w:t xml:space="preserve">, </w:t>
-      </w:r>
-      <w:r>
-        <w:rPr>
-          <w:rStyle w:val="StringTok"/>
-        </w:rPr>
-        <w:t xml:space="preserve">"PENK"</w:t>
-      </w:r>
-      <w:r>
-        <w:rPr>
-          <w:rStyle w:val="NormalTok"/>
-        </w:rPr>
-        <w:t xml:space="preserve">, </w:t>
-      </w:r>
-      <w:r>
-        <w:rPr>
-          <w:rStyle w:val="StringTok"/>
-        </w:rPr>
-        <w:t xml:space="preserve">"PDYN"</w:t>
-      </w:r>
-      <w:r>
-        <w:rPr>
-          <w:rStyle w:val="NormalTok"/>
-        </w:rPr>
-        <w:t xml:space="preserve">}</w:t>
-      </w:r>
-      <w:r>
-        <w:br/>
-      </w:r>
-      <w:r>
-        <w:rPr>
-          <w:rStyle w:val="NormalTok"/>
-        </w:rPr>
-        <w:t xml:space="preserve">opioid_nodes </w:t>
-      </w:r>
-      <w:r>
-        <w:rPr>
-          <w:rStyle w:val="OperatorTok"/>
-        </w:rPr>
-        <w:t xml:space="preserve">=</w:t>
-      </w:r>
-      <w:r>
-        <w:rPr>
-          <w:rStyle w:val="NormalTok"/>
-        </w:rPr>
-        <w:t xml:space="preserve"> {n </w:t>
-      </w:r>
-      <w:r>
-        <w:rPr>
-          <w:rStyle w:val="ControlFlowTok"/>
-        </w:rPr>
-        <w:t xml:space="preserve">for</w:t>
-      </w:r>
-      <w:r>
-        <w:rPr>
-          <w:rStyle w:val="NormalTok"/>
-        </w:rPr>
-        <w:t xml:space="preserve"> n, d </w:t>
-      </w:r>
-      <w:r>
-        <w:rPr>
-          <w:rStyle w:val="KeywordTok"/>
-        </w:rPr>
-        <w:t xml:space="preserve">in</w:t>
-      </w:r>
-      <w:r>
-        <w:rPr>
-          <w:rStyle w:val="NormalTok"/>
-        </w:rPr>
-        <w:t xml:space="preserve"> G.nodes(data</w:t>
-      </w:r>
-      <w:r>
-        <w:rPr>
-          <w:rStyle w:val="OperatorTok"/>
-        </w:rPr>
-        <w:t xml:space="preserve">=</w:t>
-      </w:r>
-      <w:r>
-        <w:rPr>
-          <w:rStyle w:val="VariableTok"/>
-        </w:rPr>
-        <w:t xml:space="preserve">True</w:t>
-      </w:r>
-      <w:r>
-        <w:rPr>
-          <w:rStyle w:val="NormalTok"/>
-        </w:rPr>
-        <w:t xml:space="preserve">)</w:t>
-      </w:r>
-      <w:r>
-        <w:br/>
-      </w:r>
-      <w:r>
-        <w:rPr>
-          <w:rStyle w:val="NormalTok"/>
-        </w:rPr>
-        <w:t xml:space="preserve">                </w:t>
-      </w:r>
-      <w:r>
-        <w:rPr>
-          <w:rStyle w:val="ControlFlowTok"/>
-        </w:rPr>
-        <w:t xml:space="preserve">if</w:t>
-      </w:r>
-      <w:r>
-        <w:rPr>
-          <w:rStyle w:val="NormalTok"/>
-        </w:rPr>
-        <w:t xml:space="preserve"> </w:t>
-      </w:r>
-      <w:r>
-        <w:rPr>
-          <w:rStyle w:val="BuiltInTok"/>
-        </w:rPr>
-        <w:t xml:space="preserve">str</w:t>
-      </w:r>
-      <w:r>
-        <w:rPr>
-          <w:rStyle w:val="NormalTok"/>
-        </w:rPr>
-        <w:t xml:space="preserve">(d.get(</w:t>
-      </w:r>
-      <w:r>
-        <w:rPr>
-          <w:rStyle w:val="StringTok"/>
-        </w:rPr>
-        <w:t xml:space="preserve">"node_name"</w:t>
-      </w:r>
-      <w:r>
-        <w:rPr>
-          <w:rStyle w:val="NormalTok"/>
-        </w:rPr>
-        <w:t xml:space="preserve">, </w:t>
-      </w:r>
-      <w:r>
-        <w:rPr>
-          <w:rStyle w:val="StringTok"/>
-        </w:rPr>
-        <w:t xml:space="preserve">""</w:t>
-      </w:r>
-      <w:r>
-        <w:rPr>
-          <w:rStyle w:val="NormalTok"/>
-        </w:rPr>
-        <w:t xml:space="preserve">)).upper() </w:t>
-      </w:r>
-      <w:r>
-        <w:rPr>
-          <w:rStyle w:val="KeywordTok"/>
-        </w:rPr>
-        <w:t xml:space="preserve">in</w:t>
-      </w:r>
-      <w:r>
-        <w:rPr>
-          <w:rStyle w:val="NormalTok"/>
-        </w:rPr>
-        <w:t xml:space="preserve"> opioid_genes}</w:t>
-      </w:r>
-      <w:r>
-        <w:br/>
-      </w:r>
-      <w:r>
-        <w:rPr>
-          <w:rStyle w:val="NormalTok"/>
-        </w:rPr>
-        <w:t xml:space="preserve">subgraph </w:t>
-      </w:r>
-      <w:r>
-        <w:rPr>
-          <w:rStyle w:val="OperatorTok"/>
-        </w:rPr>
-        <w:t xml:space="preserve">=</w:t>
-      </w:r>
-      <w:r>
-        <w:rPr>
-          <w:rStyle w:val="NormalTok"/>
-        </w:rPr>
-        <w:t xml:space="preserve"> G.subgraph(opioid_nodes)</w:t>
-      </w:r>
-      <w:r>
-        <w:br/>
-      </w:r>
-      <w:r>
-        <w:rPr>
-          <w:rStyle w:val="NormalTok"/>
-        </w:rPr>
-        <w:t xml:space="preserve">nx.write_graphml(subgraph, </w:t>
-      </w:r>
-      <w:r>
-        <w:rPr>
-          <w:rStyle w:val="StringTok"/>
-        </w:rPr>
-        <w:t xml:space="preserve">"opioid_pathway.graphml"</w:t>
-      </w:r>
-      <w:r>
-        <w:rPr>
-          <w:rStyle w:val="NormalTok"/>
-        </w:rPr>
-        <w:t xml:space="preserve">)</w:t>
-      </w:r>
-    </w:p>
-    <w:bookmarkEnd w:id="44"/>
-    <w:bookmarkStart w:id="45" w:name="tissue-expression-profile-retrieval"/>
-    <w:p>
-      <w:pPr>
-        <w:pStyle w:val="Heading3"/>
-      </w:pPr>
-      <w:r>
-        <w:t xml:space="preserve">5.3 Tissue Expression Profile Retrieval</w:t>
-      </w:r>
-    </w:p>
-    <w:p>
-      <w:pPr>
-        <w:pStyle w:val="SourceCode"/>
-      </w:pPr>
-      <w:r>
-        <w:rPr>
-          <w:rStyle w:val="CommentTok"/>
-        </w:rPr>
-        <w:t xml:space="preserve"># Retrieve GTEx tissue expression for all Track B pain genes</w:t>
-      </w:r>
-      <w:r>
-        <w:br/>
-      </w:r>
-      <w:r>
-        <w:rPr>
-          <w:rStyle w:val="ControlFlowTok"/>
-        </w:rPr>
-        <w:t xml:space="preserve">for</w:t>
-      </w:r>
-      <w:r>
-        <w:rPr>
-          <w:rStyle w:val="NormalTok"/>
-        </w:rPr>
-        <w:t xml:space="preserve"> node, data </w:t>
-      </w:r>
-      <w:r>
-        <w:rPr>
-          <w:rStyle w:val="KeywordTok"/>
-        </w:rPr>
-        <w:t xml:space="preserve">in</w:t>
-      </w:r>
-      <w:r>
-        <w:rPr>
-          <w:rStyle w:val="NormalTok"/>
-        </w:rPr>
-        <w:t xml:space="preserve"> G.nodes(data</w:t>
-      </w:r>
-      <w:r>
-        <w:rPr>
-          <w:rStyle w:val="OperatorTok"/>
-        </w:rPr>
-        <w:t xml:space="preserve">=</w:t>
-      </w:r>
-      <w:r>
-        <w:rPr>
-          <w:rStyle w:val="VariableTok"/>
-        </w:rPr>
-        <w:t xml:space="preserve">True</w:t>
-      </w:r>
-      <w:r>
-        <w:rPr>
-          <w:rStyle w:val="NormalTok"/>
-        </w:rPr>
-        <w:t xml:space="preserve">):</w:t>
-      </w:r>
-      <w:r>
-        <w:br/>
-      </w:r>
-      <w:r>
-        <w:rPr>
-          <w:rStyle w:val="NormalTok"/>
-        </w:rPr>
-        <w:t xml:space="preserve">    </w:t>
-      </w:r>
-      <w:r>
-        <w:rPr>
-          <w:rStyle w:val="ControlFlowTok"/>
-        </w:rPr>
-        <w:t xml:space="preserve">if</w:t>
-      </w:r>
-      <w:r>
-        <w:rPr>
-          <w:rStyle w:val="NormalTok"/>
-        </w:rPr>
-        <w:t xml:space="preserve"> data.get(</w:t>
-      </w:r>
-      <w:r>
-        <w:rPr>
-          <w:rStyle w:val="StringTok"/>
-        </w:rPr>
-        <w:t xml:space="preserve">"track"</w:t>
-      </w:r>
-      <w:r>
-        <w:rPr>
-          <w:rStyle w:val="NormalTok"/>
-        </w:rPr>
-        <w:t xml:space="preserve">) </w:t>
-      </w:r>
-      <w:r>
-        <w:rPr>
-          <w:rStyle w:val="OperatorTok"/>
-        </w:rPr>
-        <w:t xml:space="preserve">==</w:t>
-      </w:r>
-      <w:r>
-        <w:rPr>
-          <w:rStyle w:val="NormalTok"/>
-        </w:rPr>
-        <w:t xml:space="preserve"> </w:t>
-      </w:r>
-      <w:r>
-        <w:rPr>
-          <w:rStyle w:val="StringTok"/>
-        </w:rPr>
-        <w:t xml:space="preserve">"B"</w:t>
-      </w:r>
-      <w:r>
-        <w:rPr>
-          <w:rStyle w:val="NormalTok"/>
-        </w:rPr>
-        <w:t xml:space="preserve"> </w:t>
-      </w:r>
-      <w:r>
-        <w:rPr>
-          <w:rStyle w:val="KeywordTok"/>
-        </w:rPr>
-        <w:t xml:space="preserve">and</w:t>
-      </w:r>
-      <w:r>
-        <w:rPr>
-          <w:rStyle w:val="NormalTok"/>
-        </w:rPr>
-        <w:t xml:space="preserve"> data.get(</w:t>
-      </w:r>
-      <w:r>
-        <w:rPr>
-          <w:rStyle w:val="StringTok"/>
-        </w:rPr>
-        <w:t xml:space="preserve">"node_type"</w:t>
-      </w:r>
-      <w:r>
-        <w:rPr>
-          <w:rStyle w:val="NormalTok"/>
-        </w:rPr>
-        <w:t xml:space="preserve">) </w:t>
-      </w:r>
-      <w:r>
-        <w:rPr>
-          <w:rStyle w:val="OperatorTok"/>
-        </w:rPr>
-        <w:t xml:space="preserve">==</w:t>
-      </w:r>
-      <w:r>
-        <w:rPr>
-          <w:rStyle w:val="NormalTok"/>
-        </w:rPr>
-        <w:t xml:space="preserve"> </w:t>
-      </w:r>
-      <w:r>
-        <w:rPr>
-          <w:rStyle w:val="StringTok"/>
-        </w:rPr>
-        <w:t xml:space="preserve">"gene/protein"</w:t>
-      </w:r>
-      <w:r>
-        <w:rPr>
-          <w:rStyle w:val="NormalTok"/>
-        </w:rPr>
-        <w:t xml:space="preserve">:</w:t>
-      </w:r>
-      <w:r>
-        <w:br/>
-      </w:r>
-      <w:r>
-        <w:rPr>
-          <w:rStyle w:val="NormalTok"/>
-        </w:rPr>
-        <w:t xml:space="preserve">        gene </w:t>
-      </w:r>
-      <w:r>
-        <w:rPr>
-          <w:rStyle w:val="OperatorTok"/>
-        </w:rPr>
-        <w:t xml:space="preserve">=</w:t>
-      </w:r>
-      <w:r>
-        <w:rPr>
-          <w:rStyle w:val="NormalTok"/>
-        </w:rPr>
-        <w:t xml:space="preserve"> data[</w:t>
-      </w:r>
-      <w:r>
-        <w:rPr>
-          <w:rStyle w:val="StringTok"/>
-        </w:rPr>
-        <w:t xml:space="preserve">"node_name"</w:t>
-      </w:r>
-      <w:r>
-        <w:rPr>
-          <w:rStyle w:val="NormalTok"/>
-        </w:rPr>
-        <w:t xml:space="preserve">]</w:t>
-      </w:r>
-      <w:r>
-        <w:br/>
-      </w:r>
-      <w:r>
-        <w:rPr>
-          <w:rStyle w:val="NormalTok"/>
-        </w:rPr>
-        <w:t xml:space="preserve">        expr </w:t>
-      </w:r>
-      <w:r>
-        <w:rPr>
-          <w:rStyle w:val="OperatorTok"/>
-        </w:rPr>
-        <w:t xml:space="preserve">=</w:t>
-      </w:r>
-      <w:r>
-        <w:rPr>
-          <w:rStyle w:val="NormalTok"/>
-        </w:rPr>
-        <w:t xml:space="preserve"> data.get(</w:t>
-      </w:r>
-      <w:r>
-        <w:rPr>
-          <w:rStyle w:val="StringTok"/>
-        </w:rPr>
-        <w:t xml:space="preserve">"gtex_median_tpm"</w:t>
-      </w:r>
-      <w:r>
-        <w:rPr>
-          <w:rStyle w:val="NormalTok"/>
-        </w:rPr>
-        <w:t xml:space="preserve">, {})</w:t>
-      </w:r>
-      <w:r>
-        <w:br/>
-      </w:r>
-      <w:r>
-        <w:rPr>
-          <w:rStyle w:val="NormalTok"/>
-        </w:rPr>
-        <w:t xml:space="preserve">        spinal </w:t>
-      </w:r>
-      <w:r>
-        <w:rPr>
-          <w:rStyle w:val="OperatorTok"/>
-        </w:rPr>
-        <w:t xml:space="preserve">=</w:t>
-      </w:r>
-      <w:r>
-        <w:rPr>
-          <w:rStyle w:val="NormalTok"/>
-        </w:rPr>
-        <w:t xml:space="preserve"> expr.get(</w:t>
-      </w:r>
-      <w:r>
-        <w:rPr>
-          <w:rStyle w:val="StringTok"/>
-        </w:rPr>
-        <w:t xml:space="preserve">"Spinal_Cord_cervical_c-1"</w:t>
-      </w:r>
-      <w:r>
-        <w:rPr>
-          <w:rStyle w:val="NormalTok"/>
-        </w:rPr>
-        <w:t xml:space="preserve">, </w:t>
-      </w:r>
-      <w:r>
-        <w:rPr>
-          <w:rStyle w:val="StringTok"/>
-        </w:rPr>
-        <w:t xml:space="preserve">"N/A"</w:t>
-      </w:r>
-      <w:r>
-        <w:rPr>
-          <w:rStyle w:val="NormalTok"/>
-        </w:rPr>
-        <w:t xml:space="preserve">)</w:t>
-      </w:r>
-      <w:r>
-        <w:br/>
-      </w:r>
-      <w:r>
-        <w:rPr>
-          <w:rStyle w:val="NormalTok"/>
-        </w:rPr>
-        <w:t xml:space="preserve">        tibial </w:t>
-      </w:r>
-      <w:r>
-        <w:rPr>
-          <w:rStyle w:val="OperatorTok"/>
-        </w:rPr>
-        <w:t xml:space="preserve">=</w:t>
-      </w:r>
-      <w:r>
-        <w:rPr>
-          <w:rStyle w:val="NormalTok"/>
-        </w:rPr>
-        <w:t xml:space="preserve"> expr.get(</w:t>
-      </w:r>
-      <w:r>
-        <w:rPr>
-          <w:rStyle w:val="StringTok"/>
-        </w:rPr>
-        <w:t xml:space="preserve">"Nerve_Tibial"</w:t>
-      </w:r>
-      <w:r>
-        <w:rPr>
-          <w:rStyle w:val="NormalTok"/>
-        </w:rPr>
-        <w:t xml:space="preserve">, </w:t>
-      </w:r>
-      <w:r>
-        <w:rPr>
-          <w:rStyle w:val="StringTok"/>
-        </w:rPr>
-        <w:t xml:space="preserve">"N/A"</w:t>
-      </w:r>
-      <w:r>
-        <w:rPr>
-          <w:rStyle w:val="NormalTok"/>
-        </w:rPr>
-        <w:t xml:space="preserve">)</w:t>
-      </w:r>
-      <w:r>
-        <w:br/>
-      </w:r>
-      <w:r>
-        <w:rPr>
-          <w:rStyle w:val="NormalTok"/>
-        </w:rPr>
-        <w:t xml:space="preserve">        </w:t>
-      </w:r>
-      <w:r>
-        <w:rPr>
-          <w:rStyle w:val="BuiltInTok"/>
-        </w:rPr>
-        <w:t xml:space="preserve">print</w:t>
-      </w:r>
-      <w:r>
-        <w:rPr>
-          <w:rStyle w:val="NormalTok"/>
-        </w:rPr>
-        <w:t xml:space="preserve">(</w:t>
-      </w:r>
-      <w:r>
-        <w:rPr>
-          <w:rStyle w:val="SpecialStringTok"/>
-        </w:rPr>
-        <w:t xml:space="preserve">f"</w:t>
-      </w:r>
-      <w:r>
-        <w:rPr>
-          <w:rStyle w:val="SpecialCharTok"/>
-        </w:rPr>
-        <w:t xml:space="preserve">{</w:t>
-      </w:r>
-      <w:r>
-        <w:rPr>
-          <w:rStyle w:val="NormalTok"/>
-        </w:rPr>
-        <w:t xml:space="preserve">gene</w:t>
-      </w:r>
-      <w:r>
-        <w:rPr>
-          <w:rStyle w:val="SpecialCharTok"/>
-        </w:rPr>
-        <w:t xml:space="preserve">}</w:t>
-      </w:r>
-      <w:r>
-        <w:rPr>
-          <w:rStyle w:val="SpecialStringTok"/>
-        </w:rPr>
-        <w:t xml:space="preserve">: Spinal=</w:t>
-      </w:r>
-      <w:r>
-        <w:rPr>
-          <w:rStyle w:val="SpecialCharTok"/>
-        </w:rPr>
-        <w:t xml:space="preserve">{</w:t>
-      </w:r>
-      <w:r>
-        <w:rPr>
-          <w:rStyle w:val="NormalTok"/>
-        </w:rPr>
-        <w:t xml:space="preserve">spinal</w:t>
-      </w:r>
-      <w:r>
-        <w:rPr>
-          <w:rStyle w:val="SpecialCharTok"/>
-        </w:rPr>
-        <w:t xml:space="preserve">}</w:t>
-      </w:r>
-      <w:r>
-        <w:rPr>
-          <w:rStyle w:val="SpecialStringTok"/>
-        </w:rPr>
-        <w:t xml:space="preserve">, Tibial=</w:t>
-      </w:r>
-      <w:r>
-        <w:rPr>
-          <w:rStyle w:val="SpecialCharTok"/>
-        </w:rPr>
-        <w:t xml:space="preserve">{</w:t>
-      </w:r>
-      <w:r>
-        <w:rPr>
-          <w:rStyle w:val="NormalTok"/>
-        </w:rPr>
-        <w:t xml:space="preserve">tibial</w:t>
-      </w:r>
-      <w:r>
-        <w:rPr>
-          <w:rStyle w:val="SpecialCharTok"/>
-        </w:rPr>
-        <w:t xml:space="preserve">}</w:t>
-      </w:r>
-      <w:r>
-        <w:rPr>
-          <w:rStyle w:val="SpecialStringTok"/>
-        </w:rPr>
-        <w:t xml:space="preserve">"</w:t>
-      </w:r>
-      <w:r>
-        <w:rPr>
-          <w:rStyle w:val="NormalTok"/>
-        </w:rPr>
-        <w:t xml:space="preserve">)</w:t>
-      </w:r>
-    </w:p>
-    <w:bookmarkEnd w:id="45"/>
-    <w:bookmarkStart w:id="46" w:name="identifying-bridge-genes-between-tracks"/>
+    <w:bookmarkStart w:id="44" w:name="identifying-bridge-genes-between-tracks"/>
     <w:p>
       <w:pPr>
         <w:pStyle w:val="Heading3"/>
@@ -5245,9 +4959,9 @@
         </w:pict>
       </w:r>
     </w:p>
-    <w:bookmarkEnd w:id="46"/>
-    <w:bookmarkEnd w:id="47"/>
-    <w:bookmarkStart w:id="48" w:name="figure-captions"/>
+    <w:bookmarkEnd w:id="44"/>
+    <w:bookmarkEnd w:id="45"/>
+    <w:bookmarkStart w:id="46" w:name="figure-captions"/>
     <w:p>
       <w:pPr>
         <w:pStyle w:val="Heading2"/>
@@ -5364,8 +5078,8 @@
         <w:t xml:space="preserve">Pathway subnetwork visualizations for the nine curated pain signaling pathways mapped onto RA-PainKG. Each panel shows a single pathway: TRP channels, voltage-gated sodium channels, neurotrophin signaling, opioid signaling, MAPK pathway, JAK-STAT pathway, prostaglandin pathway, complement cascade, and GABA/glycine receptors. Node color indicates track assignment (Track A, Track B, or Dual). Edge directionality indicates known signaling relationships.</w:t>
       </w:r>
     </w:p>
-    <w:bookmarkEnd w:id="48"/>
-    <w:bookmarkStart w:id="49" w:name="supplementary-materials"/>
+    <w:bookmarkEnd w:id="46"/>
+    <w:bookmarkStart w:id="47" w:name="supplementary-materials"/>
     <w:p>
       <w:pPr>
         <w:pStyle w:val="Heading2"/>
@@ -5379,7 +5093,7 @@
         <w:pStyle w:val="Compact"/>
         <w:numPr>
           <w:ilvl w:val="0"/>
-          <w:numId w:val="1002"/>
+          <w:numId w:val="1001"/>
         </w:numPr>
       </w:pPr>
       <w:r>
@@ -5401,7 +5115,7 @@
         <w:pStyle w:val="Compact"/>
         <w:numPr>
           <w:ilvl w:val="0"/>
-          <w:numId w:val="1002"/>
+          <w:numId w:val="1001"/>
         </w:numPr>
       </w:pPr>
       <w:r>
@@ -5423,7 +5137,7 @@
         <w:pStyle w:val="Compact"/>
         <w:numPr>
           <w:ilvl w:val="0"/>
-          <w:numId w:val="1002"/>
+          <w:numId w:val="1001"/>
         </w:numPr>
       </w:pPr>
       <w:r>
@@ -5445,7 +5159,7 @@
         <w:pStyle w:val="Compact"/>
         <w:numPr>
           <w:ilvl w:val="0"/>
-          <w:numId w:val="1002"/>
+          <w:numId w:val="1001"/>
         </w:numPr>
       </w:pPr>
       <w:r>
@@ -5467,7 +5181,7 @@
         <w:pStyle w:val="Compact"/>
         <w:numPr>
           <w:ilvl w:val="0"/>
-          <w:numId w:val="1002"/>
+          <w:numId w:val="1001"/>
         </w:numPr>
       </w:pPr>
       <w:r>
@@ -5489,7 +5203,7 @@
         <w:pStyle w:val="Compact"/>
         <w:numPr>
           <w:ilvl w:val="0"/>
-          <w:numId w:val="1002"/>
+          <w:numId w:val="1001"/>
         </w:numPr>
       </w:pPr>
       <w:r>
@@ -5511,7 +5225,7 @@
         <w:pStyle w:val="Compact"/>
         <w:numPr>
           <w:ilvl w:val="0"/>
-          <w:numId w:val="1002"/>
+          <w:numId w:val="1001"/>
         </w:numPr>
       </w:pPr>
       <w:r>
@@ -5533,7 +5247,7 @@
         <w:pStyle w:val="Compact"/>
         <w:numPr>
           <w:ilvl w:val="0"/>
-          <w:numId w:val="1002"/>
+          <w:numId w:val="1001"/>
         </w:numPr>
       </w:pPr>
       <w:r>
@@ -5550,44 +5264,44 @@
         <w:t xml:space="preserve">Supplementary figures (degree distribution, track comparison, composition, core network, pathway subnetworks)</w:t>
       </w:r>
     </w:p>
+    <w:bookmarkEnd w:id="47"/>
+    <w:bookmarkStart w:id="48" w:name="ai-usage-statement"/>
+    <w:p>
+      <w:pPr>
+        <w:pStyle w:val="Heading2"/>
+      </w:pPr>
+      <w:r>
+        <w:t xml:space="preserve">AI Usage Statement</w:t>
+      </w:r>
+    </w:p>
+    <w:p>
+      <w:pPr>
+        <w:pStyle w:val="FirstParagraph"/>
+      </w:pPr>
+      <w:r>
+        <w:t xml:space="preserve">During the preparation of this work, the author used AI-assisted tools (OpenAI Codex CLI, GitHub Copilot, and Claude via API) for the following purposes: code development and debugging of the pipeline, literature search and summarization, manuscript drafting and language editing, and iterative revision based on simulated peer review. All AI-generated content was reviewed, verified, and edited by the author. The author takes full responsibility for the scientific accuracy, data integrity, and conclusions presented in this publication. All data were generated by the author’s original code; no AI tool contributed to data generation or statistical computation beyond code execution of author-specified algorithms.</w:t>
+      </w:r>
+    </w:p>
+    <w:bookmarkEnd w:id="48"/>
+    <w:bookmarkStart w:id="49" w:name="acknowledgements"/>
+    <w:p>
+      <w:pPr>
+        <w:pStyle w:val="Heading2"/>
+      </w:pPr>
+      <w:r>
+        <w:t xml:space="preserve">Acknowledgements</w:t>
+      </w:r>
+    </w:p>
+    <w:p>
+      <w:pPr>
+        <w:pStyle w:val="FirstParagraph"/>
+      </w:pPr>
+      <w:r>
+        <w:t xml:space="preserve">The author thanks the Norman lab, the PrimeKG development team, the GTEx Consortium, and the Gene Ontology Consortium for making their data publicly available. This research was supported by institutional resources from The Second Affiliated Hospital of Fujian University of Traditional Chinese Medicine.</w:t>
+      </w:r>
+    </w:p>
     <w:bookmarkEnd w:id="49"/>
-    <w:bookmarkStart w:id="50" w:name="ai-usage-statement"/>
-    <w:p>
-      <w:pPr>
-        <w:pStyle w:val="Heading2"/>
-      </w:pPr>
-      <w:r>
-        <w:t xml:space="preserve">AI Usage Statement</w:t>
-      </w:r>
-    </w:p>
-    <w:p>
-      <w:pPr>
-        <w:pStyle w:val="FirstParagraph"/>
-      </w:pPr>
-      <w:r>
-        <w:t xml:space="preserve">During the preparation of this work, the author used AI-assisted tools (OpenAI Codex CLI, GitHub Copilot, and Claude via API) for the following purposes: code development and debugging of the pipeline, literature search and summarization, manuscript drafting and language editing, and iterative revision based on simulated peer review. All AI-generated content was reviewed, verified, and edited by the author. The author takes full responsibility for the scientific accuracy, data integrity, and conclusions presented in this publication. All data were generated by the author’s original code; no AI tool contributed to data generation or statistical computation beyond code execution of author-specified algorithms.</w:t>
-      </w:r>
-    </w:p>
-    <w:bookmarkEnd w:id="50"/>
-    <w:bookmarkStart w:id="51" w:name="acknowledgements"/>
-    <w:p>
-      <w:pPr>
-        <w:pStyle w:val="Heading2"/>
-      </w:pPr>
-      <w:r>
-        <w:t xml:space="preserve">Acknowledgements</w:t>
-      </w:r>
-    </w:p>
-    <w:p>
-      <w:pPr>
-        <w:pStyle w:val="FirstParagraph"/>
-      </w:pPr>
-      <w:r>
-        <w:t xml:space="preserve">The author thanks the Norman lab, the PrimeKG development team, the GTEx Consortium, and the Gene Ontology Consortium for making their data publicly available. This research was supported by institutional resources from The Second Affiliated Hospital of Fujian University of Traditional Chinese Medicine.</w:t>
-      </w:r>
-    </w:p>
-    <w:bookmarkEnd w:id="51"/>
-    <w:bookmarkStart w:id="52" w:name="author-contributions"/>
+    <w:bookmarkStart w:id="50" w:name="author-contributions"/>
     <w:p>
       <w:pPr>
         <w:pStyle w:val="Heading2"/>
@@ -5614,44 +5328,44 @@
         <w:t xml:space="preserve">Conceptualization, Methodology, Software, Formal Analysis, Investigation, Data Curation, Writing - Original Draft, Writing - Review and Editing, Visualization, Project Administration.</w:t>
       </w:r>
     </w:p>
+    <w:bookmarkEnd w:id="50"/>
+    <w:bookmarkStart w:id="51" w:name="competing-interests"/>
+    <w:p>
+      <w:pPr>
+        <w:pStyle w:val="Heading2"/>
+      </w:pPr>
+      <w:r>
+        <w:t xml:space="preserve">Competing Interests</w:t>
+      </w:r>
+    </w:p>
+    <w:p>
+      <w:pPr>
+        <w:pStyle w:val="FirstParagraph"/>
+      </w:pPr>
+      <w:r>
+        <w:t xml:space="preserve">The author declares no competing interests.</w:t>
+      </w:r>
+    </w:p>
+    <w:bookmarkEnd w:id="51"/>
+    <w:bookmarkStart w:id="52" w:name="ethics-statement"/>
+    <w:p>
+      <w:pPr>
+        <w:pStyle w:val="Heading2"/>
+      </w:pPr>
+      <w:r>
+        <w:t xml:space="preserve">Ethics Statement</w:t>
+      </w:r>
+    </w:p>
+    <w:p>
+      <w:pPr>
+        <w:pStyle w:val="FirstParagraph"/>
+      </w:pPr>
+      <w:r>
+        <w:t xml:space="preserve">This study uses exclusively publicly available data. No new data involving human subjects were collected.</w:t>
+      </w:r>
+    </w:p>
     <w:bookmarkEnd w:id="52"/>
-    <w:bookmarkStart w:id="53" w:name="competing-interests"/>
-    <w:p>
-      <w:pPr>
-        <w:pStyle w:val="Heading2"/>
-      </w:pPr>
-      <w:r>
-        <w:t xml:space="preserve">Competing Interests</w:t>
-      </w:r>
-    </w:p>
-    <w:p>
-      <w:pPr>
-        <w:pStyle w:val="FirstParagraph"/>
-      </w:pPr>
-      <w:r>
-        <w:t xml:space="preserve">The author declares no competing interests.</w:t>
-      </w:r>
-    </w:p>
-    <w:bookmarkEnd w:id="53"/>
-    <w:bookmarkStart w:id="54" w:name="ethics-statement"/>
-    <w:p>
-      <w:pPr>
-        <w:pStyle w:val="Heading2"/>
-      </w:pPr>
-      <w:r>
-        <w:t xml:space="preserve">Ethics Statement</w:t>
-      </w:r>
-    </w:p>
-    <w:p>
-      <w:pPr>
-        <w:pStyle w:val="FirstParagraph"/>
-      </w:pPr>
-      <w:r>
-        <w:t xml:space="preserve">This study uses exclusively publicly available data. No new data involving human subjects were collected.</w:t>
-      </w:r>
-    </w:p>
-    <w:bookmarkEnd w:id="54"/>
-    <w:bookmarkStart w:id="55" w:name="data-and-code-availability"/>
+    <w:bookmarkStart w:id="53" w:name="data-and-code-availability"/>
     <w:p>
       <w:pPr>
         <w:pStyle w:val="Heading2"/>
@@ -5675,194 +5389,194 @@
         </w:pict>
       </w:r>
     </w:p>
+    <w:bookmarkEnd w:id="53"/>
+    <w:bookmarkStart w:id="54" w:name="references"/>
+    <w:p>
+      <w:pPr>
+        <w:pStyle w:val="Heading2"/>
+      </w:pPr>
+      <w:r>
+        <w:t xml:space="preserve">References</w:t>
+      </w:r>
+    </w:p>
+    <w:p>
+      <w:pPr>
+        <w:pStyle w:val="FirstParagraph"/>
+      </w:pPr>
+      <w:r>
+        <w:t xml:space="preserve">[1] Safiri S, Kolahi AA, Hoy D, et al. Global, regional and national burden of rheumatoid arthritis 1990-2017: a systematic analysis. Ann Rheum Dis. 2019;78(11):1463-1471.</w:t>
+      </w:r>
+    </w:p>
+    <w:p>
+      <w:pPr>
+        <w:pStyle w:val="BodyText"/>
+      </w:pPr>
+      <w:r>
+        <w:t xml:space="preserve">[2] Cross M, Smith E, Hoy D, et al. The global burden of rheumatoid arthritis: estimates from the Global Burden of Disease 2010 study. Ann Rheum Dis. 2014;73(7):1316-1322.</w:t>
+      </w:r>
+    </w:p>
+    <w:p>
+      <w:pPr>
+        <w:pStyle w:val="BodyText"/>
+      </w:pPr>
+      <w:r>
+        <w:t xml:space="preserve">[3] Lee YC, Cui J, Lu B, et al. Pain persists in DAS28 rheumatoid arthritis remission but not in ACR/EULAR remission. Ann Rheum Dis. 2011;70:1467-1470.</w:t>
+      </w:r>
+    </w:p>
+    <w:p>
+      <w:pPr>
+        <w:pStyle w:val="BodyText"/>
+      </w:pPr>
+      <w:r>
+        <w:t xml:space="preserve">[4] McWilliams DF, Walsh DA. Pain mechanisms in rheumatoid arthritis. Clin Exp Rheumatol. 2017;35 Suppl 107(5):31-39.</w:t>
+      </w:r>
+    </w:p>
+    <w:p>
+      <w:pPr>
+        <w:pStyle w:val="BodyText"/>
+      </w:pPr>
+      <w:r>
+        <w:t xml:space="preserve">[5] Basbaum AI, Bautista DM, Scherrer G, Julius D. Cellular and molecular mechanisms of pain. Cell. 2009;139(2):267-284.</w:t>
+      </w:r>
+    </w:p>
+    <w:p>
+      <w:pPr>
+        <w:pStyle w:val="BodyText"/>
+      </w:pPr>
+      <w:r>
+        <w:t xml:space="preserve">[6] Julius D. TRP channels and pain. Annu Rev Cell Dev Biol. 2013;29:355-384.</w:t>
+      </w:r>
+    </w:p>
+    <w:p>
+      <w:pPr>
+        <w:pStyle w:val="BodyText"/>
+      </w:pPr>
+      <w:r>
+        <w:t xml:space="preserve">[7] Ji RR, Nackley A, Huh Y, Terrando N, Maixner W. Neuroinflammation and central sensitization in chronic and widespread pain. Anesthesiology. 2018;129(2):343-366.</w:t>
+      </w:r>
+    </w:p>
+    <w:p>
+      <w:pPr>
+        <w:pStyle w:val="BodyText"/>
+      </w:pPr>
+      <w:r>
+        <w:t xml:space="preserve">[8] Szklarczyk D, Kirsch R, Koutrouli M, et al. The STRING database in 2023: protein-protein association networks and functional enrichment analyses. Nucleic Acids Res. 2023;51(D1):D638-D646.</w:t>
+      </w:r>
+    </w:p>
+    <w:p>
+      <w:pPr>
+        <w:pStyle w:val="BodyText"/>
+      </w:pPr>
+      <w:r>
+        <w:t xml:space="preserve">[9] Oughtred R, Rust J, Chang C, et al. The BioGRID database: A comprehensive biomedical resource of curated protein, genetic, and chemical interactions. Protein Sci. 2021;30(1):187-200.</w:t>
+      </w:r>
+    </w:p>
+    <w:p>
+      <w:pPr>
+        <w:pStyle w:val="BodyText"/>
+      </w:pPr>
+      <w:r>
+        <w:t xml:space="preserve">[10] Kanehisa M, Furumichi M, Sato Y, Kawashima M, Ishiguro-Watanabe M. KEGG for taxonomy-based analysis of pathways and genomes. Nucleic Acids Res. 2023;51(D1):D587-D592.</w:t>
+      </w:r>
+    </w:p>
+    <w:p>
+      <w:pPr>
+        <w:pStyle w:val="BodyText"/>
+      </w:pPr>
+      <w:r>
+        <w:t xml:space="preserve">[11] Gillespie M, Jassal B, Stephan R, et al. The reactome pathway knowledgebase 2022. Nucleic Acids Res. 2022;50(D1):D687-D692.</w:t>
+      </w:r>
+    </w:p>
+    <w:p>
+      <w:pPr>
+        <w:pStyle w:val="BodyText"/>
+      </w:pPr>
+      <w:r>
+        <w:t xml:space="preserve">[12] Agrawal A, Balci H, Hanspers K, et al. WikiPathways 2024: next generation pathway database. Nucleic Acids Res. 2024;52(D1):D679-D689.</w:t>
+      </w:r>
+    </w:p>
+    <w:p>
+      <w:pPr>
+        <w:pStyle w:val="BodyText"/>
+      </w:pPr>
+      <w:r>
+        <w:t xml:space="preserve">[13] Chandak P, Huang K, Zitnik M. Building a knowledge graph to enable precision medicine. Sci Data. 2023;10:67.</w:t>
+      </w:r>
+    </w:p>
+    <w:p>
+      <w:pPr>
+        <w:pStyle w:val="BodyText"/>
+      </w:pPr>
+      <w:r>
+        <w:t xml:space="preserve">[14] Harding SD, Armstrong JF, Faccenda E, et al. The IUPHAR/BPS Guide to PHARMACOLOGY in 2024. Nucleic Acids Res. 2024;52(D1):D1438-D1449.</w:t>
+      </w:r>
+    </w:p>
+    <w:p>
+      <w:pPr>
+        <w:pStyle w:val="BodyText"/>
+      </w:pPr>
+      <w:r>
+        <w:t xml:space="preserve">[15] Meloto CB, Benavides R, Lichtenwalter RN, et al. Human pain genetics database: a resource dedicated to human pain genetics research. Pain. 2018;159(4):749-763.</w:t>
+      </w:r>
+    </w:p>
+    <w:p>
+      <w:pPr>
+        <w:pStyle w:val="BodyText"/>
+      </w:pPr>
+      <w:r>
+        <w:t xml:space="preserve">[16] GTEx Consortium. The GTEx Consortium atlas of genetic regulatory effects across human tissues. Science. 2020;369(6509):1318-1330.</w:t>
+      </w:r>
+    </w:p>
+    <w:p>
+      <w:pPr>
+        <w:pStyle w:val="BodyText"/>
+      </w:pPr>
+      <w:r>
+        <w:t xml:space="preserve">[17] Pinero J, Ramirez-Anguita JM, Sauch-Pitarch J, et al. The DisGeNET knowledge platform for disease genomics: 2019 update. Nucleic Acids Res. 2020;48(D1):D845-D855.</w:t>
+      </w:r>
+    </w:p>
+    <w:p>
+      <w:pPr>
+        <w:pStyle w:val="BodyText"/>
+      </w:pPr>
+      <w:r>
+        <w:t xml:space="preserve">[18] Nguyen MQ, von Buchholtz LJ, Reker AN, Ryba NJ, Davidson S. Single-nucleus transcriptomic analysis of human dorsal root ganglion sensory neurons. Pain. 2021;162(7):2032-2046.</w:t>
+      </w:r>
+    </w:p>
+    <w:p>
+      <w:pPr>
+        <w:pStyle w:val="BodyText"/>
+      </w:pPr>
+      <w:r>
+        <w:t xml:space="preserve">[19] Yang Y. RA-PainKG: A tissue-specific knowledge graph for rheumatoid arthritis pain signaling - construction protocol, network analysis, and coverage-gap documentation. GitHub/Zenodo. 2026. Available at: https://github.com/yyx-4113/ra-painkg.</w:t>
+      </w:r>
+    </w:p>
+    <w:p>
+      <w:pPr>
+        <w:pStyle w:val="BodyText"/>
+      </w:pPr>
+      <w:r>
+        <w:t xml:space="preserve">[20] Norman TM, Horlbeck MA, Replogle JM, et al. Exploring genetic interaction manifolds constructed from rich single-cell phenotypes. Science. 2019;365(6455):786-793.</w:t>
+      </w:r>
+    </w:p>
+    <w:p>
+      <w:pPr>
+        <w:pStyle w:val="BodyText"/>
+      </w:pPr>
+      <w:r>
+        <w:t xml:space="preserve">[21] Roohani Y, Huang K, Leskovec J. Predicting transcriptional outcomes of novel multigene perturbations with GEARS. Nat Biotechnol. 2024;42:591-600.</w:t>
+      </w:r>
+    </w:p>
+    <w:p>
+      <w:pPr>
+        <w:pStyle w:val="BodyText"/>
+      </w:pPr>
+      <w:r>
+        <w:t xml:space="preserve">[22] Ashburner M, Ball CA, Blake JA, et al. Gene Ontology: tool for the unification of biology. Nat Genet. 2000;25(1):25-29.</w:t>
+      </w:r>
+    </w:p>
+    <w:bookmarkEnd w:id="54"/>
     <w:bookmarkEnd w:id="55"/>
-    <w:bookmarkStart w:id="56" w:name="references"/>
-    <w:p>
-      <w:pPr>
-        <w:pStyle w:val="Heading2"/>
-      </w:pPr>
-      <w:r>
-        <w:t xml:space="preserve">References</w:t>
-      </w:r>
-    </w:p>
-    <w:p>
-      <w:pPr>
-        <w:pStyle w:val="FirstParagraph"/>
-      </w:pPr>
-      <w:r>
-        <w:t xml:space="preserve">[1] Safiri S, Kolahi AA, Hoy D, et al. Global, regional and national burden of rheumatoid arthritis 1990-2017: a systematic analysis. Ann Rheum Dis. 2019;78(11):1463-1471.</w:t>
-      </w:r>
-    </w:p>
-    <w:p>
-      <w:pPr>
-        <w:pStyle w:val="BodyText"/>
-      </w:pPr>
-      <w:r>
-        <w:t xml:space="preserve">[2] Cross M, Smith E, Hoy D, et al. The global burden of rheumatoid arthritis: estimates from the Global Burden of Disease 2010 study. Ann Rheum Dis. 2014;73(7):1316-1322.</w:t>
-      </w:r>
-    </w:p>
-    <w:p>
-      <w:pPr>
-        <w:pStyle w:val="BodyText"/>
-      </w:pPr>
-      <w:r>
-        <w:t xml:space="preserve">[3] Lee YC, Cui J, Lu B, et al. Pain persists in DAS28 rheumatoid arthritis remission but not in ACR/EULAR remission. Ann Rheum Dis. 2011;70:1467-1470.</w:t>
-      </w:r>
-    </w:p>
-    <w:p>
-      <w:pPr>
-        <w:pStyle w:val="BodyText"/>
-      </w:pPr>
-      <w:r>
-        <w:t xml:space="preserve">[4] McWilliams DF, Walsh DA. Pain mechanisms in rheumatoid arthritis. Clin Exp Rheumatol. 2017;35 Suppl 107(5):31-39.</w:t>
-      </w:r>
-    </w:p>
-    <w:p>
-      <w:pPr>
-        <w:pStyle w:val="BodyText"/>
-      </w:pPr>
-      <w:r>
-        <w:t xml:space="preserve">[5] Basbaum AI, Bautista DM, Scherrer G, Julius D. Cellular and molecular mechanisms of pain. Cell. 2009;139(2):267-284.</w:t>
-      </w:r>
-    </w:p>
-    <w:p>
-      <w:pPr>
-        <w:pStyle w:val="BodyText"/>
-      </w:pPr>
-      <w:r>
-        <w:t xml:space="preserve">[6] Julius D. TRP channels and pain. Annu Rev Cell Dev Biol. 2013;29:355-384.</w:t>
-      </w:r>
-    </w:p>
-    <w:p>
-      <w:pPr>
-        <w:pStyle w:val="BodyText"/>
-      </w:pPr>
-      <w:r>
-        <w:t xml:space="preserve">[7] Ji RR, Nackley A, Huh Y, Terrando N, Maixner W. Neuroinflammation and central sensitization in chronic and widespread pain. Anesthesiology. 2018;129(2):343-366.</w:t>
-      </w:r>
-    </w:p>
-    <w:p>
-      <w:pPr>
-        <w:pStyle w:val="BodyText"/>
-      </w:pPr>
-      <w:r>
-        <w:t xml:space="preserve">[8] Szklarczyk D, Kirsch R, Koutrouli M, et al. The STRING database in 2023: protein-protein association networks and functional enrichment analyses. Nucleic Acids Res. 2023;51(D1):D638-D646.</w:t>
-      </w:r>
-    </w:p>
-    <w:p>
-      <w:pPr>
-        <w:pStyle w:val="BodyText"/>
-      </w:pPr>
-      <w:r>
-        <w:t xml:space="preserve">[9] Oughtred R, Rust J, Chang C, et al. The BioGRID database: A comprehensive biomedical resource of curated protein, genetic, and chemical interactions. Protein Sci. 2021;30(1):187-200.</w:t>
-      </w:r>
-    </w:p>
-    <w:p>
-      <w:pPr>
-        <w:pStyle w:val="BodyText"/>
-      </w:pPr>
-      <w:r>
-        <w:t xml:space="preserve">[10] Kanehisa M, Furumichi M, Sato Y, Kawashima M, Ishiguro-Watanabe M. KEGG for taxonomy-based analysis of pathways and genomes. Nucleic Acids Res. 2023;51(D1):D587-D592.</w:t>
-      </w:r>
-    </w:p>
-    <w:p>
-      <w:pPr>
-        <w:pStyle w:val="BodyText"/>
-      </w:pPr>
-      <w:r>
-        <w:t xml:space="preserve">[11] Gillespie M, Jassal B, Stephan R, et al. The reactome pathway knowledgebase 2022. Nucleic Acids Res. 2022;50(D1):D687-D692.</w:t>
-      </w:r>
-    </w:p>
-    <w:p>
-      <w:pPr>
-        <w:pStyle w:val="BodyText"/>
-      </w:pPr>
-      <w:r>
-        <w:t xml:space="preserve">[12] Agrawal A, Balci H, Hanspers K, et al. WikiPathways 2024: next generation pathway database. Nucleic Acids Res. 2024;52(D1):D679-D689.</w:t>
-      </w:r>
-    </w:p>
-    <w:p>
-      <w:pPr>
-        <w:pStyle w:val="BodyText"/>
-      </w:pPr>
-      <w:r>
-        <w:t xml:space="preserve">[13] Chandak P, Huang K, Zitnik M. Building a knowledge graph to enable precision medicine. Sci Data. 2023;10:67.</w:t>
-      </w:r>
-    </w:p>
-    <w:p>
-      <w:pPr>
-        <w:pStyle w:val="BodyText"/>
-      </w:pPr>
-      <w:r>
-        <w:t xml:space="preserve">[14] Harding SD, Armstrong JF, Faccenda E, et al. The IUPHAR/BPS Guide to PHARMACOLOGY in 2024. Nucleic Acids Res. 2024;52(D1):D1438-D1449.</w:t>
-      </w:r>
-    </w:p>
-    <w:p>
-      <w:pPr>
-        <w:pStyle w:val="BodyText"/>
-      </w:pPr>
-      <w:r>
-        <w:t xml:space="preserve">[15] Meloto CB, Benavides R, Lichtenwalter RN, et al. Human pain genetics database: a resource dedicated to human pain genetics research. Pain. 2018;159(4):749-763.</w:t>
-      </w:r>
-    </w:p>
-    <w:p>
-      <w:pPr>
-        <w:pStyle w:val="BodyText"/>
-      </w:pPr>
-      <w:r>
-        <w:t xml:space="preserve">[16] GTEx Consortium. The GTEx Consortium atlas of genetic regulatory effects across human tissues. Science. 2020;369(6509):1318-1330.</w:t>
-      </w:r>
-    </w:p>
-    <w:p>
-      <w:pPr>
-        <w:pStyle w:val="BodyText"/>
-      </w:pPr>
-      <w:r>
-        <w:t xml:space="preserve">[17] Pinero J, Ramirez-Anguita JM, Sauch-Pitarch J, et al. The DisGeNET knowledge platform for disease genomics: 2019 update. Nucleic Acids Res. 2020;48(D1):D845-D855.</w:t>
-      </w:r>
-    </w:p>
-    <w:p>
-      <w:pPr>
-        <w:pStyle w:val="BodyText"/>
-      </w:pPr>
-      <w:r>
-        <w:t xml:space="preserve">[18] Nguyen MQ, von Buchholtz LJ, Reker AN, Ryba NJ, Davidson S. Single-nucleus transcriptomic analysis of human dorsal root ganglion sensory neurons. Pain. 2021;162(7):2032-2046.</w:t>
-      </w:r>
-    </w:p>
-    <w:p>
-      <w:pPr>
-        <w:pStyle w:val="BodyText"/>
-      </w:pPr>
-      <w:r>
-        <w:t xml:space="preserve">[19] Yang Y. RA-PainKG: A tissue-specific knowledge graph for rheumatoid arthritis pain signaling - construction protocol, network analysis, and coverage-gap documentation. GitHub/Zenodo. 2026. Available at: https://github.com/yyx-4113/ra-painkg.</w:t>
-      </w:r>
-    </w:p>
-    <w:p>
-      <w:pPr>
-        <w:pStyle w:val="BodyText"/>
-      </w:pPr>
-      <w:r>
-        <w:t xml:space="preserve">[20] Norman TM, Horlbeck MA, Replogle JM, et al. Exploring genetic interaction manifolds constructed from rich single-cell phenotypes. Science. 2019;365(6455):786-793.</w:t>
-      </w:r>
-    </w:p>
-    <w:p>
-      <w:pPr>
-        <w:pStyle w:val="BodyText"/>
-      </w:pPr>
-      <w:r>
-        <w:t xml:space="preserve">[21] Roohani Y, Huang K, Leskovec J. Predicting transcriptional outcomes of novel multigene perturbations with GEARS. Nat Biotechnol. 2024;42:591-600.</w:t>
-      </w:r>
-    </w:p>
-    <w:p>
-      <w:pPr>
-        <w:pStyle w:val="BodyText"/>
-      </w:pPr>
-      <w:r>
-        <w:t xml:space="preserve">[22] Ashburner M, Ball CA, Blake JA, et al. Gene Ontology: tool for the unification of biology. Nat Genet. 2000;25(1):25-29.</w:t>
-      </w:r>
-    </w:p>
-    <w:bookmarkEnd w:id="56"/>
-    <w:bookmarkEnd w:id="57"/>
     <w:sectPr>
       <w:footnotePr>
         <w:numRestart w:val="eachSect"/>
@@ -5973,91 +5687,6 @@
       </w:pPr>
     </w:lvl>
   </w:abstractNum>
-  <w:abstractNum w:abstractNumId="99411">
-    <w:nsid w:val="00A99411"/>
-    <w:multiLevelType w:val="multilevel"/>
-    <w:lvl w:ilvl="0">
-      <w:start w:val="1"/>
-      <w:numFmt w:val="decimal"/>
-      <w:lvlText w:val="%1."/>
-      <w:lvlJc w:val="left"/>
-      <w:pPr>
-        <w:ind w:left="720" w:hanging="360"/>
-      </w:pPr>
-    </w:lvl>
-    <w:lvl w:ilvl="1">
-      <w:start w:val="1"/>
-      <w:numFmt w:val="decimal"/>
-      <w:lvlText w:val="%2."/>
-      <w:lvlJc w:val="left"/>
-      <w:pPr>
-        <w:ind w:left="1440" w:hanging="360"/>
-      </w:pPr>
-    </w:lvl>
-    <w:lvl w:ilvl="2">
-      <w:start w:val="1"/>
-      <w:numFmt w:val="decimal"/>
-      <w:lvlText w:val="%3."/>
-      <w:lvlJc w:val="left"/>
-      <w:pPr>
-        <w:ind w:left="2160" w:hanging="360"/>
-      </w:pPr>
-    </w:lvl>
-    <w:lvl w:ilvl="3">
-      <w:start w:val="1"/>
-      <w:numFmt w:val="decimal"/>
-      <w:lvlText w:val="%4."/>
-      <w:lvlJc w:val="left"/>
-      <w:pPr>
-        <w:ind w:left="2880" w:hanging="360"/>
-      </w:pPr>
-    </w:lvl>
-    <w:lvl w:ilvl="4">
-      <w:start w:val="1"/>
-      <w:numFmt w:val="decimal"/>
-      <w:lvlText w:val="%5."/>
-      <w:lvlJc w:val="left"/>
-      <w:pPr>
-        <w:ind w:left="3600" w:hanging="360"/>
-      </w:pPr>
-    </w:lvl>
-    <w:lvl w:ilvl="5">
-      <w:start w:val="1"/>
-      <w:numFmt w:val="decimal"/>
-      <w:lvlText w:val="%6."/>
-      <w:lvlJc w:val="left"/>
-      <w:pPr>
-        <w:ind w:left="4320" w:hanging="360"/>
-      </w:pPr>
-    </w:lvl>
-    <w:lvl w:ilvl="6">
-      <w:start w:val="1"/>
-      <w:numFmt w:val="decimal"/>
-      <w:lvlText w:val="%7."/>
-      <w:lvlJc w:val="left"/>
-      <w:pPr>
-        <w:ind w:left="5040" w:hanging="360"/>
-      </w:pPr>
-    </w:lvl>
-    <w:lvl w:ilvl="7">
-      <w:start w:val="1"/>
-      <w:numFmt w:val="decimal"/>
-      <w:lvlText w:val="%8."/>
-      <w:lvlJc w:val="left"/>
-      <w:pPr>
-        <w:ind w:left="5760" w:hanging="360"/>
-      </w:pPr>
-    </w:lvl>
-    <w:lvl w:ilvl="8">
-      <w:start w:val="1"/>
-      <w:numFmt w:val="decimal"/>
-      <w:lvlText w:val="%9."/>
-      <w:lvlJc w:val="left"/>
-      <w:pPr>
-        <w:ind w:left="6480" w:hanging="360"/>
-      </w:pPr>
-    </w:lvl>
-  </w:abstractNum>
   <w:abstractNum w:abstractNumId="991">
     <w:nsid w:val="0000A991"/>
     <w:multiLevelType w:val="multilevel"/>
@@ -6165,36 +5794,6 @@
     <w:abstractNumId w:val="990"/>
   </w:num>
   <w:num w:numId="1001">
-    <w:abstractNumId w:val="99411"/>
-    <w:lvlOverride w:ilvl="0">
-      <w:startOverride w:val="1"/>
-    </w:lvlOverride>
-    <w:lvlOverride w:ilvl="1">
-      <w:startOverride w:val="1"/>
-    </w:lvlOverride>
-    <w:lvlOverride w:ilvl="2">
-      <w:startOverride w:val="1"/>
-    </w:lvlOverride>
-    <w:lvlOverride w:ilvl="3">
-      <w:startOverride w:val="1"/>
-    </w:lvlOverride>
-    <w:lvlOverride w:ilvl="4">
-      <w:startOverride w:val="1"/>
-    </w:lvlOverride>
-    <w:lvlOverride w:ilvl="5">
-      <w:startOverride w:val="1"/>
-    </w:lvlOverride>
-    <w:lvlOverride w:ilvl="6">
-      <w:startOverride w:val="1"/>
-    </w:lvlOverride>
-    <w:lvlOverride w:ilvl="7">
-      <w:startOverride w:val="1"/>
-    </w:lvlOverride>
-    <w:lvlOverride w:ilvl="8">
-      <w:startOverride w:val="1"/>
-    </w:lvlOverride>
-  </w:num>
-  <w:num w:numId="1002">
     <w:abstractNumId w:val="991"/>
   </w:num>
 </w:numbering>

</xml_diff>

<commit_message>
Round 6: fix number contradiction, encoding, self-citation, Usage loop, Table sources, wording
</commit_message>
<xml_diff>
--- a/submission/manuscript.docx
+++ b/submission/manuscript.docx
@@ -2,7 +2,7 @@
 <file path=word/document.xml><?xml version="1.0" encoding="utf-8"?>
 <w:document xmlns:w="http://schemas.openxmlformats.org/wordprocessingml/2006/main" xmlns:m="http://schemas.openxmlformats.org/officeDocument/2006/math" xmlns:r="http://schemas.openxmlformats.org/officeDocument/2006/relationships" xmlns:o="urn:schemas-microsoft-com:office:office" xmlns:v="urn:schemas-microsoft-com:vml" xmlns:w10="urn:schemas-microsoft-com:office:word" xmlns:a="http://schemas.openxmlformats.org/drawingml/2006/main" xmlns:pic="http://schemas.openxmlformats.org/drawingml/2006/picture" xmlns:wp="http://schemas.openxmlformats.org/drawingml/2006/wordprocessingDrawing">
   <w:body>
-    <w:bookmarkStart w:id="55" w:name="X86057564cd223f25774b1dcecee05ca31ed1e18"/>
+    <w:bookmarkStart w:id="56" w:name="X86057564cd223f25774b1dcecee05ca31ed1e18"/>
     <w:p>
       <w:pPr>
         <w:pStyle w:val="Heading1"/>
@@ -28,122 +28,6 @@
           <w:iCs/>
         </w:rPr>
         <w:t xml:space="preserve">Database: The Journal of Biological Databases and Curation</w:t>
-      </w:r>
-    </w:p>
-    <w:p>
-      <w:pPr>
-        <w:pStyle w:val="FirstParagraph"/>
-      </w:pPr>
-      <w:r>
-        <w:t xml:space="preserve">—## Abstract</w:t>
-      </w:r>
-    </w:p>
-    <w:p>
-      <w:pPr>
-        <w:pStyle w:val="BodyText"/>
-      </w:pPr>
-      <w:r>
-        <w:rPr>
-          <w:b/>
-          <w:bCs/>
-        </w:rPr>
-        <w:t xml:space="preserve">Objective:</w:t>
-      </w:r>
-      <w:r>
-        <w:t xml:space="preserve"> </w:t>
-      </w:r>
-      <w:r>
-        <w:t xml:space="preserve">Rheumatoid arthritis (RA) pain persists despite effective inflammation control, indicating that analgesic and inflammatory mechanisms are partially dissociable. Existing biological network resources do not distinguish pain-specific signaling pathways, provide tissue-contextual information for nociception-relevant compartments, or systematically document knowledge gaps. We present RA-PainKG, a tissue-contextualized knowledge graph with comprehensive coverage-gap documentation and benchmark validation.</w:t>
-      </w:r>
-    </w:p>
-    <w:p>
-      <w:pPr>
-        <w:pStyle w:val="BodyText"/>
-      </w:pPr>
-      <w:r>
-        <w:rPr>
-          <w:b/>
-          <w:bCs/>
-        </w:rPr>
-        <w:t xml:space="preserve">Materials and Methods:</w:t>
-      </w:r>
-      <w:r>
-        <w:t xml:space="preserve"> </w:t>
-      </w:r>
-      <w:r>
-        <w:t xml:space="preserve">RA-PainKG was constructed by integrating PrimeKG v1.0, GTEx v8 tissue expression data (54 tissues), and manual curation of 15 functional gene categories spanning nine core pain signaling pathways. Starting from 192 manually curated pain genes, 120 were identified in PrimeKG by exact symbol matching; 2-hop neighborhood expansion discovered 45 additional pain-relevant genes, yielding 165 annotated genes organized into Track A (immune-inflammation) and Track B (nociception). The graph contains 18,069 nodes (10 entity types) and 127,226 directed edges (24 relation types). All nine curated pathways were mapped (gene coverage: 57–100%). A systematic coverage-gap analysis identified 72 core pain genes absent from PrimeKG. Validation was performed via a multi-split ablation benchmark using the Norman Perturb-seq dataset (91,205 K562 cells) across 11 KG variants.</w:t>
-      </w:r>
-    </w:p>
-    <w:p>
-      <w:pPr>
-        <w:pStyle w:val="BodyText"/>
-      </w:pPr>
-      <w:r>
-        <w:rPr>
-          <w:b/>
-          <w:bCs/>
-        </w:rPr>
-        <w:t xml:space="preserve">Results:</w:t>
-      </w:r>
-      <w:r>
-        <w:t xml:space="preserve"> </w:t>
-      </w:r>
-      <w:r>
-        <w:t xml:space="preserve">RA-PainKG captures 120 of 192 core pain genes (62.5%) and maps all nine literature-curated pain signaling pathways. Coverage-gap analysis revealed that 37.5% of core pain genes are absent from PrimeKG, concentrated in complement cascade, anesthetic targets, and GABA receptor families. Network topology identified EGR1, FOS, STAT3, JUN, and AKT1 as top hub nodes by betweenness centrality. Benchmark validation confirmed that the graph’s predictive utility is constrained by K562 cell-type limitations (59.1% of measurable pain genes below expression threshold), establishing honest boundary conditions for downstream applications.</w:t>
-      </w:r>
-    </w:p>
-    <w:p>
-      <w:pPr>
-        <w:pStyle w:val="BodyText"/>
-      </w:pPr>
-      <w:r>
-        <w:rPr>
-          <w:b/>
-          <w:bCs/>
-        </w:rPr>
-        <w:t xml:space="preserve">Discussion:</w:t>
-      </w:r>
-      <w:r>
-        <w:t xml:space="preserve"> </w:t>
-      </w:r>
-      <w:r>
-        <w:t xml:space="preserve">RA-PainKG fills a specific resource gap: a tissue-contextualized, dual-track knowledge graph with systematic coverage-gap documentation absent from general-purpose resources. The benchmark validation, while limited by K562 cell-type constraints, provides transparent performance characterization and demonstrates the necessity of disease-relevant test systems for domain KG evaluation.</w:t>
-      </w:r>
-    </w:p>
-    <w:p>
-      <w:pPr>
-        <w:pStyle w:val="BodyText"/>
-      </w:pPr>
-      <w:r>
-        <w:rPr>
-          <w:b/>
-          <w:bCs/>
-        </w:rPr>
-        <w:t xml:space="preserve">Conclusion:</w:t>
-      </w:r>
-      <w:r>
-        <w:t xml:space="preserve"> </w:t>
-      </w:r>
-      <w:r>
-        <w:t xml:space="preserve">RA-PainKG is publicly available (GraphML, CSV, Python pickle) at https://github.com/yyx-4113/ra-painkg under the MIT license, with complete source code and documentation.</w:t>
-      </w:r>
-    </w:p>
-    <w:p>
-      <w:pPr>
-        <w:pStyle w:val="BodyText"/>
-      </w:pPr>
-      <w:r>
-        <w:rPr>
-          <w:b/>
-          <w:bCs/>
-        </w:rPr>
-        <w:t xml:space="preserve">Keywords:</w:t>
-      </w:r>
-      <w:r>
-        <w:t xml:space="preserve"> </w:t>
-      </w:r>
-      <w:r>
-        <w:t xml:space="preserve">knowledge graph; rheumatoid arthritis; pain signaling; PrimeKG; GTEx; coverage-gap analysis; tissue-specific; database resource</w:t>
       </w:r>
     </w:p>
     <w:p>
@@ -154,64 +38,189 @@
       </w:r>
     </w:p>
     <w:bookmarkEnd w:id="20"/>
-    <w:bookmarkStart w:id="21" w:name="introduction"/>
+    <w:bookmarkStart w:id="21" w:name="abstract"/>
     <w:p>
       <w:pPr>
         <w:pStyle w:val="Heading2"/>
       </w:pPr>
       <w:r>
-        <w:t xml:space="preserve">1. Introduction</w:t>
+        <w:t xml:space="preserve">Abstract</w:t>
       </w:r>
     </w:p>
     <w:p>
       <w:pPr>
         <w:pStyle w:val="FirstParagraph"/>
-      </w:pPr>
-      <w:r>
-        <w:t xml:space="preserve">Rheumatoid arthritis (RA) affects approximately 1% of the global population, causing chronic synovial inflammation that leads to joint destruction and persistent pain [1,2]. Disease-modifying antirheumatic drugs and biologic agents effectively control inflammation in many patients, yet a substantial proportion continue to experience clinically significant pain [3,4]. This dissociation between anti-inflammatory efficacy and analgesia reveals a specific knowledge gap: pain signaling pathways in RA are not adequately captured by existing biological network resources.</w:t>
-      </w:r>
-    </w:p>
-    <w:p>
-      <w:pPr>
-        <w:pStyle w:val="BodyText"/>
-      </w:pPr>
-      <w:r>
-        <w:t xml:space="preserve">The molecular basis of RA pain operates across multiple anatomical compartments. Peripheral nociceptors express transduction channels (TRPV1, TRPA1, Nav1.7/SCN9A) that initiate pain signals [5,6]. Spinal dorsal horn circuits process these signals through neuropeptide and neurotrophin mediators (CGRP, Substance P, BDNF-TrkB) [7]. Descending modulatory pathways (opioid, GABAergic, serotonergic) regulate pain transmission from supraspinal centers. These mechanisms operate in distinct tissue contexts that generic interaction networks cannot distinguish.</w:t>
-      </w:r>
-    </w:p>
-    <w:p>
-      <w:pPr>
-        <w:pStyle w:val="BodyText"/>
-      </w:pPr>
-      <w:r>
-        <w:t xml:space="preserve">Existing biological network resources have critical limitations for pain mechanism research. STRING [8] and BioGRID [9] provide comprehensive protein-protein interaction data but lack tissue specificity, directionality, and drug-target annotations. KEGG [10], Reactome [11], and WikiPathways [12] offer curated pathway models without tissue contextualization. PrimeKG [13] integrates 20 biomedical resources into a unified multimodal knowledge graph, representing a major advance over single-source networks. However, PrimeKG remains a general-purpose resource: it does not distinguish pain-specific signaling from general inflammatory pathways, lacks tissue expression filtering, and provides no systematic documentation of coverage gaps. Pain-focused resources such as the IUPHAR/BPS Guide to Pharmacology [14] and the Human Pain Genetics Database [15] curate pain-relevant genes, while DisGeNET [17] provides gene-disease associations, but these resources lack network connectivity and multi-entity integration.</w:t>
-      </w:r>
-    </w:p>
-    <w:p>
-      <w:pPr>
-        <w:pStyle w:val="BodyText"/>
-      </w:pPr>
-      <w:r>
-        <w:t xml:space="preserve">The consequence is a fragmented resource landscape. Researchers must either use general-purpose knowledge graphs that lack pain-specific organization, or pain-specific gene lists that lack network structure. A resource that integrates curated pain gene annotations with multimodal biomedical network data, provides tissue-contextual filtering, and systematically documents knowledge gaps would fill a specific and well-defined need.</w:t>
-      </w:r>
-    </w:p>
-    <w:p>
-      <w:pPr>
-        <w:pStyle w:val="BodyText"/>
-      </w:pPr>
-      <w:r>
-        <w:t xml:space="preserve">We present RA-PainKG, a tissue-contextualized dual-track knowledge graph constructed by integrating PrimeKG v1.0 [13] with GTEx v8 tissue expression data [16] and manual curation of 15 functional gene categories spanning nine core pain signaling pathways. The resource contains 18,069 nodes across 10 entity types and 127,226 directed edges across 24 relation types. Starting from 192 manually curated pain genes, 120 (62.5%) matched PrimeKG by exact symbol; 2-hop neighborhood expansion identified 45 additional pain-relevant genes, yielding 165 annotated genes organized into Track A (immune-inflammation, 106 genes) and Track B (nociception-pain transduction, 122 genes, with 96 overlapping). A systematic coverage-gap analysis documents 72 core pain genes (37.5%) absent from PrimeKG. Transparent benchmark validation using the Norman K562 Perturb-seq dataset [20] establishes honest boundary conditions. All graph files, source code, and documentation are publicly available under the MIT license at https://github.com/yyx-4113/ra-painkg [19].</w:t>
-      </w:r>
-    </w:p>
-    <w:p>
-      <w:pPr>
-        <w:pStyle w:val="BodyText"/>
       </w:pPr>
       <w:r>
         <w:rPr>
           <w:b/>
           <w:bCs/>
         </w:rPr>
+        <w:t xml:space="preserve">Objective:</w:t>
+      </w:r>
+      <w:r>
+        <w:t xml:space="preserve"> </w:t>
+      </w:r>
+      <w:r>
+        <w:t xml:space="preserve">Rheumatoid arthritis (RA) pain persists despite effective inflammation control, indicating that analgesic and inflammatory mechanisms are partially dissociable. Existing biological network resources do not distinguish pain-specific signaling pathways, provide tissue-contextual information for nociception-relevant compartments, or systematically document knowledge gaps. We present RA-PainKG, a tissue-contextualized knowledge graph with comprehensive coverage-gap documentation and benchmark validation.</w:t>
+      </w:r>
+    </w:p>
+    <w:p>
+      <w:pPr>
+        <w:pStyle w:val="BodyText"/>
+      </w:pPr>
+      <w:r>
+        <w:rPr>
+          <w:b/>
+          <w:bCs/>
+        </w:rPr>
+        <w:t xml:space="preserve">Materials and Methods:</w:t>
+      </w:r>
+      <w:r>
+        <w:t xml:space="preserve"> </w:t>
+      </w:r>
+      <w:r>
+        <w:t xml:space="preserve">RA-PainKG was constructed by integrating PrimeKG v1.0, GTEx v8 tissue expression data (54 tissues), and manual curation of 15 functional gene categories spanning nine core pain signaling pathways. Starting from 192 manually curated pain genes, 120 were identified in PrimeKG by exact symbol matching; 2-hop neighborhood expansion discovered 45 additional pain-relevant genes, yielding 165 annotated genes organized into Track A (immune-inflammation) and Track B (nociception). The graph contains 18,069 nodes (10 entity types) and 127,226 directed edges (24 relation types). All nine curated pathways were mapped (gene coverage: 57–100%). A systematic coverage-gap analysis identified 72 core pain genes absent from PrimeKG. Validation was performed via a multi-split ablation benchmark using the Norman Perturb-seq dataset (91,205 K562 cells) across 11 KG variants.</w:t>
+      </w:r>
+    </w:p>
+    <w:p>
+      <w:pPr>
+        <w:pStyle w:val="BodyText"/>
+      </w:pPr>
+      <w:r>
+        <w:rPr>
+          <w:b/>
+          <w:bCs/>
+        </w:rPr>
+        <w:t xml:space="preserve">Results:</w:t>
+      </w:r>
+      <w:r>
+        <w:t xml:space="preserve"> </w:t>
+      </w:r>
+      <w:r>
+        <w:t xml:space="preserve">RA-PainKG captures 120 of 192 core pain genes (62.5%) and maps all nine literature-curated pain signaling pathways. Coverage-gap analysis revealed that 37.5% of core pain genes are absent from PrimeKG, concentrated in complement cascade, anesthetic targets, and GABA receptor families. Network topology identified EGR1, FOS, STAT3, JUN, and AKT1 as top hub nodes by betweenness centrality. Benchmark validation confirmed that the graph’s predictive utility is constrained by K562 cell-type limitations (59.1% of measurable pain genes below expression threshold), establishing honest boundary conditions for downstream applications.</w:t>
+      </w:r>
+    </w:p>
+    <w:p>
+      <w:pPr>
+        <w:pStyle w:val="BodyText"/>
+      </w:pPr>
+      <w:r>
+        <w:rPr>
+          <w:b/>
+          <w:bCs/>
+        </w:rPr>
+        <w:t xml:space="preserve">Discussion:</w:t>
+      </w:r>
+      <w:r>
+        <w:t xml:space="preserve"> </w:t>
+      </w:r>
+      <w:r>
+        <w:t xml:space="preserve">RA-PainKG fills a specific resource gap: a tissue-contextualized, dual-track knowledge graph with systematic coverage-gap documentation absent from general-purpose resources. The benchmark validation, while limited by K562 cell-type constraints, provides transparent performance characterization and demonstrates the necessity of disease-relevant test systems for domain KG evaluation.</w:t>
+      </w:r>
+    </w:p>
+    <w:p>
+      <w:pPr>
+        <w:pStyle w:val="BodyText"/>
+      </w:pPr>
+      <w:r>
+        <w:rPr>
+          <w:b/>
+          <w:bCs/>
+        </w:rPr>
+        <w:t xml:space="preserve">Conclusion:</w:t>
+      </w:r>
+      <w:r>
+        <w:t xml:space="preserve"> </w:t>
+      </w:r>
+      <w:r>
+        <w:t xml:space="preserve">RA-PainKG is publicly available (GraphML, CSV, Python pickle) at https://github.com/yyx-4113/ra-painkg under the MIT license, with complete source code and documentation.</w:t>
+      </w:r>
+    </w:p>
+    <w:p>
+      <w:pPr>
+        <w:pStyle w:val="BodyText"/>
+      </w:pPr>
+      <w:r>
+        <w:rPr>
+          <w:b/>
+          <w:bCs/>
+        </w:rPr>
+        <w:t xml:space="preserve">Keywords:</w:t>
+      </w:r>
+      <w:r>
+        <w:t xml:space="preserve"> </w:t>
+      </w:r>
+      <w:r>
+        <w:t xml:space="preserve">knowledge graph; rheumatoid arthritis; pain signaling; PrimeKG; GTEx; coverage-gap analysis; tissue-specific; database resource</w:t>
+      </w:r>
+    </w:p>
+    <w:p>
+      <w:r>
+        <w:pict>
+          <v:rect style="width:0;height:1.5pt" o:hralign="center" o:hrstd="t" o:hr="t"/>
+        </w:pict>
+      </w:r>
+    </w:p>
+    <w:bookmarkEnd w:id="21"/>
+    <w:bookmarkStart w:id="22" w:name="introduction"/>
+    <w:p>
+      <w:pPr>
+        <w:pStyle w:val="Heading2"/>
+      </w:pPr>
+      <w:r>
+        <w:t xml:space="preserve">1. Introduction</w:t>
+      </w:r>
+    </w:p>
+    <w:p>
+      <w:pPr>
+        <w:pStyle w:val="FirstParagraph"/>
+      </w:pPr>
+      <w:r>
+        <w:t xml:space="preserve">Rheumatoid arthritis (RA) affects approximately 1% of the global population, causing chronic synovial inflammation that leads to joint destruction and persistent pain [1,2]. Disease-modifying antirheumatic drugs and biologic agents effectively control inflammation in many patients, yet a substantial proportion continue to experience clinically significant pain [3,4]. This dissociation between anti-inflammatory efficacy and analgesia reveals a specific knowledge gap: pain signaling pathways in RA are not adequately captured by existing biological network resources.</w:t>
+      </w:r>
+    </w:p>
+    <w:p>
+      <w:pPr>
+        <w:pStyle w:val="BodyText"/>
+      </w:pPr>
+      <w:r>
+        <w:t xml:space="preserve">The molecular basis of RA pain operates across multiple anatomical compartments. Peripheral nociceptors express transduction channels (TRPV1, TRPA1, Nav1.7/SCN9A) that initiate pain signals [5,6]. Spinal dorsal horn circuits process these signals through neuropeptide and neurotrophin mediators (CGRP, Substance P, BDNF-TrkB) [7]. Descending modulatory pathways (opioid, GABAergic, serotonergic) regulate pain transmission from supraspinal centers. These mechanisms operate in distinct tissue contexts that generic interaction networks cannot distinguish.</w:t>
+      </w:r>
+    </w:p>
+    <w:p>
+      <w:pPr>
+        <w:pStyle w:val="BodyText"/>
+      </w:pPr>
+      <w:r>
+        <w:t xml:space="preserve">Existing biological network resources have critical limitations for pain mechanism research. STRING [8] and BioGRID [9] provide comprehensive protein-protein interaction data but lack tissue specificity, directionality, and drug-target annotations. KEGG [10], Reactome [11], and WikiPathways [12] offer curated pathway models without tissue contextualization. PrimeKG [13] integrates 20 biomedical resources into a unified multimodal knowledge graph, representing a major advance over single-source networks. However, PrimeKG remains a general-purpose resource: it does not distinguish pain-specific signaling from general inflammatory pathways, lacks tissue expression filtering, and provides no systematic documentation of coverage gaps. Pain-focused resources such as the IUPHAR/BPS Guide to Pharmacology [14] and the Human Pain Genetics Database [15] curate pain-relevant genes, while DisGeNET [17] provides gene-disease associations, but these resources lack network connectivity and multi-entity integration.</w:t>
+      </w:r>
+    </w:p>
+    <w:p>
+      <w:pPr>
+        <w:pStyle w:val="BodyText"/>
+      </w:pPr>
+      <w:r>
+        <w:t xml:space="preserve">The consequence is a fragmented resource landscape. Researchers must either use general-purpose knowledge graphs that lack pain-specific organization, or pain-specific gene lists that lack network structure. A resource that integrates curated pain gene annotations with multimodal biomedical network data, provides tissue-contextual filtering, and systematically documents knowledge gaps would fill a specific and well-defined need.</w:t>
+      </w:r>
+    </w:p>
+    <w:p>
+      <w:pPr>
+        <w:pStyle w:val="BodyText"/>
+      </w:pPr>
+      <w:r>
+        <w:t xml:space="preserve">We present RA-PainKG, a tissue-contextualized dual-track knowledge graph constructed by integrating PrimeKG v1.0 [13] with GTEx v8 tissue expression data [16] and manual curation of 15 functional gene categories spanning nine core pain signaling pathways. The resource contains 18,069 nodes across 10 entity types and 127,226 directed edges across 24 relation types. Starting from 192 manually curated pain genes, 120 (62.5%) matched PrimeKG by exact symbol; 2-hop neighborhood expansion identified 45 additional pain-relevant genes, yielding 165 annotated genes, of which 106 were assigned to Track A (immune-inflammation), 122 to Track B (nociception-pain transduction, 96 overlapping between tracks), and 33 to neither track (expansion-discovered genes without clear pain functional assignment). A systematic coverage-gap analysis documents 72 core pain genes (37.5%) absent from PrimeKG. Transparent benchmark validation using the Norman K562 Perturb-seq dataset [20] establishes honest boundary conditions. All graph files, source code, and documentation are publicly available under the MIT license at https://github.com/yyx-4113/ra-painkg [19].</w:t>
+      </w:r>
+    </w:p>
+    <w:p>
+      <w:pPr>
+        <w:pStyle w:val="BodyText"/>
+      </w:pPr>
+      <w:r>
+        <w:rPr>
+          <w:b/>
+          <w:bCs/>
+        </w:rPr>
         <w:t xml:space="preserve">Significance Statement</w:t>
       </w:r>
     </w:p>
@@ -266,7 +275,7 @@
         <w:t xml:space="preserve"> </w:t>
       </w:r>
       <w:r>
-        <w:t xml:space="preserve">RA-PainKG, a tissue-contextualized dual-track knowledge graph integrating PrimeKG with GTEx v8 expression data and manual curation of nine pain signaling pathways. The resource includes systematic coverage-gap documentation identifying 72 core pain genes (37.5%) absent from existing biomedical knowledge graphs. All nine curated pain pathways are mapped (57-100% gene coverage), and 4,760 drug-target edges enable direct pharmacological queries.</w:t>
+        <w:t xml:space="preserve">RA-PainKG, a tissue-contextualized dual-track knowledge graph integrating PrimeKG with GTEx v8 expression data and manual curation of 15 functional gene categories spanning nine pain signaling pathways. The resource includes systematic coverage-gap documentation identifying 72 core pain genes (37.5%) absent from existing biomedical knowledge graphs. All nine curated pain pathways are mapped (57-100% gene coverage), and 4,760 drug-target edges enable direct pharmacological queries.</w:t>
       </w:r>
     </w:p>
     <w:p>
@@ -287,8 +296,8 @@
         <w:t xml:space="preserve">Pain biology researchers requiring structured, tissue-aware knowledge representations; bioinformaticians developing machine learning models with domain-specific prior knowledge; and knowledge graph curators seeking a reproducible construction framework with transparent knowledge-gap documentation.</w:t>
       </w:r>
     </w:p>
-    <w:bookmarkEnd w:id="21"/>
-    <w:bookmarkStart w:id="28" w:name="materials-and-methods"/>
+    <w:bookmarkEnd w:id="22"/>
+    <w:bookmarkStart w:id="29" w:name="materials-and-methods"/>
     <w:p>
       <w:pPr>
         <w:pStyle w:val="Heading2"/>
@@ -297,7 +306,7 @@
         <w:t xml:space="preserve">2. Materials and Methods</w:t>
       </w:r>
     </w:p>
-    <w:bookmarkStart w:id="22" w:name="knowledge-graph-construction"/>
+    <w:bookmarkStart w:id="23" w:name="knowledge-graph-construction"/>
     <w:p>
       <w:pPr>
         <w:pStyle w:val="Heading3"/>
@@ -311,11 +320,11 @@
         <w:pStyle w:val="FirstParagraph"/>
       </w:pPr>
       <w:r>
-        <w:t xml:space="preserve">RA-PainKG was constructed in three stages (detailed protocol in [19]).</w:t>
-      </w:r>
-    </w:p>
-    <w:bookmarkEnd w:id="22"/>
-    <w:bookmarkStart w:id="23" w:name="ra-painkg-construction-pipeline"/>
+        <w:t xml:space="preserve">RA-PainKG was constructed in three stages (detailed below in Sections 2.2-2.3).</w:t>
+      </w:r>
+    </w:p>
+    <w:bookmarkEnd w:id="23"/>
+    <w:bookmarkStart w:id="24" w:name="ra-painkg-construction-pipeline"/>
     <w:p>
       <w:pPr>
         <w:pStyle w:val="Heading3"/>
@@ -384,7 +393,7 @@
         <w:t xml:space="preserve"> </w:t>
       </w:r>
       <w:r>
-        <w:t xml:space="preserve">GTEx v8 median tissue expression data [16] were used to annotate each pain gene with tissue-specific expression levels across 54 human tissues. For nociception-relevant compartments, we used spinal cord (cervical C1), tibial nerve, whole blood, and spleen as proxies. A gene was classified as tissue-expressed if median TPM &gt;= 1.0 in the relevant tissue. This information is provided as node attributes in the GraphML and CSV formats but was not used to filter edges in the current release, as removing edges based on bulk tissue expression risks discarding valid low-expression interactions. Future versions will incorporate single-cell expression data for finer tissue-contextual filtering.</w:t>
+        <w:t xml:space="preserve">GTEx v8 median tissue expression data [16] were used to annotate each pain gene with tissue-specific expression levels across 54 human tissues. For nociception-relevant compartments, we used spinal cord (cervical C1), tibial nerve, whole blood, and spleen as proxies. A gene was classified as tissue-expressed if median TPM &gt;= 1.0 in the relevant tissue, following standard GTEx expression thresholds [16]. This information is provided as node attributes in the GraphML and CSV formats but was not used to filter edges in the current release, as removing edges based on bulk tissue expression risks discarding valid low-expression interactions. Future versions will incorporate single-cell expression data for finer tissue-contextual filtering.</w:t>
       </w:r>
     </w:p>
     <w:p>
@@ -405,8 +414,8 @@
         <w:t xml:space="preserve">All PrimeKG edges involving the 165 annotated genes were retained: 2,400 protein-protein interaction edges and 124,826 non-PPI edges (pathway, bioprocess, drug-target across 24 relation types). Graph statistics: 18,069 nodes (10 entity types), 127,226 directed edges. Only 44 of the 165 annotated genes (26.7%) overlap with the Norman K562 Perturb-seq gene vocabulary (Supplementary Table S6).</w:t>
       </w:r>
     </w:p>
-    <w:bookmarkEnd w:id="23"/>
-    <w:bookmarkStart w:id="24" w:name="coverage-gap-analysis"/>
+    <w:bookmarkEnd w:id="24"/>
+    <w:bookmarkStart w:id="25" w:name="coverage-gap-analysis"/>
     <w:p>
       <w:pPr>
         <w:pStyle w:val="Heading3"/>
@@ -916,8 +925,8 @@
         <w:t xml:space="preserve">STRING PPI (v12) was included in the benchmark as the 11th variant but yielded zero predictive signal (r = 0.000 on all subsets), consistent with Identity (no-edge) performance. We attribute this null result to ENSP-to-gene-symbol mapping at the 5,045-gene scale, which introduces identifier ambiguity that degrades the spectral structure relative to the intentionally dense Random graphs. The 11 variants tested span the full density-accuracy design space, with Random graphs and GO serving as dense baselines and the ablation variants (degPreserved, painCentric) testing domain specificity.</w:t>
       </w:r>
     </w:p>
-    <w:bookmarkEnd w:id="24"/>
-    <w:bookmarkStart w:id="25" w:name="Xbeca6b780cec9ce231168ef405910ff7a6161ec"/>
+    <w:bookmarkEnd w:id="25"/>
+    <w:bookmarkStart w:id="26" w:name="Xbeca6b780cec9ce231168ef405910ff7a6161ec"/>
     <w:p>
       <w:pPr>
         <w:pStyle w:val="Heading3"/>
@@ -934,8 +943,8 @@
         <w:t xml:space="preserve">The Norman et al. Perturb-seq dataset (DOI: 10.7910/DVN/R9JDLS) profiles CRISPRi in K562 chronic myeloid leukemia cells [20]. The processed dataset (perturb_processed.h5ad, 2.2 GB; Harvard Dataverse datafile 6154020) contains 5,045 genes across 91,205 cells with 284 perturbation conditions (single-gene and combinatorial). We aggregate cells by perturbation condition to compute mean post-perturbation expression changes (delta = condition_mean - ctrl_mean). Control expression variance across genes is 0.194 (SD = 0.441), computed from log-normalized expression values.</w:t>
       </w:r>
     </w:p>
-    <w:bookmarkEnd w:id="25"/>
-    <w:bookmarkStart w:id="26" w:name="benchmark-validation-methods"/>
+    <w:bookmarkEnd w:id="26"/>
+    <w:bookmarkStart w:id="27" w:name="benchmark-validation-methods"/>
     <w:p>
       <w:pPr>
         <w:pStyle w:val="Heading3"/>
@@ -952,8 +961,8 @@
         <w:t xml:space="preserve">For validation, 128-dimensional gene embeddings were computed via spectral decomposition of the normalized graph Laplacian (k = 128) for each KG [22]. Perturbation effects were predicted via ridge regression (lambda = 0.1) across 10 independent train/test splits (80%/20%). This linear architecture isolates KG contribution from model capacity. Paired t-tests with Bonferroni correction (alpha = 0.01, m = 5) and Kendall’s W ranking consistency were used for statistical comparison. Sensitivity analyses for regularization (alpha = 0.001–100.0) and embedding dimension (k = 32–512) confirmed robustness. K562 pain gene expression was quantified per-gene for all 44 pain-annotated genes (mean expression, percent expressing cells). Complete methods, including spectral decomposition details, nonlinear model comparison (MLP vs ridge), GEARS architecture comparison [21], evaluation protocol, and power analysis, are provided in Supplementary Methods.</w:t>
       </w:r>
     </w:p>
-    <w:bookmarkEnd w:id="26"/>
-    <w:bookmarkStart w:id="27" w:name="implementation"/>
+    <w:bookmarkEnd w:id="27"/>
+    <w:bookmarkStart w:id="28" w:name="implementation"/>
     <w:p>
       <w:pPr>
         <w:pStyle w:val="Heading3"/>
@@ -970,9 +979,9 @@
         <w:t xml:space="preserve">Python 3.10+, ScanPy 1.12, NetworkX 3.6, NumPy, SciPy, scikit-learn. Total compute time: approximately 12 minutes (Intel i9-13900K, 64 GB RAM). Full pipeline and processed data at https://github.com/yyx-4113/ra-painkg.</w:t>
       </w:r>
     </w:p>
-    <w:bookmarkEnd w:id="27"/>
     <w:bookmarkEnd w:id="28"/>
-    <w:bookmarkStart w:id="32" w:name="results"/>
+    <w:bookmarkEnd w:id="29"/>
+    <w:bookmarkStart w:id="33" w:name="results"/>
     <w:p>
       <w:pPr>
         <w:pStyle w:val="Heading2"/>
@@ -981,7 +990,7 @@
         <w:t xml:space="preserve">3. Results</w:t>
       </w:r>
     </w:p>
-    <w:bookmarkStart w:id="29" w:name="ra-painkg-resource-description"/>
+    <w:bookmarkStart w:id="30" w:name="ra-painkg-resource-description"/>
     <w:p>
       <w:pPr>
         <w:pStyle w:val="Heading3"/>
@@ -1011,11 +1020,11 @@
         <w:pStyle w:val="BodyText"/>
       </w:pPr>
       <w:r>
-        <w:t xml:space="preserve">All nine literature-curated pain signaling pathways were successfully mapped onto RA-PainKG with gene coverage ranging from 57% (complement cascade) to 100% (TRP channels, voltage-gated sodium channels, neurotrophin signaling). The dual-track organization is summarized in Table S1: Track A (immune-inflammation, 106 genes) and Track B (nociception-pain transduction, 122 genes), with 96 genes (58.2%) spanning both tracks. The substantial Track A/B overlap (58.2%) is biologically expected: transcription factors (FOS, JUN, STAT3) activated by inflammatory cytokines also drive nociceptive sensitization, MAP kinases transduce both inflammatory and pain signals, and prostaglandins (via COX-2/PTGS2) bridge immune activation and nociceptor sensitization [5,7]. Rather than indicating poor track separation, this overlap reflects the mechanistic reality that inflammation and pain are deeply coupled in RA. The dual-track framework serves as a conceptual lens for hypothesis generation: genes exclusive to Track A or B may represent intervention points where anti-inflammatory and analgesic effects can be partially decoupled, while dual-track hub genes represent convergence points where both processes are jointly regulated.</w:t>
-      </w:r>
-    </w:p>
-    <w:bookmarkEnd w:id="29"/>
-    <w:bookmarkStart w:id="30" w:name="coverage-gap-analysis-1"/>
+        <w:t xml:space="preserve">All nine literature-curated pain signaling pathways were successfully mapped onto RA-PainKG with gene coverage ranging from 57% (complement cascade) to 100% (TRP channels, voltage-gated sodium channels, neurotrophin signaling). The 165 annotated genes span 15 functional categories (TRP channels, voltage-gated sodium channels, neurotrophin signaling, opioid signaling, MAPK pathway, JAK-STAT pathway, prostaglandin pathway, kinase signaling, transcription factors, serotonin receptors, endocannabinoid system, complement cascade, GABA/glycine receptors, RA-specific genes, and anesthetic targets; complete list in Supplementary Table S1). The dual-track organization is summarized in Table S1: Track A (immune-inflammation, 106 genes) and Track B (nociception-pain transduction, 122 genes), with 96 genes (58.2%) spanning both tracks. The substantial Track A/B overlap (58.2%) is biologically expected: transcription factors (FOS, JUN, STAT3) activated by inflammatory cytokines also drive nociceptive sensitization, MAP kinases transduce both inflammatory and pain signals, and prostaglandins (via COX-2/PTGS2) bridge immune activation and nociceptor sensitization [5,7]. Rather than indicating poor track separation, this overlap reflects the mechanistic reality that inflammation and pain are deeply coupled in RA. The dual-track framework serves as a conceptual lens for hypothesis generation: genes exclusive to Track A or B may represent intervention points where anti-inflammatory and analgesic effects can be partially decoupled, while dual-track hub genes represent convergence points where both processes are jointly regulated.</w:t>
+      </w:r>
+    </w:p>
+    <w:bookmarkEnd w:id="30"/>
+    <w:bookmarkStart w:id="31" w:name="coverage-gap-analysis-1"/>
     <w:p>
       <w:pPr>
         <w:pStyle w:val="Heading3"/>
@@ -2058,8 +2067,8 @@
         </w:tc>
       </w:tr>
     </w:tbl>
-    <w:bookmarkEnd w:id="30"/>
-    <w:bookmarkStart w:id="31" w:name="benchmark-validation"/>
+    <w:bookmarkEnd w:id="31"/>
+    <w:bookmarkStart w:id="32" w:name="benchmark-validation"/>
     <w:p>
       <w:pPr>
         <w:pStyle w:val="Heading3"/>
@@ -2100,9 +2109,9 @@
         <w:t xml:space="preserve">Complete benchmark results for all 11 KG variants, paired statistical comparisons, sensitivity analyses (alpha = 0.001-100.0, k = 32-512), Kendall’s W ranking consistency (0.64-0.65), and ablation analyses are documented in Supplementary Tables S1-S6.</w:t>
       </w:r>
     </w:p>
-    <w:bookmarkEnd w:id="31"/>
     <w:bookmarkEnd w:id="32"/>
-    <w:bookmarkStart w:id="39" w:name="discussion"/>
+    <w:bookmarkEnd w:id="33"/>
+    <w:bookmarkStart w:id="40" w:name="discussion"/>
     <w:p>
       <w:pPr>
         <w:pStyle w:val="Heading2"/>
@@ -2111,7 +2120,7 @@
         <w:t xml:space="preserve">4. Discussion</w:t>
       </w:r>
     </w:p>
-    <w:bookmarkStart w:id="33" w:name="ra-painkg-as-a-knowledge-resource"/>
+    <w:bookmarkStart w:id="34" w:name="ra-painkg-as-a-knowledge-resource"/>
     <w:p>
       <w:pPr>
         <w:pStyle w:val="Heading3"/>
@@ -2776,11 +2785,19 @@
         <w:pStyle w:val="BodyText"/>
       </w:pPr>
       <w:r>
+        <w:t xml:space="preserve">Coverage percentages for comparator resources (IUPHAR Pain, DisGeNET) were computed by querying each resource for the same 192-gene curated set by gene symbol, following each resource’s standard query interface. See Supplementary Methods for query details.</w:t>
+      </w:r>
+    </w:p>
+    <w:p>
+      <w:pPr>
+        <w:pStyle w:val="BodyText"/>
+      </w:pPr>
+      <w:r>
         <w:t xml:space="preserve">RA-PainKG serves three primary use cases. First, as a queryable knowledge base: researchers can extract pathway subnetworks (all nine curated pain pathways), identify drugs targeting specific pain genes, and retrieve tissue expression profiles across 54 human tissues. Second, as a hypothesis-generation tool: the dual-track framework enables systematic comparison of inflammatory versus nociceptive mechanisms, and bridge genes (STAT3, RELA, NF-kappaB complex) connecting both tracks represent candidate intervention points. Third, as structured prior knowledge for machine learning: the graph provides domain-specific features for gene perturbation prediction, drug repurposing pipelines, and causal mediator identification. Transparent benchmark validation (Section 4.3) establishes the boundary conditions under which each use case applies.</w:t>
       </w:r>
     </w:p>
-    <w:bookmarkEnd w:id="33"/>
-    <w:bookmarkStart w:id="34" w:name="the-value-of-coverage-gap-documentation"/>
+    <w:bookmarkEnd w:id="34"/>
+    <w:bookmarkStart w:id="35" w:name="the-value-of-coverage-gap-documentation"/>
     <w:p>
       <w:pPr>
         <w:pStyle w:val="Heading3"/>
@@ -2794,11 +2811,11 @@
         <w:pStyle w:val="FirstParagraph"/>
       </w:pPr>
       <w:r>
-        <w:t xml:space="preserve">The systematic identification of 72 absent genes (37.5% of the curated set) represents a resource contribution in its own right. Rather than silently omitting these genes, RA-PainKG documents exactly which genes are missing, why (identifier mismatch, annotation gaps in PrimeKG), and where researchers should look for alternative information (Supplementary Table S3). This transparency serves multiple purposes: (1) it prevents false-negative conclusions when querying RA-PainKG for specific genes; (2) it identifies systematic curation biases (complement cascade, anesthetic targets, GABA receptors are underrepresented across all general-purpose biomedical KGs); and (3) it provides a prioritized list for future resource development. This approach-a knowledge graph that explicitly documents what it does not contain-is uncommon in the biomedical database literature. While resources such as the IUPHAR/BPS Guide to Pharmacology [14] acknowledge incomplete coverage in narrative form, systematic per-gene gap documentation with categorized absence reasons is rarely implemented. We argue this practice represents a methodological contribution for transparent resource development.</w:t>
-      </w:r>
-    </w:p>
-    <w:bookmarkEnd w:id="34"/>
-    <w:bookmarkStart w:id="35" w:name="X5d4c2885636e0a62531c778a83e0fa67c2a5235"/>
+        <w:t xml:space="preserve">The systematic identification of 72 absent genes (37.5% of the curated set) represents a resource contribution in its own right. Rather than silently omitting these genes, RA-PainKG documents exactly which genes are missing, why (identifier mismatch, annotation gaps in PrimeKG), and where researchers should look for alternative information (Supplementary Table S3). This transparency serves multiple purposes: (1) it prevents false-negative conclusions when querying RA-PainKG for specific genes; (2) it identifies systematic curation biases (complement cascade, anesthetic targets, GABA receptors are underrepresented across all general-purpose biomedical KGs); and (3) it provides a prioritized list for future resource development. This approach-a knowledge graph that explicitly documents what it does not contain-is, to our knowledge, rarely implemented in published biomedical knowledge graphs. While resources such as the IUPHAR/BPS Guide to Pharmacology [14] acknowledge incomplete coverage in narrative form, systematic per-gene gap documentation with categorized absence reasons has few precedents. We suggest this practice represents a methodological contribution for transparent resource development.</w:t>
+      </w:r>
+    </w:p>
+    <w:bookmarkEnd w:id="35"/>
+    <w:bookmarkStart w:id="36" w:name="X5d4c2885636e0a62531c778a83e0fa67c2a5235"/>
     <w:p>
       <w:pPr>
         <w:pStyle w:val="Heading3"/>
@@ -2839,8 +2856,8 @@
         <w:t xml:space="preserve">We emphasize that the K562 benchmark cannot resolve whether domain KGs improve prediction in disease-relevant systems. Sensory neuron models (iPSC-derived nociceptors, DRG organoids) remain the essential next step for evaluating whether RA-PainKG’s domain-specific prior knowledge confers advantages in biologically appropriate contexts.</w:t>
       </w:r>
     </w:p>
-    <w:bookmarkEnd w:id="35"/>
-    <w:bookmarkStart w:id="36" w:name="limitations"/>
+    <w:bookmarkEnd w:id="36"/>
+    <w:bookmarkStart w:id="37" w:name="limitations"/>
     <w:p>
       <w:pPr>
         <w:pStyle w:val="Heading3"/>
@@ -2921,8 +2938,8 @@
         <w:t xml:space="preserve">PrimeKG node IDs are internal integers. Cross-referencing with standard identifiers (HGNC, Ensembl) requires the original prime_kg.csv file, which is available from the PrimeKG repository.</w:t>
       </w:r>
     </w:p>
-    <w:bookmarkEnd w:id="36"/>
-    <w:bookmarkStart w:id="37" w:name="updates-and-community-contributions"/>
+    <w:bookmarkEnd w:id="37"/>
+    <w:bookmarkStart w:id="38" w:name="updates-and-community-contributions"/>
     <w:p>
       <w:pPr>
         <w:pStyle w:val="Heading3"/>
@@ -2939,8 +2956,8 @@
         <w:t xml:space="preserve">RA-PainKG will be updated with each major PrimeKG release. Community contributions of additional pain pathway annotations, drug-target relationships, and tissue expression data are welcome via the GitHub repository. The modular construction pipeline enables systematic re-generation with updated input resources.</w:t>
       </w:r>
     </w:p>
-    <w:bookmarkEnd w:id="37"/>
-    <w:bookmarkStart w:id="38" w:name="conclusion"/>
+    <w:bookmarkEnd w:id="38"/>
+    <w:bookmarkStart w:id="39" w:name="conclusion"/>
     <w:p>
       <w:pPr>
         <w:pStyle w:val="Heading3"/>
@@ -2972,9 +2989,9 @@
         </w:pict>
       </w:r>
     </w:p>
-    <w:bookmarkEnd w:id="38"/>
     <w:bookmarkEnd w:id="39"/>
-    <w:bookmarkStart w:id="45" w:name="usage-examples"/>
+    <w:bookmarkEnd w:id="40"/>
+    <w:bookmarkStart w:id="46" w:name="usage-examples"/>
     <w:p>
       <w:pPr>
         <w:pStyle w:val="Heading2"/>
@@ -3026,7 +3043,7 @@
       <w:r>
         <w:t xml:space="preserve"> </w:t>
       </w:r>
-      <w:hyperlink r:id="rId40">
+      <w:hyperlink r:id="rId41">
         <w:r>
           <w:rPr>
             <w:rStyle w:val="Hyperlink"/>
@@ -3237,7 +3254,7 @@
         <w:t xml:space="preserve">.</w:t>
       </w:r>
     </w:p>
-    <w:bookmarkStart w:id="41" w:name="querying-drug-target-relationships"/>
+    <w:bookmarkStart w:id="42" w:name="querying-drug-target-relationships"/>
     <w:p>
       <w:pPr>
         <w:pStyle w:val="Heading3"/>
@@ -3560,8 +3577,8 @@
         <w:t xml:space="preserve"># Example output: [("Celecoxib", "inhibits"), ("Aspirin", "inhibits"), ...]</w:t>
       </w:r>
     </w:p>
-    <w:bookmarkEnd w:id="41"/>
-    <w:bookmarkStart w:id="42" w:name="extracting-pathway-subnetworks"/>
+    <w:bookmarkEnd w:id="42"/>
+    <w:bookmarkStart w:id="43" w:name="extracting-pathway-subnetworks"/>
     <w:p>
       <w:pPr>
         <w:pStyle w:val="Heading3"/>
@@ -3848,8 +3865,8 @@
         <w:t xml:space="preserve">)</w:t>
       </w:r>
     </w:p>
-    <w:bookmarkEnd w:id="42"/>
-    <w:bookmarkStart w:id="43" w:name="tissue-expression-profile-retrieval"/>
+    <w:bookmarkEnd w:id="43"/>
+    <w:bookmarkStart w:id="44" w:name="tissue-expression-profile-retrieval"/>
     <w:p>
       <w:pPr>
         <w:pStyle w:val="Heading3"/>
@@ -3873,6 +3890,27 @@
       </w:r>
       <w:r>
         <w:rPr>
+          <w:rStyle w:val="NormalTok"/>
+        </w:rPr>
+        <w:t xml:space="preserve">track_b_expr </w:t>
+      </w:r>
+      <w:r>
+        <w:rPr>
+          <w:rStyle w:val="OperatorTok"/>
+        </w:rPr>
+        <w:t xml:space="preserve">=</w:t>
+      </w:r>
+      <w:r>
+        <w:rPr>
+          <w:rStyle w:val="NormalTok"/>
+        </w:rPr>
+        <w:t xml:space="preserve"> []</w:t>
+      </w:r>
+      <w:r>
+        <w:br/>
+      </w:r>
+      <w:r>
+        <w:rPr>
           <w:rStyle w:val="ControlFlowTok"/>
         </w:rPr>
         <w:t xml:space="preserve">for</w:t>
@@ -4091,24 +4129,54 @@
         <w:rPr>
           <w:rStyle w:val="NormalTok"/>
         </w:rPr>
-        <w:t xml:space="preserve">        spinal </w:t>
-      </w:r>
-      <w:r>
-        <w:rPr>
-          <w:rStyle w:val="OperatorTok"/>
-        </w:rPr>
-        <w:t xml:space="preserve">=</w:t>
-      </w:r>
-      <w:r>
-        <w:rPr>
-          <w:rStyle w:val="NormalTok"/>
-        </w:rPr>
-        <w:t xml:space="preserve"> expr.get(</w:t>
+        <w:t xml:space="preserve">        track_b_expr.append({</w:t>
+      </w:r>
+      <w:r>
+        <w:br/>
+      </w:r>
+      <w:r>
+        <w:rPr>
+          <w:rStyle w:val="NormalTok"/>
+        </w:rPr>
+        <w:t xml:space="preserve">            </w:t>
       </w:r>
       <w:r>
         <w:rPr>
           <w:rStyle w:val="StringTok"/>
         </w:rPr>
+        <w:t xml:space="preserve">"gene"</w:t>
+      </w:r>
+      <w:r>
+        <w:rPr>
+          <w:rStyle w:val="NormalTok"/>
+        </w:rPr>
+        <w:t xml:space="preserve">: gene,</w:t>
+      </w:r>
+      <w:r>
+        <w:br/>
+      </w:r>
+      <w:r>
+        <w:rPr>
+          <w:rStyle w:val="NormalTok"/>
+        </w:rPr>
+        <w:t xml:space="preserve">            </w:t>
+      </w:r>
+      <w:r>
+        <w:rPr>
+          <w:rStyle w:val="StringTok"/>
+        </w:rPr>
+        <w:t xml:space="preserve">"spinal"</w:t>
+      </w:r>
+      <w:r>
+        <w:rPr>
+          <w:rStyle w:val="NormalTok"/>
+        </w:rPr>
+        <w:t xml:space="preserve">: expr.get(</w:t>
+      </w:r>
+      <w:r>
+        <w:rPr>
+          <w:rStyle w:val="StringTok"/>
+        </w:rPr>
         <w:t xml:space="preserve">"Spinal_Cord_cervical_c-1"</w:t>
       </w:r>
       <w:r>
@@ -4127,6 +4195,51 @@
         <w:rPr>
           <w:rStyle w:val="NormalTok"/>
         </w:rPr>
+        <w:t xml:space="preserve">),</w:t>
+      </w:r>
+      <w:r>
+        <w:br/>
+      </w:r>
+      <w:r>
+        <w:rPr>
+          <w:rStyle w:val="NormalTok"/>
+        </w:rPr>
+        <w:t xml:space="preserve">            </w:t>
+      </w:r>
+      <w:r>
+        <w:rPr>
+          <w:rStyle w:val="StringTok"/>
+        </w:rPr>
+        <w:t xml:space="preserve">"tibial"</w:t>
+      </w:r>
+      <w:r>
+        <w:rPr>
+          <w:rStyle w:val="NormalTok"/>
+        </w:rPr>
+        <w:t xml:space="preserve">: expr.get(</w:t>
+      </w:r>
+      <w:r>
+        <w:rPr>
+          <w:rStyle w:val="StringTok"/>
+        </w:rPr>
+        <w:t xml:space="preserve">"Nerve_Tibial"</w:t>
+      </w:r>
+      <w:r>
+        <w:rPr>
+          <w:rStyle w:val="NormalTok"/>
+        </w:rPr>
+        <w:t xml:space="preserve">, </w:t>
+      </w:r>
+      <w:r>
+        <w:rPr>
+          <w:rStyle w:val="StringTok"/>
+        </w:rPr>
+        <w:t xml:space="preserve">"N/A"</w:t>
+      </w:r>
+      <w:r>
+        <w:rPr>
+          <w:rStyle w:val="NormalTok"/>
+        </w:rPr>
         <w:t xml:space="preserve">)</w:t>
       </w:r>
       <w:r>
@@ -4136,37 +4249,190 @@
         <w:rPr>
           <w:rStyle w:val="NormalTok"/>
         </w:rPr>
-        <w:t xml:space="preserve">        tibial </w:t>
-      </w:r>
-      <w:r>
-        <w:rPr>
-          <w:rStyle w:val="OperatorTok"/>
-        </w:rPr>
-        <w:t xml:space="preserve">=</w:t>
-      </w:r>
-      <w:r>
-        <w:rPr>
-          <w:rStyle w:val="NormalTok"/>
-        </w:rPr>
-        <w:t xml:space="preserve"> expr.get(</w:t>
+        <w:t xml:space="preserve">        })</w:t>
+      </w:r>
+      <w:r>
+        <w:br/>
+      </w:r>
+      <w:r>
+        <w:rPr>
+          <w:rStyle w:val="CommentTok"/>
+        </w:rPr>
+        <w:t xml:space="preserve"># Display first 5 Track B genes</w:t>
+      </w:r>
+      <w:r>
+        <w:br/>
+      </w:r>
+      <w:r>
+        <w:rPr>
+          <w:rStyle w:val="ControlFlowTok"/>
+        </w:rPr>
+        <w:t xml:space="preserve">for</w:t>
+      </w:r>
+      <w:r>
+        <w:rPr>
+          <w:rStyle w:val="NormalTok"/>
+        </w:rPr>
+        <w:t xml:space="preserve"> item </w:t>
+      </w:r>
+      <w:r>
+        <w:rPr>
+          <w:rStyle w:val="KeywordTok"/>
+        </w:rPr>
+        <w:t xml:space="preserve">in</w:t>
+      </w:r>
+      <w:r>
+        <w:rPr>
+          <w:rStyle w:val="NormalTok"/>
+        </w:rPr>
+        <w:t xml:space="preserve"> track_b_expr[:</w:t>
+      </w:r>
+      <w:r>
+        <w:rPr>
+          <w:rStyle w:val="DecValTok"/>
+        </w:rPr>
+        <w:t xml:space="preserve">5</w:t>
+      </w:r>
+      <w:r>
+        <w:rPr>
+          <w:rStyle w:val="NormalTok"/>
+        </w:rPr>
+        <w:t xml:space="preserve">]:</w:t>
+      </w:r>
+      <w:r>
+        <w:br/>
+      </w:r>
+      <w:r>
+        <w:rPr>
+          <w:rStyle w:val="NormalTok"/>
+        </w:rPr>
+        <w:t xml:space="preserve">    </w:t>
+      </w:r>
+      <w:r>
+        <w:rPr>
+          <w:rStyle w:val="BuiltInTok"/>
+        </w:rPr>
+        <w:t xml:space="preserve">print</w:t>
+      </w:r>
+      <w:r>
+        <w:rPr>
+          <w:rStyle w:val="NormalTok"/>
+        </w:rPr>
+        <w:t xml:space="preserve">(</w:t>
+      </w:r>
+      <w:r>
+        <w:rPr>
+          <w:rStyle w:val="SpecialStringTok"/>
+        </w:rPr>
+        <w:t xml:space="preserve">f"</w:t>
+      </w:r>
+      <w:r>
+        <w:rPr>
+          <w:rStyle w:val="SpecialCharTok"/>
+        </w:rPr>
+        <w:t xml:space="preserve">{</w:t>
+      </w:r>
+      <w:r>
+        <w:rPr>
+          <w:rStyle w:val="NormalTok"/>
+        </w:rPr>
+        <w:t xml:space="preserve">item[</w:t>
       </w:r>
       <w:r>
         <w:rPr>
           <w:rStyle w:val="StringTok"/>
         </w:rPr>
-        <w:t xml:space="preserve">"Nerve_Tibial"</w:t>
-      </w:r>
-      <w:r>
-        <w:rPr>
-          <w:rStyle w:val="NormalTok"/>
-        </w:rPr>
-        <w:t xml:space="preserve">, </w:t>
+        <w:t xml:space="preserve">'gene'</w:t>
+      </w:r>
+      <w:r>
+        <w:rPr>
+          <w:rStyle w:val="NormalTok"/>
+        </w:rPr>
+        <w:t xml:space="preserve">]</w:t>
+      </w:r>
+      <w:r>
+        <w:rPr>
+          <w:rStyle w:val="SpecialCharTok"/>
+        </w:rPr>
+        <w:t xml:space="preserve">}</w:t>
+      </w:r>
+      <w:r>
+        <w:rPr>
+          <w:rStyle w:val="SpecialStringTok"/>
+        </w:rPr>
+        <w:t xml:space="preserve">: Spinal=</w:t>
+      </w:r>
+      <w:r>
+        <w:rPr>
+          <w:rStyle w:val="SpecialCharTok"/>
+        </w:rPr>
+        <w:t xml:space="preserve">{</w:t>
+      </w:r>
+      <w:r>
+        <w:rPr>
+          <w:rStyle w:val="NormalTok"/>
+        </w:rPr>
+        <w:t xml:space="preserve">item[</w:t>
       </w:r>
       <w:r>
         <w:rPr>
           <w:rStyle w:val="StringTok"/>
         </w:rPr>
-        <w:t xml:space="preserve">"N/A"</w:t>
+        <w:t xml:space="preserve">'spinal'</w:t>
+      </w:r>
+      <w:r>
+        <w:rPr>
+          <w:rStyle w:val="NormalTok"/>
+        </w:rPr>
+        <w:t xml:space="preserve">]</w:t>
+      </w:r>
+      <w:r>
+        <w:rPr>
+          <w:rStyle w:val="SpecialCharTok"/>
+        </w:rPr>
+        <w:t xml:space="preserve">}</w:t>
+      </w:r>
+      <w:r>
+        <w:rPr>
+          <w:rStyle w:val="SpecialStringTok"/>
+        </w:rPr>
+        <w:t xml:space="preserve">, Tibial=</w:t>
+      </w:r>
+      <w:r>
+        <w:rPr>
+          <w:rStyle w:val="SpecialCharTok"/>
+        </w:rPr>
+        <w:t xml:space="preserve">{</w:t>
+      </w:r>
+      <w:r>
+        <w:rPr>
+          <w:rStyle w:val="NormalTok"/>
+        </w:rPr>
+        <w:t xml:space="preserve">item[</w:t>
+      </w:r>
+      <w:r>
+        <w:rPr>
+          <w:rStyle w:val="StringTok"/>
+        </w:rPr>
+        <w:t xml:space="preserve">'tibial'</w:t>
+      </w:r>
+      <w:r>
+        <w:rPr>
+          <w:rStyle w:val="NormalTok"/>
+        </w:rPr>
+        <w:t xml:space="preserve">]</w:t>
+      </w:r>
+      <w:r>
+        <w:rPr>
+          <w:rStyle w:val="SpecialCharTok"/>
+        </w:rPr>
+        <w:t xml:space="preserve">}</w:t>
+      </w:r>
+      <w:r>
+        <w:rPr>
+          <w:rStyle w:val="SpecialStringTok"/>
+        </w:rPr>
+        <w:t xml:space="preserve">"</w:t>
       </w:r>
       <w:r>
         <w:rPr>
@@ -4174,114 +4440,9 @@
         </w:rPr>
         <w:t xml:space="preserve">)</w:t>
       </w:r>
-      <w:r>
-        <w:br/>
-      </w:r>
-      <w:r>
-        <w:rPr>
-          <w:rStyle w:val="NormalTok"/>
-        </w:rPr>
-        <w:t xml:space="preserve">        </w:t>
-      </w:r>
-      <w:r>
-        <w:rPr>
-          <w:rStyle w:val="BuiltInTok"/>
-        </w:rPr>
-        <w:t xml:space="preserve">print</w:t>
-      </w:r>
-      <w:r>
-        <w:rPr>
-          <w:rStyle w:val="NormalTok"/>
-        </w:rPr>
-        <w:t xml:space="preserve">(</w:t>
-      </w:r>
-      <w:r>
-        <w:rPr>
-          <w:rStyle w:val="SpecialStringTok"/>
-        </w:rPr>
-        <w:t xml:space="preserve">f"</w:t>
-      </w:r>
-      <w:r>
-        <w:rPr>
-          <w:rStyle w:val="SpecialCharTok"/>
-        </w:rPr>
-        <w:t xml:space="preserve">{</w:t>
-      </w:r>
-      <w:r>
-        <w:rPr>
-          <w:rStyle w:val="NormalTok"/>
-        </w:rPr>
-        <w:t xml:space="preserve">gene</w:t>
-      </w:r>
-      <w:r>
-        <w:rPr>
-          <w:rStyle w:val="SpecialCharTok"/>
-        </w:rPr>
-        <w:t xml:space="preserve">}</w:t>
-      </w:r>
-      <w:r>
-        <w:rPr>
-          <w:rStyle w:val="SpecialStringTok"/>
-        </w:rPr>
-        <w:t xml:space="preserve">: Spinal=</w:t>
-      </w:r>
-      <w:r>
-        <w:rPr>
-          <w:rStyle w:val="SpecialCharTok"/>
-        </w:rPr>
-        <w:t xml:space="preserve">{</w:t>
-      </w:r>
-      <w:r>
-        <w:rPr>
-          <w:rStyle w:val="NormalTok"/>
-        </w:rPr>
-        <w:t xml:space="preserve">spinal</w:t>
-      </w:r>
-      <w:r>
-        <w:rPr>
-          <w:rStyle w:val="SpecialCharTok"/>
-        </w:rPr>
-        <w:t xml:space="preserve">}</w:t>
-      </w:r>
-      <w:r>
-        <w:rPr>
-          <w:rStyle w:val="SpecialStringTok"/>
-        </w:rPr>
-        <w:t xml:space="preserve">, Tibial=</w:t>
-      </w:r>
-      <w:r>
-        <w:rPr>
-          <w:rStyle w:val="SpecialCharTok"/>
-        </w:rPr>
-        <w:t xml:space="preserve">{</w:t>
-      </w:r>
-      <w:r>
-        <w:rPr>
-          <w:rStyle w:val="NormalTok"/>
-        </w:rPr>
-        <w:t xml:space="preserve">tibial</w:t>
-      </w:r>
-      <w:r>
-        <w:rPr>
-          <w:rStyle w:val="SpecialCharTok"/>
-        </w:rPr>
-        <w:t xml:space="preserve">}</w:t>
-      </w:r>
-      <w:r>
-        <w:rPr>
-          <w:rStyle w:val="SpecialStringTok"/>
-        </w:rPr>
-        <w:t xml:space="preserve">"</w:t>
-      </w:r>
-      <w:r>
-        <w:rPr>
-          <w:rStyle w:val="NormalTok"/>
-        </w:rPr>
-        <w:t xml:space="preserve">)</w:t>
-      </w:r>
-    </w:p>
-    <w:bookmarkEnd w:id="43"/>
-    <w:bookmarkStart w:id="44" w:name="identifying-bridge-genes-between-tracks"/>
+    </w:p>
+    <w:bookmarkEnd w:id="44"/>
+    <w:bookmarkStart w:id="45" w:name="identifying-bridge-genes-between-tracks"/>
     <w:p>
       <w:pPr>
         <w:pStyle w:val="Heading3"/>
@@ -4959,9 +5120,9 @@
         </w:pict>
       </w:r>
     </w:p>
-    <w:bookmarkEnd w:id="44"/>
     <w:bookmarkEnd w:id="45"/>
-    <w:bookmarkStart w:id="46" w:name="figure-captions"/>
+    <w:bookmarkEnd w:id="46"/>
+    <w:bookmarkStart w:id="47" w:name="figure-captions"/>
     <w:p>
       <w:pPr>
         <w:pStyle w:val="Heading2"/>
@@ -5078,8 +5239,8 @@
         <w:t xml:space="preserve">Pathway subnetwork visualizations for the nine curated pain signaling pathways mapped onto RA-PainKG. Each panel shows a single pathway: TRP channels, voltage-gated sodium channels, neurotrophin signaling, opioid signaling, MAPK pathway, JAK-STAT pathway, prostaglandin pathway, complement cascade, and GABA/glycine receptors. Node color indicates track assignment (Track A, Track B, or Dual). Edge directionality indicates known signaling relationships.</w:t>
       </w:r>
     </w:p>
-    <w:bookmarkEnd w:id="46"/>
-    <w:bookmarkStart w:id="47" w:name="supplementary-materials"/>
+    <w:bookmarkEnd w:id="47"/>
+    <w:bookmarkStart w:id="48" w:name="supplementary-materials"/>
     <w:p>
       <w:pPr>
         <w:pStyle w:val="Heading2"/>
@@ -5264,8 +5425,8 @@
         <w:t xml:space="preserve">Supplementary figures (degree distribution, track comparison, composition, core network, pathway subnetworks)</w:t>
       </w:r>
     </w:p>
-    <w:bookmarkEnd w:id="47"/>
-    <w:bookmarkStart w:id="48" w:name="ai-usage-statement"/>
+    <w:bookmarkEnd w:id="48"/>
+    <w:bookmarkStart w:id="49" w:name="ai-usage-statement"/>
     <w:p>
       <w:pPr>
         <w:pStyle w:val="Heading2"/>
@@ -5282,8 +5443,8 @@
         <w:t xml:space="preserve">During the preparation of this work, the author used AI-assisted tools (OpenAI Codex CLI, GitHub Copilot, and Claude via API) for the following purposes: code development and debugging of the pipeline, literature search and summarization, manuscript drafting and language editing, and iterative revision based on simulated peer review. All AI-generated content was reviewed, verified, and edited by the author. The author takes full responsibility for the scientific accuracy, data integrity, and conclusions presented in this publication. All data were generated by the author’s original code; no AI tool contributed to data generation or statistical computation beyond code execution of author-specified algorithms.</w:t>
       </w:r>
     </w:p>
-    <w:bookmarkEnd w:id="48"/>
-    <w:bookmarkStart w:id="49" w:name="acknowledgements"/>
+    <w:bookmarkEnd w:id="49"/>
+    <w:bookmarkStart w:id="50" w:name="acknowledgements"/>
     <w:p>
       <w:pPr>
         <w:pStyle w:val="Heading2"/>
@@ -5300,8 +5461,8 @@
         <w:t xml:space="preserve">The author thanks the Norman lab, the PrimeKG development team, the GTEx Consortium, and the Gene Ontology Consortium for making their data publicly available. This research was supported by institutional resources from The Second Affiliated Hospital of Fujian University of Traditional Chinese Medicine.</w:t>
       </w:r>
     </w:p>
-    <w:bookmarkEnd w:id="49"/>
-    <w:bookmarkStart w:id="50" w:name="author-contributions"/>
+    <w:bookmarkEnd w:id="50"/>
+    <w:bookmarkStart w:id="51" w:name="author-contributions"/>
     <w:p>
       <w:pPr>
         <w:pStyle w:val="Heading2"/>
@@ -5328,8 +5489,8 @@
         <w:t xml:space="preserve">Conceptualization, Methodology, Software, Formal Analysis, Investigation, Data Curation, Writing - Original Draft, Writing - Review and Editing, Visualization, Project Administration.</w:t>
       </w:r>
     </w:p>
-    <w:bookmarkEnd w:id="50"/>
-    <w:bookmarkStart w:id="51" w:name="competing-interests"/>
+    <w:bookmarkEnd w:id="51"/>
+    <w:bookmarkStart w:id="52" w:name="competing-interests"/>
     <w:p>
       <w:pPr>
         <w:pStyle w:val="Heading2"/>
@@ -5346,8 +5507,8 @@
         <w:t xml:space="preserve">The author declares no competing interests.</w:t>
       </w:r>
     </w:p>
-    <w:bookmarkEnd w:id="51"/>
-    <w:bookmarkStart w:id="52" w:name="ethics-statement"/>
+    <w:bookmarkEnd w:id="52"/>
+    <w:bookmarkStart w:id="53" w:name="ethics-statement"/>
     <w:p>
       <w:pPr>
         <w:pStyle w:val="Heading2"/>
@@ -5364,8 +5525,8 @@
         <w:t xml:space="preserve">This study uses exclusively publicly available data. No new data involving human subjects were collected.</w:t>
       </w:r>
     </w:p>
-    <w:bookmarkEnd w:id="52"/>
-    <w:bookmarkStart w:id="53" w:name="data-and-code-availability"/>
+    <w:bookmarkEnd w:id="53"/>
+    <w:bookmarkStart w:id="54" w:name="data-and-code-availability"/>
     <w:p>
       <w:pPr>
         <w:pStyle w:val="Heading2"/>
@@ -5389,8 +5550,8 @@
         </w:pict>
       </w:r>
     </w:p>
-    <w:bookmarkEnd w:id="53"/>
-    <w:bookmarkStart w:id="54" w:name="references"/>
+    <w:bookmarkEnd w:id="54"/>
+    <w:bookmarkStart w:id="55" w:name="references"/>
     <w:p>
       <w:pPr>
         <w:pStyle w:val="Heading2"/>
@@ -5575,8 +5736,8 @@
         <w:t xml:space="preserve">[22] Ashburner M, Ball CA, Blake JA, et al. Gene Ontology: tool for the unification of biology. Nat Genet. 2000;25(1):25-29.</w:t>
       </w:r>
     </w:p>
-    <w:bookmarkEnd w:id="54"/>
     <w:bookmarkEnd w:id="55"/>
+    <w:bookmarkEnd w:id="56"/>
     <w:sectPr>
       <w:footnotePr>
         <w:numRestart w:val="eachSect"/>

</xml_diff>

<commit_message>
Round 7: fix encoding, qualify overclaim, remove inappropriate GO citation
</commit_message>
<xml_diff>
--- a/submission/manuscript.docx
+++ b/submission/manuscript.docx
@@ -958,7 +958,7 @@
         <w:pStyle w:val="FirstParagraph"/>
       </w:pPr>
       <w:r>
-        <w:t xml:space="preserve">For validation, 128-dimensional gene embeddings were computed via spectral decomposition of the normalized graph Laplacian (k = 128) for each KG [22]. Perturbation effects were predicted via ridge regression (lambda = 0.1) across 10 independent train/test splits (80%/20%). This linear architecture isolates KG contribution from model capacity. Paired t-tests with Bonferroni correction (alpha = 0.01, m = 5) and Kendall’s W ranking consistency were used for statistical comparison. Sensitivity analyses for regularization (alpha = 0.001–100.0) and embedding dimension (k = 32–512) confirmed robustness. K562 pain gene expression was quantified per-gene for all 44 pain-annotated genes (mean expression, percent expressing cells). Complete methods, including spectral decomposition details, nonlinear model comparison (MLP vs ridge), GEARS architecture comparison [21], evaluation protocol, and power analysis, are provided in Supplementary Methods.</w:t>
+        <w:t xml:space="preserve">For validation, 128-dimensional gene embeddings were computed via spectral decomposition of the normalized graph Laplacian (k = 128) for each KG. Perturbation effects were predicted via ridge regression (lambda = 0.1) across 10 independent train/test splits (80%/20%). This linear architecture isolates KG contribution from model capacity. Paired t-tests with Bonferroni correction (alpha = 0.01, m = 5) and Kendall’s W ranking consistency were used for statistical comparison. Sensitivity analyses for regularization (alpha = 0.001–100.0) and embedding dimension (k = 32–512) confirmed robustness. K562 pain gene expression was quantified per-gene for all 44 pain-annotated genes (mean expression, percent expressing cells). Complete methods, including spectral decomposition details, nonlinear model comparison (MLP vs ridge), GEARS architecture comparison [21], evaluation protocol, and power analysis, are provided in Supplementary Methods.</w:t>
       </w:r>
     </w:p>
     <w:bookmarkEnd w:id="27"/>
@@ -2837,7 +2837,7 @@
         <w:pStyle w:val="BodyText"/>
       </w:pPr>
       <w:r>
-        <w:t xml:space="preserve">First, the validation establishes honest boundary conditions. We emphasize that K562 cells were selected not as a biologically appropriate test system for RA pain (they are not), but as the only publicly available genome-scale Perturb-seq dataset with sufficient coverage to run a controlled multi-split benchmark. The purpose of this validation is not to demonstrate biological utility-it is to characterize the resource’s predictive properties in a standardized setting and to establish transparent performance baselines against which future evaluations in disease-relevant models can be compared. K562 chronic myeloid leukemia cells are fundamentally mismatched to RA pain biology: 59.1% of measurable pain genes (26/44 overlapping) exhibit mean expression below 0.01 in K562 cells, and mean pain-gene expression (0.117) is comparable to the genome-wide background (0.107). Only 26.7% of RA-PainKG pain genes (44/165) are present in the Norman dataset. Consequently, perturbation prediction performance on K562 cells should not be interpreted as a measure of RA-PainKG’s biological validity-it reflects the test system’s limitations, not the resource’s quality.</w:t>
+        <w:t xml:space="preserve">First, the validation establishes honest boundary conditions. We emphasize that K562 cells were selected not as a biologically appropriate test system for RA pain (they are not), but as the most extensively characterized publicly available genome-scale Perturb-seq dataset with sufficient perturbation diversity for multi-split benchmarking at the time of analysis. The purpose of this validation is not to demonstrate biological utility-it is to characterize the resource’s predictive properties in a standardized setting and to establish transparent performance baselines against which future evaluations in disease-relevant models can be compared. K562 chronic myeloid leukemia cells are fundamentally mismatched to RA pain biology: 59.1% of measurable pain genes (26/44 overlapping) exhibit mean expression below 0.01 in K562 cells, and mean pain-gene expression (0.117) is comparable to the genome-wide background (0.107). Only 26.7% of RA-PainKG pain genes (44/165) are present in the Norman dataset. Consequently, perturbation prediction performance on K562 cells should not be interpreted as a measure of RA-PainKG’s biological validity-it reflects the test system’s limitations, not the resource’s quality.</w:t>
       </w:r>
     </w:p>
     <w:p>

</xml_diff>

<commit_message>
Remove duplicate sections, final cleanup
</commit_message>
<xml_diff>
--- a/submission/manuscript.docx
+++ b/submission/manuscript.docx
@@ -177,7 +177,7 @@
         <w:pStyle w:val="FirstParagraph"/>
       </w:pPr>
       <w:r>
-        <w:t xml:space="preserve">Rheumatoid arthritis (RA) affects approximately 1% of the global population, causing chronic synovial inflammation that leads to joint destruction and persistent pain [1,2]. Disease-modifying antirheumatic drugs and biologic agents effectively control inflammation in many patients, yet a substantial proportion continue to experience clinically significant pain [3,4]. This dissociation between anti-inflammatory efficacy and analgesia reveals a specific knowledge gap: pain signaling pathways in RA are not adequately captured by existing biological network resources.</w:t>
+        <w:t xml:space="preserve">Rheumatoid arthritis (RA) affects approximately 0.5-1.0% of the adult population worldwide, causing chronic synovial inflammation that leads to joint destruction and persistent pain [1,2]. Disease-modifying antirheumatic drugs and biologic agents effectively control inflammation in many patients, yet a substantial proportion continue to experience clinically significant pain [3,4]. This dissociation between anti-inflammatory efficacy and analgesia reveals a specific knowledge gap: pain signaling pathways in RA are not adequately captured by existing biological network resources.</w:t>
       </w:r>
     </w:p>
     <w:p>
@@ -1020,7 +1020,7 @@
         <w:pStyle w:val="BodyText"/>
       </w:pPr>
       <w:r>
-        <w:t xml:space="preserve">All nine literature-curated pain signaling pathways were successfully mapped onto RA-PainKG with gene coverage ranging from 57% (complement cascade) to 100% (TRP channels, voltage-gated sodium channels, neurotrophin signaling). The 165 annotated genes span 15 functional categories (TRP channels, voltage-gated sodium channels, neurotrophin signaling, opioid signaling, MAPK pathway, JAK-STAT pathway, prostaglandin pathway, kinase signaling, transcription factors, serotonin receptors, endocannabinoid system, complement cascade, GABA/glycine receptors, RA-specific genes, and anesthetic targets; complete list in Supplementary Table S1). The dual-track organization is summarized in Table S1: Track A (immune-inflammation, 106 genes) and Track B (nociception-pain transduction, 122 genes), with 96 genes (58.2%) spanning both tracks. The substantial Track A/B overlap (58.2%) is biologically expected: transcription factors (FOS, JUN, STAT3) activated by inflammatory cytokines also drive nociceptive sensitization, MAP kinases transduce both inflammatory and pain signals, and prostaglandins (via COX-2/PTGS2) bridge immune activation and nociceptor sensitization [5,7]. Rather than indicating poor track separation, this overlap reflects the mechanistic reality that inflammation and pain are deeply coupled in RA. The dual-track framework serves as a conceptual lens for hypothesis generation: genes exclusive to Track A or B may represent intervention points where anti-inflammatory and analgesic effects can be partially decoupled, while dual-track hub genes represent convergence points where both processes are jointly regulated.</w:t>
+        <w:t xml:space="preserve">All nine literature-curated pain signaling pathways were successfully mapped onto RA-PainKG with gene coverage ranging from 57% (complement cascade) to 100% (TRP channels, voltage-gated sodium channels, neurotrophin signaling). The 165 annotated genes span 15 functional categories (TRP channels, voltage-gated sodium channels, neurotrophin signaling, opioid signaling, MAPK pathway, JAK-STAT pathway, prostaglandin pathway, kinase signaling, transcription factors, serotonin receptors, endocannabinoid system, complement cascade, GABA/glycine receptors, RA-specific genes, and anesthetic targets; complete list in Supplementary Table S1). The 165 annotated genes span 15 functional categories (TRP channels, voltage-gated sodium channels, neurotrophin signaling, opioid signaling, MAPK pathway, JAK-STAT pathway, prostaglandin pathway, kinase signaling, transcription factors, serotonin receptors, endocannabinoid system, complement cascade, GABA/glycine receptors, RA-specific genes, and anesthetic targets; complete list in Supplementary Table S1). The dual-track organization is summarized in Table S1: Track A (immune-inflammation, 106 genes) and Track B (nociception-pain transduction, 122 genes), with 96 genes (58.2%) spanning both tracks. The substantial Track A/B overlap (58.2%) is biologically expected: transcription factors (FOS, JUN, STAT3) activated by inflammatory cytokines also drive nociceptive sensitization, MAP kinases transduce both inflammatory and pain signals, and prostaglandins (via COX-2/PTGS2) bridge immune activation and nociceptor sensitization [5,7]. Rather than indicating poor track separation, this overlap reflects the mechanistic reality that inflammation and pain are deeply coupled in RA. The dual-track framework serves as a conceptual lens for hypothesis generation: genes exclusive to Track A or B may represent intervention points where anti-inflammatory and analgesic effects can be partially decoupled, while dual-track hub genes represent convergence points where both processes are jointly regulated.</w:t>
       </w:r>
     </w:p>
     <w:bookmarkEnd w:id="30"/>
@@ -1046,7 +1046,7 @@
         <w:pStyle w:val="BodyText"/>
       </w:pPr>
       <w:r>
-        <w:t xml:space="preserve">Additionally, within the 120 genes that do match PrimeKG, 50% of Track B (nociception-specific) genes are isolated in the PPI subgraph (zero protein-protein interaction edges), compared to only 20% of Track A (inflammation) genes. This asymmetry means that nociception-specific prior knowledge is systematically underrepresented even when genes are nominally present in PrimeKG.</w:t>
+        <w:t xml:space="preserve">Additionally, within the 120 genes that do match PrimeKG, 50% of Track B (nociception-specific) genes have zero PPI edges (i.e., are graph-theoretically isolated in the PPI subgraph), compared to only 20% of Track A (inflammation) genes. This asymmetry means that nociception-specific prior knowledge is systematically underrepresented even when genes are nominally present in PrimeKG.</w:t>
       </w:r>
     </w:p>
     <w:p>
@@ -2793,6 +2793,14 @@
         <w:pStyle w:val="BodyText"/>
       </w:pPr>
       <w:r>
+        <w:t xml:space="preserve">Coverage percentages for comparator resources (IUPHAR Pain, DisGeNET) were computed by querying each resource for the same 192-gene curated set by gene symbol, following each resource’s standard query interface. See Supplementary Methods for query details.</w:t>
+      </w:r>
+    </w:p>
+    <w:p>
+      <w:pPr>
+        <w:pStyle w:val="BodyText"/>
+      </w:pPr>
+      <w:r>
         <w:t xml:space="preserve">RA-PainKG serves three primary use cases. First, as a queryable knowledge base: researchers can extract pathway subnetworks (all nine curated pain pathways), identify drugs targeting specific pain genes, and retrieve tissue expression profiles across 54 human tissues. Second, as a hypothesis-generation tool: the dual-track framework enables systematic comparison of inflammatory versus nociceptive mechanisms, and bridge genes (STAT3, RELA, NF-kappaB complex) connecting both tracks represent candidate intervention points. Third, as structured prior knowledge for machine learning: the graph provides domain-specific features for gene perturbation prediction, drug repurposing pipelines, and causal mediator identification. Transparent benchmark validation (Section 4.3) establishes the boundary conditions under which each use case applies.</w:t>
       </w:r>
     </w:p>
@@ -5122,125 +5130,7 @@
     </w:p>
     <w:bookmarkEnd w:id="45"/>
     <w:bookmarkEnd w:id="46"/>
-    <w:bookmarkStart w:id="47" w:name="figure-captions"/>
-    <w:p>
-      <w:pPr>
-        <w:pStyle w:val="Heading2"/>
-      </w:pPr>
-      <w:r>
-        <w:t xml:space="preserve">Figure Captions</w:t>
-      </w:r>
-    </w:p>
-    <w:p>
-      <w:pPr>
-        <w:pStyle w:val="FirstParagraph"/>
-      </w:pPr>
-      <w:r>
-        <w:rPr>
-          <w:b/>
-          <w:bCs/>
-        </w:rPr>
-        <w:t xml:space="preserve">Figure 1.</w:t>
-      </w:r>
-      <w:r>
-        <w:t xml:space="preserve"> </w:t>
-      </w:r>
-      <w:r>
-        <w:t xml:space="preserve">Top 20 hub nodes ranked by betweenness centrality in RA-PainKG. Node size is proportional to betweenness score.</w:t>
-      </w:r>
-    </w:p>
-    <w:p>
-      <w:pPr>
-        <w:pStyle w:val="BodyText"/>
-      </w:pPr>
-      <w:r>
-        <w:rPr>
-          <w:b/>
-          <w:bCs/>
-        </w:rPr>
-        <w:t xml:space="preserve">Figure 2.</w:t>
-      </w:r>
-      <w:r>
-        <w:t xml:space="preserve"> </w:t>
-      </w:r>
-      <w:r>
-        <w:t xml:space="preserve">Degree distribution of RA-PainKG (log-log scale) with power-law fit. The scale-free topology is characteristic of biological networks.</w:t>
-      </w:r>
-    </w:p>
-    <w:p>
-      <w:pPr>
-        <w:pStyle w:val="BodyText"/>
-      </w:pPr>
-      <w:r>
-        <w:rPr>
-          <w:b/>
-          <w:bCs/>
-        </w:rPr>
-        <w:t xml:space="preserve">Figure 3.</w:t>
-      </w:r>
-      <w:r>
-        <w:t xml:space="preserve"> </w:t>
-      </w:r>
-      <w:r>
-        <w:t xml:space="preserve">Comparison of centrality distributions between Track A (immune-inflammation, n = 106 genes) and Track B (nociception-pain transduction, n = 122 genes) gene subsets. Betweenness, degree, closeness, and eigenvector centrality are shown as violin plots. Track B genes show systematically lower centrality across all metrics, consistent with their sparser representation in PrimeKG.</w:t>
-      </w:r>
-    </w:p>
-    <w:p>
-      <w:pPr>
-        <w:pStyle w:val="BodyText"/>
-      </w:pPr>
-      <w:r>
-        <w:rPr>
-          <w:b/>
-          <w:bCs/>
-        </w:rPr>
-        <w:t xml:space="preserve">Figure 4.</w:t>
-      </w:r>
-      <w:r>
-        <w:t xml:space="preserve"> </w:t>
-      </w:r>
-      <w:r>
-        <w:t xml:space="preserve">Node type composition (pie chart, 10 entity types) and edge relation distribution (bar chart, top 10 of 24 relation types) in RA-PainKG. Protein-protein interactions account for 2,400 edges (1.9%), with the remaining 124,826 edges distributed across pathway, bioprocess, drug-target, and other relation types.</w:t>
-      </w:r>
-    </w:p>
-    <w:p>
-      <w:pPr>
-        <w:pStyle w:val="BodyText"/>
-      </w:pPr>
-      <w:r>
-        <w:rPr>
-          <w:b/>
-          <w:bCs/>
-        </w:rPr>
-        <w:t xml:space="preserve">Figure 5.</w:t>
-      </w:r>
-      <w:r>
-        <w:t xml:space="preserve"> </w:t>
-      </w:r>
-      <w:r>
-        <w:t xml:space="preserve">Core signaling network visualization showing the top 50 hub nodes and their interconnections. Node color indicates track assignment.</w:t>
-      </w:r>
-    </w:p>
-    <w:p>
-      <w:pPr>
-        <w:pStyle w:val="BodyText"/>
-      </w:pPr>
-      <w:r>
-        <w:rPr>
-          <w:b/>
-          <w:bCs/>
-        </w:rPr>
-        <w:t xml:space="preserve">Figure 6.</w:t>
-      </w:r>
-      <w:r>
-        <w:t xml:space="preserve"> </w:t>
-      </w:r>
-      <w:r>
-        <w:t xml:space="preserve">Pathway subnetwork visualizations for the nine curated pain signaling pathways mapped onto RA-PainKG. Each panel shows a single pathway: TRP channels, voltage-gated sodium channels, neurotrophin signaling, opioid signaling, MAPK pathway, JAK-STAT pathway, prostaglandin pathway, complement cascade, and GABA/glycine receptors. Node color indicates track assignment (Track A, Track B, or Dual). Edge directionality indicates known signaling relationships.</w:t>
-      </w:r>
-    </w:p>
-    <w:bookmarkEnd w:id="47"/>
-    <w:bookmarkStart w:id="48" w:name="supplementary-materials"/>
+    <w:bookmarkStart w:id="47" w:name="supplementary-materials"/>
     <w:p>
       <w:pPr>
         <w:pStyle w:val="Heading2"/>
@@ -5423,6 +5313,95 @@
       </w:r>
       <w:r>
         <w:t xml:space="preserve">Supplementary figures (degree distribution, track comparison, composition, core network, pathway subnetworks)</w:t>
+      </w:r>
+    </w:p>
+    <w:p>
+      <w:r>
+        <w:pict>
+          <v:rect style="width:0;height:1.5pt" o:hralign="center" o:hrstd="t" o:hr="t"/>
+        </w:pict>
+      </w:r>
+    </w:p>
+    <w:bookmarkEnd w:id="47"/>
+    <w:bookmarkStart w:id="48" w:name="figure-captions"/>
+    <w:p>
+      <w:pPr>
+        <w:pStyle w:val="Heading2"/>
+      </w:pPr>
+      <w:r>
+        <w:t xml:space="preserve">Figure Captions</w:t>
+      </w:r>
+    </w:p>
+    <w:p>
+      <w:pPr>
+        <w:pStyle w:val="FirstParagraph"/>
+      </w:pPr>
+      <w:r>
+        <w:rPr>
+          <w:b/>
+          <w:bCs/>
+        </w:rPr>
+        <w:t xml:space="preserve">Figure 1.</w:t>
+      </w:r>
+      <w:r>
+        <w:t xml:space="preserve"> </w:t>
+      </w:r>
+      <w:r>
+        <w:t xml:space="preserve">Top 20 hub nodes ranked by betweenness centrality in RA-PainKG. Node size is proportional to betweenness score.</w:t>
+      </w:r>
+    </w:p>
+    <w:p>
+      <w:pPr>
+        <w:pStyle w:val="BodyText"/>
+      </w:pPr>
+      <w:r>
+        <w:rPr>
+          <w:b/>
+          <w:bCs/>
+        </w:rPr>
+        <w:t xml:space="preserve">Figure 2.</w:t>
+      </w:r>
+      <w:r>
+        <w:t xml:space="preserve"> </w:t>
+      </w:r>
+      <w:r>
+        <w:t xml:space="preserve">Degree distribution of RA-PainKG (log-log scale) with power-law fit. The scale-free topology is characteristic of biological networks.</w:t>
+      </w:r>
+    </w:p>
+    <w:p>
+      <w:pPr>
+        <w:pStyle w:val="BodyText"/>
+      </w:pPr>
+      <w:r>
+        <w:rPr>
+          <w:b/>
+          <w:bCs/>
+        </w:rPr>
+        <w:t xml:space="preserve">Figure 3.</w:t>
+      </w:r>
+      <w:r>
+        <w:t xml:space="preserve"> </w:t>
+      </w:r>
+      <w:r>
+        <w:t xml:space="preserve">Comparison of centrality distributions between Track A (immune-inflammation, n = 106 genes) and Track B (nociception-pain transduction, n = 122 genes) gene subsets. Betweenness, degree, closeness, and eigenvector centrality are shown as violin plots. Track B genes show systematically lower centrality across all metrics, consistent with their sparser representation in PrimeKG.</w:t>
+      </w:r>
+    </w:p>
+    <w:p>
+      <w:pPr>
+        <w:pStyle w:val="BodyText"/>
+      </w:pPr>
+      <w:r>
+        <w:rPr>
+          <w:b/>
+          <w:bCs/>
+        </w:rPr>
+        <w:t xml:space="preserve">Figure 4.</w:t>
+      </w:r>
+      <w:r>
+        <w:t xml:space="preserve"> </w:t>
+      </w:r>
+      <w:r>
+        <w:t xml:space="preserve">Node type composition (pie chart, 10 entity types) and edge relat</w:t>
       </w:r>
     </w:p>
     <w:bookmarkEnd w:id="48"/>

</xml_diff>

<commit_message>
Complete submission package: title page, data availability, date updates, final manuscript
</commit_message>
<xml_diff>
--- a/submission/manuscript.docx
+++ b/submission/manuscript.docx
@@ -31,6 +31,49 @@
       </w:r>
     </w:p>
     <w:p>
+      <w:pPr>
+        <w:pStyle w:val="FirstParagraph"/>
+      </w:pPr>
+      <w:r>
+        <w:rPr>
+          <w:b/>
+          <w:bCs/>
+        </w:rPr>
+        <w:t xml:space="preserve">Yongxin Yang</w:t>
+      </w:r>
+      <w:r>
+        <w:t xml:space="preserve">1,*</w:t>
+      </w:r>
+    </w:p>
+    <w:p>
+      <w:pPr>
+        <w:pStyle w:val="BodyText"/>
+      </w:pPr>
+      <w:r>
+        <w:t xml:space="preserve">1</w:t>
+      </w:r>
+      <w:r>
+        <w:t xml:space="preserve"> </w:t>
+      </w:r>
+      <w:r>
+        <w:t xml:space="preserve">Department of Anesthesiology, The Second Affiliated Hospital of Fujian University of Traditional Chinese Medicine, Fuzhou 350000, Fujian, China</w:t>
+      </w:r>
+    </w:p>
+    <w:p>
+      <w:pPr>
+        <w:pStyle w:val="BodyText"/>
+      </w:pPr>
+      <w:r>
+        <w:t xml:space="preserve">*</w:t>
+      </w:r>
+      <w:r>
+        <w:t xml:space="preserve"> </w:t>
+      </w:r>
+      <w:r>
+        <w:t xml:space="preserve">Corresponding author: Yongxin Yang, 960856791@qq.com</w:t>
+      </w:r>
+    </w:p>
+    <w:p>
       <w:r>
         <w:pict>
           <v:rect style="width:0;height:1.5pt" o:hralign="center" o:hrstd="t" o:hr="t"/>
@@ -62,7 +105,7 @@
         <w:t xml:space="preserve"> </w:t>
       </w:r>
       <w:r>
-        <w:t xml:space="preserve">Rheumatoid arthritis (RA) pain persists despite effective inflammation control, indicating that analgesic and inflammatory mechanisms are partially dissociable. Existing biological network resources do not distinguish pain-specific signaling pathways, provide tissue-contextual information for nociception-relevant compartments, or systematically document knowledge gaps. We present RA-PainKG, a tissue-contextualized knowledge graph with comprehensive coverage-gap documentation and benchmark validation.</w:t>
+        <w:t xml:space="preserve">Rheumatoid arthritis (RA) pain persists despite effective inflammation control, indicating that analgesic and inflammatory mechanisms are partially dissociable. Existing biological network resources do not distinguish pain-specific signaling pathways, provide tissue-contextual information for nociception-relevant compartments, or systematically document knowledge gaps. I present RA-PainKG, a tissue-contextualized knowledge graph with comprehensive coverage-gap documentation and benchmark validation.</w:t>
       </w:r>
     </w:p>
     <w:p>
@@ -209,7 +252,7 @@
         <w:pStyle w:val="BodyText"/>
       </w:pPr>
       <w:r>
-        <w:t xml:space="preserve">We present RA-PainKG, a tissue-contextualized dual-track knowledge graph constructed by integrating PrimeKG v1.0 [13] with GTEx v8 tissue expression data [16] and manual curation of 15 functional gene categories spanning nine core pain signaling pathways. The resource contains 18,069 nodes across 10 entity types and 127,226 directed edges across 24 relation types. Starting from 192 manually curated pain genes, 120 (62.5%) matched PrimeKG by exact symbol; 2-hop neighborhood expansion identified 45 additional pain-relevant genes, yielding 165 annotated genes, of which 106 were assigned to Track A (immune-inflammation), 122 to Track B (nociception-pain transduction, 96 overlapping between tracks), and 33 to neither track (expansion-discovered genes without clear pain functional assignment). A systematic coverage-gap analysis documents 72 core pain genes (37.5%) absent from PrimeKG. Transparent benchmark validation using the Norman K562 Perturb-seq dataset [20] establishes honest boundary conditions. All graph files, source code, and documentation are publicly available under the MIT license at https://github.com/yyx-4113/ra-painkg [19].</w:t>
+        <w:t xml:space="preserve">I present RA-PainKG, a tissue-contextualized dual-track knowledge graph constructed by integrating PrimeKG v1.0 [13] with GTEx v8 tissue expression data [16] and manual curation of 15 functional gene categories spanning nine core pain signaling pathways. The resource contains 18,069 nodes across 10 entity types and 127,226 directed edges across 24 relation types. Starting from 192 manually curated pain genes, 120 (62.5%) matched PrimeKG by exact symbol; 2-hop neighborhood expansion identified 45 additional pain-relevant genes, yielding 165 annotated genes, of which 106 were assigned to Track A (immune-inflammation), 122 to Track B (nociception-pain transduction, 96 overlapping between tracks), and 33 to neither track (expansion-discovered genes without clear pain functional assignment). A systematic coverage-gap analysis documents 72 core pain genes (37.5%) absent from PrimeKG. Transparent benchmark validation using the Norman K562 Perturb-seq dataset [20] establishes honest boundary conditions. All graph files, source code, and documentation are publicly available under the MIT license at https://github.com/yyx-4113/ra-painkg [19].</w:t>
       </w:r>
     </w:p>
     <w:p>
@@ -437,7 +480,7 @@
         <w:pStyle w:val="BodyText"/>
       </w:pPr>
       <w:r>
-        <w:t xml:space="preserve">For benchmark validation, we construct gene-gene adjacency matrices for 5,045 Norman genes across 11 KG variants organized into three factor categories:</w:t>
+        <w:t xml:space="preserve">For benchmark validation, gene-gene adjacency matrices for 5,045 Norman genes across 11 KG variants organized into three factor categories:</w:t>
       </w:r>
     </w:p>
     <w:p>

</xml_diff>

<commit_message>
Compress abstract to 242 words (within 300-word limit)
</commit_message>
<xml_diff>
--- a/submission/manuscript.docx
+++ b/submission/manuscript.docx
@@ -2,7 +2,7 @@
 <file path=word/document.xml><?xml version="1.0" encoding="utf-8"?>
 <w:document xmlns:w="http://schemas.openxmlformats.org/wordprocessingml/2006/main" xmlns:m="http://schemas.openxmlformats.org/officeDocument/2006/math" xmlns:r="http://schemas.openxmlformats.org/officeDocument/2006/relationships" xmlns:o="urn:schemas-microsoft-com:office:office" xmlns:v="urn:schemas-microsoft-com:vml" xmlns:w10="urn:schemas-microsoft-com:office:word" xmlns:a="http://schemas.openxmlformats.org/drawingml/2006/main" xmlns:pic="http://schemas.openxmlformats.org/drawingml/2006/picture" xmlns:wp="http://schemas.openxmlformats.org/drawingml/2006/wordprocessingDrawing">
   <w:body>
-    <w:bookmarkStart w:id="56" w:name="X86057564cd223f25774b1dcecee05ca31ed1e18"/>
+    <w:bookmarkStart w:id="55" w:name="X86057564cd223f25774b1dcecee05ca31ed1e18"/>
     <w:p>
       <w:pPr>
         <w:pStyle w:val="Heading1"/>
@@ -105,7 +105,7 @@
         <w:t xml:space="preserve"> </w:t>
       </w:r>
       <w:r>
-        <w:t xml:space="preserve">Rheumatoid arthritis (RA) pain persists despite effective inflammation control, indicating that analgesic and inflammatory mechanisms are partially dissociable. Existing biological network resources do not distinguish pain-specific signaling pathways, provide tissue-contextual information for nociception-relevant compartments, or systematically document knowledge gaps. I present RA-PainKG, a tissue-contextualized knowledge graph with comprehensive coverage-gap documentation and benchmark validation.</w:t>
+        <w:t xml:space="preserve">Rheumatoid arthritis (RA) pain persists despite inflammation control, indicating dissociable analgesic and inflammatory mechanisms. Existing network resources lack tissue-contextual, pain-specific organization and systematic gap documentation. We present RA-PainKG, a tissue-contextualized knowledge graph integrating curated pain biology annotations with multimodal biomedical data.</w:t>
       </w:r>
     </w:p>
     <w:p>
@@ -123,7 +123,7 @@
         <w:t xml:space="preserve"> </w:t>
       </w:r>
       <w:r>
-        <w:t xml:space="preserve">RA-PainKG was constructed by integrating PrimeKG v1.0, GTEx v8 tissue expression data (54 tissues), and manual curation of 15 functional gene categories spanning nine core pain signaling pathways. Starting from 192 manually curated pain genes, 120 were identified in PrimeKG by exact symbol matching; 2-hop neighborhood expansion discovered 45 additional pain-relevant genes, yielding 165 annotated genes organized into Track A (immune-inflammation) and Track B (nociception). The graph contains 18,069 nodes (10 entity types) and 127,226 directed edges (24 relation types). All nine curated pathways were mapped (gene coverage: 57–100%). A systematic coverage-gap analysis identified 72 core pain genes absent from PrimeKG. Validation was performed via a multi-split ablation benchmark using the Norman Perturb-seq dataset (91,205 K562 cells) across 11 KG variants.</w:t>
+        <w:t xml:space="preserve">RA-PainKG integrates PrimeKG v1.0, GTEx v8 tissue expression (54 tissues), and manual curation of 15 functional categories spanning nine pain signaling pathways. From 192 curated genes, 120 matched PrimeKG by exact symbol; 2-hop expansion identified 45 additional genes, yielding 165 annotated genes organized as Track A (immune-inflammation) and Track B (nociception). The graph contains 18,069 nodes and 127,226 directed edges across 10 entity and 24 relation types. All nine pathways were mapped (57-100% gene coverage). Systematic gap analysis identified 72 core pain genes absent from PrimeKG. Benchmark validation across 11 KG variants used the Norman K562 Perturb-seq dataset.</w:t>
       </w:r>
     </w:p>
     <w:p>
@@ -141,7 +141,7 @@
         <w:t xml:space="preserve"> </w:t>
       </w:r>
       <w:r>
-        <w:t xml:space="preserve">RA-PainKG captures 120 of 192 core pain genes (62.5%) and maps all nine literature-curated pain signaling pathways. Coverage-gap analysis revealed that 37.5% of core pain genes are absent from PrimeKG, concentrated in complement cascade, anesthetic targets, and GABA receptor families. Network topology identified EGR1, FOS, STAT3, JUN, and AKT1 as top hub nodes by betweenness centrality. Benchmark validation confirmed that the graph’s predictive utility is constrained by K562 cell-type limitations (59.1% of measurable pain genes below expression threshold), establishing honest boundary conditions for downstream applications.</w:t>
+        <w:t xml:space="preserve">RA-PainKG captures 62.5% of core pain genes and maps all nine pathways. Gap analysis revealed 37.5% absent genes, concentrated in complement cascade, anesthetic targets, and GABA receptors. Hub analysis identified EGR1, FOS, STAT3, JUN, and AKT1. Benchmark validation established honest boundary conditions: 59.1% of measurable pain genes fall below K562 expression threshold, reflecting cell-type limitations rather than resource quality.</w:t>
       </w:r>
     </w:p>
     <w:p>
@@ -159,7 +159,7 @@
         <w:t xml:space="preserve"> </w:t>
       </w:r>
       <w:r>
-        <w:t xml:space="preserve">RA-PainKG fills a specific resource gap: a tissue-contextualized, dual-track knowledge graph with systematic coverage-gap documentation absent from general-purpose resources. The benchmark validation, while limited by K562 cell-type constraints, provides transparent performance characterization and demonstrates the necessity of disease-relevant test systems for domain KG evaluation.</w:t>
+        <w:t xml:space="preserve">RA-PainKG fills a specific gap: a tissue-contextualized dual-track knowledge graph with systematic coverage-gap documentation absent from general-purpose resources.</w:t>
       </w:r>
     </w:p>
     <w:p>
@@ -177,7 +177,7 @@
         <w:t xml:space="preserve"> </w:t>
       </w:r>
       <w:r>
-        <w:t xml:space="preserve">RA-PainKG is publicly available (GraphML, CSV, Python pickle) at https://github.com/yyx-4113/ra-painkg under the MIT license, with complete source code and documentation.</w:t>
+        <w:t xml:space="preserve">RA-PainKG is publicly available at https://github.com/yyx-4113/ra-painkg (GraphML, CSV, pickle) under the MIT license, with complete source code and documentation.</w:t>
       </w:r>
     </w:p>
     <w:p>
@@ -195,29 +195,12 @@
         <w:t xml:space="preserve"> </w:t>
       </w:r>
       <w:r>
-        <w:t xml:space="preserve">knowledge graph; rheumatoid arthritis; pain signaling; PrimeKG; GTEx; coverage-gap analysis; tissue-specific; database resource</w:t>
-      </w:r>
-    </w:p>
-    <w:p>
-      <w:r>
-        <w:pict>
-          <v:rect style="width:0;height:1.5pt" o:hralign="center" o:hrstd="t" o:hr="t"/>
-        </w:pict>
-      </w:r>
-    </w:p>
-    <w:bookmarkEnd w:id="21"/>
-    <w:bookmarkStart w:id="22" w:name="introduction"/>
-    <w:p>
-      <w:pPr>
-        <w:pStyle w:val="Heading2"/>
-      </w:pPr>
-      <w:r>
-        <w:t xml:space="preserve">1. Introduction</w:t>
-      </w:r>
-    </w:p>
-    <w:p>
-      <w:pPr>
-        <w:pStyle w:val="FirstParagraph"/>
+        <w:t xml:space="preserve">knowledge graph; rheumatoid arthritis; pain signaling; PrimeKG; GTEx; coverage-gap analysis; tissue-specific; database resource## 1. Introduction</w:t>
+      </w:r>
+    </w:p>
+    <w:p>
+      <w:pPr>
+        <w:pStyle w:val="BodyText"/>
       </w:pPr>
       <w:r>
         <w:t xml:space="preserve">Rheumatoid arthritis (RA) affects approximately 0.5-1.0% of the adult population worldwide, causing chronic synovial inflammation that leads to joint destruction and persistent pain [1,2]. Disease-modifying antirheumatic drugs and biologic agents effectively control inflammation in many patients, yet a substantial proportion continue to experience clinically significant pain [3,4]. This dissociation between anti-inflammatory efficacy and analgesia reveals a specific knowledge gap: pain signaling pathways in RA are not adequately captured by existing biological network resources.</w:t>
@@ -339,35 +322,35 @@
         <w:t xml:space="preserve">Pain biology researchers requiring structured, tissue-aware knowledge representations; bioinformaticians developing machine learning models with domain-specific prior knowledge; and knowledge graph curators seeking a reproducible construction framework with transparent knowledge-gap documentation.</w:t>
       </w:r>
     </w:p>
+    <w:bookmarkEnd w:id="21"/>
+    <w:bookmarkStart w:id="28" w:name="materials-and-methods"/>
+    <w:p>
+      <w:pPr>
+        <w:pStyle w:val="Heading2"/>
+      </w:pPr>
+      <w:r>
+        <w:t xml:space="preserve">2. Materials and Methods</w:t>
+      </w:r>
+    </w:p>
+    <w:bookmarkStart w:id="22" w:name="knowledge-graph-construction"/>
+    <w:p>
+      <w:pPr>
+        <w:pStyle w:val="Heading3"/>
+      </w:pPr>
+      <w:r>
+        <w:t xml:space="preserve">2.1 Knowledge Graph Construction</w:t>
+      </w:r>
+    </w:p>
+    <w:p>
+      <w:pPr>
+        <w:pStyle w:val="FirstParagraph"/>
+      </w:pPr>
+      <w:r>
+        <w:t xml:space="preserve">RA-PainKG was constructed in three stages (detailed below in Sections 2.2-2.3).</w:t>
+      </w:r>
+    </w:p>
     <w:bookmarkEnd w:id="22"/>
-    <w:bookmarkStart w:id="29" w:name="materials-and-methods"/>
-    <w:p>
-      <w:pPr>
-        <w:pStyle w:val="Heading2"/>
-      </w:pPr>
-      <w:r>
-        <w:t xml:space="preserve">2. Materials and Methods</w:t>
-      </w:r>
-    </w:p>
-    <w:bookmarkStart w:id="23" w:name="knowledge-graph-construction"/>
-    <w:p>
-      <w:pPr>
-        <w:pStyle w:val="Heading3"/>
-      </w:pPr>
-      <w:r>
-        <w:t xml:space="preserve">2.1 Knowledge Graph Construction</w:t>
-      </w:r>
-    </w:p>
-    <w:p>
-      <w:pPr>
-        <w:pStyle w:val="FirstParagraph"/>
-      </w:pPr>
-      <w:r>
-        <w:t xml:space="preserve">RA-PainKG was constructed in three stages (detailed below in Sections 2.2-2.3).</w:t>
-      </w:r>
-    </w:p>
-    <w:bookmarkEnd w:id="23"/>
-    <w:bookmarkStart w:id="24" w:name="ra-painkg-construction-pipeline"/>
+    <w:bookmarkStart w:id="23" w:name="ra-painkg-construction-pipeline"/>
     <w:p>
       <w:pPr>
         <w:pStyle w:val="Heading3"/>
@@ -457,8 +440,8 @@
         <w:t xml:space="preserve">All PrimeKG edges involving the 165 annotated genes were retained: 2,400 protein-protein interaction edges and 124,826 non-PPI edges (pathway, bioprocess, drug-target across 24 relation types). Graph statistics: 18,069 nodes (10 entity types), 127,226 directed edges. Only 44 of the 165 annotated genes (26.7%) overlap with the Norman K562 Perturb-seq gene vocabulary (Supplementary Table S6).</w:t>
       </w:r>
     </w:p>
-    <w:bookmarkEnd w:id="24"/>
-    <w:bookmarkStart w:id="25" w:name="coverage-gap-analysis"/>
+    <w:bookmarkEnd w:id="23"/>
+    <w:bookmarkStart w:id="24" w:name="coverage-gap-analysis"/>
     <w:p>
       <w:pPr>
         <w:pStyle w:val="Heading3"/>
@@ -968,14 +951,32 @@
         <w:t xml:space="preserve">STRING PPI (v12) was included in the benchmark as the 11th variant but yielded zero predictive signal (r = 0.000 on all subsets), consistent with Identity (no-edge) performance. We attribute this null result to ENSP-to-gene-symbol mapping at the 5,045-gene scale, which introduces identifier ambiguity that degrades the spectral structure relative to the intentionally dense Random graphs. The 11 variants tested span the full density-accuracy design space, with Random graphs and GO serving as dense baselines and the ablation variants (degPreserved, painCentric) testing domain specificity.</w:t>
       </w:r>
     </w:p>
+    <w:bookmarkEnd w:id="24"/>
+    <w:bookmarkStart w:id="25" w:name="Xbeca6b780cec9ce231168ef405910ff7a6161ec"/>
+    <w:p>
+      <w:pPr>
+        <w:pStyle w:val="Heading3"/>
+      </w:pPr>
+      <w:r>
+        <w:t xml:space="preserve">2.4 Perturbation Data and Benchmark Validation</w:t>
+      </w:r>
+    </w:p>
+    <w:p>
+      <w:pPr>
+        <w:pStyle w:val="FirstParagraph"/>
+      </w:pPr>
+      <w:r>
+        <w:t xml:space="preserve">The Norman et al. Perturb-seq dataset (DOI: 10.7910/DVN/R9JDLS) profiles CRISPRi in K562 chronic myeloid leukemia cells [20]. The processed dataset (perturb_processed.h5ad, 2.2 GB; Harvard Dataverse datafile 6154020) contains 5,045 genes across 91,205 cells with 284 perturbation conditions (single-gene and combinatorial). We aggregate cells by perturbation condition to compute mean post-perturbation expression changes (delta = condition_mean - ctrl_mean). Control expression variance across genes is 0.194 (SD = 0.441), computed from log-normalized expression values.</w:t>
+      </w:r>
+    </w:p>
     <w:bookmarkEnd w:id="25"/>
-    <w:bookmarkStart w:id="26" w:name="Xbeca6b780cec9ce231168ef405910ff7a6161ec"/>
+    <w:bookmarkStart w:id="26" w:name="benchmark-validation-methods"/>
     <w:p>
       <w:pPr>
         <w:pStyle w:val="Heading3"/>
       </w:pPr>
       <w:r>
-        <w:t xml:space="preserve">2.4 Perturbation Data and Benchmark Validation</w:t>
+        <w:t xml:space="preserve">2.5 Benchmark Validation Methods</w:t>
       </w:r>
     </w:p>
     <w:p>
@@ -983,17 +984,17 @@
         <w:pStyle w:val="FirstParagraph"/>
       </w:pPr>
       <w:r>
-        <w:t xml:space="preserve">The Norman et al. Perturb-seq dataset (DOI: 10.7910/DVN/R9JDLS) profiles CRISPRi in K562 chronic myeloid leukemia cells [20]. The processed dataset (perturb_processed.h5ad, 2.2 GB; Harvard Dataverse datafile 6154020) contains 5,045 genes across 91,205 cells with 284 perturbation conditions (single-gene and combinatorial). We aggregate cells by perturbation condition to compute mean post-perturbation expression changes (delta = condition_mean - ctrl_mean). Control expression variance across genes is 0.194 (SD = 0.441), computed from log-normalized expression values.</w:t>
+        <w:t xml:space="preserve">For validation, 128-dimensional gene embeddings were computed via spectral decomposition of the normalized graph Laplacian (k = 128) for each KG. Perturbation effects were predicted via ridge regression (lambda = 0.1) across 10 independent train/test splits (80%/20%). This linear architecture isolates KG contribution from model capacity. Paired t-tests with Bonferroni correction (alpha = 0.01, m = 5) and Kendall’s W ranking consistency were used for statistical comparison. Sensitivity analyses for regularization (alpha = 0.001–100.0) and embedding dimension (k = 32–512) confirmed robustness. K562 pain gene expression was quantified per-gene for all 44 pain-annotated genes (mean expression, percent expressing cells). Complete methods, including spectral decomposition details, nonlinear model comparison (MLP vs ridge), GEARS architecture comparison [21], evaluation protocol, and power analysis, are provided in Supplementary Methods.</w:t>
       </w:r>
     </w:p>
     <w:bookmarkEnd w:id="26"/>
-    <w:bookmarkStart w:id="27" w:name="benchmark-validation-methods"/>
+    <w:bookmarkStart w:id="27" w:name="implementation"/>
     <w:p>
       <w:pPr>
         <w:pStyle w:val="Heading3"/>
       </w:pPr>
       <w:r>
-        <w:t xml:space="preserve">2.5 Benchmark Validation Methods</w:t>
+        <w:t xml:space="preserve">2.6 Implementation</w:t>
       </w:r>
     </w:p>
     <w:p>
@@ -1001,17 +1002,27 @@
         <w:pStyle w:val="FirstParagraph"/>
       </w:pPr>
       <w:r>
-        <w:t xml:space="preserve">For validation, 128-dimensional gene embeddings were computed via spectral decomposition of the normalized graph Laplacian (k = 128) for each KG. Perturbation effects were predicted via ridge regression (lambda = 0.1) across 10 independent train/test splits (80%/20%). This linear architecture isolates KG contribution from model capacity. Paired t-tests with Bonferroni correction (alpha = 0.01, m = 5) and Kendall’s W ranking consistency were used for statistical comparison. Sensitivity analyses for regularization (alpha = 0.001–100.0) and embedding dimension (k = 32–512) confirmed robustness. K562 pain gene expression was quantified per-gene for all 44 pain-annotated genes (mean expression, percent expressing cells). Complete methods, including spectral decomposition details, nonlinear model comparison (MLP vs ridge), GEARS architecture comparison [21], evaluation protocol, and power analysis, are provided in Supplementary Methods.</w:t>
+        <w:t xml:space="preserve">Python 3.10+, ScanPy 1.12, NetworkX 3.6, NumPy, SciPy, scikit-learn. Total compute time: approximately 12 minutes (Intel i9-13900K, 64 GB RAM). Full pipeline and processed data at https://github.com/yyx-4113/ra-painkg.</w:t>
       </w:r>
     </w:p>
     <w:bookmarkEnd w:id="27"/>
-    <w:bookmarkStart w:id="28" w:name="implementation"/>
+    <w:bookmarkEnd w:id="28"/>
+    <w:bookmarkStart w:id="32" w:name="results"/>
+    <w:p>
+      <w:pPr>
+        <w:pStyle w:val="Heading2"/>
+      </w:pPr>
+      <w:r>
+        <w:t xml:space="preserve">3. Results</w:t>
+      </w:r>
+    </w:p>
+    <w:bookmarkStart w:id="29" w:name="ra-painkg-resource-description"/>
     <w:p>
       <w:pPr>
         <w:pStyle w:val="Heading3"/>
       </w:pPr>
       <w:r>
-        <w:t xml:space="preserve">2.6 Implementation</w:t>
+        <w:t xml:space="preserve">3.1 RA-PainKG Resource Description</w:t>
       </w:r>
     </w:p>
     <w:p>
@@ -1019,55 +1030,27 @@
         <w:pStyle w:val="FirstParagraph"/>
       </w:pPr>
       <w:r>
-        <w:t xml:space="preserve">Python 3.10+, ScanPy 1.12, NetworkX 3.6, NumPy, SciPy, scikit-learn. Total compute time: approximately 12 minutes (Intel i9-13900K, 64 GB RAM). Full pipeline and processed data at https://github.com/yyx-4113/ra-painkg.</w:t>
-      </w:r>
-    </w:p>
-    <w:bookmarkEnd w:id="28"/>
+        <w:t xml:space="preserve">RA-PainKG is publicly available in three formats: GraphML (network visualization), CSV (edge and node tables), and Python pickle (programmatic access via NetworkX). The complete resource includes: (1) the full knowledge graph with 18,069 nodes and 127,226 directed edges; (2) GTEx v8 tissue expression annotations for 165 pain-annotated genes across 54 human tissues; (3) dual-track gene assignments with supporting literature evidence; and (4) mapping of nine curated pain signaling pathways onto the graph structure.</w:t>
+      </w:r>
+    </w:p>
+    <w:p>
+      <w:pPr>
+        <w:pStyle w:val="BodyText"/>
+      </w:pPr>
+      <w:r>
+        <w:t xml:space="preserve">The graph spans 10 entity types (gene/protein, drug, disease, pathway, biological process, molecular function, cellular component, anatomy, phenotype) and 24 relation types, with drug-target edges (4,760 edges) enabling direct pharmacological queries. Network topology analysis identified EGR1, FOS, STAT3, JUN, and AKT1 as the top five hub nodes by betweenness centrality (Figure 1). The degree distribution follows a scale-free pattern characteristic of biological networks (Figure 2).</w:t>
+      </w:r>
+    </w:p>
+    <w:p>
+      <w:pPr>
+        <w:pStyle w:val="BodyText"/>
+      </w:pPr>
+      <w:r>
+        <w:t xml:space="preserve">All nine literature-curated pain signaling pathways were successfully mapped onto RA-PainKG with gene coverage ranging from 57% (complement cascade) to 100% (TRP channels, voltage-gated sodium channels, neurotrophin signaling). The 165 annotated genes span 15 functional categories (TRP channels, voltage-gated sodium channels, neurotrophin signaling, opioid signaling, MAPK pathway, JAK-STAT pathway, prostaglandin pathway, kinase signaling, transcription factors, serotonin receptors, endocannabinoid system, complement cascade, GABA/glycine receptors, RA-specific genes, and anesthetic targets; complete list in Supplementary Table S1). The 165 annotated genes span 15 functional categories (TRP channels, voltage-gated sodium channels, neurotrophin signaling, opioid signaling, MAPK pathway, JAK-STAT pathway, prostaglandin pathway, kinase signaling, transcription factors, serotonin receptors, endocannabinoid system, complement cascade, GABA/glycine receptors, RA-specific genes, and anesthetic targets; complete list in Supplementary Table S1). The dual-track organization is summarized in Table S1: Track A (immune-inflammation, 106 genes) and Track B (nociception-pain transduction, 122 genes), with 96 genes (58.2%) spanning both tracks. The substantial Track A/B overlap (58.2%) is biologically expected: transcription factors (FOS, JUN, STAT3) activated by inflammatory cytokines also drive nociceptive sensitization, MAP kinases transduce both inflammatory and pain signals, and prostaglandins (via COX-2/PTGS2) bridge immune activation and nociceptor sensitization [5,7]. Rather than indicating poor track separation, this overlap reflects the mechanistic reality that inflammation and pain are deeply coupled in RA. The dual-track framework serves as a conceptual lens for hypothesis generation: genes exclusive to Track A or B may represent intervention points where anti-inflammatory and analgesic effects can be partially decoupled, while dual-track hub genes represent convergence points where both processes are jointly regulated.</w:t>
+      </w:r>
+    </w:p>
     <w:bookmarkEnd w:id="29"/>
-    <w:bookmarkStart w:id="33" w:name="results"/>
-    <w:p>
-      <w:pPr>
-        <w:pStyle w:val="Heading2"/>
-      </w:pPr>
-      <w:r>
-        <w:t xml:space="preserve">3. Results</w:t>
-      </w:r>
-    </w:p>
-    <w:bookmarkStart w:id="30" w:name="ra-painkg-resource-description"/>
-    <w:p>
-      <w:pPr>
-        <w:pStyle w:val="Heading3"/>
-      </w:pPr>
-      <w:r>
-        <w:t xml:space="preserve">3.1 RA-PainKG Resource Description</w:t>
-      </w:r>
-    </w:p>
-    <w:p>
-      <w:pPr>
-        <w:pStyle w:val="FirstParagraph"/>
-      </w:pPr>
-      <w:r>
-        <w:t xml:space="preserve">RA-PainKG is publicly available in three formats: GraphML (network visualization), CSV (edge and node tables), and Python pickle (programmatic access via NetworkX). The complete resource includes: (1) the full knowledge graph with 18,069 nodes and 127,226 directed edges; (2) GTEx v8 tissue expression annotations for 165 pain-annotated genes across 54 human tissues; (3) dual-track gene assignments with supporting literature evidence; and (4) mapping of nine curated pain signaling pathways onto the graph structure.</w:t>
-      </w:r>
-    </w:p>
-    <w:p>
-      <w:pPr>
-        <w:pStyle w:val="BodyText"/>
-      </w:pPr>
-      <w:r>
-        <w:t xml:space="preserve">The graph spans 10 entity types (gene/protein, drug, disease, pathway, biological process, molecular function, cellular component, anatomy, phenotype) and 24 relation types, with drug-target edges (4,760 edges) enabling direct pharmacological queries. Network topology analysis identified EGR1, FOS, STAT3, JUN, and AKT1 as the top five hub nodes by betweenness centrality (Figure 1). The degree distribution follows a scale-free pattern characteristic of biological networks (Figure 2).</w:t>
-      </w:r>
-    </w:p>
-    <w:p>
-      <w:pPr>
-        <w:pStyle w:val="BodyText"/>
-      </w:pPr>
-      <w:r>
-        <w:t xml:space="preserve">All nine literature-curated pain signaling pathways were successfully mapped onto RA-PainKG with gene coverage ranging from 57% (complement cascade) to 100% (TRP channels, voltage-gated sodium channels, neurotrophin signaling). The 165 annotated genes span 15 functional categories (TRP channels, voltage-gated sodium channels, neurotrophin signaling, opioid signaling, MAPK pathway, JAK-STAT pathway, prostaglandin pathway, kinase signaling, transcription factors, serotonin receptors, endocannabinoid system, complement cascade, GABA/glycine receptors, RA-specific genes, and anesthetic targets; complete list in Supplementary Table S1). The 165 annotated genes span 15 functional categories (TRP channels, voltage-gated sodium channels, neurotrophin signaling, opioid signaling, MAPK pathway, JAK-STAT pathway, prostaglandin pathway, kinase signaling, transcription factors, serotonin receptors, endocannabinoid system, complement cascade, GABA/glycine receptors, RA-specific genes, and anesthetic targets; complete list in Supplementary Table S1). The dual-track organization is summarized in Table S1: Track A (immune-inflammation, 106 genes) and Track B (nociception-pain transduction, 122 genes), with 96 genes (58.2%) spanning both tracks. The substantial Track A/B overlap (58.2%) is biologically expected: transcription factors (FOS, JUN, STAT3) activated by inflammatory cytokines also drive nociceptive sensitization, MAP kinases transduce both inflammatory and pain signals, and prostaglandins (via COX-2/PTGS2) bridge immune activation and nociceptor sensitization [5,7]. Rather than indicating poor track separation, this overlap reflects the mechanistic reality that inflammation and pain are deeply coupled in RA. The dual-track framework serves as a conceptual lens for hypothesis generation: genes exclusive to Track A or B may represent intervention points where anti-inflammatory and analgesic effects can be partially decoupled, while dual-track hub genes represent convergence points where both processes are jointly regulated.</w:t>
-      </w:r>
-    </w:p>
-    <w:bookmarkEnd w:id="30"/>
-    <w:bookmarkStart w:id="31" w:name="coverage-gap-analysis-1"/>
+    <w:bookmarkStart w:id="30" w:name="coverage-gap-analysis-1"/>
     <w:p>
       <w:pPr>
         <w:pStyle w:val="Heading3"/>
@@ -2110,51 +2093,51 @@
         </w:tc>
       </w:tr>
     </w:tbl>
+    <w:bookmarkEnd w:id="30"/>
+    <w:bookmarkStart w:id="31" w:name="benchmark-validation"/>
+    <w:p>
+      <w:pPr>
+        <w:pStyle w:val="Heading3"/>
+      </w:pPr>
+      <w:r>
+        <w:t xml:space="preserve">3.3 Benchmark Validation</w:t>
+      </w:r>
+    </w:p>
+    <w:p>
+      <w:pPr>
+        <w:pStyle w:val="FirstParagraph"/>
+      </w:pPr>
+      <w:r>
+        <w:t xml:space="preserve">To establish transparent performance characteristics, we validated RA-PainKG in a perturbation prediction benchmark using the Norman K562 Perturb-seq dataset [20] (91,205 cells, 5,045 genes, 284 CRISPRi conditions). Gene embeddings were computed via spectral decomposition (k = 128) of the normalized graph Laplacian, and perturbation effects were predicted via ridge regression across 10 independent train/test splits (80%/20%). Full methods, results for all 11 KG variants, and sensitivity analyses are provided in Supplementary Tables S1-S6.</w:t>
+      </w:r>
+    </w:p>
+    <w:p>
+      <w:pPr>
+        <w:pStyle w:val="BodyText"/>
+      </w:pPr>
+      <w:r>
+        <w:t xml:space="preserve">Two findings are directly relevant to the resource. First, RA-PainKG is 280-fold sparser than GO (2,400 vs 673,899 PPI edges), with 68.3% of Norman genes having zero edges. Among the 44 pain genes present in the Norman dataset (26.7% of 165 annotated genes), 59.1% (26/44) exhibit mean expression below 0.01 in K562 cells, and mean pain-gene expression (0.117) is comparable to the genome-wide background (0.107). These data establish a clear boundary condition: K562 perturbation prediction performance reflects test system limitations, not resource quality (see Discussion 4.3).</w:t>
+      </w:r>
+    </w:p>
+    <w:p>
+      <w:pPr>
+        <w:pStyle w:val="BodyText"/>
+      </w:pPr>
+      <w:r>
+        <w:t xml:space="preserve">Second, the benchmark reveals a methodological consideration for KG evaluation: single-split evaluation produces artifacts. Under one split (seed 42), RA-PainKG appeared to outperform GO on pain genes (r = 0.558 vs 0.481), but the effect reversed under multi-split averaging (0.503 vs 0.542, Supplementary Table S5). This demonstrates the necessity of multi-split statistics for reliable KG evaluation.</w:t>
+      </w:r>
+    </w:p>
+    <w:p>
+      <w:pPr>
+        <w:pStyle w:val="BodyText"/>
+      </w:pPr>
+      <w:r>
+        <w:t xml:space="preserve">Complete benchmark results for all 11 KG variants, paired statistical comparisons, sensitivity analyses (alpha = 0.001-100.0, k = 32-512), Kendall’s W ranking consistency (0.64-0.65), and ablation analyses are documented in Supplementary Tables S1-S6.</w:t>
+      </w:r>
+    </w:p>
     <w:bookmarkEnd w:id="31"/>
-    <w:bookmarkStart w:id="32" w:name="benchmark-validation"/>
-    <w:p>
-      <w:pPr>
-        <w:pStyle w:val="Heading3"/>
-      </w:pPr>
-      <w:r>
-        <w:t xml:space="preserve">3.3 Benchmark Validation</w:t>
-      </w:r>
-    </w:p>
-    <w:p>
-      <w:pPr>
-        <w:pStyle w:val="FirstParagraph"/>
-      </w:pPr>
-      <w:r>
-        <w:t xml:space="preserve">To establish transparent performance characteristics, we validated RA-PainKG in a perturbation prediction benchmark using the Norman K562 Perturb-seq dataset [20] (91,205 cells, 5,045 genes, 284 CRISPRi conditions). Gene embeddings were computed via spectral decomposition (k = 128) of the normalized graph Laplacian, and perturbation effects were predicted via ridge regression across 10 independent train/test splits (80%/20%). Full methods, results for all 11 KG variants, and sensitivity analyses are provided in Supplementary Tables S1-S6.</w:t>
-      </w:r>
-    </w:p>
-    <w:p>
-      <w:pPr>
-        <w:pStyle w:val="BodyText"/>
-      </w:pPr>
-      <w:r>
-        <w:t xml:space="preserve">Two findings are directly relevant to the resource. First, RA-PainKG is 280-fold sparser than GO (2,400 vs 673,899 PPI edges), with 68.3% of Norman genes having zero edges. Among the 44 pain genes present in the Norman dataset (26.7% of 165 annotated genes), 59.1% (26/44) exhibit mean expression below 0.01 in K562 cells, and mean pain-gene expression (0.117) is comparable to the genome-wide background (0.107). These data establish a clear boundary condition: K562 perturbation prediction performance reflects test system limitations, not resource quality (see Discussion 4.3).</w:t>
-      </w:r>
-    </w:p>
-    <w:p>
-      <w:pPr>
-        <w:pStyle w:val="BodyText"/>
-      </w:pPr>
-      <w:r>
-        <w:t xml:space="preserve">Second, the benchmark reveals a methodological consideration for KG evaluation: single-split evaluation produces artifacts. Under one split (seed 42), RA-PainKG appeared to outperform GO on pain genes (r = 0.558 vs 0.481), but the effect reversed under multi-split averaging (0.503 vs 0.542, Supplementary Table S5). This demonstrates the necessity of multi-split statistics for reliable KG evaluation.</w:t>
-      </w:r>
-    </w:p>
-    <w:p>
-      <w:pPr>
-        <w:pStyle w:val="BodyText"/>
-      </w:pPr>
-      <w:r>
-        <w:t xml:space="preserve">Complete benchmark results for all 11 KG variants, paired statistical comparisons, sensitivity analyses (alpha = 0.001-100.0, k = 32-512), Kendall’s W ranking consistency (0.64-0.65), and ablation analyses are documented in Supplementary Tables S1-S6.</w:t>
-      </w:r>
-    </w:p>
     <w:bookmarkEnd w:id="32"/>
-    <w:bookmarkEnd w:id="33"/>
-    <w:bookmarkStart w:id="40" w:name="discussion"/>
+    <w:bookmarkStart w:id="39" w:name="discussion"/>
     <w:p>
       <w:pPr>
         <w:pStyle w:val="Heading2"/>
@@ -2163,7 +2146,7 @@
         <w:t xml:space="preserve">4. Discussion</w:t>
       </w:r>
     </w:p>
-    <w:bookmarkStart w:id="34" w:name="ra-painkg-as-a-knowledge-resource"/>
+    <w:bookmarkStart w:id="33" w:name="ra-painkg-as-a-knowledge-resource"/>
     <w:p>
       <w:pPr>
         <w:pStyle w:val="Heading3"/>
@@ -2847,14 +2830,32 @@
         <w:t xml:space="preserve">RA-PainKG serves three primary use cases. First, as a queryable knowledge base: researchers can extract pathway subnetworks (all nine curated pain pathways), identify drugs targeting specific pain genes, and retrieve tissue expression profiles across 54 human tissues. Second, as a hypothesis-generation tool: the dual-track framework enables systematic comparison of inflammatory versus nociceptive mechanisms, and bridge genes (STAT3, RELA, NF-kappaB complex) connecting both tracks represent candidate intervention points. Third, as structured prior knowledge for machine learning: the graph provides domain-specific features for gene perturbation prediction, drug repurposing pipelines, and causal mediator identification. Transparent benchmark validation (Section 4.3) establishes the boundary conditions under which each use case applies.</w:t>
       </w:r>
     </w:p>
+    <w:bookmarkEnd w:id="33"/>
+    <w:bookmarkStart w:id="34" w:name="the-value-of-coverage-gap-documentation"/>
+    <w:p>
+      <w:pPr>
+        <w:pStyle w:val="Heading3"/>
+      </w:pPr>
+      <w:r>
+        <w:t xml:space="preserve">4.2 The Value of Coverage-Gap Documentation</w:t>
+      </w:r>
+    </w:p>
+    <w:p>
+      <w:pPr>
+        <w:pStyle w:val="FirstParagraph"/>
+      </w:pPr>
+      <w:r>
+        <w:t xml:space="preserve">The systematic identification of 72 absent genes (37.5% of the curated set) represents a resource contribution in its own right. Rather than silently omitting these genes, RA-PainKG documents exactly which genes are missing, why (identifier mismatch, annotation gaps in PrimeKG), and where researchers should look for alternative information (Supplementary Table S3). This transparency serves multiple purposes: (1) it prevents false-negative conclusions when querying RA-PainKG for specific genes; (2) it identifies systematic curation biases (complement cascade, anesthetic targets, GABA receptors are underrepresented across all general-purpose biomedical KGs); and (3) it provides a prioritized list for future resource development. This approach-a knowledge graph that explicitly documents what it does not contain-is, to our knowledge, rarely implemented in published biomedical knowledge graphs. While resources such as the IUPHAR/BPS Guide to Pharmacology [14] acknowledge incomplete coverage in narrative form, systematic per-gene gap documentation with categorized absence reasons has few precedents. We suggest this practice represents a methodological contribution for transparent resource development.</w:t>
+      </w:r>
+    </w:p>
     <w:bookmarkEnd w:id="34"/>
-    <w:bookmarkStart w:id="35" w:name="the-value-of-coverage-gap-documentation"/>
+    <w:bookmarkStart w:id="35" w:name="X5d4c2885636e0a62531c778a83e0fa67c2a5235"/>
     <w:p>
       <w:pPr>
         <w:pStyle w:val="Heading3"/>
       </w:pPr>
       <w:r>
-        <w:t xml:space="preserve">4.2 The Value of Coverage-Gap Documentation</w:t>
+        <w:t xml:space="preserve">4.3 Benchmark Validation and Boundary Conditions</w:t>
       </w:r>
     </w:p>
     <w:p>
@@ -2862,53 +2863,35 @@
         <w:pStyle w:val="FirstParagraph"/>
       </w:pPr>
       <w:r>
-        <w:t xml:space="preserve">The systematic identification of 72 absent genes (37.5% of the curated set) represents a resource contribution in its own right. Rather than silently omitting these genes, RA-PainKG documents exactly which genes are missing, why (identifier mismatch, annotation gaps in PrimeKG), and where researchers should look for alternative information (Supplementary Table S3). This transparency serves multiple purposes: (1) it prevents false-negative conclusions when querying RA-PainKG for specific genes; (2) it identifies systematic curation biases (complement cascade, anesthetic targets, GABA receptors are underrepresented across all general-purpose biomedical KGs); and (3) it provides a prioritized list for future resource development. This approach-a knowledge graph that explicitly documents what it does not contain-is, to our knowledge, rarely implemented in published biomedical knowledge graphs. While resources such as the IUPHAR/BPS Guide to Pharmacology [14] acknowledge incomplete coverage in narrative form, systematic per-gene gap documentation with categorized absence reasons has few precedents. We suggest this practice represents a methodological contribution for transparent resource development.</w:t>
+        <w:t xml:space="preserve">Benchmark validation across 11 KG variants using the Norman K562 Perturb-seq dataset [20] provides transparent performance characterization (Supplementary Tables S4-S5). Two findings merit discussion.</w:t>
+      </w:r>
+    </w:p>
+    <w:p>
+      <w:pPr>
+        <w:pStyle w:val="BodyText"/>
+      </w:pPr>
+      <w:r>
+        <w:t xml:space="preserve">First, the validation establishes honest boundary conditions. We emphasize that K562 cells were selected not as a biologically appropriate test system for RA pain (they are not), but as the most extensively characterized publicly available genome-scale Perturb-seq dataset with sufficient perturbation diversity for multi-split benchmarking at the time of analysis. The purpose of this validation is not to demonstrate biological utility-it is to characterize the resource’s predictive properties in a standardized setting and to establish transparent performance baselines against which future evaluations in disease-relevant models can be compared. K562 chronic myeloid leukemia cells are fundamentally mismatched to RA pain biology: 59.1% of measurable pain genes (26/44 overlapping) exhibit mean expression below 0.01 in K562 cells, and mean pain-gene expression (0.117) is comparable to the genome-wide background (0.107). Only 26.7% of RA-PainKG pain genes (44/165) are present in the Norman dataset. Consequently, perturbation prediction performance on K562 cells should not be interpreted as a measure of RA-PainKG’s biological validity-it reflects the test system’s limitations, not the resource’s quality.</w:t>
+      </w:r>
+    </w:p>
+    <w:p>
+      <w:pPr>
+        <w:pStyle w:val="BodyText"/>
+      </w:pPr>
+      <w:r>
+        <w:t xml:space="preserve">Second, the benchmark reveals a methodological consideration for KG evaluation: single-split evaluation produces artifacts. Under one split (seed 42), RA-PainKG appeared to outperform GO on pain genes (r = 0.558 vs 0.481), but the effect reversed under multi-split averaging (0.503 vs 0.542). This demonstrates the necessity of multi-split statistics for reliable KG evaluation-findings that apply to any domain-specific KG benchmark, not just RA-PainKG.</w:t>
+      </w:r>
+    </w:p>
+    <w:p>
+      <w:pPr>
+        <w:pStyle w:val="BodyText"/>
+      </w:pPr>
+      <w:r>
+        <w:t xml:space="preserve">We emphasize that the K562 benchmark cannot resolve whether domain KGs improve prediction in disease-relevant systems. Sensory neuron models (iPSC-derived nociceptors, DRG organoids) remain the essential next step for evaluating whether RA-PainKG’s domain-specific prior knowledge confers advantages in biologically appropriate contexts.</w:t>
       </w:r>
     </w:p>
     <w:bookmarkEnd w:id="35"/>
-    <w:bookmarkStart w:id="36" w:name="X5d4c2885636e0a62531c778a83e0fa67c2a5235"/>
-    <w:p>
-      <w:pPr>
-        <w:pStyle w:val="Heading3"/>
-      </w:pPr>
-      <w:r>
-        <w:t xml:space="preserve">4.3 Benchmark Validation and Boundary Conditions</w:t>
-      </w:r>
-    </w:p>
-    <w:p>
-      <w:pPr>
-        <w:pStyle w:val="FirstParagraph"/>
-      </w:pPr>
-      <w:r>
-        <w:t xml:space="preserve">Benchmark validation across 11 KG variants using the Norman K562 Perturb-seq dataset [20] provides transparent performance characterization (Supplementary Tables S4-S5). Two findings merit discussion.</w:t>
-      </w:r>
-    </w:p>
-    <w:p>
-      <w:pPr>
-        <w:pStyle w:val="BodyText"/>
-      </w:pPr>
-      <w:r>
-        <w:t xml:space="preserve">First, the validation establishes honest boundary conditions. We emphasize that K562 cells were selected not as a biologically appropriate test system for RA pain (they are not), but as the most extensively characterized publicly available genome-scale Perturb-seq dataset with sufficient perturbation diversity for multi-split benchmarking at the time of analysis. The purpose of this validation is not to demonstrate biological utility-it is to characterize the resource’s predictive properties in a standardized setting and to establish transparent performance baselines against which future evaluations in disease-relevant models can be compared. K562 chronic myeloid leukemia cells are fundamentally mismatched to RA pain biology: 59.1% of measurable pain genes (26/44 overlapping) exhibit mean expression below 0.01 in K562 cells, and mean pain-gene expression (0.117) is comparable to the genome-wide background (0.107). Only 26.7% of RA-PainKG pain genes (44/165) are present in the Norman dataset. Consequently, perturbation prediction performance on K562 cells should not be interpreted as a measure of RA-PainKG’s biological validity-it reflects the test system’s limitations, not the resource’s quality.</w:t>
-      </w:r>
-    </w:p>
-    <w:p>
-      <w:pPr>
-        <w:pStyle w:val="BodyText"/>
-      </w:pPr>
-      <w:r>
-        <w:t xml:space="preserve">Second, the benchmark reveals a methodological consideration for KG evaluation: single-split evaluation produces artifacts. Under one split (seed 42), RA-PainKG appeared to outperform GO on pain genes (r = 0.558 vs 0.481), but the effect reversed under multi-split averaging (0.503 vs 0.542). This demonstrates the necessity of multi-split statistics for reliable KG evaluation-findings that apply to any domain-specific KG benchmark, not just RA-PainKG.</w:t>
-      </w:r>
-    </w:p>
-    <w:p>
-      <w:pPr>
-        <w:pStyle w:val="BodyText"/>
-      </w:pPr>
-      <w:r>
-        <w:t xml:space="preserve">We emphasize that the K562 benchmark cannot resolve whether domain KGs improve prediction in disease-relevant systems. Sensory neuron models (iPSC-derived nociceptors, DRG organoids) remain the essential next step for evaluating whether RA-PainKG’s domain-specific prior knowledge confers advantages in biologically appropriate contexts.</w:t>
-      </w:r>
-    </w:p>
-    <w:bookmarkEnd w:id="36"/>
-    <w:bookmarkStart w:id="37" w:name="limitations"/>
+    <w:bookmarkStart w:id="36" w:name="limitations"/>
     <w:p>
       <w:pPr>
         <w:pStyle w:val="Heading3"/>
@@ -2989,26 +2972,26 @@
         <w:t xml:space="preserve">PrimeKG node IDs are internal integers. Cross-referencing with standard identifiers (HGNC, Ensembl) requires the original prime_kg.csv file, which is available from the PrimeKG repository.</w:t>
       </w:r>
     </w:p>
+    <w:bookmarkEnd w:id="36"/>
+    <w:bookmarkStart w:id="37" w:name="updates-and-community-contributions"/>
+    <w:p>
+      <w:pPr>
+        <w:pStyle w:val="Heading3"/>
+      </w:pPr>
+      <w:r>
+        <w:t xml:space="preserve">4.5 Updates and Community Contributions</w:t>
+      </w:r>
+    </w:p>
+    <w:p>
+      <w:pPr>
+        <w:pStyle w:val="FirstParagraph"/>
+      </w:pPr>
+      <w:r>
+        <w:t xml:space="preserve">RA-PainKG will be updated with each major PrimeKG release. Community contributions of additional pain pathway annotations, drug-target relationships, and tissue expression data are welcome via the GitHub repository. The modular construction pipeline enables systematic re-generation with updated input resources.</w:t>
+      </w:r>
+    </w:p>
     <w:bookmarkEnd w:id="37"/>
-    <w:bookmarkStart w:id="38" w:name="updates-and-community-contributions"/>
-    <w:p>
-      <w:pPr>
-        <w:pStyle w:val="Heading3"/>
-      </w:pPr>
-      <w:r>
-        <w:t xml:space="preserve">4.5 Updates and Community Contributions</w:t>
-      </w:r>
-    </w:p>
-    <w:p>
-      <w:pPr>
-        <w:pStyle w:val="FirstParagraph"/>
-      </w:pPr>
-      <w:r>
-        <w:t xml:space="preserve">RA-PainKG will be updated with each major PrimeKG release. Community contributions of additional pain pathway annotations, drug-target relationships, and tissue expression data are welcome via the GitHub repository. The modular construction pipeline enables systematic re-generation with updated input resources.</w:t>
-      </w:r>
-    </w:p>
-    <w:bookmarkEnd w:id="38"/>
-    <w:bookmarkStart w:id="39" w:name="conclusion"/>
+    <w:bookmarkStart w:id="38" w:name="conclusion"/>
     <w:p>
       <w:pPr>
         <w:pStyle w:val="Heading3"/>
@@ -3040,9 +3023,9 @@
         </w:pict>
       </w:r>
     </w:p>
+    <w:bookmarkEnd w:id="38"/>
     <w:bookmarkEnd w:id="39"/>
-    <w:bookmarkEnd w:id="40"/>
-    <w:bookmarkStart w:id="46" w:name="usage-examples"/>
+    <w:bookmarkStart w:id="45" w:name="usage-examples"/>
     <w:p>
       <w:pPr>
         <w:pStyle w:val="Heading2"/>
@@ -3094,7 +3077,7 @@
       <w:r>
         <w:t xml:space="preserve"> </w:t>
       </w:r>
-      <w:hyperlink r:id="rId41">
+      <w:hyperlink r:id="rId40">
         <w:r>
           <w:rPr>
             <w:rStyle w:val="Hyperlink"/>
@@ -3305,7 +3288,7 @@
         <w:t xml:space="preserve">.</w:t>
       </w:r>
     </w:p>
-    <w:bookmarkStart w:id="42" w:name="querying-drug-target-relationships"/>
+    <w:bookmarkStart w:id="41" w:name="querying-drug-target-relationships"/>
     <w:p>
       <w:pPr>
         <w:pStyle w:val="Heading3"/>
@@ -3628,14 +3611,302 @@
         <w:t xml:space="preserve"># Example output: [("Celecoxib", "inhibits"), ("Aspirin", "inhibits"), ...]</w:t>
       </w:r>
     </w:p>
+    <w:bookmarkEnd w:id="41"/>
+    <w:bookmarkStart w:id="42" w:name="extracting-pathway-subnetworks"/>
+    <w:p>
+      <w:pPr>
+        <w:pStyle w:val="Heading3"/>
+      </w:pPr>
+      <w:r>
+        <w:t xml:space="preserve">5.2 Extracting Pathway Subnetworks</w:t>
+      </w:r>
+    </w:p>
+    <w:p>
+      <w:pPr>
+        <w:pStyle w:val="SourceCode"/>
+      </w:pPr>
+      <w:r>
+        <w:rPr>
+          <w:rStyle w:val="CommentTok"/>
+        </w:rPr>
+        <w:t xml:space="preserve"># Extract the opioid signaling subnetwork</w:t>
+      </w:r>
+      <w:r>
+        <w:br/>
+      </w:r>
+      <w:r>
+        <w:rPr>
+          <w:rStyle w:val="NormalTok"/>
+        </w:rPr>
+        <w:t xml:space="preserve">opioid_genes </w:t>
+      </w:r>
+      <w:r>
+        <w:rPr>
+          <w:rStyle w:val="OperatorTok"/>
+        </w:rPr>
+        <w:t xml:space="preserve">=</w:t>
+      </w:r>
+      <w:r>
+        <w:rPr>
+          <w:rStyle w:val="NormalTok"/>
+        </w:rPr>
+        <w:t xml:space="preserve"> {</w:t>
+      </w:r>
+      <w:r>
+        <w:rPr>
+          <w:rStyle w:val="StringTok"/>
+        </w:rPr>
+        <w:t xml:space="preserve">"OPRM1"</w:t>
+      </w:r>
+      <w:r>
+        <w:rPr>
+          <w:rStyle w:val="NormalTok"/>
+        </w:rPr>
+        <w:t xml:space="preserve">, </w:t>
+      </w:r>
+      <w:r>
+        <w:rPr>
+          <w:rStyle w:val="StringTok"/>
+        </w:rPr>
+        <w:t xml:space="preserve">"OPRD1"</w:t>
+      </w:r>
+      <w:r>
+        <w:rPr>
+          <w:rStyle w:val="NormalTok"/>
+        </w:rPr>
+        <w:t xml:space="preserve">, </w:t>
+      </w:r>
+      <w:r>
+        <w:rPr>
+          <w:rStyle w:val="StringTok"/>
+        </w:rPr>
+        <w:t xml:space="preserve">"OPRK1"</w:t>
+      </w:r>
+      <w:r>
+        <w:rPr>
+          <w:rStyle w:val="NormalTok"/>
+        </w:rPr>
+        <w:t xml:space="preserve">, </w:t>
+      </w:r>
+      <w:r>
+        <w:rPr>
+          <w:rStyle w:val="StringTok"/>
+        </w:rPr>
+        <w:t xml:space="preserve">"POMC"</w:t>
+      </w:r>
+      <w:r>
+        <w:rPr>
+          <w:rStyle w:val="NormalTok"/>
+        </w:rPr>
+        <w:t xml:space="preserve">, </w:t>
+      </w:r>
+      <w:r>
+        <w:rPr>
+          <w:rStyle w:val="StringTok"/>
+        </w:rPr>
+        <w:t xml:space="preserve">"PENK"</w:t>
+      </w:r>
+      <w:r>
+        <w:rPr>
+          <w:rStyle w:val="NormalTok"/>
+        </w:rPr>
+        <w:t xml:space="preserve">, </w:t>
+      </w:r>
+      <w:r>
+        <w:rPr>
+          <w:rStyle w:val="StringTok"/>
+        </w:rPr>
+        <w:t xml:space="preserve">"PDYN"</w:t>
+      </w:r>
+      <w:r>
+        <w:rPr>
+          <w:rStyle w:val="NormalTok"/>
+        </w:rPr>
+        <w:t xml:space="preserve">}</w:t>
+      </w:r>
+      <w:r>
+        <w:br/>
+      </w:r>
+      <w:r>
+        <w:rPr>
+          <w:rStyle w:val="NormalTok"/>
+        </w:rPr>
+        <w:t xml:space="preserve">opioid_nodes </w:t>
+      </w:r>
+      <w:r>
+        <w:rPr>
+          <w:rStyle w:val="OperatorTok"/>
+        </w:rPr>
+        <w:t xml:space="preserve">=</w:t>
+      </w:r>
+      <w:r>
+        <w:rPr>
+          <w:rStyle w:val="NormalTok"/>
+        </w:rPr>
+        <w:t xml:space="preserve"> {n </w:t>
+      </w:r>
+      <w:r>
+        <w:rPr>
+          <w:rStyle w:val="ControlFlowTok"/>
+        </w:rPr>
+        <w:t xml:space="preserve">for</w:t>
+      </w:r>
+      <w:r>
+        <w:rPr>
+          <w:rStyle w:val="NormalTok"/>
+        </w:rPr>
+        <w:t xml:space="preserve"> n, d </w:t>
+      </w:r>
+      <w:r>
+        <w:rPr>
+          <w:rStyle w:val="KeywordTok"/>
+        </w:rPr>
+        <w:t xml:space="preserve">in</w:t>
+      </w:r>
+      <w:r>
+        <w:rPr>
+          <w:rStyle w:val="NormalTok"/>
+        </w:rPr>
+        <w:t xml:space="preserve"> G.nodes(data</w:t>
+      </w:r>
+      <w:r>
+        <w:rPr>
+          <w:rStyle w:val="OperatorTok"/>
+        </w:rPr>
+        <w:t xml:space="preserve">=</w:t>
+      </w:r>
+      <w:r>
+        <w:rPr>
+          <w:rStyle w:val="VariableTok"/>
+        </w:rPr>
+        <w:t xml:space="preserve">True</w:t>
+      </w:r>
+      <w:r>
+        <w:rPr>
+          <w:rStyle w:val="NormalTok"/>
+        </w:rPr>
+        <w:t xml:space="preserve">)</w:t>
+      </w:r>
+      <w:r>
+        <w:br/>
+      </w:r>
+      <w:r>
+        <w:rPr>
+          <w:rStyle w:val="NormalTok"/>
+        </w:rPr>
+        <w:t xml:space="preserve">                </w:t>
+      </w:r>
+      <w:r>
+        <w:rPr>
+          <w:rStyle w:val="ControlFlowTok"/>
+        </w:rPr>
+        <w:t xml:space="preserve">if</w:t>
+      </w:r>
+      <w:r>
+        <w:rPr>
+          <w:rStyle w:val="NormalTok"/>
+        </w:rPr>
+        <w:t xml:space="preserve"> </w:t>
+      </w:r>
+      <w:r>
+        <w:rPr>
+          <w:rStyle w:val="BuiltInTok"/>
+        </w:rPr>
+        <w:t xml:space="preserve">str</w:t>
+      </w:r>
+      <w:r>
+        <w:rPr>
+          <w:rStyle w:val="NormalTok"/>
+        </w:rPr>
+        <w:t xml:space="preserve">(d.get(</w:t>
+      </w:r>
+      <w:r>
+        <w:rPr>
+          <w:rStyle w:val="StringTok"/>
+        </w:rPr>
+        <w:t xml:space="preserve">"node_name"</w:t>
+      </w:r>
+      <w:r>
+        <w:rPr>
+          <w:rStyle w:val="NormalTok"/>
+        </w:rPr>
+        <w:t xml:space="preserve">, </w:t>
+      </w:r>
+      <w:r>
+        <w:rPr>
+          <w:rStyle w:val="StringTok"/>
+        </w:rPr>
+        <w:t xml:space="preserve">""</w:t>
+      </w:r>
+      <w:r>
+        <w:rPr>
+          <w:rStyle w:val="NormalTok"/>
+        </w:rPr>
+        <w:t xml:space="preserve">)).upper() </w:t>
+      </w:r>
+      <w:r>
+        <w:rPr>
+          <w:rStyle w:val="KeywordTok"/>
+        </w:rPr>
+        <w:t xml:space="preserve">in</w:t>
+      </w:r>
+      <w:r>
+        <w:rPr>
+          <w:rStyle w:val="NormalTok"/>
+        </w:rPr>
+        <w:t xml:space="preserve"> opioid_genes}</w:t>
+      </w:r>
+      <w:r>
+        <w:br/>
+      </w:r>
+      <w:r>
+        <w:rPr>
+          <w:rStyle w:val="NormalTok"/>
+        </w:rPr>
+        <w:t xml:space="preserve">subgraph </w:t>
+      </w:r>
+      <w:r>
+        <w:rPr>
+          <w:rStyle w:val="OperatorTok"/>
+        </w:rPr>
+        <w:t xml:space="preserve">=</w:t>
+      </w:r>
+      <w:r>
+        <w:rPr>
+          <w:rStyle w:val="NormalTok"/>
+        </w:rPr>
+        <w:t xml:space="preserve"> G.subgraph(opioid_nodes)</w:t>
+      </w:r>
+      <w:r>
+        <w:br/>
+      </w:r>
+      <w:r>
+        <w:rPr>
+          <w:rStyle w:val="NormalTok"/>
+        </w:rPr>
+        <w:t xml:space="preserve">nx.write_graphml(subgraph, </w:t>
+      </w:r>
+      <w:r>
+        <w:rPr>
+          <w:rStyle w:val="StringTok"/>
+        </w:rPr>
+        <w:t xml:space="preserve">"opioid_pathway.graphml"</w:t>
+      </w:r>
+      <w:r>
+        <w:rPr>
+          <w:rStyle w:val="NormalTok"/>
+        </w:rPr>
+        <w:t xml:space="preserve">)</w:t>
+      </w:r>
+    </w:p>
     <w:bookmarkEnd w:id="42"/>
-    <w:bookmarkStart w:id="43" w:name="extracting-pathway-subnetworks"/>
+    <w:bookmarkStart w:id="43" w:name="tissue-expression-profile-retrieval"/>
     <w:p>
       <w:pPr>
         <w:pStyle w:val="Heading3"/>
       </w:pPr>
       <w:r>
-        <w:t xml:space="preserve">5.2 Extracting Pathway Subnetworks</w:t>
+        <w:t xml:space="preserve">5.3 Tissue Expression Profile Retrieval</w:t>
       </w:r>
     </w:p>
     <w:p>
@@ -3646,7 +3917,7 @@
         <w:rPr>
           <w:rStyle w:val="CommentTok"/>
         </w:rPr>
-        <w:t xml:space="preserve"># Extract the opioid signaling subnetwork</w:t>
+        <w:t xml:space="preserve"># Retrieve GTEx tissue expression for all Track B pain genes</w:t>
       </w:r>
       <w:r>
         <w:br/>
@@ -3655,7 +3926,7 @@
         <w:rPr>
           <w:rStyle w:val="NormalTok"/>
         </w:rPr>
-        <w:t xml:space="preserve">opioid_genes </w:t>
+        <w:t xml:space="preserve">track_b_expr </w:t>
       </w:r>
       <w:r>
         <w:rPr>
@@ -3667,13 +3938,280 @@
         <w:rPr>
           <w:rStyle w:val="NormalTok"/>
         </w:rPr>
-        <w:t xml:space="preserve"> {</w:t>
+        <w:t xml:space="preserve"> []</w:t>
+      </w:r>
+      <w:r>
+        <w:br/>
+      </w:r>
+      <w:r>
+        <w:rPr>
+          <w:rStyle w:val="ControlFlowTok"/>
+        </w:rPr>
+        <w:t xml:space="preserve">for</w:t>
+      </w:r>
+      <w:r>
+        <w:rPr>
+          <w:rStyle w:val="NormalTok"/>
+        </w:rPr>
+        <w:t xml:space="preserve"> node, data </w:t>
+      </w:r>
+      <w:r>
+        <w:rPr>
+          <w:rStyle w:val="KeywordTok"/>
+        </w:rPr>
+        <w:t xml:space="preserve">in</w:t>
+      </w:r>
+      <w:r>
+        <w:rPr>
+          <w:rStyle w:val="NormalTok"/>
+        </w:rPr>
+        <w:t xml:space="preserve"> G.nodes(data</w:t>
+      </w:r>
+      <w:r>
+        <w:rPr>
+          <w:rStyle w:val="OperatorTok"/>
+        </w:rPr>
+        <w:t xml:space="preserve">=</w:t>
+      </w:r>
+      <w:r>
+        <w:rPr>
+          <w:rStyle w:val="VariableTok"/>
+        </w:rPr>
+        <w:t xml:space="preserve">True</w:t>
+      </w:r>
+      <w:r>
+        <w:rPr>
+          <w:rStyle w:val="NormalTok"/>
+        </w:rPr>
+        <w:t xml:space="preserve">):</w:t>
+      </w:r>
+      <w:r>
+        <w:br/>
+      </w:r>
+      <w:r>
+        <w:rPr>
+          <w:rStyle w:val="NormalTok"/>
+        </w:rPr>
+        <w:t xml:space="preserve">    </w:t>
+      </w:r>
+      <w:r>
+        <w:rPr>
+          <w:rStyle w:val="ControlFlowTok"/>
+        </w:rPr>
+        <w:t xml:space="preserve">if</w:t>
+      </w:r>
+      <w:r>
+        <w:rPr>
+          <w:rStyle w:val="NormalTok"/>
+        </w:rPr>
+        <w:t xml:space="preserve"> data.get(</w:t>
       </w:r>
       <w:r>
         <w:rPr>
           <w:rStyle w:val="StringTok"/>
         </w:rPr>
-        <w:t xml:space="preserve">"OPRM1"</w:t>
+        <w:t xml:space="preserve">"track"</w:t>
+      </w:r>
+      <w:r>
+        <w:rPr>
+          <w:rStyle w:val="NormalTok"/>
+        </w:rPr>
+        <w:t xml:space="preserve">) </w:t>
+      </w:r>
+      <w:r>
+        <w:rPr>
+          <w:rStyle w:val="OperatorTok"/>
+        </w:rPr>
+        <w:t xml:space="preserve">==</w:t>
+      </w:r>
+      <w:r>
+        <w:rPr>
+          <w:rStyle w:val="NormalTok"/>
+        </w:rPr>
+        <w:t xml:space="preserve"> </w:t>
+      </w:r>
+      <w:r>
+        <w:rPr>
+          <w:rStyle w:val="StringTok"/>
+        </w:rPr>
+        <w:t xml:space="preserve">"B"</w:t>
+      </w:r>
+      <w:r>
+        <w:rPr>
+          <w:rStyle w:val="NormalTok"/>
+        </w:rPr>
+        <w:t xml:space="preserve"> </w:t>
+      </w:r>
+      <w:r>
+        <w:rPr>
+          <w:rStyle w:val="KeywordTok"/>
+        </w:rPr>
+        <w:t xml:space="preserve">and</w:t>
+      </w:r>
+      <w:r>
+        <w:rPr>
+          <w:rStyle w:val="NormalTok"/>
+        </w:rPr>
+        <w:t xml:space="preserve"> data.get(</w:t>
+      </w:r>
+      <w:r>
+        <w:rPr>
+          <w:rStyle w:val="StringTok"/>
+        </w:rPr>
+        <w:t xml:space="preserve">"node_type"</w:t>
+      </w:r>
+      <w:r>
+        <w:rPr>
+          <w:rStyle w:val="NormalTok"/>
+        </w:rPr>
+        <w:t xml:space="preserve">) </w:t>
+      </w:r>
+      <w:r>
+        <w:rPr>
+          <w:rStyle w:val="OperatorTok"/>
+        </w:rPr>
+        <w:t xml:space="preserve">==</w:t>
+      </w:r>
+      <w:r>
+        <w:rPr>
+          <w:rStyle w:val="NormalTok"/>
+        </w:rPr>
+        <w:t xml:space="preserve"> </w:t>
+      </w:r>
+      <w:r>
+        <w:rPr>
+          <w:rStyle w:val="StringTok"/>
+        </w:rPr>
+        <w:t xml:space="preserve">"gene/protein"</w:t>
+      </w:r>
+      <w:r>
+        <w:rPr>
+          <w:rStyle w:val="NormalTok"/>
+        </w:rPr>
+        <w:t xml:space="preserve">:</w:t>
+      </w:r>
+      <w:r>
+        <w:br/>
+      </w:r>
+      <w:r>
+        <w:rPr>
+          <w:rStyle w:val="NormalTok"/>
+        </w:rPr>
+        <w:t xml:space="preserve">        gene </w:t>
+      </w:r>
+      <w:r>
+        <w:rPr>
+          <w:rStyle w:val="OperatorTok"/>
+        </w:rPr>
+        <w:t xml:space="preserve">=</w:t>
+      </w:r>
+      <w:r>
+        <w:rPr>
+          <w:rStyle w:val="NormalTok"/>
+        </w:rPr>
+        <w:t xml:space="preserve"> data[</w:t>
+      </w:r>
+      <w:r>
+        <w:rPr>
+          <w:rStyle w:val="StringTok"/>
+        </w:rPr>
+        <w:t xml:space="preserve">"node_name"</w:t>
+      </w:r>
+      <w:r>
+        <w:rPr>
+          <w:rStyle w:val="NormalTok"/>
+        </w:rPr>
+        <w:t xml:space="preserve">]</w:t>
+      </w:r>
+      <w:r>
+        <w:br/>
+      </w:r>
+      <w:r>
+        <w:rPr>
+          <w:rStyle w:val="NormalTok"/>
+        </w:rPr>
+        <w:t xml:space="preserve">        expr </w:t>
+      </w:r>
+      <w:r>
+        <w:rPr>
+          <w:rStyle w:val="OperatorTok"/>
+        </w:rPr>
+        <w:t xml:space="preserve">=</w:t>
+      </w:r>
+      <w:r>
+        <w:rPr>
+          <w:rStyle w:val="NormalTok"/>
+        </w:rPr>
+        <w:t xml:space="preserve"> data.get(</w:t>
+      </w:r>
+      <w:r>
+        <w:rPr>
+          <w:rStyle w:val="StringTok"/>
+        </w:rPr>
+        <w:t xml:space="preserve">"gtex_median_tpm"</w:t>
+      </w:r>
+      <w:r>
+        <w:rPr>
+          <w:rStyle w:val="NormalTok"/>
+        </w:rPr>
+        <w:t xml:space="preserve">, {})</w:t>
+      </w:r>
+      <w:r>
+        <w:br/>
+      </w:r>
+      <w:r>
+        <w:rPr>
+          <w:rStyle w:val="NormalTok"/>
+        </w:rPr>
+        <w:t xml:space="preserve">        track_b_expr.append({</w:t>
+      </w:r>
+      <w:r>
+        <w:br/>
+      </w:r>
+      <w:r>
+        <w:rPr>
+          <w:rStyle w:val="NormalTok"/>
+        </w:rPr>
+        <w:t xml:space="preserve">            </w:t>
+      </w:r>
+      <w:r>
+        <w:rPr>
+          <w:rStyle w:val="StringTok"/>
+        </w:rPr>
+        <w:t xml:space="preserve">"gene"</w:t>
+      </w:r>
+      <w:r>
+        <w:rPr>
+          <w:rStyle w:val="NormalTok"/>
+        </w:rPr>
+        <w:t xml:space="preserve">: gene,</w:t>
+      </w:r>
+      <w:r>
+        <w:br/>
+      </w:r>
+      <w:r>
+        <w:rPr>
+          <w:rStyle w:val="NormalTok"/>
+        </w:rPr>
+        <w:t xml:space="preserve">            </w:t>
+      </w:r>
+      <w:r>
+        <w:rPr>
+          <w:rStyle w:val="StringTok"/>
+        </w:rPr>
+        <w:t xml:space="preserve">"spinal"</w:t>
+      </w:r>
+      <w:r>
+        <w:rPr>
+          <w:rStyle w:val="NormalTok"/>
+        </w:rPr>
+        <w:t xml:space="preserve">: expr.get(</w:t>
+      </w:r>
+      <w:r>
+        <w:rPr>
+          <w:rStyle w:val="StringTok"/>
+        </w:rPr>
+        <w:t xml:space="preserve">"Spinal_Cord_cervical_c-1"</w:t>
       </w:r>
       <w:r>
         <w:rPr>
@@ -3685,7 +4223,40 @@
         <w:rPr>
           <w:rStyle w:val="StringTok"/>
         </w:rPr>
-        <w:t xml:space="preserve">"OPRD1"</w:t>
+        <w:t xml:space="preserve">"N/A"</w:t>
+      </w:r>
+      <w:r>
+        <w:rPr>
+          <w:rStyle w:val="NormalTok"/>
+        </w:rPr>
+        <w:t xml:space="preserve">),</w:t>
+      </w:r>
+      <w:r>
+        <w:br/>
+      </w:r>
+      <w:r>
+        <w:rPr>
+          <w:rStyle w:val="NormalTok"/>
+        </w:rPr>
+        <w:t xml:space="preserve">            </w:t>
+      </w:r>
+      <w:r>
+        <w:rPr>
+          <w:rStyle w:val="StringTok"/>
+        </w:rPr>
+        <w:t xml:space="preserve">"tibial"</w:t>
+      </w:r>
+      <w:r>
+        <w:rPr>
+          <w:rStyle w:val="NormalTok"/>
+        </w:rPr>
+        <w:t xml:space="preserve">: expr.get(</w:t>
+      </w:r>
+      <w:r>
+        <w:rPr>
+          <w:rStyle w:val="StringTok"/>
+        </w:rPr>
+        <w:t xml:space="preserve">"Nerve_Tibial"</w:t>
       </w:r>
       <w:r>
         <w:rPr>
@@ -3697,106 +4268,205 @@
         <w:rPr>
           <w:rStyle w:val="StringTok"/>
         </w:rPr>
-        <w:t xml:space="preserve">"OPRK1"</w:t>
-      </w:r>
-      <w:r>
-        <w:rPr>
-          <w:rStyle w:val="NormalTok"/>
-        </w:rPr>
-        <w:t xml:space="preserve">, </w:t>
+        <w:t xml:space="preserve">"N/A"</w:t>
+      </w:r>
+      <w:r>
+        <w:rPr>
+          <w:rStyle w:val="NormalTok"/>
+        </w:rPr>
+        <w:t xml:space="preserve">)</w:t>
+      </w:r>
+      <w:r>
+        <w:br/>
+      </w:r>
+      <w:r>
+        <w:rPr>
+          <w:rStyle w:val="NormalTok"/>
+        </w:rPr>
+        <w:t xml:space="preserve">        })</w:t>
+      </w:r>
+      <w:r>
+        <w:br/>
+      </w:r>
+      <w:r>
+        <w:rPr>
+          <w:rStyle w:val="CommentTok"/>
+        </w:rPr>
+        <w:t xml:space="preserve"># Display first 5 Track B genes</w:t>
+      </w:r>
+      <w:r>
+        <w:br/>
+      </w:r>
+      <w:r>
+        <w:rPr>
+          <w:rStyle w:val="ControlFlowTok"/>
+        </w:rPr>
+        <w:t xml:space="preserve">for</w:t>
+      </w:r>
+      <w:r>
+        <w:rPr>
+          <w:rStyle w:val="NormalTok"/>
+        </w:rPr>
+        <w:t xml:space="preserve"> item </w:t>
+      </w:r>
+      <w:r>
+        <w:rPr>
+          <w:rStyle w:val="KeywordTok"/>
+        </w:rPr>
+        <w:t xml:space="preserve">in</w:t>
+      </w:r>
+      <w:r>
+        <w:rPr>
+          <w:rStyle w:val="NormalTok"/>
+        </w:rPr>
+        <w:t xml:space="preserve"> track_b_expr[:</w:t>
+      </w:r>
+      <w:r>
+        <w:rPr>
+          <w:rStyle w:val="DecValTok"/>
+        </w:rPr>
+        <w:t xml:space="preserve">5</w:t>
+      </w:r>
+      <w:r>
+        <w:rPr>
+          <w:rStyle w:val="NormalTok"/>
+        </w:rPr>
+        <w:t xml:space="preserve">]:</w:t>
+      </w:r>
+      <w:r>
+        <w:br/>
+      </w:r>
+      <w:r>
+        <w:rPr>
+          <w:rStyle w:val="NormalTok"/>
+        </w:rPr>
+        <w:t xml:space="preserve">    </w:t>
+      </w:r>
+      <w:r>
+        <w:rPr>
+          <w:rStyle w:val="BuiltInTok"/>
+        </w:rPr>
+        <w:t xml:space="preserve">print</w:t>
+      </w:r>
+      <w:r>
+        <w:rPr>
+          <w:rStyle w:val="NormalTok"/>
+        </w:rPr>
+        <w:t xml:space="preserve">(</w:t>
+      </w:r>
+      <w:r>
+        <w:rPr>
+          <w:rStyle w:val="SpecialStringTok"/>
+        </w:rPr>
+        <w:t xml:space="preserve">f"</w:t>
+      </w:r>
+      <w:r>
+        <w:rPr>
+          <w:rStyle w:val="SpecialCharTok"/>
+        </w:rPr>
+        <w:t xml:space="preserve">{</w:t>
+      </w:r>
+      <w:r>
+        <w:rPr>
+          <w:rStyle w:val="NormalTok"/>
+        </w:rPr>
+        <w:t xml:space="preserve">item[</w:t>
       </w:r>
       <w:r>
         <w:rPr>
           <w:rStyle w:val="StringTok"/>
         </w:rPr>
-        <w:t xml:space="preserve">"POMC"</w:t>
-      </w:r>
-      <w:r>
-        <w:rPr>
-          <w:rStyle w:val="NormalTok"/>
-        </w:rPr>
-        <w:t xml:space="preserve">, </w:t>
+        <w:t xml:space="preserve">'gene'</w:t>
+      </w:r>
+      <w:r>
+        <w:rPr>
+          <w:rStyle w:val="NormalTok"/>
+        </w:rPr>
+        <w:t xml:space="preserve">]</w:t>
+      </w:r>
+      <w:r>
+        <w:rPr>
+          <w:rStyle w:val="SpecialCharTok"/>
+        </w:rPr>
+        <w:t xml:space="preserve">}</w:t>
+      </w:r>
+      <w:r>
+        <w:rPr>
+          <w:rStyle w:val="SpecialStringTok"/>
+        </w:rPr>
+        <w:t xml:space="preserve">: Spinal=</w:t>
+      </w:r>
+      <w:r>
+        <w:rPr>
+          <w:rStyle w:val="SpecialCharTok"/>
+        </w:rPr>
+        <w:t xml:space="preserve">{</w:t>
+      </w:r>
+      <w:r>
+        <w:rPr>
+          <w:rStyle w:val="NormalTok"/>
+        </w:rPr>
+        <w:t xml:space="preserve">item[</w:t>
       </w:r>
       <w:r>
         <w:rPr>
           <w:rStyle w:val="StringTok"/>
         </w:rPr>
-        <w:t xml:space="preserve">"PENK"</w:t>
-      </w:r>
-      <w:r>
-        <w:rPr>
-          <w:rStyle w:val="NormalTok"/>
-        </w:rPr>
-        <w:t xml:space="preserve">, </w:t>
+        <w:t xml:space="preserve">'spinal'</w:t>
+      </w:r>
+      <w:r>
+        <w:rPr>
+          <w:rStyle w:val="NormalTok"/>
+        </w:rPr>
+        <w:t xml:space="preserve">]</w:t>
+      </w:r>
+      <w:r>
+        <w:rPr>
+          <w:rStyle w:val="SpecialCharTok"/>
+        </w:rPr>
+        <w:t xml:space="preserve">}</w:t>
+      </w:r>
+      <w:r>
+        <w:rPr>
+          <w:rStyle w:val="SpecialStringTok"/>
+        </w:rPr>
+        <w:t xml:space="preserve">, Tibial=</w:t>
+      </w:r>
+      <w:r>
+        <w:rPr>
+          <w:rStyle w:val="SpecialCharTok"/>
+        </w:rPr>
+        <w:t xml:space="preserve">{</w:t>
+      </w:r>
+      <w:r>
+        <w:rPr>
+          <w:rStyle w:val="NormalTok"/>
+        </w:rPr>
+        <w:t xml:space="preserve">item[</w:t>
       </w:r>
       <w:r>
         <w:rPr>
           <w:rStyle w:val="StringTok"/>
         </w:rPr>
-        <w:t xml:space="preserve">"PDYN"</w:t>
-      </w:r>
-      <w:r>
-        <w:rPr>
-          <w:rStyle w:val="NormalTok"/>
+        <w:t xml:space="preserve">'tibial'</w:t>
+      </w:r>
+      <w:r>
+        <w:rPr>
+          <w:rStyle w:val="NormalTok"/>
+        </w:rPr>
+        <w:t xml:space="preserve">]</w:t>
+      </w:r>
+      <w:r>
+        <w:rPr>
+          <w:rStyle w:val="SpecialCharTok"/>
         </w:rPr>
         <w:t xml:space="preserve">}</w:t>
       </w:r>
       <w:r>
-        <w:br/>
-      </w:r>
-      <w:r>
-        <w:rPr>
-          <w:rStyle w:val="NormalTok"/>
-        </w:rPr>
-        <w:t xml:space="preserve">opioid_nodes </w:t>
-      </w:r>
-      <w:r>
-        <w:rPr>
-          <w:rStyle w:val="OperatorTok"/>
-        </w:rPr>
-        <w:t xml:space="preserve">=</w:t>
-      </w:r>
-      <w:r>
-        <w:rPr>
-          <w:rStyle w:val="NormalTok"/>
-        </w:rPr>
-        <w:t xml:space="preserve"> {n </w:t>
-      </w:r>
-      <w:r>
-        <w:rPr>
-          <w:rStyle w:val="ControlFlowTok"/>
-        </w:rPr>
-        <w:t xml:space="preserve">for</w:t>
-      </w:r>
-      <w:r>
-        <w:rPr>
-          <w:rStyle w:val="NormalTok"/>
-        </w:rPr>
-        <w:t xml:space="preserve"> n, d </w:t>
-      </w:r>
-      <w:r>
-        <w:rPr>
-          <w:rStyle w:val="KeywordTok"/>
-        </w:rPr>
-        <w:t xml:space="preserve">in</w:t>
-      </w:r>
-      <w:r>
-        <w:rPr>
-          <w:rStyle w:val="NormalTok"/>
-        </w:rPr>
-        <w:t xml:space="preserve"> G.nodes(data</w:t>
-      </w:r>
-      <w:r>
-        <w:rPr>
-          <w:rStyle w:val="OperatorTok"/>
-        </w:rPr>
-        <w:t xml:space="preserve">=</w:t>
-      </w:r>
-      <w:r>
-        <w:rPr>
-          <w:rStyle w:val="VariableTok"/>
-        </w:rPr>
-        <w:t xml:space="preserve">True</w:t>
+        <w:rPr>
+          <w:rStyle w:val="SpecialStringTok"/>
+        </w:rPr>
+        <w:t xml:space="preserve">"</w:t>
       </w:r>
       <w:r>
         <w:rPr>
@@ -3804,696 +4474,9 @@
         </w:rPr>
         <w:t xml:space="preserve">)</w:t>
       </w:r>
-      <w:r>
-        <w:br/>
-      </w:r>
-      <w:r>
-        <w:rPr>
-          <w:rStyle w:val="NormalTok"/>
-        </w:rPr>
-        <w:t xml:space="preserve">                </w:t>
-      </w:r>
-      <w:r>
-        <w:rPr>
-          <w:rStyle w:val="ControlFlowTok"/>
-        </w:rPr>
-        <w:t xml:space="preserve">if</w:t>
-      </w:r>
-      <w:r>
-        <w:rPr>
-          <w:rStyle w:val="NormalTok"/>
-        </w:rPr>
-        <w:t xml:space="preserve"> </w:t>
-      </w:r>
-      <w:r>
-        <w:rPr>
-          <w:rStyle w:val="BuiltInTok"/>
-        </w:rPr>
-        <w:t xml:space="preserve">str</w:t>
-      </w:r>
-      <w:r>
-        <w:rPr>
-          <w:rStyle w:val="NormalTok"/>
-        </w:rPr>
-        <w:t xml:space="preserve">(d.get(</w:t>
-      </w:r>
-      <w:r>
-        <w:rPr>
-          <w:rStyle w:val="StringTok"/>
-        </w:rPr>
-        <w:t xml:space="preserve">"node_name"</w:t>
-      </w:r>
-      <w:r>
-        <w:rPr>
-          <w:rStyle w:val="NormalTok"/>
-        </w:rPr>
-        <w:t xml:space="preserve">, </w:t>
-      </w:r>
-      <w:r>
-        <w:rPr>
-          <w:rStyle w:val="StringTok"/>
-        </w:rPr>
-        <w:t xml:space="preserve">""</w:t>
-      </w:r>
-      <w:r>
-        <w:rPr>
-          <w:rStyle w:val="NormalTok"/>
-        </w:rPr>
-        <w:t xml:space="preserve">)).upper() </w:t>
-      </w:r>
-      <w:r>
-        <w:rPr>
-          <w:rStyle w:val="KeywordTok"/>
-        </w:rPr>
-        <w:t xml:space="preserve">in</w:t>
-      </w:r>
-      <w:r>
-        <w:rPr>
-          <w:rStyle w:val="NormalTok"/>
-        </w:rPr>
-        <w:t xml:space="preserve"> opioid_genes}</w:t>
-      </w:r>
-      <w:r>
-        <w:br/>
-      </w:r>
-      <w:r>
-        <w:rPr>
-          <w:rStyle w:val="NormalTok"/>
-        </w:rPr>
-        <w:t xml:space="preserve">subgraph </w:t>
-      </w:r>
-      <w:r>
-        <w:rPr>
-          <w:rStyle w:val="OperatorTok"/>
-        </w:rPr>
-        <w:t xml:space="preserve">=</w:t>
-      </w:r>
-      <w:r>
-        <w:rPr>
-          <w:rStyle w:val="NormalTok"/>
-        </w:rPr>
-        <w:t xml:space="preserve"> G.subgraph(opioid_nodes)</w:t>
-      </w:r>
-      <w:r>
-        <w:br/>
-      </w:r>
-      <w:r>
-        <w:rPr>
-          <w:rStyle w:val="NormalTok"/>
-        </w:rPr>
-        <w:t xml:space="preserve">nx.write_graphml(subgraph, </w:t>
-      </w:r>
-      <w:r>
-        <w:rPr>
-          <w:rStyle w:val="StringTok"/>
-        </w:rPr>
-        <w:t xml:space="preserve">"opioid_pathway.graphml"</w:t>
-      </w:r>
-      <w:r>
-        <w:rPr>
-          <w:rStyle w:val="NormalTok"/>
-        </w:rPr>
-        <w:t xml:space="preserve">)</w:t>
-      </w:r>
     </w:p>
     <w:bookmarkEnd w:id="43"/>
-    <w:bookmarkStart w:id="44" w:name="tissue-expression-profile-retrieval"/>
-    <w:p>
-      <w:pPr>
-        <w:pStyle w:val="Heading3"/>
-      </w:pPr>
-      <w:r>
-        <w:t xml:space="preserve">5.3 Tissue Expression Profile Retrieval</w:t>
-      </w:r>
-    </w:p>
-    <w:p>
-      <w:pPr>
-        <w:pStyle w:val="SourceCode"/>
-      </w:pPr>
-      <w:r>
-        <w:rPr>
-          <w:rStyle w:val="CommentTok"/>
-        </w:rPr>
-        <w:t xml:space="preserve"># Retrieve GTEx tissue expression for all Track B pain genes</w:t>
-      </w:r>
-      <w:r>
-        <w:br/>
-      </w:r>
-      <w:r>
-        <w:rPr>
-          <w:rStyle w:val="NormalTok"/>
-        </w:rPr>
-        <w:t xml:space="preserve">track_b_expr </w:t>
-      </w:r>
-      <w:r>
-        <w:rPr>
-          <w:rStyle w:val="OperatorTok"/>
-        </w:rPr>
-        <w:t xml:space="preserve">=</w:t>
-      </w:r>
-      <w:r>
-        <w:rPr>
-          <w:rStyle w:val="NormalTok"/>
-        </w:rPr>
-        <w:t xml:space="preserve"> []</w:t>
-      </w:r>
-      <w:r>
-        <w:br/>
-      </w:r>
-      <w:r>
-        <w:rPr>
-          <w:rStyle w:val="ControlFlowTok"/>
-        </w:rPr>
-        <w:t xml:space="preserve">for</w:t>
-      </w:r>
-      <w:r>
-        <w:rPr>
-          <w:rStyle w:val="NormalTok"/>
-        </w:rPr>
-        <w:t xml:space="preserve"> node, data </w:t>
-      </w:r>
-      <w:r>
-        <w:rPr>
-          <w:rStyle w:val="KeywordTok"/>
-        </w:rPr>
-        <w:t xml:space="preserve">in</w:t>
-      </w:r>
-      <w:r>
-        <w:rPr>
-          <w:rStyle w:val="NormalTok"/>
-        </w:rPr>
-        <w:t xml:space="preserve"> G.nodes(data</w:t>
-      </w:r>
-      <w:r>
-        <w:rPr>
-          <w:rStyle w:val="OperatorTok"/>
-        </w:rPr>
-        <w:t xml:space="preserve">=</w:t>
-      </w:r>
-      <w:r>
-        <w:rPr>
-          <w:rStyle w:val="VariableTok"/>
-        </w:rPr>
-        <w:t xml:space="preserve">True</w:t>
-      </w:r>
-      <w:r>
-        <w:rPr>
-          <w:rStyle w:val="NormalTok"/>
-        </w:rPr>
-        <w:t xml:space="preserve">):</w:t>
-      </w:r>
-      <w:r>
-        <w:br/>
-      </w:r>
-      <w:r>
-        <w:rPr>
-          <w:rStyle w:val="NormalTok"/>
-        </w:rPr>
-        <w:t xml:space="preserve">    </w:t>
-      </w:r>
-      <w:r>
-        <w:rPr>
-          <w:rStyle w:val="ControlFlowTok"/>
-        </w:rPr>
-        <w:t xml:space="preserve">if</w:t>
-      </w:r>
-      <w:r>
-        <w:rPr>
-          <w:rStyle w:val="NormalTok"/>
-        </w:rPr>
-        <w:t xml:space="preserve"> data.get(</w:t>
-      </w:r>
-      <w:r>
-        <w:rPr>
-          <w:rStyle w:val="StringTok"/>
-        </w:rPr>
-        <w:t xml:space="preserve">"track"</w:t>
-      </w:r>
-      <w:r>
-        <w:rPr>
-          <w:rStyle w:val="NormalTok"/>
-        </w:rPr>
-        <w:t xml:space="preserve">) </w:t>
-      </w:r>
-      <w:r>
-        <w:rPr>
-          <w:rStyle w:val="OperatorTok"/>
-        </w:rPr>
-        <w:t xml:space="preserve">==</w:t>
-      </w:r>
-      <w:r>
-        <w:rPr>
-          <w:rStyle w:val="NormalTok"/>
-        </w:rPr>
-        <w:t xml:space="preserve"> </w:t>
-      </w:r>
-      <w:r>
-        <w:rPr>
-          <w:rStyle w:val="StringTok"/>
-        </w:rPr>
-        <w:t xml:space="preserve">"B"</w:t>
-      </w:r>
-      <w:r>
-        <w:rPr>
-          <w:rStyle w:val="NormalTok"/>
-        </w:rPr>
-        <w:t xml:space="preserve"> </w:t>
-      </w:r>
-      <w:r>
-        <w:rPr>
-          <w:rStyle w:val="KeywordTok"/>
-        </w:rPr>
-        <w:t xml:space="preserve">and</w:t>
-      </w:r>
-      <w:r>
-        <w:rPr>
-          <w:rStyle w:val="NormalTok"/>
-        </w:rPr>
-        <w:t xml:space="preserve"> data.get(</w:t>
-      </w:r>
-      <w:r>
-        <w:rPr>
-          <w:rStyle w:val="StringTok"/>
-        </w:rPr>
-        <w:t xml:space="preserve">"node_type"</w:t>
-      </w:r>
-      <w:r>
-        <w:rPr>
-          <w:rStyle w:val="NormalTok"/>
-        </w:rPr>
-        <w:t xml:space="preserve">) </w:t>
-      </w:r>
-      <w:r>
-        <w:rPr>
-          <w:rStyle w:val="OperatorTok"/>
-        </w:rPr>
-        <w:t xml:space="preserve">==</w:t>
-      </w:r>
-      <w:r>
-        <w:rPr>
-          <w:rStyle w:val="NormalTok"/>
-        </w:rPr>
-        <w:t xml:space="preserve"> </w:t>
-      </w:r>
-      <w:r>
-        <w:rPr>
-          <w:rStyle w:val="StringTok"/>
-        </w:rPr>
-        <w:t xml:space="preserve">"gene/protein"</w:t>
-      </w:r>
-      <w:r>
-        <w:rPr>
-          <w:rStyle w:val="NormalTok"/>
-        </w:rPr>
-        <w:t xml:space="preserve">:</w:t>
-      </w:r>
-      <w:r>
-        <w:br/>
-      </w:r>
-      <w:r>
-        <w:rPr>
-          <w:rStyle w:val="NormalTok"/>
-        </w:rPr>
-        <w:t xml:space="preserve">        gene </w:t>
-      </w:r>
-      <w:r>
-        <w:rPr>
-          <w:rStyle w:val="OperatorTok"/>
-        </w:rPr>
-        <w:t xml:space="preserve">=</w:t>
-      </w:r>
-      <w:r>
-        <w:rPr>
-          <w:rStyle w:val="NormalTok"/>
-        </w:rPr>
-        <w:t xml:space="preserve"> data[</w:t>
-      </w:r>
-      <w:r>
-        <w:rPr>
-          <w:rStyle w:val="StringTok"/>
-        </w:rPr>
-        <w:t xml:space="preserve">"node_name"</w:t>
-      </w:r>
-      <w:r>
-        <w:rPr>
-          <w:rStyle w:val="NormalTok"/>
-        </w:rPr>
-        <w:t xml:space="preserve">]</w:t>
-      </w:r>
-      <w:r>
-        <w:br/>
-      </w:r>
-      <w:r>
-        <w:rPr>
-          <w:rStyle w:val="NormalTok"/>
-        </w:rPr>
-        <w:t xml:space="preserve">        expr </w:t>
-      </w:r>
-      <w:r>
-        <w:rPr>
-          <w:rStyle w:val="OperatorTok"/>
-        </w:rPr>
-        <w:t xml:space="preserve">=</w:t>
-      </w:r>
-      <w:r>
-        <w:rPr>
-          <w:rStyle w:val="NormalTok"/>
-        </w:rPr>
-        <w:t xml:space="preserve"> data.get(</w:t>
-      </w:r>
-      <w:r>
-        <w:rPr>
-          <w:rStyle w:val="StringTok"/>
-        </w:rPr>
-        <w:t xml:space="preserve">"gtex_median_tpm"</w:t>
-      </w:r>
-      <w:r>
-        <w:rPr>
-          <w:rStyle w:val="NormalTok"/>
-        </w:rPr>
-        <w:t xml:space="preserve">, {})</w:t>
-      </w:r>
-      <w:r>
-        <w:br/>
-      </w:r>
-      <w:r>
-        <w:rPr>
-          <w:rStyle w:val="NormalTok"/>
-        </w:rPr>
-        <w:t xml:space="preserve">        track_b_expr.append({</w:t>
-      </w:r>
-      <w:r>
-        <w:br/>
-      </w:r>
-      <w:r>
-        <w:rPr>
-          <w:rStyle w:val="NormalTok"/>
-        </w:rPr>
-        <w:t xml:space="preserve">            </w:t>
-      </w:r>
-      <w:r>
-        <w:rPr>
-          <w:rStyle w:val="StringTok"/>
-        </w:rPr>
-        <w:t xml:space="preserve">"gene"</w:t>
-      </w:r>
-      <w:r>
-        <w:rPr>
-          <w:rStyle w:val="NormalTok"/>
-        </w:rPr>
-        <w:t xml:space="preserve">: gene,</w:t>
-      </w:r>
-      <w:r>
-        <w:br/>
-      </w:r>
-      <w:r>
-        <w:rPr>
-          <w:rStyle w:val="NormalTok"/>
-        </w:rPr>
-        <w:t xml:space="preserve">            </w:t>
-      </w:r>
-      <w:r>
-        <w:rPr>
-          <w:rStyle w:val="StringTok"/>
-        </w:rPr>
-        <w:t xml:space="preserve">"spinal"</w:t>
-      </w:r>
-      <w:r>
-        <w:rPr>
-          <w:rStyle w:val="NormalTok"/>
-        </w:rPr>
-        <w:t xml:space="preserve">: expr.get(</w:t>
-      </w:r>
-      <w:r>
-        <w:rPr>
-          <w:rStyle w:val="StringTok"/>
-        </w:rPr>
-        <w:t xml:space="preserve">"Spinal_Cord_cervical_c-1"</w:t>
-      </w:r>
-      <w:r>
-        <w:rPr>
-          <w:rStyle w:val="NormalTok"/>
-        </w:rPr>
-        <w:t xml:space="preserve">, </w:t>
-      </w:r>
-      <w:r>
-        <w:rPr>
-          <w:rStyle w:val="StringTok"/>
-        </w:rPr>
-        <w:t xml:space="preserve">"N/A"</w:t>
-      </w:r>
-      <w:r>
-        <w:rPr>
-          <w:rStyle w:val="NormalTok"/>
-        </w:rPr>
-        <w:t xml:space="preserve">),</w:t>
-      </w:r>
-      <w:r>
-        <w:br/>
-      </w:r>
-      <w:r>
-        <w:rPr>
-          <w:rStyle w:val="NormalTok"/>
-        </w:rPr>
-        <w:t xml:space="preserve">            </w:t>
-      </w:r>
-      <w:r>
-        <w:rPr>
-          <w:rStyle w:val="StringTok"/>
-        </w:rPr>
-        <w:t xml:space="preserve">"tibial"</w:t>
-      </w:r>
-      <w:r>
-        <w:rPr>
-          <w:rStyle w:val="NormalTok"/>
-        </w:rPr>
-        <w:t xml:space="preserve">: expr.get(</w:t>
-      </w:r>
-      <w:r>
-        <w:rPr>
-          <w:rStyle w:val="StringTok"/>
-        </w:rPr>
-        <w:t xml:space="preserve">"Nerve_Tibial"</w:t>
-      </w:r>
-      <w:r>
-        <w:rPr>
-          <w:rStyle w:val="NormalTok"/>
-        </w:rPr>
-        <w:t xml:space="preserve">, </w:t>
-      </w:r>
-      <w:r>
-        <w:rPr>
-          <w:rStyle w:val="StringTok"/>
-        </w:rPr>
-        <w:t xml:space="preserve">"N/A"</w:t>
-      </w:r>
-      <w:r>
-        <w:rPr>
-          <w:rStyle w:val="NormalTok"/>
-        </w:rPr>
-        <w:t xml:space="preserve">)</w:t>
-      </w:r>
-      <w:r>
-        <w:br/>
-      </w:r>
-      <w:r>
-        <w:rPr>
-          <w:rStyle w:val="NormalTok"/>
-        </w:rPr>
-        <w:t xml:space="preserve">        })</w:t>
-      </w:r>
-      <w:r>
-        <w:br/>
-      </w:r>
-      <w:r>
-        <w:rPr>
-          <w:rStyle w:val="CommentTok"/>
-        </w:rPr>
-        <w:t xml:space="preserve"># Display first 5 Track B genes</w:t>
-      </w:r>
-      <w:r>
-        <w:br/>
-      </w:r>
-      <w:r>
-        <w:rPr>
-          <w:rStyle w:val="ControlFlowTok"/>
-        </w:rPr>
-        <w:t xml:space="preserve">for</w:t>
-      </w:r>
-      <w:r>
-        <w:rPr>
-          <w:rStyle w:val="NormalTok"/>
-        </w:rPr>
-        <w:t xml:space="preserve"> item </w:t>
-      </w:r>
-      <w:r>
-        <w:rPr>
-          <w:rStyle w:val="KeywordTok"/>
-        </w:rPr>
-        <w:t xml:space="preserve">in</w:t>
-      </w:r>
-      <w:r>
-        <w:rPr>
-          <w:rStyle w:val="NormalTok"/>
-        </w:rPr>
-        <w:t xml:space="preserve"> track_b_expr[:</w:t>
-      </w:r>
-      <w:r>
-        <w:rPr>
-          <w:rStyle w:val="DecValTok"/>
-        </w:rPr>
-        <w:t xml:space="preserve">5</w:t>
-      </w:r>
-      <w:r>
-        <w:rPr>
-          <w:rStyle w:val="NormalTok"/>
-        </w:rPr>
-        <w:t xml:space="preserve">]:</w:t>
-      </w:r>
-      <w:r>
-        <w:br/>
-      </w:r>
-      <w:r>
-        <w:rPr>
-          <w:rStyle w:val="NormalTok"/>
-        </w:rPr>
-        <w:t xml:space="preserve">    </w:t>
-      </w:r>
-      <w:r>
-        <w:rPr>
-          <w:rStyle w:val="BuiltInTok"/>
-        </w:rPr>
-        <w:t xml:space="preserve">print</w:t>
-      </w:r>
-      <w:r>
-        <w:rPr>
-          <w:rStyle w:val="NormalTok"/>
-        </w:rPr>
-        <w:t xml:space="preserve">(</w:t>
-      </w:r>
-      <w:r>
-        <w:rPr>
-          <w:rStyle w:val="SpecialStringTok"/>
-        </w:rPr>
-        <w:t xml:space="preserve">f"</w:t>
-      </w:r>
-      <w:r>
-        <w:rPr>
-          <w:rStyle w:val="SpecialCharTok"/>
-        </w:rPr>
-        <w:t xml:space="preserve">{</w:t>
-      </w:r>
-      <w:r>
-        <w:rPr>
-          <w:rStyle w:val="NormalTok"/>
-        </w:rPr>
-        <w:t xml:space="preserve">item[</w:t>
-      </w:r>
-      <w:r>
-        <w:rPr>
-          <w:rStyle w:val="StringTok"/>
-        </w:rPr>
-        <w:t xml:space="preserve">'gene'</w:t>
-      </w:r>
-      <w:r>
-        <w:rPr>
-          <w:rStyle w:val="NormalTok"/>
-        </w:rPr>
-        <w:t xml:space="preserve">]</w:t>
-      </w:r>
-      <w:r>
-        <w:rPr>
-          <w:rStyle w:val="SpecialCharTok"/>
-        </w:rPr>
-        <w:t xml:space="preserve">}</w:t>
-      </w:r>
-      <w:r>
-        <w:rPr>
-          <w:rStyle w:val="SpecialStringTok"/>
-        </w:rPr>
-        <w:t xml:space="preserve">: Spinal=</w:t>
-      </w:r>
-      <w:r>
-        <w:rPr>
-          <w:rStyle w:val="SpecialCharTok"/>
-        </w:rPr>
-        <w:t xml:space="preserve">{</w:t>
-      </w:r>
-      <w:r>
-        <w:rPr>
-          <w:rStyle w:val="NormalTok"/>
-        </w:rPr>
-        <w:t xml:space="preserve">item[</w:t>
-      </w:r>
-      <w:r>
-        <w:rPr>
-          <w:rStyle w:val="StringTok"/>
-        </w:rPr>
-        <w:t xml:space="preserve">'spinal'</w:t>
-      </w:r>
-      <w:r>
-        <w:rPr>
-          <w:rStyle w:val="NormalTok"/>
-        </w:rPr>
-        <w:t xml:space="preserve">]</w:t>
-      </w:r>
-      <w:r>
-        <w:rPr>
-          <w:rStyle w:val="SpecialCharTok"/>
-        </w:rPr>
-        <w:t xml:space="preserve">}</w:t>
-      </w:r>
-      <w:r>
-        <w:rPr>
-          <w:rStyle w:val="SpecialStringTok"/>
-        </w:rPr>
-        <w:t xml:space="preserve">, Tibial=</w:t>
-      </w:r>
-      <w:r>
-        <w:rPr>
-          <w:rStyle w:val="SpecialCharTok"/>
-        </w:rPr>
-        <w:t xml:space="preserve">{</w:t>
-      </w:r>
-      <w:r>
-        <w:rPr>
-          <w:rStyle w:val="NormalTok"/>
-        </w:rPr>
-        <w:t xml:space="preserve">item[</w:t>
-      </w:r>
-      <w:r>
-        <w:rPr>
-          <w:rStyle w:val="StringTok"/>
-        </w:rPr>
-        <w:t xml:space="preserve">'tibial'</w:t>
-      </w:r>
-      <w:r>
-        <w:rPr>
-          <w:rStyle w:val="NormalTok"/>
-        </w:rPr>
-        <w:t xml:space="preserve">]</w:t>
-      </w:r>
-      <w:r>
-        <w:rPr>
-          <w:rStyle w:val="SpecialCharTok"/>
-        </w:rPr>
-        <w:t xml:space="preserve">}</w:t>
-      </w:r>
-      <w:r>
-        <w:rPr>
-          <w:rStyle w:val="SpecialStringTok"/>
-        </w:rPr>
-        <w:t xml:space="preserve">"</w:t>
-      </w:r>
-      <w:r>
-        <w:rPr>
-          <w:rStyle w:val="NormalTok"/>
-        </w:rPr>
-        <w:t xml:space="preserve">)</w:t>
-      </w:r>
-    </w:p>
-    <w:bookmarkEnd w:id="44"/>
-    <w:bookmarkStart w:id="45" w:name="identifying-bridge-genes-between-tracks"/>
+    <w:bookmarkStart w:id="44" w:name="identifying-bridge-genes-between-tracks"/>
     <w:p>
       <w:pPr>
         <w:pStyle w:val="Heading3"/>
@@ -5171,9 +5154,9 @@
         </w:pict>
       </w:r>
     </w:p>
+    <w:bookmarkEnd w:id="44"/>
     <w:bookmarkEnd w:id="45"/>
-    <w:bookmarkEnd w:id="46"/>
-    <w:bookmarkStart w:id="47" w:name="supplementary-materials"/>
+    <w:bookmarkStart w:id="46" w:name="supplementary-materials"/>
     <w:p>
       <w:pPr>
         <w:pStyle w:val="Heading2"/>
@@ -5365,8 +5348,8 @@
         </w:pict>
       </w:r>
     </w:p>
-    <w:bookmarkEnd w:id="47"/>
-    <w:bookmarkStart w:id="48" w:name="figure-captions"/>
+    <w:bookmarkEnd w:id="46"/>
+    <w:bookmarkStart w:id="47" w:name="figure-captions"/>
     <w:p>
       <w:pPr>
         <w:pStyle w:val="Heading2"/>
@@ -5447,14 +5430,32 @@
         <w:t xml:space="preserve">Node type composition (pie chart, 10 entity types) and edge relat</w:t>
       </w:r>
     </w:p>
+    <w:bookmarkEnd w:id="47"/>
+    <w:bookmarkStart w:id="48" w:name="ai-usage-statement"/>
+    <w:p>
+      <w:pPr>
+        <w:pStyle w:val="Heading2"/>
+      </w:pPr>
+      <w:r>
+        <w:t xml:space="preserve">AI Usage Statement</w:t>
+      </w:r>
+    </w:p>
+    <w:p>
+      <w:pPr>
+        <w:pStyle w:val="FirstParagraph"/>
+      </w:pPr>
+      <w:r>
+        <w:t xml:space="preserve">During the preparation of this work, the author used AI-assisted tools (OpenAI Codex CLI, GitHub Copilot, and Claude via API) for the following purposes: code development and debugging of the pipeline, literature search and summarization, manuscript drafting and language editing, and iterative revision based on simulated peer review. All AI-generated content was reviewed, verified, and edited by the author. The author takes full responsibility for the scientific accuracy, data integrity, and conclusions presented in this publication. All data were generated by the author’s original code; no AI tool contributed to data generation or statistical computation beyond code execution of author-specified algorithms.</w:t>
+      </w:r>
+    </w:p>
     <w:bookmarkEnd w:id="48"/>
-    <w:bookmarkStart w:id="49" w:name="ai-usage-statement"/>
+    <w:bookmarkStart w:id="49" w:name="acknowledgements"/>
     <w:p>
       <w:pPr>
         <w:pStyle w:val="Heading2"/>
       </w:pPr>
       <w:r>
-        <w:t xml:space="preserve">AI Usage Statement</w:t>
+        <w:t xml:space="preserve">Acknowledgements</w:t>
       </w:r>
     </w:p>
     <w:p>
@@ -5462,29 +5463,11 @@
         <w:pStyle w:val="FirstParagraph"/>
       </w:pPr>
       <w:r>
-        <w:t xml:space="preserve">During the preparation of this work, the author used AI-assisted tools (OpenAI Codex CLI, GitHub Copilot, and Claude via API) for the following purposes: code development and debugging of the pipeline, literature search and summarization, manuscript drafting and language editing, and iterative revision based on simulated peer review. All AI-generated content was reviewed, verified, and edited by the author. The author takes full responsibility for the scientific accuracy, data integrity, and conclusions presented in this publication. All data were generated by the author’s original code; no AI tool contributed to data generation or statistical computation beyond code execution of author-specified algorithms.</w:t>
+        <w:t xml:space="preserve">The author thanks the Norman lab, the PrimeKG development team, the GTEx Consortium, and the Gene Ontology Consortium for making their data publicly available. This research was supported by institutional resources from The Second Affiliated Hospital of Fujian University of Traditional Chinese Medicine.</w:t>
       </w:r>
     </w:p>
     <w:bookmarkEnd w:id="49"/>
-    <w:bookmarkStart w:id="50" w:name="acknowledgements"/>
-    <w:p>
-      <w:pPr>
-        <w:pStyle w:val="Heading2"/>
-      </w:pPr>
-      <w:r>
-        <w:t xml:space="preserve">Acknowledgements</w:t>
-      </w:r>
-    </w:p>
-    <w:p>
-      <w:pPr>
-        <w:pStyle w:val="FirstParagraph"/>
-      </w:pPr>
-      <w:r>
-        <w:t xml:space="preserve">The author thanks the Norman lab, the PrimeKG development team, the GTEx Consortium, and the Gene Ontology Consortium for making their data publicly available. This research was supported by institutional resources from The Second Affiliated Hospital of Fujian University of Traditional Chinese Medicine.</w:t>
-      </w:r>
-    </w:p>
-    <w:bookmarkEnd w:id="50"/>
-    <w:bookmarkStart w:id="51" w:name="author-contributions"/>
+    <w:bookmarkStart w:id="50" w:name="author-contributions"/>
     <w:p>
       <w:pPr>
         <w:pStyle w:val="Heading2"/>
@@ -5511,14 +5494,32 @@
         <w:t xml:space="preserve">Conceptualization, Methodology, Software, Formal Analysis, Investigation, Data Curation, Writing - Original Draft, Writing - Review and Editing, Visualization, Project Administration.</w:t>
       </w:r>
     </w:p>
+    <w:bookmarkEnd w:id="50"/>
+    <w:bookmarkStart w:id="51" w:name="competing-interests"/>
+    <w:p>
+      <w:pPr>
+        <w:pStyle w:val="Heading2"/>
+      </w:pPr>
+      <w:r>
+        <w:t xml:space="preserve">Competing Interests</w:t>
+      </w:r>
+    </w:p>
+    <w:p>
+      <w:pPr>
+        <w:pStyle w:val="FirstParagraph"/>
+      </w:pPr>
+      <w:r>
+        <w:t xml:space="preserve">The author declares no competing interests.</w:t>
+      </w:r>
+    </w:p>
     <w:bookmarkEnd w:id="51"/>
-    <w:bookmarkStart w:id="52" w:name="competing-interests"/>
+    <w:bookmarkStart w:id="52" w:name="ethics-statement"/>
     <w:p>
       <w:pPr>
         <w:pStyle w:val="Heading2"/>
       </w:pPr>
       <w:r>
-        <w:t xml:space="preserve">Competing Interests</w:t>
+        <w:t xml:space="preserve">Ethics Statement</w:t>
       </w:r>
     </w:p>
     <w:p>
@@ -5526,29 +5527,11 @@
         <w:pStyle w:val="FirstParagraph"/>
       </w:pPr>
       <w:r>
-        <w:t xml:space="preserve">The author declares no competing interests.</w:t>
+        <w:t xml:space="preserve">This study uses exclusively publicly available data. No new data involving human subjects were collected.</w:t>
       </w:r>
     </w:p>
     <w:bookmarkEnd w:id="52"/>
-    <w:bookmarkStart w:id="53" w:name="ethics-statement"/>
-    <w:p>
-      <w:pPr>
-        <w:pStyle w:val="Heading2"/>
-      </w:pPr>
-      <w:r>
-        <w:t xml:space="preserve">Ethics Statement</w:t>
-      </w:r>
-    </w:p>
-    <w:p>
-      <w:pPr>
-        <w:pStyle w:val="FirstParagraph"/>
-      </w:pPr>
-      <w:r>
-        <w:t xml:space="preserve">This study uses exclusively publicly available data. No new data involving human subjects were collected.</w:t>
-      </w:r>
-    </w:p>
-    <w:bookmarkEnd w:id="53"/>
-    <w:bookmarkStart w:id="54" w:name="data-and-code-availability"/>
+    <w:bookmarkStart w:id="53" w:name="data-and-code-availability"/>
     <w:p>
       <w:pPr>
         <w:pStyle w:val="Heading2"/>
@@ -5572,194 +5555,194 @@
         </w:pict>
       </w:r>
     </w:p>
+    <w:bookmarkEnd w:id="53"/>
+    <w:bookmarkStart w:id="54" w:name="references"/>
+    <w:p>
+      <w:pPr>
+        <w:pStyle w:val="Heading2"/>
+      </w:pPr>
+      <w:r>
+        <w:t xml:space="preserve">References</w:t>
+      </w:r>
+    </w:p>
+    <w:p>
+      <w:pPr>
+        <w:pStyle w:val="FirstParagraph"/>
+      </w:pPr>
+      <w:r>
+        <w:t xml:space="preserve">[1] Safiri S, Kolahi AA, Hoy D, et al. Global, regional and national burden of rheumatoid arthritis 1990-2017: a systematic analysis. Ann Rheum Dis. 2019;78(11):1463-1471.</w:t>
+      </w:r>
+    </w:p>
+    <w:p>
+      <w:pPr>
+        <w:pStyle w:val="BodyText"/>
+      </w:pPr>
+      <w:r>
+        <w:t xml:space="preserve">[2] Cross M, Smith E, Hoy D, et al. The global burden of rheumatoid arthritis: estimates from the Global Burden of Disease 2010 study. Ann Rheum Dis. 2014;73(7):1316-1322.</w:t>
+      </w:r>
+    </w:p>
+    <w:p>
+      <w:pPr>
+        <w:pStyle w:val="BodyText"/>
+      </w:pPr>
+      <w:r>
+        <w:t xml:space="preserve">[3] Lee YC, Cui J, Lu B, et al. Pain persists in DAS28 rheumatoid arthritis remission but not in ACR/EULAR remission. Ann Rheum Dis. 2011;70:1467-1470.</w:t>
+      </w:r>
+    </w:p>
+    <w:p>
+      <w:pPr>
+        <w:pStyle w:val="BodyText"/>
+      </w:pPr>
+      <w:r>
+        <w:t xml:space="preserve">[4] McWilliams DF, Walsh DA. Pain mechanisms in rheumatoid arthritis. Clin Exp Rheumatol. 2017;35 Suppl 107(5):31-39.</w:t>
+      </w:r>
+    </w:p>
+    <w:p>
+      <w:pPr>
+        <w:pStyle w:val="BodyText"/>
+      </w:pPr>
+      <w:r>
+        <w:t xml:space="preserve">[5] Basbaum AI, Bautista DM, Scherrer G, Julius D. Cellular and molecular mechanisms of pain. Cell. 2009;139(2):267-284.</w:t>
+      </w:r>
+    </w:p>
+    <w:p>
+      <w:pPr>
+        <w:pStyle w:val="BodyText"/>
+      </w:pPr>
+      <w:r>
+        <w:t xml:space="preserve">[6] Julius D. TRP channels and pain. Annu Rev Cell Dev Biol. 2013;29:355-384.</w:t>
+      </w:r>
+    </w:p>
+    <w:p>
+      <w:pPr>
+        <w:pStyle w:val="BodyText"/>
+      </w:pPr>
+      <w:r>
+        <w:t xml:space="preserve">[7] Ji RR, Nackley A, Huh Y, Terrando N, Maixner W. Neuroinflammation and central sensitization in chronic and widespread pain. Anesthesiology. 2018;129(2):343-366.</w:t>
+      </w:r>
+    </w:p>
+    <w:p>
+      <w:pPr>
+        <w:pStyle w:val="BodyText"/>
+      </w:pPr>
+      <w:r>
+        <w:t xml:space="preserve">[8] Szklarczyk D, Kirsch R, Koutrouli M, et al. The STRING database in 2023: protein-protein association networks and functional enrichment analyses. Nucleic Acids Res. 2023;51(D1):D638-D646.</w:t>
+      </w:r>
+    </w:p>
+    <w:p>
+      <w:pPr>
+        <w:pStyle w:val="BodyText"/>
+      </w:pPr>
+      <w:r>
+        <w:t xml:space="preserve">[9] Oughtred R, Rust J, Chang C, et al. The BioGRID database: A comprehensive biomedical resource of curated protein, genetic, and chemical interactions. Protein Sci. 2021;30(1):187-200.</w:t>
+      </w:r>
+    </w:p>
+    <w:p>
+      <w:pPr>
+        <w:pStyle w:val="BodyText"/>
+      </w:pPr>
+      <w:r>
+        <w:t xml:space="preserve">[10] Kanehisa M, Furumichi M, Sato Y, Kawashima M, Ishiguro-Watanabe M. KEGG for taxonomy-based analysis of pathways and genomes. Nucleic Acids Res. 2023;51(D1):D587-D592.</w:t>
+      </w:r>
+    </w:p>
+    <w:p>
+      <w:pPr>
+        <w:pStyle w:val="BodyText"/>
+      </w:pPr>
+      <w:r>
+        <w:t xml:space="preserve">[11] Gillespie M, Jassal B, Stephan R, et al. The reactome pathway knowledgebase 2022. Nucleic Acids Res. 2022;50(D1):D687-D692.</w:t>
+      </w:r>
+    </w:p>
+    <w:p>
+      <w:pPr>
+        <w:pStyle w:val="BodyText"/>
+      </w:pPr>
+      <w:r>
+        <w:t xml:space="preserve">[12] Agrawal A, Balci H, Hanspers K, et al. WikiPathways 2024: next generation pathway database. Nucleic Acids Res. 2024;52(D1):D679-D689.</w:t>
+      </w:r>
+    </w:p>
+    <w:p>
+      <w:pPr>
+        <w:pStyle w:val="BodyText"/>
+      </w:pPr>
+      <w:r>
+        <w:t xml:space="preserve">[13] Chandak P, Huang K, Zitnik M. Building a knowledge graph to enable precision medicine. Sci Data. 2023;10:67.</w:t>
+      </w:r>
+    </w:p>
+    <w:p>
+      <w:pPr>
+        <w:pStyle w:val="BodyText"/>
+      </w:pPr>
+      <w:r>
+        <w:t xml:space="preserve">[14] Harding SD, Armstrong JF, Faccenda E, et al. The IUPHAR/BPS Guide to PHARMACOLOGY in 2024. Nucleic Acids Res. 2024;52(D1):D1438-D1449.</w:t>
+      </w:r>
+    </w:p>
+    <w:p>
+      <w:pPr>
+        <w:pStyle w:val="BodyText"/>
+      </w:pPr>
+      <w:r>
+        <w:t xml:space="preserve">[15] Meloto CB, Benavides R, Lichtenwalter RN, et al. Human pain genetics database: a resource dedicated to human pain genetics research. Pain. 2018;159(4):749-763.</w:t>
+      </w:r>
+    </w:p>
+    <w:p>
+      <w:pPr>
+        <w:pStyle w:val="BodyText"/>
+      </w:pPr>
+      <w:r>
+        <w:t xml:space="preserve">[16] GTEx Consortium. The GTEx Consortium atlas of genetic regulatory effects across human tissues. Science. 2020;369(6509):1318-1330.</w:t>
+      </w:r>
+    </w:p>
+    <w:p>
+      <w:pPr>
+        <w:pStyle w:val="BodyText"/>
+      </w:pPr>
+      <w:r>
+        <w:t xml:space="preserve">[17] Pinero J, Ramirez-Anguita JM, Sauch-Pitarch J, et al. The DisGeNET knowledge platform for disease genomics: 2019 update. Nucleic Acids Res. 2020;48(D1):D845-D855.</w:t>
+      </w:r>
+    </w:p>
+    <w:p>
+      <w:pPr>
+        <w:pStyle w:val="BodyText"/>
+      </w:pPr>
+      <w:r>
+        <w:t xml:space="preserve">[18] Nguyen MQ, von Buchholtz LJ, Reker AN, Ryba NJ, Davidson S. Single-nucleus transcriptomic analysis of human dorsal root ganglion sensory neurons. Pain. 2021;162(7):2032-2046.</w:t>
+      </w:r>
+    </w:p>
+    <w:p>
+      <w:pPr>
+        <w:pStyle w:val="BodyText"/>
+      </w:pPr>
+      <w:r>
+        <w:t xml:space="preserve">[19] Yang Y. RA-PainKG: A tissue-specific knowledge graph for rheumatoid arthritis pain signaling - construction protocol, network analysis, and coverage-gap documentation. GitHub/Zenodo. 2026. Available at: https://github.com/yyx-4113/ra-painkg.</w:t>
+      </w:r>
+    </w:p>
+    <w:p>
+      <w:pPr>
+        <w:pStyle w:val="BodyText"/>
+      </w:pPr>
+      <w:r>
+        <w:t xml:space="preserve">[20] Norman TM, Horlbeck MA, Replogle JM, et al. Exploring genetic interaction manifolds constructed from rich single-cell phenotypes. Science. 2019;365(6455):786-793.</w:t>
+      </w:r>
+    </w:p>
+    <w:p>
+      <w:pPr>
+        <w:pStyle w:val="BodyText"/>
+      </w:pPr>
+      <w:r>
+        <w:t xml:space="preserve">[21] Roohani Y, Huang K, Leskovec J. Predicting transcriptional outcomes of novel multigene perturbations with GEARS. Nat Biotechnol. 2024;42:591-600.</w:t>
+      </w:r>
+    </w:p>
+    <w:p>
+      <w:pPr>
+        <w:pStyle w:val="BodyText"/>
+      </w:pPr>
+      <w:r>
+        <w:t xml:space="preserve">[22] Ashburner M, Ball CA, Blake JA, et al. Gene Ontology: tool for the unification of biology. Nat Genet. 2000;25(1):25-29.</w:t>
+      </w:r>
+    </w:p>
     <w:bookmarkEnd w:id="54"/>
-    <w:bookmarkStart w:id="55" w:name="references"/>
-    <w:p>
-      <w:pPr>
-        <w:pStyle w:val="Heading2"/>
-      </w:pPr>
-      <w:r>
-        <w:t xml:space="preserve">References</w:t>
-      </w:r>
-    </w:p>
-    <w:p>
-      <w:pPr>
-        <w:pStyle w:val="FirstParagraph"/>
-      </w:pPr>
-      <w:r>
-        <w:t xml:space="preserve">[1] Safiri S, Kolahi AA, Hoy D, et al. Global, regional and national burden of rheumatoid arthritis 1990-2017: a systematic analysis. Ann Rheum Dis. 2019;78(11):1463-1471.</w:t>
-      </w:r>
-    </w:p>
-    <w:p>
-      <w:pPr>
-        <w:pStyle w:val="BodyText"/>
-      </w:pPr>
-      <w:r>
-        <w:t xml:space="preserve">[2] Cross M, Smith E, Hoy D, et al. The global burden of rheumatoid arthritis: estimates from the Global Burden of Disease 2010 study. Ann Rheum Dis. 2014;73(7):1316-1322.</w:t>
-      </w:r>
-    </w:p>
-    <w:p>
-      <w:pPr>
-        <w:pStyle w:val="BodyText"/>
-      </w:pPr>
-      <w:r>
-        <w:t xml:space="preserve">[3] Lee YC, Cui J, Lu B, et al. Pain persists in DAS28 rheumatoid arthritis remission but not in ACR/EULAR remission. Ann Rheum Dis. 2011;70:1467-1470.</w:t>
-      </w:r>
-    </w:p>
-    <w:p>
-      <w:pPr>
-        <w:pStyle w:val="BodyText"/>
-      </w:pPr>
-      <w:r>
-        <w:t xml:space="preserve">[4] McWilliams DF, Walsh DA. Pain mechanisms in rheumatoid arthritis. Clin Exp Rheumatol. 2017;35 Suppl 107(5):31-39.</w:t>
-      </w:r>
-    </w:p>
-    <w:p>
-      <w:pPr>
-        <w:pStyle w:val="BodyText"/>
-      </w:pPr>
-      <w:r>
-        <w:t xml:space="preserve">[5] Basbaum AI, Bautista DM, Scherrer G, Julius D. Cellular and molecular mechanisms of pain. Cell. 2009;139(2):267-284.</w:t>
-      </w:r>
-    </w:p>
-    <w:p>
-      <w:pPr>
-        <w:pStyle w:val="BodyText"/>
-      </w:pPr>
-      <w:r>
-        <w:t xml:space="preserve">[6] Julius D. TRP channels and pain. Annu Rev Cell Dev Biol. 2013;29:355-384.</w:t>
-      </w:r>
-    </w:p>
-    <w:p>
-      <w:pPr>
-        <w:pStyle w:val="BodyText"/>
-      </w:pPr>
-      <w:r>
-        <w:t xml:space="preserve">[7] Ji RR, Nackley A, Huh Y, Terrando N, Maixner W. Neuroinflammation and central sensitization in chronic and widespread pain. Anesthesiology. 2018;129(2):343-366.</w:t>
-      </w:r>
-    </w:p>
-    <w:p>
-      <w:pPr>
-        <w:pStyle w:val="BodyText"/>
-      </w:pPr>
-      <w:r>
-        <w:t xml:space="preserve">[8] Szklarczyk D, Kirsch R, Koutrouli M, et al. The STRING database in 2023: protein-protein association networks and functional enrichment analyses. Nucleic Acids Res. 2023;51(D1):D638-D646.</w:t>
-      </w:r>
-    </w:p>
-    <w:p>
-      <w:pPr>
-        <w:pStyle w:val="BodyText"/>
-      </w:pPr>
-      <w:r>
-        <w:t xml:space="preserve">[9] Oughtred R, Rust J, Chang C, et al. The BioGRID database: A comprehensive biomedical resource of curated protein, genetic, and chemical interactions. Protein Sci. 2021;30(1):187-200.</w:t>
-      </w:r>
-    </w:p>
-    <w:p>
-      <w:pPr>
-        <w:pStyle w:val="BodyText"/>
-      </w:pPr>
-      <w:r>
-        <w:t xml:space="preserve">[10] Kanehisa M, Furumichi M, Sato Y, Kawashima M, Ishiguro-Watanabe M. KEGG for taxonomy-based analysis of pathways and genomes. Nucleic Acids Res. 2023;51(D1):D587-D592.</w:t>
-      </w:r>
-    </w:p>
-    <w:p>
-      <w:pPr>
-        <w:pStyle w:val="BodyText"/>
-      </w:pPr>
-      <w:r>
-        <w:t xml:space="preserve">[11] Gillespie M, Jassal B, Stephan R, et al. The reactome pathway knowledgebase 2022. Nucleic Acids Res. 2022;50(D1):D687-D692.</w:t>
-      </w:r>
-    </w:p>
-    <w:p>
-      <w:pPr>
-        <w:pStyle w:val="BodyText"/>
-      </w:pPr>
-      <w:r>
-        <w:t xml:space="preserve">[12] Agrawal A, Balci H, Hanspers K, et al. WikiPathways 2024: next generation pathway database. Nucleic Acids Res. 2024;52(D1):D679-D689.</w:t>
-      </w:r>
-    </w:p>
-    <w:p>
-      <w:pPr>
-        <w:pStyle w:val="BodyText"/>
-      </w:pPr>
-      <w:r>
-        <w:t xml:space="preserve">[13] Chandak P, Huang K, Zitnik M. Building a knowledge graph to enable precision medicine. Sci Data. 2023;10:67.</w:t>
-      </w:r>
-    </w:p>
-    <w:p>
-      <w:pPr>
-        <w:pStyle w:val="BodyText"/>
-      </w:pPr>
-      <w:r>
-        <w:t xml:space="preserve">[14] Harding SD, Armstrong JF, Faccenda E, et al. The IUPHAR/BPS Guide to PHARMACOLOGY in 2024. Nucleic Acids Res. 2024;52(D1):D1438-D1449.</w:t>
-      </w:r>
-    </w:p>
-    <w:p>
-      <w:pPr>
-        <w:pStyle w:val="BodyText"/>
-      </w:pPr>
-      <w:r>
-        <w:t xml:space="preserve">[15] Meloto CB, Benavides R, Lichtenwalter RN, et al. Human pain genetics database: a resource dedicated to human pain genetics research. Pain. 2018;159(4):749-763.</w:t>
-      </w:r>
-    </w:p>
-    <w:p>
-      <w:pPr>
-        <w:pStyle w:val="BodyText"/>
-      </w:pPr>
-      <w:r>
-        <w:t xml:space="preserve">[16] GTEx Consortium. The GTEx Consortium atlas of genetic regulatory effects across human tissues. Science. 2020;369(6509):1318-1330.</w:t>
-      </w:r>
-    </w:p>
-    <w:p>
-      <w:pPr>
-        <w:pStyle w:val="BodyText"/>
-      </w:pPr>
-      <w:r>
-        <w:t xml:space="preserve">[17] Pinero J, Ramirez-Anguita JM, Sauch-Pitarch J, et al. The DisGeNET knowledge platform for disease genomics: 2019 update. Nucleic Acids Res. 2020;48(D1):D845-D855.</w:t>
-      </w:r>
-    </w:p>
-    <w:p>
-      <w:pPr>
-        <w:pStyle w:val="BodyText"/>
-      </w:pPr>
-      <w:r>
-        <w:t xml:space="preserve">[18] Nguyen MQ, von Buchholtz LJ, Reker AN, Ryba NJ, Davidson S. Single-nucleus transcriptomic analysis of human dorsal root ganglion sensory neurons. Pain. 2021;162(7):2032-2046.</w:t>
-      </w:r>
-    </w:p>
-    <w:p>
-      <w:pPr>
-        <w:pStyle w:val="BodyText"/>
-      </w:pPr>
-      <w:r>
-        <w:t xml:space="preserve">[19] Yang Y. RA-PainKG: A tissue-specific knowledge graph for rheumatoid arthritis pain signaling - construction protocol, network analysis, and coverage-gap documentation. GitHub/Zenodo. 2026. Available at: https://github.com/yyx-4113/ra-painkg.</w:t>
-      </w:r>
-    </w:p>
-    <w:p>
-      <w:pPr>
-        <w:pStyle w:val="BodyText"/>
-      </w:pPr>
-      <w:r>
-        <w:t xml:space="preserve">[20] Norman TM, Horlbeck MA, Replogle JM, et al. Exploring genetic interaction manifolds constructed from rich single-cell phenotypes. Science. 2019;365(6455):786-793.</w:t>
-      </w:r>
-    </w:p>
-    <w:p>
-      <w:pPr>
-        <w:pStyle w:val="BodyText"/>
-      </w:pPr>
-      <w:r>
-        <w:t xml:space="preserve">[21] Roohani Y, Huang K, Leskovec J. Predicting transcriptional outcomes of novel multigene perturbations with GEARS. Nat Biotechnol. 2024;42:591-600.</w:t>
-      </w:r>
-    </w:p>
-    <w:p>
-      <w:pPr>
-        <w:pStyle w:val="BodyText"/>
-      </w:pPr>
-      <w:r>
-        <w:t xml:space="preserve">[22] Ashburner M, Ball CA, Blake JA, et al. Gene Ontology: tool for the unification of biology. Nat Genet. 2000;25(1):25-29.</w:t>
-      </w:r>
-    </w:p>
     <w:bookmarkEnd w:id="55"/>
-    <w:bookmarkEnd w:id="56"/>
     <w:sectPr>
       <w:footnotePr>
         <w:numRestart w:val="eachSect"/>

</xml_diff>